<commit_message>
vault backup: 2025-10-08 14:20:37
</commit_message>
<xml_diff>
--- a/College/Tugas Akhir/Prototype Skripsi/Tahap Seminar Proposal/Muhammad Alif Seminar Proposal v.1.docx
+++ b/College/Tugas Akhir/Prototype Skripsi/Tahap Seminar Proposal/Muhammad Alif Seminar Proposal v.1.docx
@@ -1727,29 +1727,18 @@
         <w:spacing w:after="0" w:line="276" w:lineRule="auto"/>
         <w:jc w:val="both"/>
         <w:rPr>
-          <w:rFonts w:ascii="Times New Roman" w:eastAsia="Times New Roman" w:hAnsi="Times New Roman" w:cs="Times New Roman"/>
-          <w:color w:val="000000"/>
-          <w:sz w:val="24"/>
-          <w:szCs w:val="24"/>
-        </w:rPr>
-      </w:pPr>
-      <w:sdt>
-        <w:sdtPr>
-          <w:tag w:val="goog_rdk_0"/>
-          <w:id w:val="-1667005009"/>
-        </w:sdtPr>
-        <w:sdtContent>
-          <w:commentRangeStart w:id="1"/>
-        </w:sdtContent>
-      </w:sdt>
-      <w:r>
-        <w:rPr>
-          <w:rFonts w:ascii="Times New Roman" w:eastAsia="Times New Roman" w:hAnsi="Times New Roman" w:cs="Times New Roman"/>
-          <w:color w:val="000000"/>
-          <w:sz w:val="24"/>
-          <w:szCs w:val="24"/>
-        </w:rPr>
-        <w:t>Nama dan gelar akademik lengkap Dekan selaku Dekan Fakultas Teknik, Universitas Mulawarman.</w:t>
+          <w:rFonts w:ascii="Times New Roman" w:hAnsi="Times New Roman" w:cs="Times New Roman"/>
+          <w:sz w:val="24"/>
+          <w:szCs w:val="24"/>
+        </w:rPr>
+      </w:pPr>
+      <w:r>
+        <w:rPr>
+          <w:rFonts w:ascii="Times New Roman" w:hAnsi="Times New Roman" w:cs="Times New Roman"/>
+          <w:sz w:val="24"/>
+          <w:szCs w:val="24"/>
+        </w:rPr>
+        <w:t>Bapak Prof. Dr. Ir. H. Tamrin, S.T., M.T., IPU., APEC Eng., selaku Dekan Fakultas Teknik Universitas Mulawarman, atas fasilitas dan dukungan yang diberikan selama proses perkuliahan.</w:t>
       </w:r>
     </w:p>
     <w:p>
@@ -1768,20 +1757,18 @@
         <w:spacing w:after="0" w:line="276" w:lineRule="auto"/>
         <w:jc w:val="both"/>
         <w:rPr>
-          <w:rFonts w:ascii="Times New Roman" w:eastAsia="Times New Roman" w:hAnsi="Times New Roman" w:cs="Times New Roman"/>
-          <w:color w:val="000000"/>
-          <w:sz w:val="24"/>
-          <w:szCs w:val="24"/>
-        </w:rPr>
-      </w:pPr>
-      <w:r>
-        <w:rPr>
-          <w:rFonts w:ascii="Times New Roman" w:eastAsia="Times New Roman" w:hAnsi="Times New Roman" w:cs="Times New Roman"/>
-          <w:color w:val="000000"/>
-          <w:sz w:val="24"/>
-          <w:szCs w:val="24"/>
-        </w:rPr>
-        <w:t>Nama dan gelar akademik Koordinator Prodi selaku K Program Studi Informatika</w:t>
+          <w:rFonts w:ascii="Times New Roman" w:hAnsi="Times New Roman" w:cs="Times New Roman"/>
+          <w:sz w:val="24"/>
+          <w:szCs w:val="24"/>
+        </w:rPr>
+      </w:pPr>
+      <w:r>
+        <w:rPr>
+          <w:rFonts w:ascii="Times New Roman" w:hAnsi="Times New Roman" w:cs="Times New Roman"/>
+          <w:sz w:val="24"/>
+          <w:szCs w:val="24"/>
+        </w:rPr>
+        <w:t>Bapak Awang Harsa Kridalaksana, S.Kom., M.Kom., selaku Koordinator Program Studi Informatika, atas bimbingan dan arahannya selama penyusunan proposal ini.</w:t>
       </w:r>
     </w:p>
     <w:p>
@@ -1800,20 +1787,18 @@
         <w:spacing w:after="0" w:line="276" w:lineRule="auto"/>
         <w:jc w:val="both"/>
         <w:rPr>
-          <w:rFonts w:ascii="Times New Roman" w:eastAsia="Times New Roman" w:hAnsi="Times New Roman" w:cs="Times New Roman"/>
-          <w:color w:val="000000"/>
-          <w:sz w:val="24"/>
-          <w:szCs w:val="24"/>
-        </w:rPr>
-      </w:pPr>
-      <w:r>
-        <w:rPr>
-          <w:rFonts w:ascii="Times New Roman" w:eastAsia="Times New Roman" w:hAnsi="Times New Roman" w:cs="Times New Roman"/>
-          <w:color w:val="000000"/>
-          <w:sz w:val="24"/>
-          <w:szCs w:val="24"/>
-        </w:rPr>
-        <w:t>Nama dan gelar akademik Dosen Pembimbing I selaku Pembimbing I yang selalu memberikan arahan dan masukkan terhadap penelitian ini.</w:t>
+          <w:rFonts w:ascii="Times New Roman" w:hAnsi="Times New Roman" w:cs="Times New Roman"/>
+          <w:sz w:val="24"/>
+          <w:szCs w:val="24"/>
+        </w:rPr>
+      </w:pPr>
+      <w:r>
+        <w:rPr>
+          <w:rFonts w:ascii="Times New Roman" w:hAnsi="Times New Roman" w:cs="Times New Roman"/>
+          <w:sz w:val="24"/>
+          <w:szCs w:val="24"/>
+        </w:rPr>
+        <w:t>Ibu Prof. Dr. Anindita Septiarini, S.T., M.Cs, selaku Dosen Pembimbing I, yang telah memberikan arahan, saran, dan motivasi dalam penyusunan proposal ini.</w:t>
       </w:r>
     </w:p>
     <w:p>
@@ -1840,104 +1825,21 @@
       </w:pPr>
       <w:r>
         <w:rPr>
+          <w:rFonts w:ascii="Times New Roman" w:hAnsi="Times New Roman" w:cs="Times New Roman"/>
+          <w:sz w:val="24"/>
+          <w:szCs w:val="24"/>
+        </w:rPr>
+        <w:t>Bapak Reza Wardhana, S.Kom., M.Eng., selaku Dosen Pembimbing II, yang telah memberikan bimbingan dan masukan yang sangat berharga bagi penyempurnaan penelitian ini.</w:t>
+      </w:r>
+      <w:r>
+        <w:rPr>
           <w:rFonts w:ascii="Times New Roman" w:eastAsia="Times New Roman" w:hAnsi="Times New Roman" w:cs="Times New Roman"/>
           <w:color w:val="000000"/>
           <w:sz w:val="24"/>
           <w:szCs w:val="24"/>
         </w:rPr>
-        <w:t xml:space="preserve">Nama dan gelar akademik Dosen Pembimbing II selaku Pembimbing II atas masukkan terhadap penelitian ini </w:t>
-      </w:r>
-    </w:p>
-    <w:p>
-      <w:pPr>
-        <w:numPr>
-          <w:ilvl w:val="0"/>
-          <w:numId w:val="7"/>
-        </w:numPr>
-        <w:pBdr>
-          <w:top w:val="nil"/>
-          <w:left w:val="nil"/>
-          <w:bottom w:val="nil"/>
-          <w:right w:val="nil"/>
-          <w:between w:val="nil"/>
-        </w:pBdr>
-        <w:spacing w:after="0" w:line="276" w:lineRule="auto"/>
-        <w:jc w:val="both"/>
-        <w:rPr>
-          <w:rFonts w:ascii="Times New Roman" w:eastAsia="Times New Roman" w:hAnsi="Times New Roman" w:cs="Times New Roman"/>
-          <w:color w:val="000000"/>
-          <w:sz w:val="24"/>
-          <w:szCs w:val="24"/>
-        </w:rPr>
-      </w:pPr>
-      <w:r>
-        <w:rPr>
-          <w:rFonts w:ascii="Times New Roman" w:eastAsia="Times New Roman" w:hAnsi="Times New Roman" w:cs="Times New Roman"/>
-          <w:color w:val="000000"/>
-          <w:sz w:val="24"/>
-          <w:szCs w:val="24"/>
-        </w:rPr>
-        <w:t>Nama dan gelar akademik Dosen Penguji I selaku Penguji I atas saran dan masukkan terhadap penelitian ini.</w:t>
-      </w:r>
-    </w:p>
-    <w:p>
-      <w:pPr>
-        <w:numPr>
-          <w:ilvl w:val="0"/>
-          <w:numId w:val="7"/>
-        </w:numPr>
-        <w:pBdr>
-          <w:top w:val="nil"/>
-          <w:left w:val="nil"/>
-          <w:bottom w:val="nil"/>
-          <w:right w:val="nil"/>
-          <w:between w:val="nil"/>
-        </w:pBdr>
-        <w:spacing w:after="0" w:line="276" w:lineRule="auto"/>
-        <w:jc w:val="both"/>
-        <w:rPr>
-          <w:rFonts w:ascii="Times New Roman" w:eastAsia="Times New Roman" w:hAnsi="Times New Roman" w:cs="Times New Roman"/>
-          <w:color w:val="000000"/>
-          <w:sz w:val="24"/>
-          <w:szCs w:val="24"/>
-        </w:rPr>
-      </w:pPr>
-      <w:r>
-        <w:rPr>
-          <w:rFonts w:ascii="Times New Roman" w:eastAsia="Times New Roman" w:hAnsi="Times New Roman" w:cs="Times New Roman"/>
-          <w:color w:val="000000"/>
-          <w:sz w:val="24"/>
-          <w:szCs w:val="24"/>
-        </w:rPr>
-        <w:t>Nama dan gelar akademik Dosen Penguji II selaku Penguji II atas saran dan masukkan terhadap penelitian ini.</w:t>
-      </w:r>
-      <w:commentRangeEnd w:id="1"/>
-      <w:r>
-        <w:commentReference w:id="1"/>
-      </w:r>
-    </w:p>
-    <w:p>
-      <w:pPr>
-        <w:numPr>
-          <w:ilvl w:val="0"/>
-          <w:numId w:val="7"/>
-        </w:numPr>
-        <w:pBdr>
-          <w:top w:val="nil"/>
-          <w:left w:val="nil"/>
-          <w:bottom w:val="nil"/>
-          <w:right w:val="nil"/>
-          <w:between w:val="nil"/>
-        </w:pBdr>
-        <w:spacing w:after="0" w:line="276" w:lineRule="auto"/>
-        <w:jc w:val="both"/>
-        <w:rPr>
-          <w:rFonts w:ascii="Times New Roman" w:eastAsia="Times New Roman" w:hAnsi="Times New Roman" w:cs="Times New Roman"/>
-          <w:color w:val="000000"/>
-          <w:sz w:val="24"/>
-          <w:szCs w:val="24"/>
-        </w:rPr>
-      </w:pPr>
+        <w:t xml:space="preserve"> </w:t>
+      </w:r>
       <w:r>
         <w:rPr>
           <w:rFonts w:ascii="Times New Roman" w:eastAsia="Times New Roman" w:hAnsi="Times New Roman" w:cs="Times New Roman"/>
@@ -2072,8 +1974,8 @@
           <w:b/>
         </w:rPr>
       </w:pPr>
-      <w:bookmarkStart w:id="2" w:name="_heading=h.3znysh7" w:colFirst="0" w:colLast="0"/>
-      <w:bookmarkEnd w:id="2"/>
+      <w:bookmarkStart w:id="1" w:name="_heading=h.3znysh7" w:colFirst="0" w:colLast="0"/>
+      <w:bookmarkEnd w:id="1"/>
       <w:r>
         <w:rPr>
           <w:b/>
@@ -2664,19 +2566,8 @@
           </w:r>
           <w:r>
             <w:rPr>
-              <w:rFonts w:ascii="Times New Roman" w:eastAsia="Times New Roman" w:hAnsi="Times New Roman" w:cs="Times New Roman"/>
-              <w:color w:val="000000"/>
-              <w:sz w:val="24"/>
-              <w:szCs w:val="24"/>
+              <w:noProof/>
             </w:rPr>
-            <w:t>Latar Belakang</w:t>
-          </w:r>
-          <w:r>
-            <w:rPr>
-              <w:rFonts w:ascii="Times New Roman" w:eastAsia="Times New Roman" w:hAnsi="Times New Roman" w:cs="Times New Roman"/>
-              <w:color w:val="000000"/>
-            </w:rPr>
-            <w:tab/>
             <w:t>1</w:t>
           </w:r>
           <w:r>
@@ -2734,19 +2625,8 @@
           </w:r>
           <w:r>
             <w:rPr>
-              <w:rFonts w:ascii="Times New Roman" w:eastAsia="Times New Roman" w:hAnsi="Times New Roman" w:cs="Times New Roman"/>
-              <w:color w:val="000000"/>
-              <w:sz w:val="24"/>
-              <w:szCs w:val="24"/>
+              <w:noProof/>
             </w:rPr>
-            <w:t>Rumusan Masalah</w:t>
-          </w:r>
-          <w:r>
-            <w:rPr>
-              <w:rFonts w:ascii="Times New Roman" w:eastAsia="Times New Roman" w:hAnsi="Times New Roman" w:cs="Times New Roman"/>
-              <w:color w:val="000000"/>
-            </w:rPr>
-            <w:tab/>
             <w:t>1</w:t>
           </w:r>
           <w:r>
@@ -2804,19 +2684,8 @@
           </w:r>
           <w:r>
             <w:rPr>
-              <w:rFonts w:ascii="Times New Roman" w:eastAsia="Times New Roman" w:hAnsi="Times New Roman" w:cs="Times New Roman"/>
-              <w:color w:val="000000"/>
-              <w:sz w:val="24"/>
-              <w:szCs w:val="24"/>
+              <w:noProof/>
             </w:rPr>
-            <w:t>Batasan Masalah</w:t>
-          </w:r>
-          <w:r>
-            <w:rPr>
-              <w:rFonts w:ascii="Times New Roman" w:eastAsia="Times New Roman" w:hAnsi="Times New Roman" w:cs="Times New Roman"/>
-              <w:color w:val="000000"/>
-            </w:rPr>
-            <w:tab/>
             <w:t>1</w:t>
           </w:r>
           <w:r>
@@ -2874,19 +2743,8 @@
           </w:r>
           <w:r>
             <w:rPr>
-              <w:rFonts w:ascii="Times New Roman" w:eastAsia="Times New Roman" w:hAnsi="Times New Roman" w:cs="Times New Roman"/>
-              <w:color w:val="000000"/>
-              <w:sz w:val="24"/>
-              <w:szCs w:val="24"/>
+              <w:noProof/>
             </w:rPr>
-            <w:t>Tujuan Penelitian</w:t>
-          </w:r>
-          <w:r>
-            <w:rPr>
-              <w:rFonts w:ascii="Times New Roman" w:eastAsia="Times New Roman" w:hAnsi="Times New Roman" w:cs="Times New Roman"/>
-              <w:color w:val="000000"/>
-            </w:rPr>
-            <w:tab/>
             <w:t>1</w:t>
           </w:r>
           <w:r>
@@ -2944,19 +2802,8 @@
           </w:r>
           <w:r>
             <w:rPr>
-              <w:rFonts w:ascii="Times New Roman" w:eastAsia="Times New Roman" w:hAnsi="Times New Roman" w:cs="Times New Roman"/>
-              <w:color w:val="000000"/>
-              <w:sz w:val="24"/>
-              <w:szCs w:val="24"/>
+              <w:noProof/>
             </w:rPr>
-            <w:t>Manfaat Penelitian</w:t>
-          </w:r>
-          <w:r>
-            <w:rPr>
-              <w:rFonts w:ascii="Times New Roman" w:eastAsia="Times New Roman" w:hAnsi="Times New Roman" w:cs="Times New Roman"/>
-              <w:color w:val="000000"/>
-            </w:rPr>
-            <w:tab/>
             <w:t>2</w:t>
           </w:r>
           <w:r>
@@ -3017,19 +2864,8 @@
           </w:r>
           <w:r>
             <w:rPr>
-              <w:rFonts w:ascii="Times New Roman" w:eastAsia="Times New Roman" w:hAnsi="Times New Roman" w:cs="Times New Roman"/>
-              <w:color w:val="000000"/>
-              <w:sz w:val="24"/>
-              <w:szCs w:val="24"/>
+              <w:noProof/>
             </w:rPr>
-            <w:t>Kontribusi Penelitian</w:t>
-          </w:r>
-          <w:r>
-            <w:rPr>
-              <w:rFonts w:ascii="Times New Roman" w:eastAsia="Times New Roman" w:hAnsi="Times New Roman" w:cs="Times New Roman"/>
-              <w:color w:val="000000"/>
-            </w:rPr>
-            <w:tab/>
             <w:t>2</w:t>
           </w:r>
           <w:r>
@@ -3150,19 +2986,8 @@
           </w:r>
           <w:r>
             <w:rPr>
-              <w:rFonts w:ascii="Times New Roman" w:eastAsia="Times New Roman" w:hAnsi="Times New Roman" w:cs="Times New Roman"/>
-              <w:color w:val="000000"/>
-              <w:sz w:val="24"/>
-              <w:szCs w:val="24"/>
+              <w:noProof/>
             </w:rPr>
-            <w:t>Penelitian Terkait</w:t>
-          </w:r>
-          <w:r>
-            <w:rPr>
-              <w:rFonts w:ascii="Times New Roman" w:eastAsia="Times New Roman" w:hAnsi="Times New Roman" w:cs="Times New Roman"/>
-              <w:color w:val="000000"/>
-            </w:rPr>
-            <w:tab/>
             <w:t>3</w:t>
           </w:r>
           <w:r>
@@ -3220,19 +3045,8 @@
           </w:r>
           <w:r>
             <w:rPr>
-              <w:rFonts w:ascii="Times New Roman" w:eastAsia="Times New Roman" w:hAnsi="Times New Roman" w:cs="Times New Roman"/>
-              <w:color w:val="000000"/>
-              <w:sz w:val="24"/>
-              <w:szCs w:val="24"/>
+              <w:noProof/>
             </w:rPr>
-            <w:t>Teori Pendukung</w:t>
-          </w:r>
-          <w:r>
-            <w:rPr>
-              <w:rFonts w:ascii="Times New Roman" w:eastAsia="Times New Roman" w:hAnsi="Times New Roman" w:cs="Times New Roman"/>
-              <w:color w:val="000000"/>
-            </w:rPr>
-            <w:tab/>
             <w:t>5</w:t>
           </w:r>
           <w:r>
@@ -3290,19 +3104,8 @@
           </w:r>
           <w:r>
             <w:rPr>
-              <w:rFonts w:ascii="Times New Roman" w:eastAsia="Times New Roman" w:hAnsi="Times New Roman" w:cs="Times New Roman"/>
-              <w:color w:val="000000"/>
-              <w:sz w:val="24"/>
-              <w:szCs w:val="24"/>
+              <w:noProof/>
             </w:rPr>
-            <w:t>Teori Pendukung</w:t>
-          </w:r>
-          <w:r>
-            <w:rPr>
-              <w:rFonts w:ascii="Times New Roman" w:eastAsia="Times New Roman" w:hAnsi="Times New Roman" w:cs="Times New Roman"/>
-              <w:color w:val="000000"/>
-            </w:rPr>
-            <w:tab/>
             <w:t>5</w:t>
           </w:r>
           <w:r>
@@ -3366,22 +3169,8 @@
           </w:r>
           <w:r>
             <w:rPr>
-              <w:rFonts w:ascii="Times New Roman" w:eastAsia="Times New Roman" w:hAnsi="Times New Roman" w:cs="Times New Roman"/>
-              <w:color w:val="000000"/>
-              <w:sz w:val="24"/>
-              <w:szCs w:val="24"/>
+              <w:noProof/>
             </w:rPr>
-            <w:t>Teori Pendukung Sub BAB</w:t>
-          </w:r>
-          <w:r>
-            <w:rPr>
-              <w:rFonts w:ascii="Times New Roman" w:eastAsia="Times New Roman" w:hAnsi="Times New Roman" w:cs="Times New Roman"/>
-              <w:b/>
-              <w:color w:val="000000"/>
-              <w:sz w:val="24"/>
-              <w:szCs w:val="24"/>
-            </w:rPr>
-            <w:tab/>
             <w:t>5</w:t>
           </w:r>
           <w:r>
@@ -3490,19 +3279,8 @@
           </w:r>
           <w:r>
             <w:rPr>
-              <w:rFonts w:ascii="Times New Roman" w:eastAsia="Times New Roman" w:hAnsi="Times New Roman" w:cs="Times New Roman"/>
-              <w:color w:val="000000"/>
-              <w:sz w:val="24"/>
-              <w:szCs w:val="24"/>
+              <w:noProof/>
             </w:rPr>
-            <w:t>Teori Pendukung</w:t>
-          </w:r>
-          <w:r>
-            <w:rPr>
-              <w:rFonts w:ascii="Times New Roman" w:eastAsia="Times New Roman" w:hAnsi="Times New Roman" w:cs="Times New Roman"/>
-              <w:color w:val="000000"/>
-            </w:rPr>
-            <w:tab/>
             <w:t>5</w:t>
           </w:r>
           <w:r>
@@ -3623,19 +3401,8 @@
           </w:r>
           <w:r>
             <w:rPr>
-              <w:rFonts w:ascii="Times New Roman" w:eastAsia="Times New Roman" w:hAnsi="Times New Roman" w:cs="Times New Roman"/>
-              <w:color w:val="000000"/>
-              <w:sz w:val="24"/>
-              <w:szCs w:val="24"/>
+              <w:noProof/>
             </w:rPr>
-            <w:t>Tahapan Pelaksanaan Penelitian</w:t>
-          </w:r>
-          <w:r>
-            <w:rPr>
-              <w:rFonts w:ascii="Times New Roman" w:eastAsia="Times New Roman" w:hAnsi="Times New Roman" w:cs="Times New Roman"/>
-              <w:color w:val="000000"/>
-            </w:rPr>
-            <w:tab/>
             <w:t>7</w:t>
           </w:r>
           <w:r>
@@ -3693,19 +3460,8 @@
           </w:r>
           <w:r>
             <w:rPr>
-              <w:rFonts w:ascii="Times New Roman" w:eastAsia="Times New Roman" w:hAnsi="Times New Roman" w:cs="Times New Roman"/>
-              <w:color w:val="000000"/>
-              <w:sz w:val="24"/>
-              <w:szCs w:val="24"/>
+              <w:noProof/>
             </w:rPr>
-            <w:t>Pengumpulan Data</w:t>
-          </w:r>
-          <w:r>
-            <w:rPr>
-              <w:rFonts w:ascii="Times New Roman" w:eastAsia="Times New Roman" w:hAnsi="Times New Roman" w:cs="Times New Roman"/>
-              <w:color w:val="000000"/>
-            </w:rPr>
-            <w:tab/>
             <w:t>7</w:t>
           </w:r>
           <w:r>
@@ -3763,19 +3519,8 @@
           </w:r>
           <w:r>
             <w:rPr>
-              <w:rFonts w:ascii="Times New Roman" w:eastAsia="Times New Roman" w:hAnsi="Times New Roman" w:cs="Times New Roman"/>
-              <w:color w:val="000000"/>
-              <w:sz w:val="24"/>
-              <w:szCs w:val="24"/>
+              <w:noProof/>
             </w:rPr>
-            <w:t>Perancangan Data</w:t>
-          </w:r>
-          <w:r>
-            <w:rPr>
-              <w:rFonts w:ascii="Times New Roman" w:eastAsia="Times New Roman" w:hAnsi="Times New Roman" w:cs="Times New Roman"/>
-              <w:color w:val="000000"/>
-            </w:rPr>
-            <w:tab/>
             <w:t>7</w:t>
           </w:r>
           <w:r>
@@ -3833,19 +3578,8 @@
           </w:r>
           <w:r>
             <w:rPr>
-              <w:rFonts w:ascii="Times New Roman" w:eastAsia="Times New Roman" w:hAnsi="Times New Roman" w:cs="Times New Roman"/>
-              <w:color w:val="000000"/>
-              <w:sz w:val="24"/>
-              <w:szCs w:val="24"/>
+              <w:noProof/>
             </w:rPr>
-            <w:t>Perancangan Proses/Algoritma</w:t>
-          </w:r>
-          <w:r>
-            <w:rPr>
-              <w:rFonts w:ascii="Times New Roman" w:eastAsia="Times New Roman" w:hAnsi="Times New Roman" w:cs="Times New Roman"/>
-              <w:color w:val="000000"/>
-            </w:rPr>
-            <w:tab/>
             <w:t>7</w:t>
           </w:r>
           <w:r>
@@ -3903,19 +3637,8 @@
           </w:r>
           <w:r>
             <w:rPr>
-              <w:rFonts w:ascii="Times New Roman" w:eastAsia="Times New Roman" w:hAnsi="Times New Roman" w:cs="Times New Roman"/>
-              <w:color w:val="000000"/>
-              <w:sz w:val="24"/>
-              <w:szCs w:val="24"/>
+              <w:noProof/>
             </w:rPr>
-            <w:t>Perancangan Tampilan</w:t>
-          </w:r>
-          <w:r>
-            <w:rPr>
-              <w:rFonts w:ascii="Times New Roman" w:eastAsia="Times New Roman" w:hAnsi="Times New Roman" w:cs="Times New Roman"/>
-              <w:color w:val="000000"/>
-            </w:rPr>
-            <w:tab/>
             <w:t>7</w:t>
           </w:r>
           <w:r>
@@ -3973,19 +3696,8 @@
           </w:r>
           <w:r>
             <w:rPr>
-              <w:rFonts w:ascii="Times New Roman" w:eastAsia="Times New Roman" w:hAnsi="Times New Roman" w:cs="Times New Roman"/>
-              <w:color w:val="000000"/>
-              <w:sz w:val="24"/>
-              <w:szCs w:val="24"/>
+              <w:noProof/>
             </w:rPr>
-            <w:t>Perancangan Pengujian</w:t>
-          </w:r>
-          <w:r>
-            <w:rPr>
-              <w:rFonts w:ascii="Times New Roman" w:eastAsia="Times New Roman" w:hAnsi="Times New Roman" w:cs="Times New Roman"/>
-              <w:color w:val="000000"/>
-            </w:rPr>
-            <w:tab/>
             <w:t>7</w:t>
           </w:r>
           <w:r>
@@ -4046,20 +3758,9 @@
           </w:r>
           <w:r>
             <w:rPr>
-              <w:rFonts w:ascii="Times New Roman" w:eastAsia="Times New Roman" w:hAnsi="Times New Roman" w:cs="Times New Roman"/>
-              <w:color w:val="000000"/>
-              <w:sz w:val="24"/>
-              <w:szCs w:val="24"/>
+              <w:noProof/>
             </w:rPr>
-            <w:t>Waktu dan Tempat Penelitian</w:t>
-          </w:r>
-          <w:r>
-            <w:rPr>
-              <w:rFonts w:ascii="Times New Roman" w:eastAsia="Times New Roman" w:hAnsi="Times New Roman" w:cs="Times New Roman"/>
-              <w:color w:val="000000"/>
-            </w:rPr>
-            <w:tab/>
-            <w:t>8</w:t>
+            <w:t>7</w:t>
           </w:r>
           <w:r>
             <w:fldChar w:fldCharType="end"/>
@@ -4253,8 +3954,8 @@
           <w:szCs w:val="28"/>
         </w:rPr>
       </w:pPr>
-      <w:bookmarkStart w:id="3" w:name="_heading=h.2et92p0" w:colFirst="0" w:colLast="0"/>
-      <w:bookmarkEnd w:id="3"/>
+      <w:bookmarkStart w:id="2" w:name="_heading=h.2et92p0" w:colFirst="0" w:colLast="0"/>
+      <w:bookmarkEnd w:id="2"/>
       <w:r>
         <w:rPr>
           <w:b/>
@@ -4504,8 +4205,8 @@
           <w:szCs w:val="28"/>
         </w:rPr>
       </w:pPr>
-      <w:bookmarkStart w:id="4" w:name="_heading=h.tyjcwt" w:colFirst="0" w:colLast="0"/>
-      <w:bookmarkEnd w:id="4"/>
+      <w:bookmarkStart w:id="3" w:name="_heading=h.tyjcwt" w:colFirst="0" w:colLast="0"/>
+      <w:bookmarkEnd w:id="3"/>
       <w:r>
         <w:rPr>
           <w:b/>
@@ -4787,8 +4488,8 @@
           <w:szCs w:val="28"/>
         </w:rPr>
       </w:pPr>
-      <w:bookmarkStart w:id="5" w:name="_heading=h.3dy6vkm" w:colFirst="0" w:colLast="0"/>
-      <w:bookmarkEnd w:id="5"/>
+      <w:bookmarkStart w:id="4" w:name="_heading=h.3dy6vkm" w:colFirst="0" w:colLast="0"/>
+      <w:bookmarkEnd w:id="4"/>
       <w:r>
         <w:rPr>
           <w:b/>
@@ -4957,8 +4658,8 @@
           <w:szCs w:val="28"/>
         </w:rPr>
       </w:pPr>
-      <w:bookmarkStart w:id="6" w:name="_heading=h.1t3h5sf" w:colFirst="0" w:colLast="0"/>
-      <w:bookmarkEnd w:id="6"/>
+      <w:bookmarkStart w:id="5" w:name="_heading=h.1t3h5sf" w:colFirst="0" w:colLast="0"/>
+      <w:bookmarkEnd w:id="5"/>
       <w:r>
         <w:rPr>
           <w:b/>
@@ -5047,8 +4748,8 @@
           <w:szCs w:val="28"/>
         </w:rPr>
       </w:pPr>
-      <w:bookmarkStart w:id="7" w:name="_heading=h.4d34og8" w:colFirst="0" w:colLast="0"/>
-      <w:bookmarkEnd w:id="7"/>
+      <w:bookmarkStart w:id="6" w:name="_heading=h.4d34og8" w:colFirst="0" w:colLast="0"/>
+      <w:bookmarkEnd w:id="6"/>
       <w:r>
         <w:rPr>
           <w:b/>
@@ -5145,8 +4846,8 @@
           <w:szCs w:val="24"/>
         </w:rPr>
         <w:sectPr>
-          <w:headerReference w:type="default" r:id="rId15"/>
-          <w:footerReference w:type="default" r:id="rId16"/>
+          <w:headerReference w:type="default" r:id="rId12"/>
+          <w:footerReference w:type="default" r:id="rId13"/>
           <w:type w:val="continuous"/>
           <w:pgSz w:w="11907" w:h="16839"/>
           <w:pgMar w:top="1985" w:right="1418" w:bottom="1418" w:left="1985" w:header="0" w:footer="1134" w:gutter="0"/>
@@ -5178,8 +4879,8 @@
           <w:szCs w:val="28"/>
         </w:rPr>
       </w:pPr>
-      <w:bookmarkStart w:id="8" w:name="_heading=h.2s8eyo1" w:colFirst="0" w:colLast="0"/>
-      <w:bookmarkEnd w:id="8"/>
+      <w:bookmarkStart w:id="7" w:name="_heading=h.2s8eyo1" w:colFirst="0" w:colLast="0"/>
+      <w:bookmarkEnd w:id="7"/>
       <w:r>
         <w:rPr>
           <w:b/>
@@ -5210,8 +4911,8 @@
           <w:szCs w:val="24"/>
         </w:rPr>
       </w:pPr>
-      <w:bookmarkStart w:id="9" w:name="_heading=h.17dp8vu" w:colFirst="0" w:colLast="0"/>
-      <w:bookmarkEnd w:id="9"/>
+      <w:bookmarkStart w:id="8" w:name="_heading=h.17dp8vu" w:colFirst="0" w:colLast="0"/>
+      <w:bookmarkEnd w:id="8"/>
       <w:r>
         <w:rPr>
           <w:rFonts w:ascii="Times New Roman" w:eastAsia="Times New Roman" w:hAnsi="Times New Roman" w:cs="Times New Roman"/>
@@ -5256,8 +4957,8 @@
           <w:sz w:val="26"/>
         </w:rPr>
       </w:pPr>
-      <w:bookmarkStart w:id="10" w:name="_heading=h.3rdcrjn" w:colFirst="0" w:colLast="0"/>
-      <w:bookmarkEnd w:id="10"/>
+      <w:bookmarkStart w:id="9" w:name="_heading=h.3rdcrjn" w:colFirst="0" w:colLast="0"/>
+      <w:bookmarkEnd w:id="9"/>
       <w:r>
         <w:rPr>
           <w:sz w:val="26"/>
@@ -5280,8 +4981,8 @@
           <w:szCs w:val="24"/>
         </w:rPr>
       </w:pPr>
-      <w:bookmarkStart w:id="11" w:name="_heading=h.26in1rg" w:colFirst="0" w:colLast="0"/>
-      <w:bookmarkEnd w:id="11"/>
+      <w:bookmarkStart w:id="10" w:name="_heading=h.26in1rg" w:colFirst="0" w:colLast="0"/>
+      <w:bookmarkEnd w:id="10"/>
       <w:r>
         <w:rPr>
           <w:rFonts w:ascii="Times New Roman" w:eastAsia="Times New Roman" w:hAnsi="Times New Roman" w:cs="Times New Roman"/>
@@ -5352,24 +5053,249 @@
           <w:sz w:val="24"/>
           <w:szCs w:val="24"/>
         </w:rPr>
-        <w:t>Oleh sebab itu, penelitian ini mengangkat judul “……………………………………” menggunakan teknik/metode</w:t>
-      </w:r>
-      <w:r>
-        <w:rPr>
-          <w:rFonts w:ascii="Times New Roman" w:eastAsia="Times New Roman" w:hAnsi="Times New Roman" w:cs="Times New Roman"/>
-          <w:i/>
-          <w:sz w:val="24"/>
-          <w:szCs w:val="24"/>
-        </w:rPr>
-        <w:t xml:space="preserve"> </w:t>
-      </w:r>
-      <w:r>
-        <w:rPr>
-          <w:rFonts w:ascii="Times New Roman" w:eastAsia="Times New Roman" w:hAnsi="Times New Roman" w:cs="Times New Roman"/>
-          <w:sz w:val="24"/>
-          <w:szCs w:val="24"/>
-        </w:rPr>
-        <w:t>………………………….. pada ……………………. Hal ini bertujuan agar dapat ……………………………………</w:t>
+        <w:t>Infrastruktur jalan merupakan komponen penting dalam pembangunan regional karena berperan penting dalam mendukung mobilitas masyarakat, distribusi barang, dan pertumbuhan ekonomi. Infrastruktur jalan yang berkualitas baik tidak hanya meningkatkan efisiensi transportasi, tetapi juga memiliki dampak langsung terhadap keselamatan pengguna jalan. Sebaliknya, jalan yang rusak dapat menyebabkan kerugian ekonomi, menghambat aktivitas masyarakat, dan meningkatkan risiko kecelakaan lalu lintas.</w:t>
+      </w:r>
+    </w:p>
+    <w:p>
+      <w:pPr>
+        <w:spacing w:after="0" w:line="360" w:lineRule="auto"/>
+        <w:ind w:firstLine="567"/>
+        <w:jc w:val="both"/>
+        <w:rPr>
+          <w:rFonts w:ascii="Times New Roman" w:eastAsia="Times New Roman" w:hAnsi="Times New Roman" w:cs="Times New Roman"/>
+          <w:sz w:val="24"/>
+          <w:szCs w:val="24"/>
+        </w:rPr>
+      </w:pPr>
+    </w:p>
+    <w:p>
+      <w:pPr>
+        <w:spacing w:after="0" w:line="360" w:lineRule="auto"/>
+        <w:ind w:firstLine="567"/>
+        <w:jc w:val="both"/>
+        <w:rPr>
+          <w:rFonts w:ascii="Times New Roman" w:eastAsia="Times New Roman" w:hAnsi="Times New Roman" w:cs="Times New Roman"/>
+          <w:sz w:val="24"/>
+          <w:szCs w:val="24"/>
+        </w:rPr>
+      </w:pPr>
+      <w:r>
+        <w:rPr>
+          <w:rFonts w:ascii="Times New Roman" w:eastAsia="Times New Roman" w:hAnsi="Times New Roman" w:cs="Times New Roman"/>
+          <w:sz w:val="24"/>
+          <w:szCs w:val="24"/>
+        </w:rPr>
+        <w:t>Di berbagai wilayah, termasuk Kota Samarinda, masalah kerusakan jalan tetap menjadi perhatian serius. Faktor-faktor seperti beban kendaraan yang berlebihan, kondisi cuaca ekstrem, dan pemeliharaan yang tidak teratur sering mempercepat kerusakan. Bentuk kerusakan yang umum meliputi retakan pada permukaan jalan, lubang jalan, dan permukaan jalan yang tidak rata. Jika kerusakan ini tidak ditangani segera, kualitas jalan akan terus menurun dan biaya perbaikan di masa depan akan lebih tinggi.</w:t>
+      </w:r>
+    </w:p>
+    <w:p>
+      <w:pPr>
+        <w:spacing w:after="0" w:line="360" w:lineRule="auto"/>
+        <w:ind w:firstLine="567"/>
+        <w:jc w:val="both"/>
+        <w:rPr>
+          <w:rFonts w:ascii="Times New Roman" w:eastAsia="Times New Roman" w:hAnsi="Times New Roman" w:cs="Times New Roman"/>
+          <w:sz w:val="24"/>
+          <w:szCs w:val="24"/>
+        </w:rPr>
+      </w:pPr>
+    </w:p>
+    <w:p>
+      <w:pPr>
+        <w:spacing w:after="0" w:line="360" w:lineRule="auto"/>
+        <w:ind w:firstLine="567"/>
+        <w:jc w:val="both"/>
+        <w:rPr>
+          <w:rFonts w:ascii="Times New Roman" w:eastAsia="Times New Roman" w:hAnsi="Times New Roman" w:cs="Times New Roman"/>
+          <w:sz w:val="24"/>
+          <w:szCs w:val="24"/>
+        </w:rPr>
+      </w:pPr>
+      <w:r>
+        <w:rPr>
+          <w:rFonts w:ascii="Times New Roman" w:eastAsia="Times New Roman" w:hAnsi="Times New Roman" w:cs="Times New Roman"/>
+          <w:sz w:val="24"/>
+          <w:szCs w:val="24"/>
+        </w:rPr>
+        <w:t xml:space="preserve">Hingga saat ini, proses pelaporan kerusakan jalan oleh masyarakat umumnya dilakukan secara manual melalui formulir online seperti Google Forms. Meskipun praktis, metode ini memiliki beberapa keterbatasan, termasuk ketidakhadiran sistem validasi otomatis untuk foto yang dikirimkan, kesulitan dalam pengelolaan data, dan kurangnya transparansi antara masyarakat dan lembaga terkait. Untuk mengatasi masalah ini, dikembangkan sistem pelaporan berbasis web bernama Jalan Peduli, yang </w:t>
+      </w:r>
+      <w:r>
+        <w:rPr>
+          <w:rFonts w:ascii="Times New Roman" w:eastAsia="Times New Roman" w:hAnsi="Times New Roman" w:cs="Times New Roman"/>
+          <w:sz w:val="24"/>
+          <w:szCs w:val="24"/>
+        </w:rPr>
+        <w:lastRenderedPageBreak/>
+        <w:t>memungkinkan masyarakat melaporkan kerusakan jalan dengan lebih mudah dan terstruktur.</w:t>
+      </w:r>
+    </w:p>
+    <w:p>
+      <w:pPr>
+        <w:spacing w:after="0" w:line="360" w:lineRule="auto"/>
+        <w:ind w:firstLine="567"/>
+        <w:jc w:val="both"/>
+        <w:rPr>
+          <w:rFonts w:ascii="Times New Roman" w:eastAsia="Times New Roman" w:hAnsi="Times New Roman" w:cs="Times New Roman"/>
+          <w:sz w:val="24"/>
+          <w:szCs w:val="24"/>
+        </w:rPr>
+      </w:pPr>
+    </w:p>
+    <w:p>
+      <w:pPr>
+        <w:spacing w:after="0" w:line="360" w:lineRule="auto"/>
+        <w:ind w:firstLine="567"/>
+        <w:jc w:val="both"/>
+        <w:rPr>
+          <w:rFonts w:ascii="Times New Roman" w:eastAsia="Times New Roman" w:hAnsi="Times New Roman" w:cs="Times New Roman"/>
+          <w:sz w:val="24"/>
+          <w:szCs w:val="24"/>
+        </w:rPr>
+      </w:pPr>
+      <w:r>
+        <w:rPr>
+          <w:rFonts w:ascii="Times New Roman" w:eastAsia="Times New Roman" w:hAnsi="Times New Roman" w:cs="Times New Roman"/>
+          <w:sz w:val="24"/>
+          <w:szCs w:val="24"/>
+        </w:rPr>
+        <w:t>Namun, sistem ini masih memiliki kelemahan pada tahap validasi laporan. Proses verifikasi kondisi jalan masih dilakukan secara manual oleh petugas yang memeriksa foto-foto yang dikirimkan oleh masyarakat satu per satu. Proses ini memakan waktu, rentan terhadap kesalahan manusia, dan tidak efisien pada skala besar. Oleh karena itu, diperlukan teknologi yang dapat secara otomatis dan akurat mengklasifikasikan jenis dan tingkat kerusakan jalan, sehingga mempercepat pengambilan keputusan oleh pihak berwenang.</w:t>
+      </w:r>
+    </w:p>
+    <w:p>
+      <w:pPr>
+        <w:spacing w:after="0" w:line="360" w:lineRule="auto"/>
+        <w:ind w:firstLine="567"/>
+        <w:jc w:val="both"/>
+        <w:rPr>
+          <w:rFonts w:ascii="Times New Roman" w:eastAsia="Times New Roman" w:hAnsi="Times New Roman" w:cs="Times New Roman"/>
+          <w:sz w:val="24"/>
+          <w:szCs w:val="24"/>
+        </w:rPr>
+      </w:pPr>
+    </w:p>
+    <w:p>
+      <w:pPr>
+        <w:spacing w:after="0" w:line="360" w:lineRule="auto"/>
+        <w:ind w:firstLine="567"/>
+        <w:jc w:val="both"/>
+        <w:rPr>
+          <w:rFonts w:ascii="Times New Roman" w:eastAsia="Times New Roman" w:hAnsi="Times New Roman" w:cs="Times New Roman"/>
+          <w:sz w:val="24"/>
+          <w:szCs w:val="24"/>
+        </w:rPr>
+      </w:pPr>
+      <w:r>
+        <w:rPr>
+          <w:rFonts w:ascii="Times New Roman" w:eastAsia="Times New Roman" w:hAnsi="Times New Roman" w:cs="Times New Roman"/>
+          <w:sz w:val="24"/>
+          <w:szCs w:val="24"/>
+        </w:rPr>
+        <w:t>Dalam beberapa tahun terakhir, perkembangan teknologi kecerdasan buatan (AI), khususnya di bidang pemrosesan gambar digital, telah membuka peluang besar dalam mendukung pengelolaan infrastruktur publik. Salah satu pendekatan yang paling populer dan teruji dalam analisis gambar adalah Jaringan Saraf Konvolusional (CNN). CNN mampu mengekstrak fitur visual mendalam dari sebuah gambar dan mengklasifikasikan objek berdasarkan pola visual tertentu. Teknologi ini telah digunakan dalam berbagai bidang seperti deteksi retak beton, identifikasi kondisi jalan, dan analisis permukaan aspal.</w:t>
+      </w:r>
+    </w:p>
+    <w:p>
+      <w:pPr>
+        <w:spacing w:after="0" w:line="360" w:lineRule="auto"/>
+        <w:ind w:firstLine="567"/>
+        <w:jc w:val="both"/>
+        <w:rPr>
+          <w:rFonts w:ascii="Times New Roman" w:eastAsia="Times New Roman" w:hAnsi="Times New Roman" w:cs="Times New Roman"/>
+          <w:sz w:val="24"/>
+          <w:szCs w:val="24"/>
+        </w:rPr>
+      </w:pPr>
+    </w:p>
+    <w:p>
+      <w:pPr>
+        <w:spacing w:after="0" w:line="360" w:lineRule="auto"/>
+        <w:ind w:firstLine="567"/>
+        <w:jc w:val="both"/>
+        <w:rPr>
+          <w:rFonts w:ascii="Times New Roman" w:eastAsia="Times New Roman" w:hAnsi="Times New Roman" w:cs="Times New Roman"/>
+          <w:sz w:val="24"/>
+          <w:szCs w:val="24"/>
+        </w:rPr>
+      </w:pPr>
+      <w:r>
+        <w:rPr>
+          <w:rFonts w:ascii="Times New Roman" w:eastAsia="Times New Roman" w:hAnsi="Times New Roman" w:cs="Times New Roman"/>
+          <w:sz w:val="24"/>
+          <w:szCs w:val="24"/>
+        </w:rPr>
+        <w:t>Dalam konteks penelitian ini, penerapan CNN diharapkan dapat membantu sistem Jalan Peduli dalam mengidentifikasi jenis kerusakan jalan, seperti retak, lubang, atau keausan, serta menentukan tingkat keparahan kerusakan. Dengan demikian, sistem tidak hanya berfungsi sebagai alat pelaporan tetapi juga sebagai alat analitis yang mendukung validasi data secara otomatis. Hal ini diharapkan dapat meningkatkan kecepatan, akurasi, dan efisiensi proses tindak lanjut perbaikan jalan.</w:t>
+      </w:r>
+    </w:p>
+    <w:p>
+      <w:pPr>
+        <w:spacing w:after="0" w:line="360" w:lineRule="auto"/>
+        <w:ind w:firstLine="567"/>
+        <w:jc w:val="both"/>
+        <w:rPr>
+          <w:rFonts w:ascii="Times New Roman" w:eastAsia="Times New Roman" w:hAnsi="Times New Roman" w:cs="Times New Roman"/>
+          <w:sz w:val="24"/>
+          <w:szCs w:val="24"/>
+        </w:rPr>
+      </w:pPr>
+    </w:p>
+    <w:p>
+      <w:pPr>
+        <w:spacing w:after="0" w:line="360" w:lineRule="auto"/>
+        <w:ind w:firstLine="567"/>
+        <w:jc w:val="both"/>
+        <w:rPr>
+          <w:rFonts w:ascii="Times New Roman" w:eastAsia="Times New Roman" w:hAnsi="Times New Roman" w:cs="Times New Roman"/>
+          <w:sz w:val="24"/>
+          <w:szCs w:val="24"/>
+        </w:rPr>
+      </w:pPr>
+      <w:r>
+        <w:rPr>
+          <w:rFonts w:ascii="Times New Roman" w:eastAsia="Times New Roman" w:hAnsi="Times New Roman" w:cs="Times New Roman"/>
+          <w:sz w:val="24"/>
+          <w:szCs w:val="24"/>
+        </w:rPr>
+        <w:t xml:space="preserve">Selain itu, penelitian ini dilakukan menggunakan dataset lokal, yaitu foto-foto kondisi jalan yang dikumpulkan secara manual di wilayah Kota Samarinda. Pendekatan ini dipilih karena kondisi jalan di setiap wilayah memiliki karakteristik yang berbeda, baik dari segi tekstur permukaan, pencahayaan, maupun pola kerusakan. Dengan </w:t>
+      </w:r>
+      <w:r>
+        <w:rPr>
+          <w:rFonts w:ascii="Times New Roman" w:eastAsia="Times New Roman" w:hAnsi="Times New Roman" w:cs="Times New Roman"/>
+          <w:sz w:val="24"/>
+          <w:szCs w:val="24"/>
+        </w:rPr>
+        <w:lastRenderedPageBreak/>
+        <w:t>menggunakan data lokal, model CNN yang dikembangkan akan lebih adaptif dan relevan dengan kondisi nyata di lapangan, sehingga hasil klasifikasi dapat diterapkan secara lebih efektif di lingkungan lokal.</w:t>
+      </w:r>
+    </w:p>
+    <w:p>
+      <w:pPr>
+        <w:spacing w:after="0" w:line="360" w:lineRule="auto"/>
+        <w:ind w:firstLine="567"/>
+        <w:jc w:val="both"/>
+        <w:rPr>
+          <w:rFonts w:ascii="Times New Roman" w:eastAsia="Times New Roman" w:hAnsi="Times New Roman" w:cs="Times New Roman"/>
+          <w:sz w:val="24"/>
+          <w:szCs w:val="24"/>
+        </w:rPr>
+      </w:pPr>
+    </w:p>
+    <w:p>
+      <w:pPr>
+        <w:spacing w:after="0" w:line="360" w:lineRule="auto"/>
+        <w:ind w:firstLine="567"/>
+        <w:jc w:val="both"/>
+        <w:rPr>
+          <w:rFonts w:ascii="Times New Roman" w:eastAsia="Times New Roman" w:hAnsi="Times New Roman" w:cs="Times New Roman"/>
+          <w:sz w:val="24"/>
+          <w:szCs w:val="24"/>
+        </w:rPr>
+      </w:pPr>
+      <w:r>
+        <w:rPr>
+          <w:rFonts w:ascii="Times New Roman" w:eastAsia="Times New Roman" w:hAnsi="Times New Roman" w:cs="Times New Roman"/>
+          <w:sz w:val="24"/>
+          <w:szCs w:val="24"/>
+        </w:rPr>
+        <w:t>Secara keseluruhan, penelitian ini bertujuan untuk mengembangkan sistem klasifikasi jenis dan tingkat kerusakan jalan menggunakan metode CNN sebagai bagian dari pengembangan Jalan Peduli. Hasil penelitian ini diharapkan dapat berkontribusi pada pengembangan teknologi manajemen infrastruktur cerdas dan menjadi acuan untuk penelitian lebih lanjut di bidang kecerdasan buatan dan pemrosesan gambar digital untuk pengembangan regional yang lebih berkelanjutan.</w:t>
       </w:r>
     </w:p>
     <w:p>
@@ -5397,8 +5323,8 @@
           <w:sz w:val="26"/>
         </w:rPr>
       </w:pPr>
-      <w:bookmarkStart w:id="12" w:name="_heading=h.lnxbz9" w:colFirst="0" w:colLast="0"/>
-      <w:bookmarkEnd w:id="12"/>
+      <w:bookmarkStart w:id="11" w:name="_heading=h.lnxbz9" w:colFirst="0" w:colLast="0"/>
+      <w:bookmarkEnd w:id="11"/>
       <w:r>
         <w:rPr>
           <w:sz w:val="26"/>
@@ -5468,8 +5394,8 @@
           <w:sz w:val="26"/>
         </w:rPr>
       </w:pPr>
-      <w:bookmarkStart w:id="13" w:name="_heading=h.35nkun2" w:colFirst="0" w:colLast="0"/>
-      <w:bookmarkEnd w:id="13"/>
+      <w:bookmarkStart w:id="12" w:name="_heading=h.35nkun2" w:colFirst="0" w:colLast="0"/>
+      <w:bookmarkEnd w:id="12"/>
       <w:r>
         <w:rPr>
           <w:sz w:val="26"/>
@@ -5589,8 +5515,8 @@
           <w:sz w:val="26"/>
         </w:rPr>
       </w:pPr>
-      <w:bookmarkStart w:id="14" w:name="_heading=h.1ksv4uv" w:colFirst="0" w:colLast="0"/>
-      <w:bookmarkEnd w:id="14"/>
+      <w:bookmarkStart w:id="13" w:name="_heading=h.1ksv4uv" w:colFirst="0" w:colLast="0"/>
+      <w:bookmarkEnd w:id="13"/>
       <w:r>
         <w:rPr>
           <w:sz w:val="26"/>
@@ -5649,13 +5575,12 @@
           <w:sz w:val="26"/>
         </w:rPr>
       </w:pPr>
-      <w:bookmarkStart w:id="15" w:name="_heading=h.44sinio" w:colFirst="0" w:colLast="0"/>
-      <w:bookmarkEnd w:id="15"/>
+      <w:bookmarkStart w:id="14" w:name="_heading=h.44sinio" w:colFirst="0" w:colLast="0"/>
+      <w:bookmarkEnd w:id="14"/>
       <w:r>
         <w:rPr>
           <w:sz w:val="26"/>
         </w:rPr>
-        <w:lastRenderedPageBreak/>
         <w:t>Manfaat Penelitian</w:t>
       </w:r>
     </w:p>
@@ -5706,6 +5631,7 @@
           <w:sz w:val="24"/>
           <w:szCs w:val="24"/>
         </w:rPr>
+        <w:lastRenderedPageBreak/>
         <w:t>1.</w:t>
       </w:r>
       <w:r>
@@ -5852,8 +5778,8 @@
           <w:sz w:val="26"/>
         </w:rPr>
       </w:pPr>
-      <w:bookmarkStart w:id="16" w:name="_heading=h.2jxsxqh" w:colFirst="0" w:colLast="0"/>
-      <w:bookmarkEnd w:id="16"/>
+      <w:bookmarkStart w:id="15" w:name="_heading=h.2jxsxqh" w:colFirst="0" w:colLast="0"/>
+      <w:bookmarkEnd w:id="15"/>
       <w:r>
         <w:rPr>
           <w:sz w:val="26"/>
@@ -5891,8 +5817,8 @@
           <w:szCs w:val="24"/>
         </w:rPr>
         <w:sectPr>
-          <w:headerReference w:type="default" r:id="rId17"/>
-          <w:footerReference w:type="default" r:id="rId18"/>
+          <w:headerReference w:type="default" r:id="rId14"/>
+          <w:footerReference w:type="default" r:id="rId15"/>
           <w:type w:val="continuous"/>
           <w:pgSz w:w="11907" w:h="16839"/>
           <w:pgMar w:top="1985" w:right="1418" w:bottom="1418" w:left="1985" w:header="0" w:footer="1134" w:gutter="0"/>
@@ -5900,8 +5826,8 @@
           <w:cols w:space="720"/>
         </w:sectPr>
       </w:pPr>
-      <w:bookmarkStart w:id="17" w:name="_heading=h.z337ya" w:colFirst="0" w:colLast="0"/>
-      <w:bookmarkEnd w:id="17"/>
+      <w:bookmarkStart w:id="16" w:name="_heading=h.z337ya" w:colFirst="0" w:colLast="0"/>
+      <w:bookmarkEnd w:id="16"/>
       <w:r>
         <w:rPr>
           <w:rFonts w:ascii="Times New Roman" w:eastAsia="Times New Roman" w:hAnsi="Times New Roman" w:cs="Times New Roman"/>
@@ -5993,8 +5919,8 @@
           <w:sz w:val="26"/>
         </w:rPr>
       </w:pPr>
-      <w:bookmarkStart w:id="18" w:name="_heading=h.3j2qqm3" w:colFirst="0" w:colLast="0"/>
-      <w:bookmarkEnd w:id="18"/>
+      <w:bookmarkStart w:id="17" w:name="_heading=h.3j2qqm3" w:colFirst="0" w:colLast="0"/>
+      <w:bookmarkEnd w:id="17"/>
       <w:r>
         <w:rPr>
           <w:sz w:val="26"/>
@@ -6567,8 +6493,8 @@
           <w:sz w:val="26"/>
         </w:rPr>
       </w:pPr>
-      <w:bookmarkStart w:id="19" w:name="_heading=h.1y810tw" w:colFirst="0" w:colLast="0"/>
-      <w:bookmarkEnd w:id="19"/>
+      <w:bookmarkStart w:id="18" w:name="_heading=h.1y810tw" w:colFirst="0" w:colLast="0"/>
+      <w:bookmarkEnd w:id="18"/>
       <w:r>
         <w:rPr>
           <w:sz w:val="26"/>
@@ -6777,8 +6703,8 @@
           <w:sz w:val="26"/>
         </w:rPr>
       </w:pPr>
-      <w:bookmarkStart w:id="20" w:name="_heading=h.4i7ojhp" w:colFirst="0" w:colLast="0"/>
-      <w:bookmarkEnd w:id="20"/>
+      <w:bookmarkStart w:id="19" w:name="_heading=h.4i7ojhp" w:colFirst="0" w:colLast="0"/>
+      <w:bookmarkEnd w:id="19"/>
       <w:r>
         <w:rPr>
           <w:sz w:val="26"/>
@@ -6845,8 +6771,8 @@
           <w:color w:val="000000"/>
         </w:rPr>
       </w:pPr>
-      <w:bookmarkStart w:id="21" w:name="_heading=h.2xcytpi" w:colFirst="0" w:colLast="0"/>
-      <w:bookmarkEnd w:id="21"/>
+      <w:bookmarkStart w:id="20" w:name="_heading=h.2xcytpi" w:colFirst="0" w:colLast="0"/>
+      <w:bookmarkEnd w:id="20"/>
       <w:r>
         <w:rPr>
           <w:rFonts w:ascii="Times New Roman" w:eastAsia="Times New Roman" w:hAnsi="Times New Roman" w:cs="Times New Roman"/>
@@ -6908,8 +6834,8 @@
           <w:color w:val="000000"/>
         </w:rPr>
       </w:pPr>
-      <w:bookmarkStart w:id="22" w:name="_heading=h.1ci93xb" w:colFirst="0" w:colLast="0"/>
-      <w:bookmarkEnd w:id="22"/>
+      <w:bookmarkStart w:id="21" w:name="_heading=h.1ci93xb" w:colFirst="0" w:colLast="0"/>
+      <w:bookmarkEnd w:id="21"/>
       <w:r>
         <w:rPr>
           <w:rFonts w:ascii="Times New Roman" w:eastAsia="Times New Roman" w:hAnsi="Times New Roman" w:cs="Times New Roman"/>
@@ -6973,8 +6899,8 @@
           <w:sz w:val="26"/>
         </w:rPr>
       </w:pPr>
-      <w:bookmarkStart w:id="23" w:name="_heading=h.3whwml4" w:colFirst="0" w:colLast="0"/>
-      <w:bookmarkEnd w:id="23"/>
+      <w:bookmarkStart w:id="22" w:name="_heading=h.3whwml4" w:colFirst="0" w:colLast="0"/>
+      <w:bookmarkEnd w:id="22"/>
       <w:r>
         <w:rPr>
           <w:sz w:val="26"/>
@@ -7083,7 +7009,7 @@
                     <pic:cNvPicPr preferRelativeResize="0"/>
                   </pic:nvPicPr>
                   <pic:blipFill>
-                    <a:blip r:embed="rId19"/>
+                    <a:blip r:embed="rId16"/>
                     <a:srcRect/>
                     <a:stretch>
                       <a:fillRect/>
@@ -7156,8 +7082,8 @@
           <w:szCs w:val="24"/>
         </w:rPr>
       </w:pPr>
-      <w:bookmarkStart w:id="24" w:name="_heading=h.2bn6wsx" w:colFirst="0" w:colLast="0"/>
-      <w:bookmarkEnd w:id="24"/>
+      <w:bookmarkStart w:id="23" w:name="_heading=h.2bn6wsx" w:colFirst="0" w:colLast="0"/>
+      <w:bookmarkEnd w:id="23"/>
       <w:r>
         <w:rPr>
           <w:rFonts w:ascii="Times New Roman" w:eastAsia="Times New Roman" w:hAnsi="Times New Roman" w:cs="Times New Roman"/>
@@ -8867,8 +8793,8 @@
           <w:szCs w:val="28"/>
         </w:rPr>
       </w:pPr>
-      <w:bookmarkStart w:id="25" w:name="_heading=h.qsh70q" w:colFirst="0" w:colLast="0"/>
-      <w:bookmarkEnd w:id="25"/>
+      <w:bookmarkStart w:id="24" w:name="_heading=h.qsh70q" w:colFirst="0" w:colLast="0"/>
+      <w:bookmarkEnd w:id="24"/>
     </w:p>
     <w:p/>
     <w:p/>
@@ -8923,8 +8849,8 @@
           <w:szCs w:val="28"/>
         </w:rPr>
       </w:pPr>
-      <w:bookmarkStart w:id="26" w:name="_heading=h.3as4poj" w:colFirst="0" w:colLast="0"/>
-      <w:bookmarkEnd w:id="26"/>
+      <w:bookmarkStart w:id="25" w:name="_heading=h.3as4poj" w:colFirst="0" w:colLast="0"/>
+      <w:bookmarkEnd w:id="25"/>
       <w:r>
         <w:rPr>
           <w:rFonts w:ascii="Times New Roman" w:eastAsia="Times New Roman" w:hAnsi="Times New Roman" w:cs="Times New Roman"/>
@@ -8975,8 +8901,8 @@
           <w:sz w:val="26"/>
         </w:rPr>
       </w:pPr>
-      <w:bookmarkStart w:id="27" w:name="_heading=h.1pxezwc" w:colFirst="0" w:colLast="0"/>
-      <w:bookmarkEnd w:id="27"/>
+      <w:bookmarkStart w:id="26" w:name="_heading=h.1pxezwc" w:colFirst="0" w:colLast="0"/>
+      <w:bookmarkEnd w:id="26"/>
       <w:r>
         <w:rPr>
           <w:sz w:val="26"/>
@@ -9042,8 +8968,8 @@
           <w:sz w:val="26"/>
         </w:rPr>
       </w:pPr>
-      <w:bookmarkStart w:id="28" w:name="_heading=h.49x2ik5" w:colFirst="0" w:colLast="0"/>
-      <w:bookmarkEnd w:id="28"/>
+      <w:bookmarkStart w:id="27" w:name="_heading=h.49x2ik5" w:colFirst="0" w:colLast="0"/>
+      <w:bookmarkEnd w:id="27"/>
       <w:r>
         <w:rPr>
           <w:sz w:val="26"/>
@@ -9110,8 +9036,8 @@
           <w:sz w:val="26"/>
         </w:rPr>
       </w:pPr>
-      <w:bookmarkStart w:id="29" w:name="_heading=h.2p2csry" w:colFirst="0" w:colLast="0"/>
-      <w:bookmarkEnd w:id="29"/>
+      <w:bookmarkStart w:id="28" w:name="_heading=h.2p2csry" w:colFirst="0" w:colLast="0"/>
+      <w:bookmarkEnd w:id="28"/>
       <w:r>
         <w:rPr>
           <w:sz w:val="26"/>
@@ -9173,8 +9099,8 @@
           <w:sz w:val="26"/>
         </w:rPr>
       </w:pPr>
-      <w:bookmarkStart w:id="30" w:name="_heading=h.147n2zr" w:colFirst="0" w:colLast="0"/>
-      <w:bookmarkEnd w:id="30"/>
+      <w:bookmarkStart w:id="29" w:name="_heading=h.147n2zr" w:colFirst="0" w:colLast="0"/>
+      <w:bookmarkEnd w:id="29"/>
       <w:r>
         <w:rPr>
           <w:sz w:val="26"/>
@@ -9250,8 +9176,8 @@
           <w:sz w:val="26"/>
         </w:rPr>
       </w:pPr>
-      <w:bookmarkStart w:id="31" w:name="_heading=h.3o7alnk" w:colFirst="0" w:colLast="0"/>
-      <w:bookmarkEnd w:id="31"/>
+      <w:bookmarkStart w:id="30" w:name="_heading=h.3o7alnk" w:colFirst="0" w:colLast="0"/>
+      <w:bookmarkEnd w:id="30"/>
       <w:r>
         <w:rPr>
           <w:sz w:val="26"/>
@@ -9317,8 +9243,8 @@
           <w:sz w:val="26"/>
         </w:rPr>
       </w:pPr>
-      <w:bookmarkStart w:id="32" w:name="_heading=h.23ckvvd" w:colFirst="0" w:colLast="0"/>
-      <w:bookmarkEnd w:id="32"/>
+      <w:bookmarkStart w:id="31" w:name="_heading=h.23ckvvd" w:colFirst="0" w:colLast="0"/>
+      <w:bookmarkEnd w:id="31"/>
       <w:r>
         <w:rPr>
           <w:sz w:val="26"/>
@@ -9391,8 +9317,8 @@
           <w:sz w:val="26"/>
         </w:rPr>
       </w:pPr>
-      <w:bookmarkStart w:id="33" w:name="_heading=h.ihv636" w:colFirst="0" w:colLast="0"/>
-      <w:bookmarkEnd w:id="33"/>
+      <w:bookmarkStart w:id="32" w:name="_heading=h.ihv636" w:colFirst="0" w:colLast="0"/>
+      <w:bookmarkEnd w:id="32"/>
       <w:r>
         <w:rPr>
           <w:sz w:val="26"/>
@@ -13225,8 +13151,8 @@
           <w:szCs w:val="28"/>
         </w:rPr>
       </w:pPr>
-      <w:bookmarkStart w:id="34" w:name="_heading=h.32hioqz" w:colFirst="0" w:colLast="0"/>
-      <w:bookmarkEnd w:id="34"/>
+      <w:bookmarkStart w:id="33" w:name="_heading=h.32hioqz" w:colFirst="0" w:colLast="0"/>
+      <w:bookmarkEnd w:id="33"/>
       <w:r>
         <w:rPr>
           <w:b/>
@@ -13829,8 +13755,8 @@
           <w:szCs w:val="28"/>
         </w:rPr>
       </w:pPr>
-      <w:bookmarkStart w:id="35" w:name="_heading=h.1hmsyys" w:colFirst="0" w:colLast="0"/>
-      <w:bookmarkEnd w:id="35"/>
+      <w:bookmarkStart w:id="34" w:name="_heading=h.1hmsyys" w:colFirst="0" w:colLast="0"/>
+      <w:bookmarkEnd w:id="34"/>
       <w:r>
         <w:rPr>
           <w:b/>
@@ -13908,8 +13834,8 @@
       </w:r>
     </w:p>
     <w:sectPr>
-      <w:headerReference w:type="default" r:id="rId20"/>
-      <w:footerReference w:type="default" r:id="rId21"/>
+      <w:headerReference w:type="default" r:id="rId17"/>
+      <w:footerReference w:type="default" r:id="rId18"/>
       <w:pgSz w:w="11907" w:h="16839"/>
       <w:pgMar w:top="1985" w:right="1418" w:bottom="1418" w:left="1985" w:header="0" w:footer="1134" w:gutter="0"/>
       <w:pgNumType w:start="3"/>
@@ -13917,49 +13843,6 @@
     </w:sectPr>
   </w:body>
 </w:document>
-</file>
-
-<file path=word/comments.xml><?xml version="1.0" encoding="utf-8"?>
-<w:comments xmlns:wpc="http://schemas.microsoft.com/office/word/2010/wordprocessingCanvas" xmlns:cx="http://schemas.microsoft.com/office/drawing/2014/chartex" xmlns:cx1="http://schemas.microsoft.com/office/drawing/2015/9/8/chartex" xmlns:cx2="http://schemas.microsoft.com/office/drawing/2015/10/21/chartex" xmlns:cx3="http://schemas.microsoft.com/office/drawing/2016/5/9/chartex" xmlns:cx4="http://schemas.microsoft.com/office/drawing/2016/5/10/chartex" xmlns:cx5="http://schemas.microsoft.com/office/drawing/2016/5/11/chartex" xmlns:cx6="http://schemas.microsoft.com/office/drawing/2016/5/12/chartex" xmlns:cx7="http://schemas.microsoft.com/office/drawing/2016/5/13/chartex" xmlns:cx8="http://schemas.microsoft.com/office/drawing/2016/5/14/chartex" xmlns:mc="http://schemas.openxmlformats.org/markup-compatibility/2006" xmlns:aink="http://schemas.microsoft.com/office/drawing/2016/ink" xmlns:am3d="http://schemas.microsoft.com/office/drawing/2017/model3d" xmlns:o="urn:schemas-microsoft-com:office:office" xmlns:oel="http://schemas.microsoft.com/office/2019/extlst" xmlns:r="http://schemas.openxmlformats.org/officeDocument/2006/relationships" xmlns:m="http://schemas.openxmlformats.org/officeDocument/2006/math" xmlns:v="urn:schemas-microsoft-com:vml" xmlns:wp14="http://schemas.microsoft.com/office/word/2010/wordprocessingDrawing" xmlns:wp="http://schemas.openxmlformats.org/drawingml/2006/wordprocessingDrawing" xmlns:w10="urn:schemas-microsoft-com:office:word" xmlns:w="http://schemas.openxmlformats.org/wordprocessingml/2006/main" xmlns:w14="http://schemas.microsoft.com/office/word/2010/wordml" xmlns:w15="http://schemas.microsoft.com/office/word/2012/wordml" xmlns:w16cex="http://schemas.microsoft.com/office/word/2018/wordml/cex" xmlns:w16cid="http://schemas.microsoft.com/office/word/2016/wordml/cid" xmlns:w16="http://schemas.microsoft.com/office/word/2018/wordml" xmlns:w16du="http://schemas.microsoft.com/office/word/2023/wordml/word16du" xmlns:w16sdtdh="http://schemas.microsoft.com/office/word/2020/wordml/sdtdatahash" xmlns:w16sdtfl="http://schemas.microsoft.com/office/word/2024/wordml/sdtformatlock" xmlns:w16se="http://schemas.microsoft.com/office/word/2015/wordml/symex" xmlns:wpg="http://schemas.microsoft.com/office/word/2010/wordprocessingGroup" xmlns:wpi="http://schemas.microsoft.com/office/word/2010/wordprocessingInk" xmlns:wne="http://schemas.microsoft.com/office/word/2006/wordml" xmlns:wps="http://schemas.microsoft.com/office/word/2010/wordprocessingShape" mc:Ignorable="w14 w15 w16se w16cid w16 w16cex w16sdtdh w16sdtfl w16du wp14">
-  <w:comment w:id="1" w:author="Anggun Rahmatika" w:date="2022-06-08T09:14:00Z" w:initials="">
-    <w:p>
-      <w:pPr>
-        <w:widowControl w:val="0"/>
-        <w:pBdr>
-          <w:top w:val="nil"/>
-          <w:left w:val="nil"/>
-          <w:bottom w:val="nil"/>
-          <w:right w:val="nil"/>
-          <w:between w:val="nil"/>
-        </w:pBdr>
-        <w:spacing w:after="0" w:line="240" w:lineRule="auto"/>
-        <w:rPr>
-          <w:rFonts w:ascii="Arial" w:eastAsia="Arial" w:hAnsi="Arial" w:cs="Arial"/>
-          <w:color w:val="000000"/>
-        </w:rPr>
-      </w:pPr>
-      <w:r>
-        <w:rPr>
-          <w:rFonts w:ascii="Arial" w:eastAsia="Arial" w:hAnsi="Arial" w:cs="Arial"/>
-          <w:color w:val="000000"/>
-        </w:rPr>
-        <w:t>Menggunakan sapaan Bapak atau Ibu sebelum nama lengkap dan gelar, sesuaikan dengan gender-nya</w:t>
-      </w:r>
-    </w:p>
-  </w:comment>
-</w:comments>
-</file>
-
-<file path=word/commentsExtended.xml><?xml version="1.0" encoding="utf-8"?>
-<w15:commentsEx xmlns:wpc="http://schemas.microsoft.com/office/word/2010/wordprocessingCanvas" xmlns:cx="http://schemas.microsoft.com/office/drawing/2014/chartex" xmlns:cx1="http://schemas.microsoft.com/office/drawing/2015/9/8/chartex" xmlns:cx2="http://schemas.microsoft.com/office/drawing/2015/10/21/chartex" xmlns:cx3="http://schemas.microsoft.com/office/drawing/2016/5/9/chartex" xmlns:cx4="http://schemas.microsoft.com/office/drawing/2016/5/10/chartex" xmlns:cx5="http://schemas.microsoft.com/office/drawing/2016/5/11/chartex" xmlns:cx6="http://schemas.microsoft.com/office/drawing/2016/5/12/chartex" xmlns:cx7="http://schemas.microsoft.com/office/drawing/2016/5/13/chartex" xmlns:cx8="http://schemas.microsoft.com/office/drawing/2016/5/14/chartex" xmlns:mc="http://schemas.openxmlformats.org/markup-compatibility/2006" xmlns:aink="http://schemas.microsoft.com/office/drawing/2016/ink" xmlns:am3d="http://schemas.microsoft.com/office/drawing/2017/model3d" xmlns:o="urn:schemas-microsoft-com:office:office" xmlns:oel="http://schemas.microsoft.com/office/2019/extlst" xmlns:r="http://schemas.openxmlformats.org/officeDocument/2006/relationships" xmlns:m="http://schemas.openxmlformats.org/officeDocument/2006/math" xmlns:v="urn:schemas-microsoft-com:vml" xmlns:wp14="http://schemas.microsoft.com/office/word/2010/wordprocessingDrawing" xmlns:wp="http://schemas.openxmlformats.org/drawingml/2006/wordprocessingDrawing" xmlns:w10="urn:schemas-microsoft-com:office:word" xmlns:w="http://schemas.openxmlformats.org/wordprocessingml/2006/main" xmlns:w14="http://schemas.microsoft.com/office/word/2010/wordml" xmlns:w15="http://schemas.microsoft.com/office/word/2012/wordml" xmlns:w16cex="http://schemas.microsoft.com/office/word/2018/wordml/cex" xmlns:w16cid="http://schemas.microsoft.com/office/word/2016/wordml/cid" xmlns:w16="http://schemas.microsoft.com/office/word/2018/wordml" xmlns:w16du="http://schemas.microsoft.com/office/word/2023/wordml/word16du" xmlns:w16sdtdh="http://schemas.microsoft.com/office/word/2020/wordml/sdtdatahash" xmlns:w16sdtfl="http://schemas.microsoft.com/office/word/2024/wordml/sdtformatlock" xmlns:w16se="http://schemas.microsoft.com/office/word/2015/wordml/symex" xmlns:wpg="http://schemas.microsoft.com/office/word/2010/wordprocessingGroup" xmlns:wpi="http://schemas.microsoft.com/office/word/2010/wordprocessingInk" xmlns:wne="http://schemas.microsoft.com/office/word/2006/wordml" xmlns:wps="http://schemas.microsoft.com/office/word/2010/wordprocessingShape" mc:Ignorable="w14 w15 w16se w16cid w16 w16cex w16sdtdh w16sdtfl w16du wp14">
-  <w15:commentEx w15:paraId="0000025A" w15:done="0"/>
-</w15:commentsEx>
-</file>
-
-<file path=word/commentsIds.xml><?xml version="1.0" encoding="utf-8"?>
-<w16cid:commentsIds xmlns:wpc="http://schemas.microsoft.com/office/word/2010/wordprocessingCanvas" xmlns:cx="http://schemas.microsoft.com/office/drawing/2014/chartex" xmlns:cx1="http://schemas.microsoft.com/office/drawing/2015/9/8/chartex" xmlns:cx2="http://schemas.microsoft.com/office/drawing/2015/10/21/chartex" xmlns:cx3="http://schemas.microsoft.com/office/drawing/2016/5/9/chartex" xmlns:cx4="http://schemas.microsoft.com/office/drawing/2016/5/10/chartex" xmlns:cx5="http://schemas.microsoft.com/office/drawing/2016/5/11/chartex" xmlns:cx6="http://schemas.microsoft.com/office/drawing/2016/5/12/chartex" xmlns:cx7="http://schemas.microsoft.com/office/drawing/2016/5/13/chartex" xmlns:cx8="http://schemas.microsoft.com/office/drawing/2016/5/14/chartex" xmlns:mc="http://schemas.openxmlformats.org/markup-compatibility/2006" xmlns:aink="http://schemas.microsoft.com/office/drawing/2016/ink" xmlns:am3d="http://schemas.microsoft.com/office/drawing/2017/model3d" xmlns:o="urn:schemas-microsoft-com:office:office" xmlns:oel="http://schemas.microsoft.com/office/2019/extlst" xmlns:r="http://schemas.openxmlformats.org/officeDocument/2006/relationships" xmlns:m="http://schemas.openxmlformats.org/officeDocument/2006/math" xmlns:v="urn:schemas-microsoft-com:vml" xmlns:wp14="http://schemas.microsoft.com/office/word/2010/wordprocessingDrawing" xmlns:wp="http://schemas.openxmlformats.org/drawingml/2006/wordprocessingDrawing" xmlns:w10="urn:schemas-microsoft-com:office:word" xmlns:w="http://schemas.openxmlformats.org/wordprocessingml/2006/main" xmlns:w14="http://schemas.microsoft.com/office/word/2010/wordml" xmlns:w15="http://schemas.microsoft.com/office/word/2012/wordml" xmlns:w16cex="http://schemas.microsoft.com/office/word/2018/wordml/cex" xmlns:w16cid="http://schemas.microsoft.com/office/word/2016/wordml/cid" xmlns:w16="http://schemas.microsoft.com/office/word/2018/wordml" xmlns:w16du="http://schemas.microsoft.com/office/word/2023/wordml/word16du" xmlns:w16sdtdh="http://schemas.microsoft.com/office/word/2020/wordml/sdtdatahash" xmlns:w16sdtfl="http://schemas.microsoft.com/office/word/2024/wordml/sdtformatlock" xmlns:w16se="http://schemas.microsoft.com/office/word/2015/wordml/symex" xmlns:wpg="http://schemas.microsoft.com/office/word/2010/wordprocessingGroup" xmlns:wpi="http://schemas.microsoft.com/office/word/2010/wordprocessingInk" xmlns:wne="http://schemas.microsoft.com/office/word/2006/wordml" xmlns:wps="http://schemas.microsoft.com/office/word/2010/wordprocessingShape" mc:Ignorable="w14 w15 w16se w16cid w16 w16cex w16sdtdh w16sdtfl w16du wp14">
-  <w16cid:commentId w16cid:paraId="0000025A" w16cid:durableId="0000025A"/>
-</w16cid:commentsIds>
 </file>
 
 <file path=word/endnotes.xml><?xml version="1.0" encoding="utf-8"?>

</xml_diff>

<commit_message>
vault backup: 2025-10-08 21:44:42
</commit_message>
<xml_diff>
--- a/College/Tugas Akhir/Prototype Skripsi/Tahap Seminar Proposal/Muhammad Alif Seminar Proposal v.1.docx
+++ b/College/Tugas Akhir/Prototype Skripsi/Tahap Seminar Proposal/Muhammad Alif Seminar Proposal v.1.docx
@@ -22,30 +22,6 @@
         </w:rPr>
         <w:t>PROPOSAL SKRIPSI</w:t>
       </w:r>
-    </w:p>
-    <w:p>
-      <w:pPr>
-        <w:spacing w:after="0" w:line="240" w:lineRule="auto"/>
-        <w:jc w:val="center"/>
-        <w:rPr>
-          <w:rFonts w:ascii="Times New Roman" w:eastAsia="Times New Roman" w:hAnsi="Times New Roman" w:cs="Times New Roman"/>
-          <w:b/>
-          <w:sz w:val="32"/>
-          <w:szCs w:val="32"/>
-        </w:rPr>
-      </w:pPr>
-    </w:p>
-    <w:p>
-      <w:pPr>
-        <w:spacing w:after="0" w:line="240" w:lineRule="auto"/>
-        <w:jc w:val="center"/>
-        <w:rPr>
-          <w:rFonts w:ascii="Times New Roman" w:eastAsia="Times New Roman" w:hAnsi="Times New Roman" w:cs="Times New Roman"/>
-          <w:b/>
-          <w:sz w:val="32"/>
-          <w:szCs w:val="32"/>
-        </w:rPr>
-      </w:pPr>
     </w:p>
     <w:p>
       <w:pPr>
@@ -296,7 +272,7 @@
                     <pic:cNvPicPr preferRelativeResize="0"/>
                   </pic:nvPicPr>
                   <pic:blipFill>
-                    <a:blip r:embed="rId8"/>
+                    <a:blip r:embed="rId9"/>
                     <a:srcRect/>
                     <a:stretch>
                       <a:fillRect/>
@@ -477,8 +453,8 @@
           <w:szCs w:val="24"/>
         </w:rPr>
         <w:sectPr>
-          <w:headerReference w:type="default" r:id="rId9"/>
-          <w:footerReference w:type="default" r:id="rId10"/>
+          <w:headerReference w:type="default" r:id="rId10"/>
+          <w:footerReference w:type="default" r:id="rId11"/>
           <w:pgSz w:w="11907" w:h="16839"/>
           <w:pgMar w:top="1985" w:right="1418" w:bottom="1418" w:left="1985" w:header="1134" w:footer="720" w:gutter="0"/>
           <w:pgNumType w:start="1"/>
@@ -523,19 +499,6 @@
     <w:p>
       <w:pPr>
         <w:spacing w:after="0" w:line="240" w:lineRule="auto"/>
-        <w:jc w:val="center"/>
-        <w:rPr>
-          <w:rFonts w:ascii="Times New Roman" w:eastAsia="Times New Roman" w:hAnsi="Times New Roman" w:cs="Times New Roman"/>
-          <w:b/>
-          <w:sz w:val="32"/>
-          <w:szCs w:val="32"/>
-        </w:rPr>
-      </w:pPr>
-    </w:p>
-    <w:p>
-      <w:pPr>
-        <w:spacing w:after="0" w:line="240" w:lineRule="auto"/>
-        <w:jc w:val="center"/>
         <w:rPr>
           <w:rFonts w:ascii="Times New Roman" w:eastAsia="Times New Roman" w:hAnsi="Times New Roman" w:cs="Times New Roman"/>
           <w:b/>
@@ -880,7 +843,7 @@
                     <pic:cNvPicPr preferRelativeResize="0"/>
                   </pic:nvPicPr>
                   <pic:blipFill>
-                    <a:blip r:embed="rId11"/>
+                    <a:blip r:embed="rId12"/>
                     <a:srcRect/>
                     <a:stretch>
                       <a:fillRect/>
@@ -1130,6 +1093,30 @@
     </w:p>
     <w:p>
       <w:pPr>
+        <w:spacing w:after="0" w:line="240" w:lineRule="auto"/>
+        <w:jc w:val="center"/>
+        <w:rPr>
+          <w:rFonts w:ascii="Times New Roman" w:eastAsia="Times New Roman" w:hAnsi="Times New Roman" w:cs="Times New Roman"/>
+          <w:b/>
+          <w:sz w:val="26"/>
+          <w:szCs w:val="26"/>
+        </w:rPr>
+      </w:pPr>
+    </w:p>
+    <w:p>
+      <w:pPr>
+        <w:spacing w:after="0" w:line="240" w:lineRule="auto"/>
+        <w:jc w:val="center"/>
+        <w:rPr>
+          <w:rFonts w:ascii="Times New Roman" w:eastAsia="Times New Roman" w:hAnsi="Times New Roman" w:cs="Times New Roman"/>
+          <w:b/>
+          <w:sz w:val="26"/>
+          <w:szCs w:val="26"/>
+        </w:rPr>
+      </w:pPr>
+    </w:p>
+    <w:p>
+      <w:pPr>
         <w:spacing w:after="0" w:line="360" w:lineRule="auto"/>
         <w:jc w:val="center"/>
         <w:rPr>
@@ -1153,7 +1140,6 @@
     <w:p>
       <w:pPr>
         <w:spacing w:after="0" w:line="360" w:lineRule="auto"/>
-        <w:jc w:val="center"/>
         <w:rPr>
           <w:rFonts w:ascii="Times New Roman" w:eastAsia="Times New Roman" w:hAnsi="Times New Roman" w:cs="Times New Roman"/>
           <w:b/>
@@ -1591,25 +1577,6 @@
     </w:p>
     <w:p>
       <w:pPr>
-        <w:shd w:val="clear" w:color="auto" w:fill="ED7D31"/>
-        <w:jc w:val="both"/>
-        <w:rPr>
-          <w:rFonts w:ascii="Times New Roman" w:eastAsia="Times New Roman" w:hAnsi="Times New Roman" w:cs="Times New Roman"/>
-          <w:sz w:val="24"/>
-          <w:szCs w:val="24"/>
-        </w:rPr>
-      </w:pPr>
-      <w:r>
-        <w:rPr>
-          <w:rFonts w:ascii="Times New Roman" w:eastAsia="Times New Roman" w:hAnsi="Times New Roman" w:cs="Times New Roman"/>
-          <w:sz w:val="24"/>
-          <w:szCs w:val="24"/>
-        </w:rPr>
-        <w:t>Kata Pengantar (preface, foreword) sebaiknya disusun secara ringkas dan tidak lebih dari 2 halaman (lihat contoh Lampiran 9). Isi Kata Pengantar mencakup: a. kalimat pembuka; b. tempat dan waktu pengumpulan data; c. ucapan terima kasih dengan hirarki sebagai berikut (i. pimpinan perusahaan/lembaga/instansi dari luar Unmul; ii. pembimbing lapangan; iii. pimpinan fakultas; iv. pimpinan program studi; v. pembimbing I dan II; vi. Penguji; dan d. kalimat penutup)</w:t>
-      </w:r>
-    </w:p>
-    <w:p>
-      <w:pPr>
         <w:jc w:val="both"/>
         <w:rPr>
           <w:rFonts w:ascii="Times New Roman" w:eastAsia="Times New Roman" w:hAnsi="Times New Roman" w:cs="Times New Roman"/>
@@ -1838,16 +1805,7 @@
           <w:sz w:val="24"/>
           <w:szCs w:val="24"/>
         </w:rPr>
-        <w:t xml:space="preserve"> </w:t>
-      </w:r>
-      <w:r>
-        <w:rPr>
-          <w:rFonts w:ascii="Times New Roman" w:eastAsia="Times New Roman" w:hAnsi="Times New Roman" w:cs="Times New Roman"/>
-          <w:color w:val="000000"/>
-          <w:sz w:val="24"/>
-          <w:szCs w:val="24"/>
-        </w:rPr>
-        <w:t>Segenap Dosen Program Studi Informatika, yang telah memberikan ilmu pengetahuan selama mengikuti perkuliahan.</w:t>
+        <w:t xml:space="preserve"> Segenap Dosen Program Studi Informatika, yang telah memberikan ilmu pengetahuan selama mengikuti perkuliahan.</w:t>
       </w:r>
     </w:p>
     <w:p>
@@ -1968,14 +1926,56 @@
     </w:p>
     <w:p>
       <w:pPr>
+        <w:ind w:left="4320" w:firstLine="720"/>
+        <w:jc w:val="both"/>
+        <w:rPr>
+          <w:rFonts w:ascii="Times New Roman" w:eastAsia="Times New Roman" w:hAnsi="Times New Roman" w:cs="Times New Roman"/>
+          <w:sz w:val="24"/>
+          <w:szCs w:val="24"/>
+        </w:rPr>
+      </w:pPr>
+    </w:p>
+    <w:p>
+      <w:pPr>
+        <w:ind w:left="4320" w:firstLine="720"/>
+        <w:jc w:val="both"/>
+        <w:rPr>
+          <w:rFonts w:ascii="Times New Roman" w:eastAsia="Times New Roman" w:hAnsi="Times New Roman" w:cs="Times New Roman"/>
+          <w:sz w:val="24"/>
+          <w:szCs w:val="24"/>
+        </w:rPr>
+      </w:pPr>
+    </w:p>
+    <w:p>
+      <w:pPr>
+        <w:ind w:left="4320" w:firstLine="720"/>
+        <w:jc w:val="both"/>
+        <w:rPr>
+          <w:rFonts w:ascii="Times New Roman" w:eastAsia="Times New Roman" w:hAnsi="Times New Roman" w:cs="Times New Roman"/>
+          <w:sz w:val="24"/>
+          <w:szCs w:val="24"/>
+        </w:rPr>
+      </w:pPr>
+    </w:p>
+    <w:p>
+      <w:pPr>
+        <w:ind w:left="4320" w:firstLine="720"/>
+        <w:jc w:val="both"/>
+        <w:rPr>
+          <w:rFonts w:ascii="Times New Roman" w:eastAsia="Times New Roman" w:hAnsi="Times New Roman" w:cs="Times New Roman"/>
+          <w:sz w:val="24"/>
+          <w:szCs w:val="24"/>
+        </w:rPr>
+      </w:pPr>
+    </w:p>
+    <w:p>
+      <w:pPr>
         <w:pStyle w:val="Heading1"/>
         <w:jc w:val="center"/>
         <w:rPr>
           <w:b/>
         </w:rPr>
       </w:pPr>
-      <w:bookmarkStart w:id="1" w:name="_heading=h.3znysh7" w:colFirst="0" w:colLast="0"/>
-      <w:bookmarkEnd w:id="1"/>
       <w:r>
         <w:rPr>
           <w:b/>
@@ -3954,8 +3954,8 @@
           <w:szCs w:val="28"/>
         </w:rPr>
       </w:pPr>
-      <w:bookmarkStart w:id="2" w:name="_heading=h.2et92p0" w:colFirst="0" w:colLast="0"/>
-      <w:bookmarkEnd w:id="2"/>
+      <w:bookmarkStart w:id="1" w:name="_heading=h.2et92p0" w:colFirst="0" w:colLast="0"/>
+      <w:bookmarkEnd w:id="1"/>
       <w:r>
         <w:rPr>
           <w:b/>
@@ -4205,8 +4205,8 @@
           <w:szCs w:val="28"/>
         </w:rPr>
       </w:pPr>
-      <w:bookmarkStart w:id="3" w:name="_heading=h.tyjcwt" w:colFirst="0" w:colLast="0"/>
-      <w:bookmarkEnd w:id="3"/>
+      <w:bookmarkStart w:id="2" w:name="_heading=h.tyjcwt" w:colFirst="0" w:colLast="0"/>
+      <w:bookmarkEnd w:id="2"/>
       <w:r>
         <w:rPr>
           <w:b/>
@@ -4488,8 +4488,8 @@
           <w:szCs w:val="28"/>
         </w:rPr>
       </w:pPr>
-      <w:bookmarkStart w:id="4" w:name="_heading=h.3dy6vkm" w:colFirst="0" w:colLast="0"/>
-      <w:bookmarkEnd w:id="4"/>
+      <w:bookmarkStart w:id="3" w:name="_heading=h.3dy6vkm" w:colFirst="0" w:colLast="0"/>
+      <w:bookmarkEnd w:id="3"/>
       <w:r>
         <w:rPr>
           <w:b/>
@@ -4658,8 +4658,8 @@
           <w:szCs w:val="28"/>
         </w:rPr>
       </w:pPr>
-      <w:bookmarkStart w:id="5" w:name="_heading=h.1t3h5sf" w:colFirst="0" w:colLast="0"/>
-      <w:bookmarkEnd w:id="5"/>
+      <w:bookmarkStart w:id="4" w:name="_heading=h.1t3h5sf" w:colFirst="0" w:colLast="0"/>
+      <w:bookmarkEnd w:id="4"/>
       <w:r>
         <w:rPr>
           <w:b/>
@@ -4748,8 +4748,8 @@
           <w:szCs w:val="28"/>
         </w:rPr>
       </w:pPr>
-      <w:bookmarkStart w:id="6" w:name="_heading=h.4d34og8" w:colFirst="0" w:colLast="0"/>
-      <w:bookmarkEnd w:id="6"/>
+      <w:bookmarkStart w:id="5" w:name="_heading=h.4d34og8" w:colFirst="0" w:colLast="0"/>
+      <w:bookmarkEnd w:id="5"/>
       <w:r>
         <w:rPr>
           <w:b/>
@@ -4846,8 +4846,8 @@
           <w:szCs w:val="24"/>
         </w:rPr>
         <w:sectPr>
-          <w:headerReference w:type="default" r:id="rId12"/>
-          <w:footerReference w:type="default" r:id="rId13"/>
+          <w:headerReference w:type="default" r:id="rId13"/>
+          <w:footerReference w:type="default" r:id="rId14"/>
           <w:type w:val="continuous"/>
           <w:pgSz w:w="11907" w:h="16839"/>
           <w:pgMar w:top="1985" w:right="1418" w:bottom="1418" w:left="1985" w:header="0" w:footer="1134" w:gutter="0"/>
@@ -4879,8 +4879,8 @@
           <w:szCs w:val="28"/>
         </w:rPr>
       </w:pPr>
-      <w:bookmarkStart w:id="7" w:name="_heading=h.2s8eyo1" w:colFirst="0" w:colLast="0"/>
-      <w:bookmarkEnd w:id="7"/>
+      <w:bookmarkStart w:id="6" w:name="_heading=h.2s8eyo1" w:colFirst="0" w:colLast="0"/>
+      <w:bookmarkEnd w:id="6"/>
       <w:r>
         <w:rPr>
           <w:b/>
@@ -4911,8 +4911,8 @@
           <w:szCs w:val="24"/>
         </w:rPr>
       </w:pPr>
-      <w:bookmarkStart w:id="8" w:name="_heading=h.17dp8vu" w:colFirst="0" w:colLast="0"/>
-      <w:bookmarkEnd w:id="8"/>
+      <w:bookmarkStart w:id="7" w:name="_heading=h.17dp8vu" w:colFirst="0" w:colLast="0"/>
+      <w:bookmarkEnd w:id="7"/>
       <w:r>
         <w:rPr>
           <w:rFonts w:ascii="Times New Roman" w:eastAsia="Times New Roman" w:hAnsi="Times New Roman" w:cs="Times New Roman"/>
@@ -4957,84 +4957,14 @@
           <w:sz w:val="26"/>
         </w:rPr>
       </w:pPr>
-      <w:bookmarkStart w:id="9" w:name="_heading=h.3rdcrjn" w:colFirst="0" w:colLast="0"/>
-      <w:bookmarkEnd w:id="9"/>
+      <w:bookmarkStart w:id="8" w:name="_heading=h.3rdcrjn" w:colFirst="0" w:colLast="0"/>
+      <w:bookmarkEnd w:id="8"/>
       <w:r>
         <w:rPr>
           <w:sz w:val="26"/>
         </w:rPr>
         <w:t>Latar Belakang</w:t>
       </w:r>
-    </w:p>
-    <w:p>
-      <w:pPr>
-        <w:spacing w:after="0" w:line="360" w:lineRule="auto"/>
-      </w:pPr>
-    </w:p>
-    <w:p>
-      <w:pPr>
-        <w:shd w:val="clear" w:color="auto" w:fill="FFFF00"/>
-        <w:spacing w:after="0" w:line="360" w:lineRule="auto"/>
-        <w:rPr>
-          <w:rFonts w:ascii="Times New Roman" w:eastAsia="Times New Roman" w:hAnsi="Times New Roman" w:cs="Times New Roman"/>
-          <w:sz w:val="24"/>
-          <w:szCs w:val="24"/>
-        </w:rPr>
-      </w:pPr>
-      <w:bookmarkStart w:id="10" w:name="_heading=h.26in1rg" w:colFirst="0" w:colLast="0"/>
-      <w:bookmarkEnd w:id="10"/>
-      <w:r>
-        <w:rPr>
-          <w:rFonts w:ascii="Times New Roman" w:eastAsia="Times New Roman" w:hAnsi="Times New Roman" w:cs="Times New Roman"/>
-          <w:sz w:val="24"/>
-          <w:szCs w:val="24"/>
-        </w:rPr>
-        <w:t xml:space="preserve">Keterangan: Buat dalam 7-10 paragraf yang memperlihatkan </w:t>
-      </w:r>
-    </w:p>
-    <w:p>
-      <w:pPr>
-        <w:numPr>
-          <w:ilvl w:val="0"/>
-          <w:numId w:val="1"/>
-        </w:numPr>
-        <w:pBdr>
-          <w:top w:val="nil"/>
-          <w:left w:val="nil"/>
-          <w:bottom w:val="nil"/>
-          <w:right w:val="nil"/>
-          <w:between w:val="nil"/>
-        </w:pBdr>
-        <w:shd w:val="clear" w:color="auto" w:fill="FFFF00"/>
-        <w:spacing w:after="0" w:line="360" w:lineRule="auto"/>
-        <w:jc w:val="both"/>
-        <w:rPr>
-          <w:rFonts w:ascii="Times New Roman" w:eastAsia="Times New Roman" w:hAnsi="Times New Roman" w:cs="Times New Roman"/>
-          <w:color w:val="000000"/>
-          <w:sz w:val="24"/>
-          <w:szCs w:val="24"/>
-        </w:rPr>
-      </w:pPr>
-      <w:r>
-        <w:rPr>
-          <w:rFonts w:ascii="Times New Roman" w:eastAsia="Times New Roman" w:hAnsi="Times New Roman" w:cs="Times New Roman"/>
-          <w:color w:val="000000"/>
-          <w:sz w:val="24"/>
-          <w:szCs w:val="24"/>
-        </w:rPr>
-        <w:t>Apa permasalahannya sehingga perlu dilakukan penelitian?</w:t>
-      </w:r>
-    </w:p>
-    <w:p>
-      <w:pPr>
-        <w:spacing w:after="0" w:line="360" w:lineRule="auto"/>
-        <w:jc w:val="both"/>
-        <w:rPr>
-          <w:rFonts w:ascii="Times New Roman" w:eastAsia="Times New Roman" w:hAnsi="Times New Roman" w:cs="Times New Roman"/>
-          <w:sz w:val="24"/>
-          <w:szCs w:val="24"/>
-        </w:rPr>
-      </w:pPr>
     </w:p>
     <w:p>
       <w:pPr>
@@ -5053,7 +4983,91 @@
           <w:sz w:val="24"/>
           <w:szCs w:val="24"/>
         </w:rPr>
-        <w:t>Infrastruktur jalan merupakan komponen penting dalam pembangunan regional karena berperan penting dalam mendukung mobilitas masyarakat, distribusi barang, dan pertumbuhan ekonomi. Infrastruktur jalan yang berkualitas baik tidak hanya meningkatkan efisiensi transportasi, tetapi juga memiliki dampak langsung terhadap keselamatan pengguna jalan. Sebaliknya, jalan yang rusak dapat menyebabkan kerugian ekonomi, menghambat aktivitas masyarakat, dan meningkatkan risiko kecelakaan lalu lintas.</w:t>
+        <w:t>Infrastruktur jalan merupakan komponen penting dalam pembangunan regional karena berperan penting dalam mendukung mobilitas masyarakat, distribusi barang, dan pertumbuhan ekonomi</w:t>
+      </w:r>
+      <w:r>
+        <w:rPr>
+          <w:rFonts w:ascii="Times New Roman" w:eastAsia="Times New Roman" w:hAnsi="Times New Roman" w:cs="Times New Roman"/>
+          <w:sz w:val="24"/>
+          <w:szCs w:val="24"/>
+        </w:rPr>
+        <w:t xml:space="preserve"> </w:t>
+      </w:r>
+      <w:sdt>
+        <w:sdtPr>
+          <w:rPr>
+            <w:rFonts w:ascii="Times New Roman" w:eastAsia="Times New Roman" w:hAnsi="Times New Roman" w:cs="Times New Roman"/>
+            <w:color w:val="000000"/>
+            <w:sz w:val="24"/>
+            <w:szCs w:val="24"/>
+          </w:rPr>
+          <w:tag w:val="MENDELEY_CITATION_v3_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"/>
+          <w:id w:val="2036070326"/>
+          <w:placeholder>
+            <w:docPart w:val="DefaultPlaceholder_-1854013440"/>
+          </w:placeholder>
+        </w:sdtPr>
+        <w:sdtContent>
+          <w:r>
+            <w:rPr>
+              <w:rFonts w:ascii="Times New Roman" w:eastAsia="Times New Roman" w:hAnsi="Times New Roman" w:cs="Times New Roman"/>
+              <w:color w:val="000000"/>
+              <w:sz w:val="24"/>
+            </w:rPr>
+            <w:t>(Biswas &amp; Jain, 2025)</w:t>
+          </w:r>
+        </w:sdtContent>
+      </w:sdt>
+      <w:r>
+        <w:rPr>
+          <w:rFonts w:ascii="Times New Roman" w:eastAsia="Times New Roman" w:hAnsi="Times New Roman" w:cs="Times New Roman"/>
+          <w:sz w:val="24"/>
+          <w:szCs w:val="24"/>
+        </w:rPr>
+        <w:t>. Infrastruktur jalan yang berkualitas baik tidak hanya meningkatkan efisiensi transportasi, tetapi juga memiliki dampak langsung terhadap keselamatan pengguna jalan. Sebaliknya, jalan yang rusak dapat menyebabkan kerugian ekonomi, menghambat aktivitas masyarakat, dan meningkatkan risiko kecelakaan lalu lintas</w:t>
+      </w:r>
+      <w:r>
+        <w:rPr>
+          <w:rFonts w:ascii="Times New Roman" w:eastAsia="Times New Roman" w:hAnsi="Times New Roman" w:cs="Times New Roman"/>
+          <w:sz w:val="24"/>
+          <w:szCs w:val="24"/>
+        </w:rPr>
+        <w:t xml:space="preserve"> </w:t>
+      </w:r>
+      <w:sdt>
+        <w:sdtPr>
+          <w:rPr>
+            <w:rFonts w:ascii="Times New Roman" w:eastAsia="Times New Roman" w:hAnsi="Times New Roman" w:cs="Times New Roman"/>
+            <w:color w:val="000000"/>
+            <w:sz w:val="24"/>
+            <w:szCs w:val="24"/>
+          </w:rPr>
+          <w:tag w:val="MENDELEY_CITATION_v3_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"/>
+          <w:id w:val="916527534"/>
+          <w:placeholder>
+            <w:docPart w:val="DefaultPlaceholder_-1854013440"/>
+          </w:placeholder>
+        </w:sdtPr>
+        <w:sdtContent>
+          <w:r>
+            <w:rPr>
+              <w:rFonts w:ascii="Times New Roman" w:eastAsia="Times New Roman" w:hAnsi="Times New Roman" w:cs="Times New Roman"/>
+              <w:color w:val="000000"/>
+              <w:sz w:val="24"/>
+              <w:szCs w:val="24"/>
+            </w:rPr>
+            <w:t>(Shaw et al., 2025)</w:t>
+          </w:r>
+        </w:sdtContent>
+      </w:sdt>
+      <w:r>
+        <w:rPr>
+          <w:rFonts w:ascii="Times New Roman" w:eastAsia="Times New Roman" w:hAnsi="Times New Roman" w:cs="Times New Roman"/>
+          <w:color w:val="000000"/>
+          <w:sz w:val="24"/>
+          <w:szCs w:val="24"/>
+        </w:rPr>
+        <w:t>.</w:t>
       </w:r>
     </w:p>
     <w:p>
@@ -5085,7 +5099,108 @@
           <w:sz w:val="24"/>
           <w:szCs w:val="24"/>
         </w:rPr>
-        <w:t>Di berbagai wilayah, termasuk Kota Samarinda, masalah kerusakan jalan tetap menjadi perhatian serius. Faktor-faktor seperti beban kendaraan yang berlebihan, kondisi cuaca ekstrem, dan pemeliharaan yang tidak teratur sering mempercepat kerusakan. Bentuk kerusakan yang umum meliputi retakan pada permukaan jalan, lubang jalan, dan permukaan jalan yang tidak rata. Jika kerusakan ini tidak ditangani segera, kualitas jalan akan terus menurun dan biaya perbaikan di masa depan akan lebih tinggi.</w:t>
+        <w:t>Di berbagai wilayah, termasuk Kota Samarinda, masalah kerusakan jalan tetap menjadi perhatian serius. Faktor-faktor seperti beban kendaraan yang berlebihan, kondisi cuaca ekstrem, dan pemeliharaan yang tidak teratur sering mempercepat kerusakan</w:t>
+      </w:r>
+      <w:r>
+        <w:rPr>
+          <w:rFonts w:ascii="Times New Roman" w:eastAsia="Times New Roman" w:hAnsi="Times New Roman" w:cs="Times New Roman"/>
+          <w:sz w:val="24"/>
+          <w:szCs w:val="24"/>
+        </w:rPr>
+        <w:t xml:space="preserve"> </w:t>
+      </w:r>
+      <w:sdt>
+        <w:sdtPr>
+          <w:rPr>
+            <w:rFonts w:ascii="Times New Roman" w:eastAsia="Times New Roman" w:hAnsi="Times New Roman" w:cs="Times New Roman"/>
+            <w:color w:val="000000"/>
+            <w:sz w:val="24"/>
+            <w:szCs w:val="24"/>
+          </w:rPr>
+          <w:tag w:val="MENDELEY_CITATION_v3_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"/>
+          <w:id w:val="1194662801"/>
+          <w:placeholder>
+            <w:docPart w:val="DefaultPlaceholder_-1854013440"/>
+          </w:placeholder>
+        </w:sdtPr>
+        <w:sdtContent>
+          <w:r>
+            <w:rPr>
+              <w:rFonts w:ascii="Times New Roman" w:eastAsia="Times New Roman" w:hAnsi="Times New Roman" w:cs="Times New Roman"/>
+              <w:color w:val="000000"/>
+              <w:sz w:val="24"/>
+            </w:rPr>
+            <w:t>(</w:t>
+          </w:r>
+          <w:r>
+            <w:rPr>
+              <w:rFonts w:ascii="Times New Roman" w:eastAsia="Times New Roman" w:hAnsi="Times New Roman" w:cs="Times New Roman"/>
+              <w:i/>
+              <w:iCs/>
+              <w:color w:val="000000"/>
+              <w:sz w:val="24"/>
+            </w:rPr>
+            <w:t>Kerusakan Jalan Di Samarinda Masalah Sistemik, Akademisi Ungkap Masalah Keterbatasan Anggaran</w:t>
+          </w:r>
+          <w:r>
+            <w:rPr>
+              <w:rFonts w:ascii="Times New Roman" w:eastAsia="Times New Roman" w:hAnsi="Times New Roman" w:cs="Times New Roman"/>
+              <w:color w:val="000000"/>
+              <w:sz w:val="24"/>
+            </w:rPr>
+            <w:t>, n.d.)</w:t>
+          </w:r>
+        </w:sdtContent>
+      </w:sdt>
+      <w:r>
+        <w:rPr>
+          <w:rFonts w:ascii="Times New Roman" w:eastAsia="Times New Roman" w:hAnsi="Times New Roman" w:cs="Times New Roman"/>
+          <w:sz w:val="24"/>
+          <w:szCs w:val="24"/>
+        </w:rPr>
+        <w:t>. Bentuk kerusakan yang umum meliputi retakan pada permukaan jalan, lubang jalan, dan permukaan jalan yang tidak rata. Jika kerusakan ini tidak ditangani segera, kualitas jalan akan terus menurun dan biaya perbaikan di masa depan akan lebih tinggi</w:t>
+      </w:r>
+      <w:r>
+        <w:rPr>
+          <w:rFonts w:ascii="Times New Roman" w:eastAsia="Times New Roman" w:hAnsi="Times New Roman" w:cs="Times New Roman"/>
+          <w:sz w:val="24"/>
+          <w:szCs w:val="24"/>
+        </w:rPr>
+        <w:t xml:space="preserve"> </w:t>
+      </w:r>
+      <w:sdt>
+        <w:sdtPr>
+          <w:rPr>
+            <w:rFonts w:ascii="Times New Roman" w:eastAsia="Times New Roman" w:hAnsi="Times New Roman" w:cs="Times New Roman"/>
+            <w:color w:val="000000"/>
+            <w:sz w:val="24"/>
+            <w:szCs w:val="24"/>
+          </w:rPr>
+          <w:tag w:val="MENDELEY_CITATION_v3_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"/>
+          <w:id w:val="-1276475347"/>
+          <w:placeholder>
+            <w:docPart w:val="DefaultPlaceholder_-1854013440"/>
+          </w:placeholder>
+        </w:sdtPr>
+        <w:sdtContent>
+          <w:r>
+            <w:rPr>
+              <w:rFonts w:ascii="Times New Roman" w:eastAsia="Times New Roman" w:hAnsi="Times New Roman" w:cs="Times New Roman"/>
+              <w:color w:val="000000"/>
+              <w:sz w:val="24"/>
+              <w:szCs w:val="24"/>
+            </w:rPr>
+            <w:t>(Kurniawan et al., 2025)</w:t>
+          </w:r>
+        </w:sdtContent>
+      </w:sdt>
+      <w:r>
+        <w:rPr>
+          <w:rFonts w:ascii="Times New Roman" w:eastAsia="Times New Roman" w:hAnsi="Times New Roman" w:cs="Times New Roman"/>
+          <w:sz w:val="24"/>
+          <w:szCs w:val="24"/>
+        </w:rPr>
+        <w:t>.</w:t>
       </w:r>
     </w:p>
     <w:p>
@@ -5117,7 +5232,123 @@
           <w:sz w:val="24"/>
           <w:szCs w:val="24"/>
         </w:rPr>
-        <w:t xml:space="preserve">Hingga saat ini, proses pelaporan kerusakan jalan oleh masyarakat umumnya dilakukan secara manual melalui formulir online seperti Google Forms. Meskipun praktis, metode ini memiliki beberapa keterbatasan, termasuk ketidakhadiran sistem validasi otomatis untuk foto yang dikirimkan, kesulitan dalam pengelolaan data, dan kurangnya transparansi antara masyarakat dan lembaga terkait. Untuk mengatasi masalah ini, dikembangkan sistem pelaporan berbasis web bernama Jalan Peduli, yang </w:t>
+        <w:t xml:space="preserve">Hingga saat ini, proses pelaporan kerusakan jalan oleh masyarakat umumnya dilakukan secara manual melalui formulir </w:t>
+      </w:r>
+      <w:r>
+        <w:rPr>
+          <w:rFonts w:ascii="Times New Roman" w:eastAsia="Times New Roman" w:hAnsi="Times New Roman" w:cs="Times New Roman"/>
+          <w:i/>
+          <w:iCs/>
+          <w:sz w:val="24"/>
+          <w:szCs w:val="24"/>
+        </w:rPr>
+        <w:t>online</w:t>
+      </w:r>
+      <w:r>
+        <w:rPr>
+          <w:rFonts w:ascii="Times New Roman" w:eastAsia="Times New Roman" w:hAnsi="Times New Roman" w:cs="Times New Roman"/>
+          <w:sz w:val="24"/>
+          <w:szCs w:val="24"/>
+        </w:rPr>
+        <w:t xml:space="preserve"> seperti Google Forms. Meskipun praktis, metode ini memiliki beberapa keterbatasan, termasuk ketidakhadiran sistem validasi otomatis untuk foto yang dikirimkan, kesulitan dalam pengelolaan data, dan kurangnya transparansi antara masyarakat dan lembaga terkait</w:t>
+      </w:r>
+      <w:r>
+        <w:rPr>
+          <w:rFonts w:ascii="Times New Roman" w:eastAsia="Times New Roman" w:hAnsi="Times New Roman" w:cs="Times New Roman"/>
+          <w:sz w:val="24"/>
+          <w:szCs w:val="24"/>
+        </w:rPr>
+        <w:t xml:space="preserve"> </w:t>
+      </w:r>
+      <w:sdt>
+        <w:sdtPr>
+          <w:rPr>
+            <w:rFonts w:ascii="Times New Roman" w:eastAsia="Times New Roman" w:hAnsi="Times New Roman" w:cs="Times New Roman"/>
+            <w:color w:val="000000"/>
+            <w:sz w:val="24"/>
+            <w:szCs w:val="24"/>
+          </w:rPr>
+          <w:tag w:val="MENDELEY_CITATION_v3_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"/>
+          <w:id w:val="1017893089"/>
+          <w:placeholder>
+            <w:docPart w:val="DefaultPlaceholder_-1854013440"/>
+          </w:placeholder>
+        </w:sdtPr>
+        <w:sdtContent>
+          <w:r>
+            <w:rPr>
+              <w:rFonts w:eastAsia="Times New Roman"/>
+              <w:color w:val="000000"/>
+              <w:sz w:val="24"/>
+            </w:rPr>
+            <w:t>(Nizamiyati &amp; Brilliant, 2024)</w:t>
+          </w:r>
+        </w:sdtContent>
+      </w:sdt>
+      <w:r>
+        <w:rPr>
+          <w:rFonts w:ascii="Times New Roman" w:eastAsia="Times New Roman" w:hAnsi="Times New Roman" w:cs="Times New Roman"/>
+          <w:sz w:val="24"/>
+          <w:szCs w:val="24"/>
+        </w:rPr>
+        <w:t xml:space="preserve">. </w:t>
+      </w:r>
+      <w:r>
+        <w:rPr>
+          <w:rFonts w:ascii="Times New Roman" w:eastAsia="Times New Roman" w:hAnsi="Times New Roman" w:cs="Times New Roman"/>
+          <w:sz w:val="24"/>
+          <w:szCs w:val="24"/>
+        </w:rPr>
+        <w:t>Penelitian oleh</w:t>
+      </w:r>
+      <w:r>
+        <w:rPr>
+          <w:rFonts w:ascii="Times New Roman" w:eastAsia="Times New Roman" w:hAnsi="Times New Roman" w:cs="Times New Roman"/>
+          <w:sz w:val="24"/>
+          <w:szCs w:val="24"/>
+        </w:rPr>
+        <w:t xml:space="preserve"> </w:t>
+      </w:r>
+      <w:sdt>
+        <w:sdtPr>
+          <w:rPr>
+            <w:rFonts w:ascii="Times New Roman" w:eastAsia="Times New Roman" w:hAnsi="Times New Roman" w:cs="Times New Roman"/>
+            <w:color w:val="000000"/>
+            <w:sz w:val="24"/>
+            <w:szCs w:val="28"/>
+          </w:rPr>
+          <w:tag w:val="MENDELEY_CITATION_v3_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"/>
+          <w:id w:val="1417748455"/>
+          <w:placeholder>
+            <w:docPart w:val="DefaultPlaceholder_-1854013440"/>
+          </w:placeholder>
+        </w:sdtPr>
+        <w:sdtContent>
+          <w:r>
+            <w:rPr>
+              <w:rFonts w:ascii="Times New Roman" w:eastAsia="Times New Roman" w:hAnsi="Times New Roman" w:cs="Times New Roman"/>
+              <w:color w:val="000000"/>
+              <w:sz w:val="24"/>
+            </w:rPr>
+            <w:t>(Falasyfa &amp; Avianto, 2024)</w:t>
+          </w:r>
+        </w:sdtContent>
+      </w:sdt>
+      <w:r>
+        <w:rPr>
+          <w:rFonts w:ascii="Times New Roman" w:eastAsia="Times New Roman" w:hAnsi="Times New Roman" w:cs="Times New Roman"/>
+          <w:sz w:val="24"/>
+          <w:szCs w:val="24"/>
+        </w:rPr>
+        <w:t xml:space="preserve"> </w:t>
+      </w:r>
+      <w:r>
+        <w:rPr>
+          <w:rFonts w:ascii="Times New Roman" w:eastAsia="Times New Roman" w:hAnsi="Times New Roman" w:cs="Times New Roman"/>
+          <w:sz w:val="24"/>
+          <w:szCs w:val="24"/>
+        </w:rPr>
+        <w:t xml:space="preserve">juga menunjukkan bahwa pelaporan secara manual sering menimbulkan permasalahan seperti keterlambatan penanganan, data yang tidak terorganisir, dan minimnya umpan balik kepada pelapor. Berdasarkan kondisi tersebut, dikembangkan sistem pelaporan berbasis web bernama Jalan Peduli, yang </w:t>
       </w:r>
       <w:r>
         <w:rPr>
@@ -5126,7 +5357,7 @@
           <w:szCs w:val="24"/>
         </w:rPr>
         <w:lastRenderedPageBreak/>
-        <w:t>memungkinkan masyarakat melaporkan kerusakan jalan dengan lebih mudah dan terstruktur.</w:t>
+        <w:t>dirancang agar proses pelaporan dapat dilakukan secara lebih terstruktur, transparan, dan efisien.</w:t>
       </w:r>
     </w:p>
     <w:p>
@@ -5158,7 +5389,252 @@
           <w:sz w:val="24"/>
           <w:szCs w:val="24"/>
         </w:rPr>
-        <w:t>Namun, sistem ini masih memiliki kelemahan pada tahap validasi laporan. Proses verifikasi kondisi jalan masih dilakukan secara manual oleh petugas yang memeriksa foto-foto yang dikirimkan oleh masyarakat satu per satu. Proses ini memakan waktu, rentan terhadap kesalahan manusia, dan tidak efisien pada skala besar. Oleh karena itu, diperlukan teknologi yang dapat secara otomatis dan akurat mengklasifikasikan jenis dan tingkat kerusakan jalan, sehingga mempercepat pengambilan keputusan oleh pihak berwenang.</w:t>
+        <w:t>Namun, sistem ini masih memiliki kelemahan pada tahap validasi laporan. Proses verifikasi kondisi jalan masih dilakukan secara manual oleh petugas yang memeriksa foto-foto yang dikirimkan oleh masyarakat satu per satu</w:t>
+      </w:r>
+      <w:r>
+        <w:rPr>
+          <w:rFonts w:ascii="Times New Roman" w:eastAsia="Times New Roman" w:hAnsi="Times New Roman" w:cs="Times New Roman"/>
+          <w:sz w:val="24"/>
+          <w:szCs w:val="24"/>
+        </w:rPr>
+        <w:t xml:space="preserve"> </w:t>
+      </w:r>
+      <w:sdt>
+        <w:sdtPr>
+          <w:rPr>
+            <w:rFonts w:ascii="Times New Roman" w:eastAsia="Times New Roman" w:hAnsi="Times New Roman" w:cs="Times New Roman"/>
+            <w:color w:val="000000"/>
+            <w:sz w:val="24"/>
+            <w:szCs w:val="24"/>
+          </w:rPr>
+          <w:tag w:val="MENDELEY_CITATION_v3_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"/>
+          <w:id w:val="-1194155076"/>
+          <w:placeholder>
+            <w:docPart w:val="DefaultPlaceholder_-1854013440"/>
+          </w:placeholder>
+        </w:sdtPr>
+        <w:sdtContent>
+          <w:r>
+            <w:rPr>
+              <w:rFonts w:ascii="Times New Roman" w:eastAsia="Times New Roman" w:hAnsi="Times New Roman" w:cs="Times New Roman"/>
+              <w:color w:val="000000"/>
+              <w:sz w:val="24"/>
+              <w:szCs w:val="24"/>
+            </w:rPr>
+            <w:t>(Probo Sumirat et al., 2021)</w:t>
+          </w:r>
+        </w:sdtContent>
+      </w:sdt>
+      <w:r>
+        <w:rPr>
+          <w:rFonts w:ascii="Times New Roman" w:eastAsia="Times New Roman" w:hAnsi="Times New Roman" w:cs="Times New Roman"/>
+          <w:sz w:val="24"/>
+          <w:szCs w:val="24"/>
+        </w:rPr>
+        <w:t xml:space="preserve">. </w:t>
+      </w:r>
+      <w:r>
+        <w:rPr>
+          <w:rFonts w:ascii="Times New Roman" w:eastAsia="Times New Roman" w:hAnsi="Times New Roman" w:cs="Times New Roman"/>
+          <w:sz w:val="24"/>
+          <w:szCs w:val="24"/>
+        </w:rPr>
+        <w:t>Proses ini memakan waktu, rentan terhadap kesalahan manusia karena bersifat sangat subjektif dan tergantung dari penilai</w:t>
+      </w:r>
+      <w:r>
+        <w:rPr>
+          <w:rFonts w:ascii="Times New Roman" w:eastAsia="Times New Roman" w:hAnsi="Times New Roman" w:cs="Times New Roman"/>
+          <w:sz w:val="24"/>
+          <w:szCs w:val="24"/>
+        </w:rPr>
+        <w:t xml:space="preserve"> </w:t>
+      </w:r>
+      <w:sdt>
+        <w:sdtPr>
+          <w:rPr>
+            <w:rFonts w:ascii="Times New Roman" w:eastAsia="Times New Roman" w:hAnsi="Times New Roman" w:cs="Times New Roman"/>
+            <w:color w:val="000000"/>
+            <w:sz w:val="24"/>
+            <w:szCs w:val="24"/>
+          </w:rPr>
+          <w:tag w:val="MENDELEY_CITATION_v3_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"/>
+          <w:id w:val="1595823228"/>
+          <w:placeholder>
+            <w:docPart w:val="DefaultPlaceholder_-1854013440"/>
+          </w:placeholder>
+        </w:sdtPr>
+        <w:sdtContent>
+          <w:r>
+            <w:rPr>
+              <w:rFonts w:ascii="Times New Roman" w:eastAsia="Times New Roman" w:hAnsi="Times New Roman" w:cs="Times New Roman"/>
+              <w:color w:val="000000"/>
+              <w:sz w:val="24"/>
+              <w:szCs w:val="24"/>
+            </w:rPr>
+            <w:t>(Angreni, 2024)</w:t>
+          </w:r>
+        </w:sdtContent>
+      </w:sdt>
+      <w:r>
+        <w:rPr>
+          <w:rFonts w:ascii="Times New Roman" w:eastAsia="Times New Roman" w:hAnsi="Times New Roman" w:cs="Times New Roman"/>
+          <w:sz w:val="24"/>
+          <w:szCs w:val="24"/>
+        </w:rPr>
+        <w:t xml:space="preserve">, </w:t>
+      </w:r>
+      <w:r>
+        <w:rPr>
+          <w:rFonts w:ascii="Times New Roman" w:eastAsia="Times New Roman" w:hAnsi="Times New Roman" w:cs="Times New Roman"/>
+          <w:sz w:val="24"/>
+          <w:szCs w:val="24"/>
+        </w:rPr>
+        <w:t>serta tidak efisien pada skala besar</w:t>
+      </w:r>
+      <w:r>
+        <w:rPr>
+          <w:rFonts w:ascii="Times New Roman" w:eastAsia="Times New Roman" w:hAnsi="Times New Roman" w:cs="Times New Roman"/>
+          <w:sz w:val="24"/>
+          <w:szCs w:val="24"/>
+        </w:rPr>
+        <w:t xml:space="preserve"> </w:t>
+      </w:r>
+      <w:sdt>
+        <w:sdtPr>
+          <w:rPr>
+            <w:rFonts w:ascii="Times New Roman" w:eastAsia="Times New Roman" w:hAnsi="Times New Roman" w:cs="Times New Roman"/>
+            <w:color w:val="000000"/>
+            <w:sz w:val="24"/>
+            <w:szCs w:val="24"/>
+          </w:rPr>
+          <w:tag w:val="MENDELEY_CITATION_v3_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"/>
+          <w:id w:val="874512484"/>
+          <w:placeholder>
+            <w:docPart w:val="DefaultPlaceholder_-1854013440"/>
+          </w:placeholder>
+        </w:sdtPr>
+        <w:sdtContent>
+          <w:r>
+            <w:rPr>
+              <w:rFonts w:ascii="Times New Roman" w:eastAsia="Times New Roman" w:hAnsi="Times New Roman" w:cs="Times New Roman"/>
+              <w:color w:val="000000"/>
+              <w:sz w:val="24"/>
+              <w:szCs w:val="24"/>
+            </w:rPr>
+            <w:t>(Pandapotan et al., 2020)</w:t>
+          </w:r>
+        </w:sdtContent>
+      </w:sdt>
+      <w:r>
+        <w:rPr>
+          <w:rFonts w:ascii="Times New Roman" w:eastAsia="Times New Roman" w:hAnsi="Times New Roman" w:cs="Times New Roman"/>
+          <w:sz w:val="24"/>
+          <w:szCs w:val="24"/>
+        </w:rPr>
+        <w:t xml:space="preserve"> </w:t>
+      </w:r>
+      <w:r>
+        <w:rPr>
+          <w:rFonts w:ascii="Times New Roman" w:eastAsia="Times New Roman" w:hAnsi="Times New Roman" w:cs="Times New Roman"/>
+          <w:sz w:val="24"/>
+          <w:szCs w:val="24"/>
+        </w:rPr>
+        <w:t>Oleh karena itu, diperlukan teknologi yang dapat secara otomatis dan akurat mengklasifikasikan jenis dan tingkat kerusakan jalan menggunakan metode machine learning</w:t>
+      </w:r>
+      <w:r>
+        <w:rPr>
+          <w:rFonts w:ascii="Times New Roman" w:eastAsia="Times New Roman" w:hAnsi="Times New Roman" w:cs="Times New Roman"/>
+          <w:sz w:val="24"/>
+          <w:szCs w:val="24"/>
+        </w:rPr>
+        <w:t xml:space="preserve"> </w:t>
+      </w:r>
+      <w:sdt>
+        <w:sdtPr>
+          <w:rPr>
+            <w:rFonts w:ascii="Times New Roman" w:eastAsia="Times New Roman" w:hAnsi="Times New Roman" w:cs="Times New Roman"/>
+            <w:color w:val="000000"/>
+            <w:sz w:val="24"/>
+            <w:szCs w:val="24"/>
+          </w:rPr>
+          <w:tag w:val="MENDELEY_CITATION_v3_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"/>
+          <w:id w:val="2098588885"/>
+          <w:placeholder>
+            <w:docPart w:val="DefaultPlaceholder_-1854013440"/>
+          </w:placeholder>
+        </w:sdtPr>
+        <w:sdtContent>
+          <w:r>
+            <w:rPr>
+              <w:rFonts w:ascii="Times New Roman" w:eastAsia="Times New Roman" w:hAnsi="Times New Roman" w:cs="Times New Roman"/>
+              <w:color w:val="000000"/>
+              <w:sz w:val="24"/>
+              <w:szCs w:val="24"/>
+            </w:rPr>
+            <w:t>(Rahman et al., 2025)</w:t>
+          </w:r>
+        </w:sdtContent>
+      </w:sdt>
+      <w:r>
+        <w:rPr>
+          <w:rFonts w:ascii="Times New Roman" w:eastAsia="Times New Roman" w:hAnsi="Times New Roman" w:cs="Times New Roman"/>
+          <w:color w:val="000000"/>
+          <w:sz w:val="24"/>
+          <w:szCs w:val="24"/>
+        </w:rPr>
+        <w:t xml:space="preserve">, </w:t>
+      </w:r>
+      <w:r>
+        <w:rPr>
+          <w:rFonts w:ascii="Times New Roman" w:eastAsia="Times New Roman" w:hAnsi="Times New Roman" w:cs="Times New Roman"/>
+          <w:color w:val="000000"/>
+          <w:sz w:val="24"/>
+          <w:szCs w:val="24"/>
+        </w:rPr>
+        <w:t>sehingga mempercepat pengambilan keputusan oleh pihak berwenang dan mendukung efisiensi biaya serta waktu dalam pemantauan berkelanjutan</w:t>
+      </w:r>
+      <w:r>
+        <w:rPr>
+          <w:rFonts w:ascii="Times New Roman" w:eastAsia="Times New Roman" w:hAnsi="Times New Roman" w:cs="Times New Roman"/>
+          <w:color w:val="000000"/>
+          <w:sz w:val="24"/>
+          <w:szCs w:val="24"/>
+        </w:rPr>
+        <w:t xml:space="preserve"> </w:t>
+      </w:r>
+      <w:sdt>
+        <w:sdtPr>
+          <w:rPr>
+            <w:rFonts w:ascii="Times New Roman" w:eastAsia="Times New Roman" w:hAnsi="Times New Roman" w:cs="Times New Roman"/>
+            <w:color w:val="000000"/>
+            <w:sz w:val="24"/>
+            <w:szCs w:val="24"/>
+          </w:rPr>
+          <w:tag w:val="MENDELEY_CITATION_v3_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"/>
+          <w:id w:val="284859622"/>
+          <w:placeholder>
+            <w:docPart w:val="DefaultPlaceholder_-1854013440"/>
+          </w:placeholder>
+        </w:sdtPr>
+        <w:sdtContent>
+          <w:r>
+            <w:rPr>
+              <w:rFonts w:ascii="Times New Roman" w:eastAsia="Times New Roman" w:hAnsi="Times New Roman" w:cs="Times New Roman"/>
+              <w:color w:val="000000"/>
+              <w:sz w:val="24"/>
+            </w:rPr>
+            <w:t>(Denaro &amp; Lim, 2025)</w:t>
+          </w:r>
+        </w:sdtContent>
+      </w:sdt>
+      <w:r>
+        <w:rPr>
+          <w:rFonts w:ascii="Times New Roman" w:eastAsia="Times New Roman" w:hAnsi="Times New Roman" w:cs="Times New Roman"/>
+          <w:color w:val="000000"/>
+          <w:sz w:val="24"/>
+          <w:szCs w:val="24"/>
+        </w:rPr>
+        <w:t>.</w:t>
       </w:r>
     </w:p>
     <w:p>
@@ -5190,7 +5666,132 @@
           <w:sz w:val="24"/>
           <w:szCs w:val="24"/>
         </w:rPr>
-        <w:t>Dalam beberapa tahun terakhir, perkembangan teknologi kecerdasan buatan (AI), khususnya di bidang pemrosesan gambar digital, telah membuka peluang besar dalam mendukung pengelolaan infrastruktur publik. Salah satu pendekatan yang paling populer dan teruji dalam analisis gambar adalah Jaringan Saraf Konvolusional (CNN). CNN mampu mengekstrak fitur visual mendalam dari sebuah gambar dan mengklasifikasikan objek berdasarkan pola visual tertentu. Teknologi ini telah digunakan dalam berbagai bidang seperti deteksi retak beton, identifikasi kondisi jalan, dan analisis permukaan aspal.</w:t>
+        <w:t>Dalam beberapa tahun terakhir, perkembangan teknologi kecerdasan buatan (AI), khususnya di bidang pemrosesan gambar digital, telah membuka peluang besar dalam mendukung pengelolaan infrastruktur publik</w:t>
+      </w:r>
+      <w:r>
+        <w:rPr>
+          <w:rFonts w:ascii="Times New Roman" w:eastAsia="Times New Roman" w:hAnsi="Times New Roman" w:cs="Times New Roman"/>
+          <w:sz w:val="24"/>
+          <w:szCs w:val="24"/>
+        </w:rPr>
+        <w:t xml:space="preserve"> </w:t>
+      </w:r>
+      <w:sdt>
+        <w:sdtPr>
+          <w:rPr>
+            <w:rFonts w:ascii="Times New Roman" w:eastAsia="Times New Roman" w:hAnsi="Times New Roman" w:cs="Times New Roman"/>
+            <w:color w:val="000000"/>
+            <w:sz w:val="24"/>
+            <w:szCs w:val="24"/>
+          </w:rPr>
+          <w:tag w:val="MENDELEY_CITATION_v3_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"/>
+          <w:id w:val="2041309934"/>
+          <w:placeholder>
+            <w:docPart w:val="DefaultPlaceholder_-1854013440"/>
+          </w:placeholder>
+        </w:sdtPr>
+        <w:sdtContent>
+          <w:r>
+            <w:rPr>
+              <w:rFonts w:ascii="Times New Roman" w:eastAsia="Times New Roman" w:hAnsi="Times New Roman" w:cs="Times New Roman"/>
+              <w:color w:val="000000"/>
+              <w:sz w:val="24"/>
+            </w:rPr>
+            <w:t>(Harahap &amp; Kembaren, 2025)</w:t>
+          </w:r>
+        </w:sdtContent>
+      </w:sdt>
+      <w:r>
+        <w:rPr>
+          <w:rFonts w:ascii="Times New Roman" w:eastAsia="Times New Roman" w:hAnsi="Times New Roman" w:cs="Times New Roman"/>
+          <w:sz w:val="24"/>
+          <w:szCs w:val="24"/>
+        </w:rPr>
+        <w:t>. Salah satu pendekatan yang paling populer dan teruji dalam analisis gambar adalah Jaringan Saraf Konvolusional (CNN). CNN mampu mengekstrak fitur visual mendalam dari sebuah gambar dan mengklasifikasikan objek berdasarkan pola visual tertentu</w:t>
+      </w:r>
+      <w:r>
+        <w:rPr>
+          <w:rFonts w:ascii="Times New Roman" w:eastAsia="Times New Roman" w:hAnsi="Times New Roman" w:cs="Times New Roman"/>
+          <w:sz w:val="24"/>
+          <w:szCs w:val="24"/>
+        </w:rPr>
+        <w:t xml:space="preserve"> </w:t>
+      </w:r>
+      <w:sdt>
+        <w:sdtPr>
+          <w:rPr>
+            <w:rFonts w:ascii="Times New Roman" w:eastAsia="Times New Roman" w:hAnsi="Times New Roman" w:cs="Times New Roman"/>
+            <w:color w:val="000000"/>
+            <w:sz w:val="24"/>
+            <w:szCs w:val="24"/>
+          </w:rPr>
+          <w:tag w:val="MENDELEY_CITATION_v3_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"/>
+          <w:id w:val="-599639811"/>
+          <w:placeholder>
+            <w:docPart w:val="DefaultPlaceholder_-1854013440"/>
+          </w:placeholder>
+        </w:sdtPr>
+        <w:sdtContent>
+          <w:r>
+            <w:rPr>
+              <w:rFonts w:ascii="Times New Roman" w:eastAsia="Times New Roman" w:hAnsi="Times New Roman" w:cs="Times New Roman"/>
+              <w:color w:val="000000"/>
+              <w:sz w:val="24"/>
+              <w:szCs w:val="24"/>
+            </w:rPr>
+            <w:t>(Zhang et al., 2022)</w:t>
+          </w:r>
+        </w:sdtContent>
+      </w:sdt>
+      <w:r>
+        <w:rPr>
+          <w:rFonts w:ascii="Times New Roman" w:eastAsia="Times New Roman" w:hAnsi="Times New Roman" w:cs="Times New Roman"/>
+          <w:sz w:val="24"/>
+          <w:szCs w:val="24"/>
+        </w:rPr>
+        <w:t>. Teknologi ini telah digunakan dalam berbagai bidang seperti deteksi retak beton, identifikasi kondisi jalan, dan analisis permukaan aspal</w:t>
+      </w:r>
+      <w:r>
+        <w:rPr>
+          <w:rFonts w:ascii="Times New Roman" w:eastAsia="Times New Roman" w:hAnsi="Times New Roman" w:cs="Times New Roman"/>
+          <w:sz w:val="24"/>
+          <w:szCs w:val="24"/>
+        </w:rPr>
+        <w:t xml:space="preserve"> </w:t>
+      </w:r>
+      <w:sdt>
+        <w:sdtPr>
+          <w:rPr>
+            <w:rFonts w:ascii="Times New Roman" w:eastAsia="Times New Roman" w:hAnsi="Times New Roman" w:cs="Times New Roman"/>
+            <w:color w:val="000000"/>
+            <w:sz w:val="24"/>
+            <w:szCs w:val="24"/>
+          </w:rPr>
+          <w:tag w:val="MENDELEY_CITATION_v3_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"/>
+          <w:id w:val="972795052"/>
+          <w:placeholder>
+            <w:docPart w:val="DefaultPlaceholder_-1854013440"/>
+          </w:placeholder>
+        </w:sdtPr>
+        <w:sdtContent>
+          <w:r>
+            <w:rPr>
+              <w:rFonts w:ascii="Times New Roman" w:eastAsia="Times New Roman" w:hAnsi="Times New Roman" w:cs="Times New Roman"/>
+              <w:color w:val="000000"/>
+              <w:sz w:val="24"/>
+              <w:szCs w:val="24"/>
+            </w:rPr>
+            <w:t>(Kulambayev et al., 2024)</w:t>
+          </w:r>
+        </w:sdtContent>
+      </w:sdt>
+      <w:r>
+        <w:rPr>
+          <w:rFonts w:ascii="Times New Roman" w:eastAsia="Times New Roman" w:hAnsi="Times New Roman" w:cs="Times New Roman"/>
+          <w:sz w:val="24"/>
+          <w:szCs w:val="24"/>
+        </w:rPr>
+        <w:t>.</w:t>
       </w:r>
     </w:p>
     <w:p>
@@ -5222,7 +5823,163 @@
           <w:sz w:val="24"/>
           <w:szCs w:val="24"/>
         </w:rPr>
-        <w:t>Dalam konteks penelitian ini, penerapan CNN diharapkan dapat membantu sistem Jalan Peduli dalam mengidentifikasi jenis kerusakan jalan, seperti retak, lubang, atau keausan, serta menentukan tingkat keparahan kerusakan. Dengan demikian, sistem tidak hanya berfungsi sebagai alat pelaporan tetapi juga sebagai alat analitis yang mendukung validasi data secara otomatis. Hal ini diharapkan dapat meningkatkan kecepatan, akurasi, dan efisiensi proses tindak lanjut perbaikan jalan.</w:t>
+        <w:t>Dalam konteks penelitian ini, penerapan CNN diharapkan dapat membantu sistem Jalan Peduli dalam mengidentifikasi jenis kerusakan jalan, seperti retak, lubang, atau keausan, serta menentukan tingkat keparahan kerusakan</w:t>
+      </w:r>
+      <w:r>
+        <w:rPr>
+          <w:rFonts w:ascii="Times New Roman" w:eastAsia="Times New Roman" w:hAnsi="Times New Roman" w:cs="Times New Roman"/>
+          <w:sz w:val="24"/>
+          <w:szCs w:val="24"/>
+        </w:rPr>
+        <w:t xml:space="preserve"> </w:t>
+      </w:r>
+      <w:sdt>
+        <w:sdtPr>
+          <w:rPr>
+            <w:rFonts w:ascii="Times New Roman" w:eastAsia="Times New Roman" w:hAnsi="Times New Roman" w:cs="Times New Roman"/>
+            <w:color w:val="000000"/>
+            <w:sz w:val="24"/>
+            <w:szCs w:val="24"/>
+          </w:rPr>
+          <w:tag w:val="MENDELEY_CITATION_v3_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"/>
+          <w:id w:val="-1486162501"/>
+          <w:placeholder>
+            <w:docPart w:val="DefaultPlaceholder_-1854013440"/>
+          </w:placeholder>
+        </w:sdtPr>
+        <w:sdtContent>
+          <w:r>
+            <w:rPr>
+              <w:rFonts w:ascii="Times New Roman" w:eastAsia="Times New Roman" w:hAnsi="Times New Roman" w:cs="Times New Roman"/>
+              <w:color w:val="000000"/>
+              <w:sz w:val="24"/>
+              <w:szCs w:val="24"/>
+            </w:rPr>
+            <w:t>(Mulyana et al., 2025)</w:t>
+          </w:r>
+        </w:sdtContent>
+      </w:sdt>
+      <w:r>
+        <w:rPr>
+          <w:rFonts w:ascii="Times New Roman" w:eastAsia="Times New Roman" w:hAnsi="Times New Roman" w:cs="Times New Roman"/>
+          <w:sz w:val="24"/>
+          <w:szCs w:val="24"/>
+        </w:rPr>
+        <w:t xml:space="preserve">. </w:t>
+      </w:r>
+      <w:r>
+        <w:rPr>
+          <w:rFonts w:ascii="Times New Roman" w:eastAsia="Times New Roman" w:hAnsi="Times New Roman" w:cs="Times New Roman"/>
+          <w:sz w:val="24"/>
+          <w:szCs w:val="24"/>
+        </w:rPr>
+        <w:t>Seperti yang ditunjukkan oleh penelitian serupa, model CNN berbasis Inception ResNet-V2 mampu mengklasifikasikan kerusakan serupa dengan akurasi hingga 95%, sehingga mendukung validasi data secara otomatis</w:t>
+      </w:r>
+      <w:r>
+        <w:rPr>
+          <w:rFonts w:ascii="Times New Roman" w:eastAsia="Times New Roman" w:hAnsi="Times New Roman" w:cs="Times New Roman"/>
+          <w:sz w:val="24"/>
+          <w:szCs w:val="24"/>
+        </w:rPr>
+        <w:t xml:space="preserve"> </w:t>
+      </w:r>
+      <w:sdt>
+        <w:sdtPr>
+          <w:rPr>
+            <w:rFonts w:ascii="Times New Roman" w:eastAsia="Times New Roman" w:hAnsi="Times New Roman" w:cs="Times New Roman"/>
+            <w:color w:val="000000"/>
+            <w:sz w:val="24"/>
+            <w:szCs w:val="24"/>
+          </w:rPr>
+          <w:tag w:val="MENDELEY_CITATION_v3_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"/>
+          <w:id w:val="-1984681554"/>
+          <w:placeholder>
+            <w:docPart w:val="DefaultPlaceholder_-1854013440"/>
+          </w:placeholder>
+        </w:sdtPr>
+        <w:sdtContent>
+          <w:r>
+            <w:rPr>
+              <w:rFonts w:ascii="Times New Roman" w:eastAsia="Times New Roman" w:hAnsi="Times New Roman" w:cs="Times New Roman"/>
+              <w:color w:val="000000"/>
+              <w:sz w:val="24"/>
+              <w:szCs w:val="24"/>
+            </w:rPr>
+            <w:t>(Yanni et al., 2025)</w:t>
+          </w:r>
+        </w:sdtContent>
+      </w:sdt>
+      <w:r>
+        <w:rPr>
+          <w:rFonts w:ascii="Times New Roman" w:eastAsia="Times New Roman" w:hAnsi="Times New Roman" w:cs="Times New Roman"/>
+          <w:color w:val="000000"/>
+          <w:sz w:val="24"/>
+          <w:szCs w:val="24"/>
+        </w:rPr>
+        <w:t xml:space="preserve">. </w:t>
+      </w:r>
+      <w:r>
+        <w:rPr>
+          <w:rFonts w:ascii="Times New Roman" w:eastAsia="Times New Roman" w:hAnsi="Times New Roman" w:cs="Times New Roman"/>
+          <w:color w:val="000000"/>
+          <w:sz w:val="24"/>
+          <w:szCs w:val="24"/>
+        </w:rPr>
+        <w:t xml:space="preserve">Dengan demikian, sistem tidak hanya berfungsi sebagai alat pelaporan tetapi juga sebagai alat analitis yang mendukung validasi data secara otomatis. Hal ini diharapkan dapat meningkatkan </w:t>
+      </w:r>
+      <w:r>
+        <w:rPr>
+          <w:rFonts w:ascii="Times New Roman" w:eastAsia="Times New Roman" w:hAnsi="Times New Roman" w:cs="Times New Roman"/>
+          <w:color w:val="000000"/>
+          <w:sz w:val="24"/>
+          <w:szCs w:val="24"/>
+        </w:rPr>
+        <w:lastRenderedPageBreak/>
+        <w:t>kecepatan, akurasi, dan efisiensi proses tindak lanjut perbaikan jalan, sebagaimana dibuktikan oleh perbandingan model VGG19 dan ResNet50 yang mencapai efisiensi lebih tinggi dalam identifikasi tingkat keparahan</w:t>
+      </w:r>
+      <w:r>
+        <w:rPr>
+          <w:rFonts w:ascii="Times New Roman" w:eastAsia="Times New Roman" w:hAnsi="Times New Roman" w:cs="Times New Roman"/>
+          <w:color w:val="000000"/>
+          <w:sz w:val="24"/>
+          <w:szCs w:val="24"/>
+        </w:rPr>
+        <w:t xml:space="preserve"> </w:t>
+      </w:r>
+      <w:sdt>
+        <w:sdtPr>
+          <w:rPr>
+            <w:rFonts w:ascii="Times New Roman" w:eastAsia="Times New Roman" w:hAnsi="Times New Roman" w:cs="Times New Roman"/>
+            <w:color w:val="000000"/>
+            <w:sz w:val="24"/>
+            <w:szCs w:val="24"/>
+          </w:rPr>
+          <w:tag w:val="MENDELEY_CITATION_v3_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"/>
+          <w:id w:val="-1254735408"/>
+          <w:placeholder>
+            <w:docPart w:val="DefaultPlaceholder_-1854013440"/>
+          </w:placeholder>
+        </w:sdtPr>
+        <w:sdtContent>
+          <w:r>
+            <w:rPr>
+              <w:rFonts w:ascii="Times New Roman" w:eastAsia="Times New Roman" w:hAnsi="Times New Roman" w:cs="Times New Roman"/>
+              <w:color w:val="000000"/>
+              <w:sz w:val="24"/>
+              <w:szCs w:val="24"/>
+            </w:rPr>
+            <w:t>(Iradaf Mandaya, n.d.)</w:t>
+          </w:r>
+        </w:sdtContent>
+      </w:sdt>
+      <w:r>
+        <w:rPr>
+          <w:rFonts w:ascii="Times New Roman" w:eastAsia="Times New Roman" w:hAnsi="Times New Roman" w:cs="Times New Roman"/>
+          <w:color w:val="000000"/>
+          <w:sz w:val="24"/>
+          <w:szCs w:val="24"/>
+        </w:rPr>
+        <w:t>.</w:t>
       </w:r>
     </w:p>
     <w:p>
@@ -5254,16 +6011,49 @@
           <w:sz w:val="24"/>
           <w:szCs w:val="24"/>
         </w:rPr>
-        <w:t xml:space="preserve">Selain itu, penelitian ini dilakukan menggunakan dataset lokal, yaitu foto-foto kondisi jalan yang dikumpulkan secara manual di wilayah Kota Samarinda. Pendekatan ini dipilih karena kondisi jalan di setiap wilayah memiliki karakteristik yang berbeda, baik dari segi tekstur permukaan, pencahayaan, maupun pola kerusakan. Dengan </w:t>
-      </w:r>
-      <w:r>
-        <w:rPr>
-          <w:rFonts w:ascii="Times New Roman" w:eastAsia="Times New Roman" w:hAnsi="Times New Roman" w:cs="Times New Roman"/>
-          <w:sz w:val="24"/>
-          <w:szCs w:val="24"/>
-        </w:rPr>
-        <w:lastRenderedPageBreak/>
-        <w:t>menggunakan data lokal, model CNN yang dikembangkan akan lebih adaptif dan relevan dengan kondisi nyata di lapangan, sehingga hasil klasifikasi dapat diterapkan secara lebih efektif di lingkungan lokal.</w:t>
+        <w:t>Selain itu, penelitian ini dilakukan menggunakan dataset lokal, yaitu foto-foto kondisi jalan yang dikumpulkan secara manual di wilayah Kota Samarinda. Pendekatan ini dipilih karena kondisi jalan di setiap wilayah memiliki karakteristik yang berbeda, baik dari segi tekstur permukaan, pencahayaan, maupun pola kerusakan</w:t>
+      </w:r>
+      <w:r>
+        <w:rPr>
+          <w:rFonts w:ascii="Times New Roman" w:eastAsia="Times New Roman" w:hAnsi="Times New Roman" w:cs="Times New Roman"/>
+          <w:sz w:val="24"/>
+          <w:szCs w:val="24"/>
+        </w:rPr>
+        <w:t xml:space="preserve"> </w:t>
+      </w:r>
+      <w:sdt>
+        <w:sdtPr>
+          <w:rPr>
+            <w:rFonts w:ascii="Times New Roman" w:eastAsia="Times New Roman" w:hAnsi="Times New Roman" w:cs="Times New Roman"/>
+            <w:color w:val="000000"/>
+            <w:sz w:val="24"/>
+            <w:szCs w:val="24"/>
+          </w:rPr>
+          <w:tag w:val="MENDELEY_CITATION_v3_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"/>
+          <w:id w:val="-334996906"/>
+          <w:placeholder>
+            <w:docPart w:val="DefaultPlaceholder_-1854013440"/>
+          </w:placeholder>
+        </w:sdtPr>
+        <w:sdtContent>
+          <w:r>
+            <w:rPr>
+              <w:rFonts w:ascii="Times New Roman" w:eastAsia="Times New Roman" w:hAnsi="Times New Roman" w:cs="Times New Roman"/>
+              <w:color w:val="000000"/>
+              <w:sz w:val="24"/>
+              <w:szCs w:val="24"/>
+            </w:rPr>
+            <w:t>(Hugo et al., 2025)</w:t>
+          </w:r>
+        </w:sdtContent>
+      </w:sdt>
+      <w:r>
+        <w:rPr>
+          <w:rFonts w:ascii="Times New Roman" w:eastAsia="Times New Roman" w:hAnsi="Times New Roman" w:cs="Times New Roman"/>
+          <w:sz w:val="24"/>
+          <w:szCs w:val="24"/>
+        </w:rPr>
+        <w:t>. Dengan menggunakan data lokal, model CNN yang dikembangkan akan lebih adaptif dan relevan dengan kondisi nyata di lapangan, sehingga hasil klasifikasi dapat diterapkan secara lebih efektif di lingkungan lokal.</w:t>
       </w:r>
     </w:p>
     <w:p>
@@ -5295,7 +6085,7 @@
           <w:sz w:val="24"/>
           <w:szCs w:val="24"/>
         </w:rPr>
-        <w:t>Secara keseluruhan, penelitian ini bertujuan untuk mengembangkan sistem klasifikasi jenis dan tingkat kerusakan jalan menggunakan metode CNN sebagai bagian dari pengembangan Jalan Peduli. Hasil penelitian ini diharapkan dapat berkontribusi pada pengembangan teknologi manajemen infrastruktur cerdas dan menjadi acuan untuk penelitian lebih lanjut di bidang kecerdasan buatan dan pemrosesan gambar digital untuk pengembangan regional yang lebih berkelanjutan.</w:t>
+        <w:t>Secara keseluruhan, penelitian ini bertujuan untuk mengembangkan sistem klasifikasi jenis dan tingkat kerusakan jalan menggunakan metode CNN sebagai bagian dari pengembangan Jalan Peduli. Hasil penelitian ini diharapkan dapat berkontribusi pada pengembangan teknologi manajemen infrastruktur cerdas dan menjadi acuan untuk penelitian lebih lanjut di bidang kecerdasan buatan dan pemrosesan gambar digital untuk pengembangan regional yang lebih.</w:t>
       </w:r>
     </w:p>
     <w:p>
@@ -5323,8 +6113,8 @@
           <w:sz w:val="26"/>
         </w:rPr>
       </w:pPr>
-      <w:bookmarkStart w:id="11" w:name="_heading=h.lnxbz9" w:colFirst="0" w:colLast="0"/>
-      <w:bookmarkEnd w:id="11"/>
+      <w:bookmarkStart w:id="9" w:name="_heading=h.lnxbz9" w:colFirst="0" w:colLast="0"/>
+      <w:bookmarkEnd w:id="9"/>
       <w:r>
         <w:rPr>
           <w:sz w:val="26"/>
@@ -5360,8 +6150,1003 @@
           <w:sz w:val="24"/>
           <w:szCs w:val="24"/>
         </w:rPr>
-        <w:t>Berdasarkan latar belakang penelitian, maka yang menjadi rumusan masalah dalam penelitian ini adalah “Bagaimana ……………………………………………………?”.</w:t>
-      </w:r>
+        <w:t xml:space="preserve">Berdasarkan latar belakang penelitian, maka yang menjadi rumusan masalah dalam penelitian ini adalah </w:t>
+      </w:r>
+      <w:r>
+        <w:rPr>
+          <w:rFonts w:ascii="Times New Roman" w:eastAsia="Times New Roman" w:hAnsi="Times New Roman" w:cs="Times New Roman"/>
+          <w:sz w:val="24"/>
+          <w:szCs w:val="24"/>
+        </w:rPr>
+        <w:t>:</w:t>
+      </w:r>
+    </w:p>
+    <w:p>
+      <w:pPr>
+        <w:spacing w:after="0" w:line="360" w:lineRule="auto"/>
+        <w:ind w:firstLine="567"/>
+        <w:jc w:val="both"/>
+        <w:rPr>
+          <w:rFonts w:ascii="Times New Roman" w:eastAsia="Times New Roman" w:hAnsi="Times New Roman" w:cs="Times New Roman"/>
+          <w:sz w:val="24"/>
+          <w:szCs w:val="24"/>
+          <w:lang w:val="en-ID"/>
+        </w:rPr>
+      </w:pPr>
+      <w:r>
+        <w:rPr>
+          <w:rFonts w:ascii="Times New Roman" w:eastAsia="Times New Roman" w:hAnsi="Times New Roman" w:cs="Times New Roman"/>
+          <w:sz w:val="24"/>
+          <w:szCs w:val="24"/>
+          <w:lang w:val="en-ID"/>
+        </w:rPr>
+        <w:t xml:space="preserve">1. </w:t>
+      </w:r>
+      <w:proofErr w:type="spellStart"/>
+      <w:r>
+        <w:rPr>
+          <w:rFonts w:ascii="Times New Roman" w:eastAsia="Times New Roman" w:hAnsi="Times New Roman" w:cs="Times New Roman"/>
+          <w:sz w:val="24"/>
+          <w:szCs w:val="24"/>
+          <w:lang w:val="en-ID"/>
+        </w:rPr>
+        <w:t>Bagaimana</w:t>
+      </w:r>
+      <w:proofErr w:type="spellEnd"/>
+      <w:r>
+        <w:rPr>
+          <w:rFonts w:ascii="Times New Roman" w:eastAsia="Times New Roman" w:hAnsi="Times New Roman" w:cs="Times New Roman"/>
+          <w:sz w:val="24"/>
+          <w:szCs w:val="24"/>
+          <w:lang w:val="en-ID"/>
+        </w:rPr>
+        <w:t xml:space="preserve"> </w:t>
+      </w:r>
+      <w:proofErr w:type="spellStart"/>
+      <w:r>
+        <w:rPr>
+          <w:rFonts w:ascii="Times New Roman" w:eastAsia="Times New Roman" w:hAnsi="Times New Roman" w:cs="Times New Roman"/>
+          <w:sz w:val="24"/>
+          <w:szCs w:val="24"/>
+          <w:lang w:val="en-ID"/>
+        </w:rPr>
+        <w:t>mengintegrasikan</w:t>
+      </w:r>
+      <w:proofErr w:type="spellEnd"/>
+      <w:r>
+        <w:rPr>
+          <w:rFonts w:ascii="Times New Roman" w:eastAsia="Times New Roman" w:hAnsi="Times New Roman" w:cs="Times New Roman"/>
+          <w:sz w:val="24"/>
+          <w:szCs w:val="24"/>
+          <w:lang w:val="en-ID"/>
+        </w:rPr>
+        <w:t xml:space="preserve"> CNN </w:t>
+      </w:r>
+      <w:proofErr w:type="spellStart"/>
+      <w:r>
+        <w:rPr>
+          <w:rFonts w:ascii="Times New Roman" w:eastAsia="Times New Roman" w:hAnsi="Times New Roman" w:cs="Times New Roman"/>
+          <w:sz w:val="24"/>
+          <w:szCs w:val="24"/>
+          <w:lang w:val="en-ID"/>
+        </w:rPr>
+        <w:t>ke</w:t>
+      </w:r>
+      <w:proofErr w:type="spellEnd"/>
+      <w:r>
+        <w:rPr>
+          <w:rFonts w:ascii="Times New Roman" w:eastAsia="Times New Roman" w:hAnsi="Times New Roman" w:cs="Times New Roman"/>
+          <w:sz w:val="24"/>
+          <w:szCs w:val="24"/>
+          <w:lang w:val="en-ID"/>
+        </w:rPr>
+        <w:t xml:space="preserve"> </w:t>
+      </w:r>
+      <w:proofErr w:type="spellStart"/>
+      <w:r>
+        <w:rPr>
+          <w:rFonts w:ascii="Times New Roman" w:eastAsia="Times New Roman" w:hAnsi="Times New Roman" w:cs="Times New Roman"/>
+          <w:sz w:val="24"/>
+          <w:szCs w:val="24"/>
+          <w:lang w:val="en-ID"/>
+        </w:rPr>
+        <w:t>sistem</w:t>
+      </w:r>
+      <w:proofErr w:type="spellEnd"/>
+      <w:r>
+        <w:rPr>
+          <w:rFonts w:ascii="Times New Roman" w:eastAsia="Times New Roman" w:hAnsi="Times New Roman" w:cs="Times New Roman"/>
+          <w:sz w:val="24"/>
+          <w:szCs w:val="24"/>
+          <w:lang w:val="en-ID"/>
+        </w:rPr>
+        <w:t xml:space="preserve"> Jalan </w:t>
+      </w:r>
+      <w:proofErr w:type="spellStart"/>
+      <w:r>
+        <w:rPr>
+          <w:rFonts w:ascii="Times New Roman" w:eastAsia="Times New Roman" w:hAnsi="Times New Roman" w:cs="Times New Roman"/>
+          <w:sz w:val="24"/>
+          <w:szCs w:val="24"/>
+          <w:lang w:val="en-ID"/>
+        </w:rPr>
+        <w:t>Peduli</w:t>
+      </w:r>
+      <w:proofErr w:type="spellEnd"/>
+      <w:r>
+        <w:rPr>
+          <w:rFonts w:ascii="Times New Roman" w:eastAsia="Times New Roman" w:hAnsi="Times New Roman" w:cs="Times New Roman"/>
+          <w:sz w:val="24"/>
+          <w:szCs w:val="24"/>
+          <w:lang w:val="en-ID"/>
+        </w:rPr>
+        <w:t xml:space="preserve"> </w:t>
+      </w:r>
+      <w:proofErr w:type="spellStart"/>
+      <w:r>
+        <w:rPr>
+          <w:rFonts w:ascii="Times New Roman" w:eastAsia="Times New Roman" w:hAnsi="Times New Roman" w:cs="Times New Roman"/>
+          <w:sz w:val="24"/>
+          <w:szCs w:val="24"/>
+          <w:lang w:val="en-ID"/>
+        </w:rPr>
+        <w:t>untuk</w:t>
+      </w:r>
+      <w:proofErr w:type="spellEnd"/>
+      <w:r>
+        <w:rPr>
+          <w:rFonts w:ascii="Times New Roman" w:eastAsia="Times New Roman" w:hAnsi="Times New Roman" w:cs="Times New Roman"/>
+          <w:sz w:val="24"/>
+          <w:szCs w:val="24"/>
+          <w:lang w:val="en-ID"/>
+        </w:rPr>
+        <w:t xml:space="preserve"> </w:t>
+      </w:r>
+      <w:proofErr w:type="spellStart"/>
+      <w:r>
+        <w:rPr>
+          <w:rFonts w:ascii="Times New Roman" w:eastAsia="Times New Roman" w:hAnsi="Times New Roman" w:cs="Times New Roman"/>
+          <w:sz w:val="24"/>
+          <w:szCs w:val="24"/>
+          <w:lang w:val="en-ID"/>
+        </w:rPr>
+        <w:t>klasifikasi</w:t>
+      </w:r>
+      <w:proofErr w:type="spellEnd"/>
+      <w:r>
+        <w:rPr>
+          <w:rFonts w:ascii="Times New Roman" w:eastAsia="Times New Roman" w:hAnsi="Times New Roman" w:cs="Times New Roman"/>
+          <w:sz w:val="24"/>
+          <w:szCs w:val="24"/>
+          <w:lang w:val="en-ID"/>
+        </w:rPr>
+        <w:t xml:space="preserve"> </w:t>
+      </w:r>
+      <w:proofErr w:type="spellStart"/>
+      <w:r>
+        <w:rPr>
+          <w:rFonts w:ascii="Times New Roman" w:eastAsia="Times New Roman" w:hAnsi="Times New Roman" w:cs="Times New Roman"/>
+          <w:sz w:val="24"/>
+          <w:szCs w:val="24"/>
+          <w:lang w:val="en-ID"/>
+        </w:rPr>
+        <w:t>otomatis</w:t>
+      </w:r>
+      <w:proofErr w:type="spellEnd"/>
+      <w:r>
+        <w:rPr>
+          <w:rFonts w:ascii="Times New Roman" w:eastAsia="Times New Roman" w:hAnsi="Times New Roman" w:cs="Times New Roman"/>
+          <w:sz w:val="24"/>
+          <w:szCs w:val="24"/>
+          <w:lang w:val="en-ID"/>
+        </w:rPr>
+        <w:t xml:space="preserve"> </w:t>
+      </w:r>
+      <w:proofErr w:type="spellStart"/>
+      <w:r>
+        <w:rPr>
+          <w:rFonts w:ascii="Times New Roman" w:eastAsia="Times New Roman" w:hAnsi="Times New Roman" w:cs="Times New Roman"/>
+          <w:sz w:val="24"/>
+          <w:szCs w:val="24"/>
+          <w:lang w:val="en-ID"/>
+        </w:rPr>
+        <w:t>jenis</w:t>
+      </w:r>
+      <w:proofErr w:type="spellEnd"/>
+      <w:r>
+        <w:rPr>
+          <w:rFonts w:ascii="Times New Roman" w:eastAsia="Times New Roman" w:hAnsi="Times New Roman" w:cs="Times New Roman"/>
+          <w:sz w:val="24"/>
+          <w:szCs w:val="24"/>
+          <w:lang w:val="en-ID"/>
+        </w:rPr>
+        <w:t xml:space="preserve"> (</w:t>
+      </w:r>
+      <w:proofErr w:type="spellStart"/>
+      <w:r>
+        <w:rPr>
+          <w:rFonts w:ascii="Times New Roman" w:eastAsia="Times New Roman" w:hAnsi="Times New Roman" w:cs="Times New Roman"/>
+          <w:sz w:val="24"/>
+          <w:szCs w:val="24"/>
+          <w:lang w:val="en-ID"/>
+        </w:rPr>
+        <w:t>retak</w:t>
+      </w:r>
+      <w:proofErr w:type="spellEnd"/>
+      <w:r>
+        <w:rPr>
+          <w:rFonts w:ascii="Times New Roman" w:eastAsia="Times New Roman" w:hAnsi="Times New Roman" w:cs="Times New Roman"/>
+          <w:sz w:val="24"/>
+          <w:szCs w:val="24"/>
+          <w:lang w:val="en-ID"/>
+        </w:rPr>
+        <w:t xml:space="preserve">, </w:t>
+      </w:r>
+      <w:proofErr w:type="spellStart"/>
+      <w:r>
+        <w:rPr>
+          <w:rFonts w:ascii="Times New Roman" w:eastAsia="Times New Roman" w:hAnsi="Times New Roman" w:cs="Times New Roman"/>
+          <w:sz w:val="24"/>
+          <w:szCs w:val="24"/>
+          <w:lang w:val="en-ID"/>
+        </w:rPr>
+        <w:t>lubang</w:t>
+      </w:r>
+      <w:proofErr w:type="spellEnd"/>
+      <w:r>
+        <w:rPr>
+          <w:rFonts w:ascii="Times New Roman" w:eastAsia="Times New Roman" w:hAnsi="Times New Roman" w:cs="Times New Roman"/>
+          <w:sz w:val="24"/>
+          <w:szCs w:val="24"/>
+          <w:lang w:val="en-ID"/>
+        </w:rPr>
+        <w:t xml:space="preserve">, </w:t>
+      </w:r>
+      <w:proofErr w:type="spellStart"/>
+      <w:r>
+        <w:rPr>
+          <w:rFonts w:ascii="Times New Roman" w:eastAsia="Times New Roman" w:hAnsi="Times New Roman" w:cs="Times New Roman"/>
+          <w:sz w:val="24"/>
+          <w:szCs w:val="24"/>
+          <w:lang w:val="en-ID"/>
+        </w:rPr>
+        <w:t>permukaan</w:t>
+      </w:r>
+      <w:proofErr w:type="spellEnd"/>
+      <w:r>
+        <w:rPr>
+          <w:rFonts w:ascii="Times New Roman" w:eastAsia="Times New Roman" w:hAnsi="Times New Roman" w:cs="Times New Roman"/>
+          <w:sz w:val="24"/>
+          <w:szCs w:val="24"/>
+          <w:lang w:val="en-ID"/>
+        </w:rPr>
+        <w:t xml:space="preserve"> </w:t>
+      </w:r>
+      <w:proofErr w:type="spellStart"/>
+      <w:r>
+        <w:rPr>
+          <w:rFonts w:ascii="Times New Roman" w:eastAsia="Times New Roman" w:hAnsi="Times New Roman" w:cs="Times New Roman"/>
+          <w:sz w:val="24"/>
+          <w:szCs w:val="24"/>
+          <w:lang w:val="en-ID"/>
+        </w:rPr>
+        <w:t>tidak</w:t>
+      </w:r>
+      <w:proofErr w:type="spellEnd"/>
+      <w:r>
+        <w:rPr>
+          <w:rFonts w:ascii="Times New Roman" w:eastAsia="Times New Roman" w:hAnsi="Times New Roman" w:cs="Times New Roman"/>
+          <w:sz w:val="24"/>
+          <w:szCs w:val="24"/>
+          <w:lang w:val="en-ID"/>
+        </w:rPr>
+        <w:t xml:space="preserve"> rata</w:t>
+      </w:r>
+      <w:r>
+        <w:rPr>
+          <w:rFonts w:ascii="Times New Roman" w:eastAsia="Times New Roman" w:hAnsi="Times New Roman" w:cs="Times New Roman"/>
+          <w:sz w:val="24"/>
+          <w:szCs w:val="24"/>
+          <w:lang w:val="en-ID"/>
+        </w:rPr>
+        <w:t xml:space="preserve">) dan </w:t>
+      </w:r>
+      <w:proofErr w:type="spellStart"/>
+      <w:r>
+        <w:rPr>
+          <w:rFonts w:ascii="Times New Roman" w:eastAsia="Times New Roman" w:hAnsi="Times New Roman" w:cs="Times New Roman"/>
+          <w:sz w:val="24"/>
+          <w:szCs w:val="24"/>
+          <w:lang w:val="en-ID"/>
+        </w:rPr>
+        <w:t>tingkat</w:t>
+      </w:r>
+      <w:proofErr w:type="spellEnd"/>
+      <w:r>
+        <w:rPr>
+          <w:rFonts w:ascii="Times New Roman" w:eastAsia="Times New Roman" w:hAnsi="Times New Roman" w:cs="Times New Roman"/>
+          <w:sz w:val="24"/>
+          <w:szCs w:val="24"/>
+          <w:lang w:val="en-ID"/>
+        </w:rPr>
+        <w:t xml:space="preserve"> </w:t>
+      </w:r>
+      <w:proofErr w:type="spellStart"/>
+      <w:r>
+        <w:rPr>
+          <w:rFonts w:ascii="Times New Roman" w:eastAsia="Times New Roman" w:hAnsi="Times New Roman" w:cs="Times New Roman"/>
+          <w:sz w:val="24"/>
+          <w:szCs w:val="24"/>
+          <w:lang w:val="en-ID"/>
+        </w:rPr>
+        <w:t>keparahan</w:t>
+      </w:r>
+      <w:proofErr w:type="spellEnd"/>
+      <w:r>
+        <w:rPr>
+          <w:rFonts w:ascii="Times New Roman" w:eastAsia="Times New Roman" w:hAnsi="Times New Roman" w:cs="Times New Roman"/>
+          <w:sz w:val="24"/>
+          <w:szCs w:val="24"/>
+          <w:lang w:val="en-ID"/>
+        </w:rPr>
+        <w:t xml:space="preserve"> </w:t>
+      </w:r>
+      <w:proofErr w:type="spellStart"/>
+      <w:r>
+        <w:rPr>
+          <w:rFonts w:ascii="Times New Roman" w:eastAsia="Times New Roman" w:hAnsi="Times New Roman" w:cs="Times New Roman"/>
+          <w:sz w:val="24"/>
+          <w:szCs w:val="24"/>
+          <w:lang w:val="en-ID"/>
+        </w:rPr>
+        <w:t>kerusakan</w:t>
+      </w:r>
+      <w:proofErr w:type="spellEnd"/>
+      <w:r>
+        <w:rPr>
+          <w:rFonts w:ascii="Times New Roman" w:eastAsia="Times New Roman" w:hAnsi="Times New Roman" w:cs="Times New Roman"/>
+          <w:sz w:val="24"/>
+          <w:szCs w:val="24"/>
+          <w:lang w:val="en-ID"/>
+        </w:rPr>
+        <w:t xml:space="preserve"> </w:t>
+      </w:r>
+      <w:proofErr w:type="spellStart"/>
+      <w:r>
+        <w:rPr>
+          <w:rFonts w:ascii="Times New Roman" w:eastAsia="Times New Roman" w:hAnsi="Times New Roman" w:cs="Times New Roman"/>
+          <w:sz w:val="24"/>
+          <w:szCs w:val="24"/>
+          <w:lang w:val="en-ID"/>
+        </w:rPr>
+        <w:t>jalan</w:t>
+      </w:r>
+      <w:proofErr w:type="spellEnd"/>
+      <w:r>
+        <w:rPr>
+          <w:rFonts w:ascii="Times New Roman" w:eastAsia="Times New Roman" w:hAnsi="Times New Roman" w:cs="Times New Roman"/>
+          <w:sz w:val="24"/>
+          <w:szCs w:val="24"/>
+          <w:lang w:val="en-ID"/>
+        </w:rPr>
+        <w:t xml:space="preserve"> di </w:t>
+      </w:r>
+      <w:proofErr w:type="spellStart"/>
+      <w:r>
+        <w:rPr>
+          <w:rFonts w:ascii="Times New Roman" w:eastAsia="Times New Roman" w:hAnsi="Times New Roman" w:cs="Times New Roman"/>
+          <w:sz w:val="24"/>
+          <w:szCs w:val="24"/>
+          <w:lang w:val="en-ID"/>
+        </w:rPr>
+        <w:t>Samarinda</w:t>
+      </w:r>
+      <w:proofErr w:type="spellEnd"/>
+      <w:r>
+        <w:rPr>
+          <w:rFonts w:ascii="Times New Roman" w:eastAsia="Times New Roman" w:hAnsi="Times New Roman" w:cs="Times New Roman"/>
+          <w:sz w:val="24"/>
+          <w:szCs w:val="24"/>
+          <w:lang w:val="en-ID"/>
+        </w:rPr>
+        <w:t xml:space="preserve">, </w:t>
+      </w:r>
+      <w:proofErr w:type="spellStart"/>
+      <w:r>
+        <w:rPr>
+          <w:rFonts w:ascii="Times New Roman" w:eastAsia="Times New Roman" w:hAnsi="Times New Roman" w:cs="Times New Roman"/>
+          <w:sz w:val="24"/>
+          <w:szCs w:val="24"/>
+          <w:lang w:val="en-ID"/>
+        </w:rPr>
+        <w:t>mengatasi</w:t>
+      </w:r>
+      <w:proofErr w:type="spellEnd"/>
+      <w:r>
+        <w:rPr>
+          <w:rFonts w:ascii="Times New Roman" w:eastAsia="Times New Roman" w:hAnsi="Times New Roman" w:cs="Times New Roman"/>
+          <w:sz w:val="24"/>
+          <w:szCs w:val="24"/>
+          <w:lang w:val="en-ID"/>
+        </w:rPr>
+        <w:t xml:space="preserve"> </w:t>
+      </w:r>
+      <w:proofErr w:type="spellStart"/>
+      <w:r>
+        <w:rPr>
+          <w:rFonts w:ascii="Times New Roman" w:eastAsia="Times New Roman" w:hAnsi="Times New Roman" w:cs="Times New Roman"/>
+          <w:sz w:val="24"/>
+          <w:szCs w:val="24"/>
+          <w:lang w:val="en-ID"/>
+        </w:rPr>
+        <w:t>keterbatasan</w:t>
+      </w:r>
+      <w:proofErr w:type="spellEnd"/>
+      <w:r>
+        <w:rPr>
+          <w:rFonts w:ascii="Times New Roman" w:eastAsia="Times New Roman" w:hAnsi="Times New Roman" w:cs="Times New Roman"/>
+          <w:sz w:val="24"/>
+          <w:szCs w:val="24"/>
+          <w:lang w:val="en-ID"/>
+        </w:rPr>
+        <w:t xml:space="preserve"> </w:t>
+      </w:r>
+      <w:proofErr w:type="spellStart"/>
+      <w:r>
+        <w:rPr>
+          <w:rFonts w:ascii="Times New Roman" w:eastAsia="Times New Roman" w:hAnsi="Times New Roman" w:cs="Times New Roman"/>
+          <w:sz w:val="24"/>
+          <w:szCs w:val="24"/>
+          <w:lang w:val="en-ID"/>
+        </w:rPr>
+        <w:t>validasi</w:t>
+      </w:r>
+      <w:proofErr w:type="spellEnd"/>
+      <w:r>
+        <w:rPr>
+          <w:rFonts w:ascii="Times New Roman" w:eastAsia="Times New Roman" w:hAnsi="Times New Roman" w:cs="Times New Roman"/>
+          <w:sz w:val="24"/>
+          <w:szCs w:val="24"/>
+          <w:lang w:val="en-ID"/>
+        </w:rPr>
+        <w:t xml:space="preserve"> manual yang </w:t>
+      </w:r>
+      <w:proofErr w:type="spellStart"/>
+      <w:r>
+        <w:rPr>
+          <w:rFonts w:ascii="Times New Roman" w:eastAsia="Times New Roman" w:hAnsi="Times New Roman" w:cs="Times New Roman"/>
+          <w:sz w:val="24"/>
+          <w:szCs w:val="24"/>
+          <w:lang w:val="en-ID"/>
+        </w:rPr>
+        <w:t>subjektif</w:t>
+      </w:r>
+      <w:proofErr w:type="spellEnd"/>
+      <w:r>
+        <w:rPr>
+          <w:rFonts w:ascii="Times New Roman" w:eastAsia="Times New Roman" w:hAnsi="Times New Roman" w:cs="Times New Roman"/>
+          <w:sz w:val="24"/>
+          <w:szCs w:val="24"/>
+          <w:lang w:val="en-ID"/>
+        </w:rPr>
+        <w:t xml:space="preserve"> dan </w:t>
+      </w:r>
+      <w:proofErr w:type="spellStart"/>
+      <w:r>
+        <w:rPr>
+          <w:rFonts w:ascii="Times New Roman" w:eastAsia="Times New Roman" w:hAnsi="Times New Roman" w:cs="Times New Roman"/>
+          <w:sz w:val="24"/>
+          <w:szCs w:val="24"/>
+          <w:lang w:val="en-ID"/>
+        </w:rPr>
+        <w:t>lambat</w:t>
+      </w:r>
+      <w:proofErr w:type="spellEnd"/>
+      <w:r>
+        <w:rPr>
+          <w:rFonts w:ascii="Times New Roman" w:eastAsia="Times New Roman" w:hAnsi="Times New Roman" w:cs="Times New Roman"/>
+          <w:sz w:val="24"/>
+          <w:szCs w:val="24"/>
+          <w:lang w:val="en-ID"/>
+        </w:rPr>
+        <w:t xml:space="preserve">? </w:t>
+      </w:r>
+    </w:p>
+    <w:p>
+      <w:pPr>
+        <w:spacing w:after="0" w:line="360" w:lineRule="auto"/>
+        <w:ind w:firstLine="567"/>
+        <w:jc w:val="both"/>
+        <w:rPr>
+          <w:rFonts w:ascii="Times New Roman" w:eastAsia="Times New Roman" w:hAnsi="Times New Roman" w:cs="Times New Roman"/>
+          <w:sz w:val="24"/>
+          <w:szCs w:val="24"/>
+          <w:lang w:val="en-ID"/>
+        </w:rPr>
+      </w:pPr>
+      <w:r>
+        <w:rPr>
+          <w:rFonts w:ascii="Times New Roman" w:eastAsia="Times New Roman" w:hAnsi="Times New Roman" w:cs="Times New Roman"/>
+          <w:sz w:val="24"/>
+          <w:szCs w:val="24"/>
+          <w:lang w:val="en-ID"/>
+        </w:rPr>
+        <w:t>2. S</w:t>
+      </w:r>
+      <w:proofErr w:type="spellStart"/>
+      <w:r>
+        <w:rPr>
+          <w:rFonts w:ascii="Times New Roman" w:eastAsia="Times New Roman" w:hAnsi="Times New Roman" w:cs="Times New Roman"/>
+          <w:sz w:val="24"/>
+          <w:szCs w:val="24"/>
+          <w:lang w:val="en-ID"/>
+        </w:rPr>
+        <w:t>ejauh</w:t>
+      </w:r>
+      <w:proofErr w:type="spellEnd"/>
+      <w:r>
+        <w:rPr>
+          <w:rFonts w:ascii="Times New Roman" w:eastAsia="Times New Roman" w:hAnsi="Times New Roman" w:cs="Times New Roman"/>
+          <w:sz w:val="24"/>
+          <w:szCs w:val="24"/>
+          <w:lang w:val="en-ID"/>
+        </w:rPr>
+        <w:t xml:space="preserve"> mana dataset </w:t>
+      </w:r>
+      <w:proofErr w:type="spellStart"/>
+      <w:r>
+        <w:rPr>
+          <w:rFonts w:ascii="Times New Roman" w:eastAsia="Times New Roman" w:hAnsi="Times New Roman" w:cs="Times New Roman"/>
+          <w:sz w:val="24"/>
+          <w:szCs w:val="24"/>
+          <w:lang w:val="en-ID"/>
+        </w:rPr>
+        <w:t>lokal</w:t>
+      </w:r>
+      <w:proofErr w:type="spellEnd"/>
+      <w:r>
+        <w:rPr>
+          <w:rFonts w:ascii="Times New Roman" w:eastAsia="Times New Roman" w:hAnsi="Times New Roman" w:cs="Times New Roman"/>
+          <w:sz w:val="24"/>
+          <w:szCs w:val="24"/>
+          <w:lang w:val="en-ID"/>
+        </w:rPr>
+        <w:t xml:space="preserve"> </w:t>
+      </w:r>
+      <w:proofErr w:type="spellStart"/>
+      <w:r>
+        <w:rPr>
+          <w:rFonts w:ascii="Times New Roman" w:eastAsia="Times New Roman" w:hAnsi="Times New Roman" w:cs="Times New Roman"/>
+          <w:sz w:val="24"/>
+          <w:szCs w:val="24"/>
+          <w:lang w:val="en-ID"/>
+        </w:rPr>
+        <w:t>Samarinda</w:t>
+      </w:r>
+      <w:proofErr w:type="spellEnd"/>
+      <w:r>
+        <w:rPr>
+          <w:rFonts w:ascii="Times New Roman" w:eastAsia="Times New Roman" w:hAnsi="Times New Roman" w:cs="Times New Roman"/>
+          <w:sz w:val="24"/>
+          <w:szCs w:val="24"/>
+          <w:lang w:val="en-ID"/>
+        </w:rPr>
+        <w:t xml:space="preserve"> </w:t>
+      </w:r>
+      <w:proofErr w:type="spellStart"/>
+      <w:r>
+        <w:rPr>
+          <w:rFonts w:ascii="Times New Roman" w:eastAsia="Times New Roman" w:hAnsi="Times New Roman" w:cs="Times New Roman"/>
+          <w:sz w:val="24"/>
+          <w:szCs w:val="24"/>
+          <w:lang w:val="en-ID"/>
+        </w:rPr>
+        <w:t>memengaruhi</w:t>
+      </w:r>
+      <w:proofErr w:type="spellEnd"/>
+      <w:r>
+        <w:rPr>
+          <w:rFonts w:ascii="Times New Roman" w:eastAsia="Times New Roman" w:hAnsi="Times New Roman" w:cs="Times New Roman"/>
+          <w:sz w:val="24"/>
+          <w:szCs w:val="24"/>
+          <w:lang w:val="en-ID"/>
+        </w:rPr>
+        <w:t xml:space="preserve"> </w:t>
+      </w:r>
+      <w:proofErr w:type="spellStart"/>
+      <w:r>
+        <w:rPr>
+          <w:rFonts w:ascii="Times New Roman" w:eastAsia="Times New Roman" w:hAnsi="Times New Roman" w:cs="Times New Roman"/>
+          <w:sz w:val="24"/>
+          <w:szCs w:val="24"/>
+          <w:lang w:val="en-ID"/>
+        </w:rPr>
+        <w:t>akurasi</w:t>
+      </w:r>
+      <w:proofErr w:type="spellEnd"/>
+      <w:r>
+        <w:rPr>
+          <w:rFonts w:ascii="Times New Roman" w:eastAsia="Times New Roman" w:hAnsi="Times New Roman" w:cs="Times New Roman"/>
+          <w:sz w:val="24"/>
+          <w:szCs w:val="24"/>
+          <w:lang w:val="en-ID"/>
+        </w:rPr>
+        <w:t xml:space="preserve"> model CNN, </w:t>
+      </w:r>
+      <w:proofErr w:type="spellStart"/>
+      <w:r>
+        <w:rPr>
+          <w:rFonts w:ascii="Times New Roman" w:eastAsia="Times New Roman" w:hAnsi="Times New Roman" w:cs="Times New Roman"/>
+          <w:sz w:val="24"/>
+          <w:szCs w:val="24"/>
+          <w:lang w:val="en-ID"/>
+        </w:rPr>
+        <w:t>mengingat</w:t>
+      </w:r>
+      <w:proofErr w:type="spellEnd"/>
+      <w:r>
+        <w:rPr>
+          <w:rFonts w:ascii="Times New Roman" w:eastAsia="Times New Roman" w:hAnsi="Times New Roman" w:cs="Times New Roman"/>
+          <w:sz w:val="24"/>
+          <w:szCs w:val="24"/>
+          <w:lang w:val="en-ID"/>
+        </w:rPr>
+        <w:t xml:space="preserve"> </w:t>
+      </w:r>
+      <w:proofErr w:type="spellStart"/>
+      <w:r>
+        <w:rPr>
+          <w:rFonts w:ascii="Times New Roman" w:eastAsia="Times New Roman" w:hAnsi="Times New Roman" w:cs="Times New Roman"/>
+          <w:sz w:val="24"/>
+          <w:szCs w:val="24"/>
+          <w:lang w:val="en-ID"/>
+        </w:rPr>
+        <w:t>variasi</w:t>
+      </w:r>
+      <w:proofErr w:type="spellEnd"/>
+      <w:r>
+        <w:rPr>
+          <w:rFonts w:ascii="Times New Roman" w:eastAsia="Times New Roman" w:hAnsi="Times New Roman" w:cs="Times New Roman"/>
+          <w:sz w:val="24"/>
+          <w:szCs w:val="24"/>
+          <w:lang w:val="en-ID"/>
+        </w:rPr>
+        <w:t xml:space="preserve"> </w:t>
+      </w:r>
+      <w:proofErr w:type="spellStart"/>
+      <w:r>
+        <w:rPr>
+          <w:rFonts w:ascii="Times New Roman" w:eastAsia="Times New Roman" w:hAnsi="Times New Roman" w:cs="Times New Roman"/>
+          <w:sz w:val="24"/>
+          <w:szCs w:val="24"/>
+          <w:lang w:val="en-ID"/>
+        </w:rPr>
+        <w:t>tekstur</w:t>
+      </w:r>
+      <w:proofErr w:type="spellEnd"/>
+      <w:r>
+        <w:rPr>
+          <w:rFonts w:ascii="Times New Roman" w:eastAsia="Times New Roman" w:hAnsi="Times New Roman" w:cs="Times New Roman"/>
+          <w:sz w:val="24"/>
+          <w:szCs w:val="24"/>
+          <w:lang w:val="en-ID"/>
+        </w:rPr>
+        <w:t xml:space="preserve">, </w:t>
+      </w:r>
+      <w:proofErr w:type="spellStart"/>
+      <w:r>
+        <w:rPr>
+          <w:rFonts w:ascii="Times New Roman" w:eastAsia="Times New Roman" w:hAnsi="Times New Roman" w:cs="Times New Roman"/>
+          <w:sz w:val="24"/>
+          <w:szCs w:val="24"/>
+          <w:lang w:val="en-ID"/>
+        </w:rPr>
+        <w:t>pencahayaan</w:t>
+      </w:r>
+      <w:proofErr w:type="spellEnd"/>
+      <w:r>
+        <w:rPr>
+          <w:rFonts w:ascii="Times New Roman" w:eastAsia="Times New Roman" w:hAnsi="Times New Roman" w:cs="Times New Roman"/>
+          <w:sz w:val="24"/>
+          <w:szCs w:val="24"/>
+          <w:lang w:val="en-ID"/>
+        </w:rPr>
+        <w:t xml:space="preserve">, dan </w:t>
+      </w:r>
+      <w:proofErr w:type="spellStart"/>
+      <w:r>
+        <w:rPr>
+          <w:rFonts w:ascii="Times New Roman" w:eastAsia="Times New Roman" w:hAnsi="Times New Roman" w:cs="Times New Roman"/>
+          <w:sz w:val="24"/>
+          <w:szCs w:val="24"/>
+          <w:lang w:val="en-ID"/>
+        </w:rPr>
+        <w:t>pola</w:t>
+      </w:r>
+      <w:proofErr w:type="spellEnd"/>
+      <w:r>
+        <w:rPr>
+          <w:rFonts w:ascii="Times New Roman" w:eastAsia="Times New Roman" w:hAnsi="Times New Roman" w:cs="Times New Roman"/>
+          <w:sz w:val="24"/>
+          <w:szCs w:val="24"/>
+          <w:lang w:val="en-ID"/>
+        </w:rPr>
+        <w:t xml:space="preserve"> </w:t>
+      </w:r>
+      <w:proofErr w:type="spellStart"/>
+      <w:r>
+        <w:rPr>
+          <w:rFonts w:ascii="Times New Roman" w:eastAsia="Times New Roman" w:hAnsi="Times New Roman" w:cs="Times New Roman"/>
+          <w:sz w:val="24"/>
+          <w:szCs w:val="24"/>
+          <w:lang w:val="en-ID"/>
+        </w:rPr>
+        <w:t>kerusakan</w:t>
+      </w:r>
+      <w:proofErr w:type="spellEnd"/>
+      <w:r>
+        <w:rPr>
+          <w:rFonts w:ascii="Times New Roman" w:eastAsia="Times New Roman" w:hAnsi="Times New Roman" w:cs="Times New Roman"/>
+          <w:sz w:val="24"/>
+          <w:szCs w:val="24"/>
+          <w:lang w:val="en-ID"/>
+        </w:rPr>
+        <w:t xml:space="preserve"> regional? </w:t>
+      </w:r>
+    </w:p>
+    <w:p>
+      <w:pPr>
+        <w:spacing w:after="0" w:line="360" w:lineRule="auto"/>
+        <w:ind w:firstLine="567"/>
+        <w:jc w:val="both"/>
+        <w:rPr>
+          <w:rFonts w:ascii="Times New Roman" w:eastAsia="Times New Roman" w:hAnsi="Times New Roman" w:cs="Times New Roman"/>
+          <w:sz w:val="24"/>
+          <w:szCs w:val="24"/>
+          <w:lang w:val="en-ID"/>
+        </w:rPr>
+      </w:pPr>
+      <w:r>
+        <w:rPr>
+          <w:rFonts w:ascii="Times New Roman" w:eastAsia="Times New Roman" w:hAnsi="Times New Roman" w:cs="Times New Roman"/>
+          <w:sz w:val="24"/>
+          <w:szCs w:val="24"/>
+          <w:lang w:val="en-ID"/>
+        </w:rPr>
+        <w:t xml:space="preserve">3. Apa </w:t>
+      </w:r>
+      <w:proofErr w:type="spellStart"/>
+      <w:r>
+        <w:rPr>
+          <w:rFonts w:ascii="Times New Roman" w:eastAsia="Times New Roman" w:hAnsi="Times New Roman" w:cs="Times New Roman"/>
+          <w:sz w:val="24"/>
+          <w:szCs w:val="24"/>
+          <w:lang w:val="en-ID"/>
+        </w:rPr>
+        <w:t>dampak</w:t>
+      </w:r>
+      <w:proofErr w:type="spellEnd"/>
+      <w:r>
+        <w:rPr>
+          <w:rFonts w:ascii="Times New Roman" w:eastAsia="Times New Roman" w:hAnsi="Times New Roman" w:cs="Times New Roman"/>
+          <w:sz w:val="24"/>
+          <w:szCs w:val="24"/>
+          <w:lang w:val="en-ID"/>
+        </w:rPr>
+        <w:t xml:space="preserve"> </w:t>
+      </w:r>
+      <w:proofErr w:type="spellStart"/>
+      <w:r>
+        <w:rPr>
+          <w:rFonts w:ascii="Times New Roman" w:eastAsia="Times New Roman" w:hAnsi="Times New Roman" w:cs="Times New Roman"/>
+          <w:sz w:val="24"/>
+          <w:szCs w:val="24"/>
+          <w:lang w:val="en-ID"/>
+        </w:rPr>
+        <w:t>penerapan</w:t>
+      </w:r>
+      <w:proofErr w:type="spellEnd"/>
+      <w:r>
+        <w:rPr>
+          <w:rFonts w:ascii="Times New Roman" w:eastAsia="Times New Roman" w:hAnsi="Times New Roman" w:cs="Times New Roman"/>
+          <w:sz w:val="24"/>
+          <w:szCs w:val="24"/>
+          <w:lang w:val="en-ID"/>
+        </w:rPr>
+        <w:t xml:space="preserve"> CNN </w:t>
+      </w:r>
+      <w:proofErr w:type="spellStart"/>
+      <w:r>
+        <w:rPr>
+          <w:rFonts w:ascii="Times New Roman" w:eastAsia="Times New Roman" w:hAnsi="Times New Roman" w:cs="Times New Roman"/>
+          <w:sz w:val="24"/>
+          <w:szCs w:val="24"/>
+          <w:lang w:val="en-ID"/>
+        </w:rPr>
+        <w:t>terhadap</w:t>
+      </w:r>
+      <w:proofErr w:type="spellEnd"/>
+      <w:r>
+        <w:rPr>
+          <w:rFonts w:ascii="Times New Roman" w:eastAsia="Times New Roman" w:hAnsi="Times New Roman" w:cs="Times New Roman"/>
+          <w:sz w:val="24"/>
+          <w:szCs w:val="24"/>
+          <w:lang w:val="en-ID"/>
+        </w:rPr>
+        <w:t xml:space="preserve"> </w:t>
+      </w:r>
+      <w:proofErr w:type="spellStart"/>
+      <w:r>
+        <w:rPr>
+          <w:rFonts w:ascii="Times New Roman" w:eastAsia="Times New Roman" w:hAnsi="Times New Roman" w:cs="Times New Roman"/>
+          <w:sz w:val="24"/>
+          <w:szCs w:val="24"/>
+          <w:lang w:val="en-ID"/>
+        </w:rPr>
+        <w:t>efisiensi</w:t>
+      </w:r>
+      <w:proofErr w:type="spellEnd"/>
+      <w:r>
+        <w:rPr>
+          <w:rFonts w:ascii="Times New Roman" w:eastAsia="Times New Roman" w:hAnsi="Times New Roman" w:cs="Times New Roman"/>
+          <w:sz w:val="24"/>
+          <w:szCs w:val="24"/>
+          <w:lang w:val="en-ID"/>
+        </w:rPr>
+        <w:t xml:space="preserve"> proses </w:t>
+      </w:r>
+      <w:proofErr w:type="spellStart"/>
+      <w:r>
+        <w:rPr>
+          <w:rFonts w:ascii="Times New Roman" w:eastAsia="Times New Roman" w:hAnsi="Times New Roman" w:cs="Times New Roman"/>
+          <w:sz w:val="24"/>
+          <w:szCs w:val="24"/>
+          <w:lang w:val="en-ID"/>
+        </w:rPr>
+        <w:t>tindak</w:t>
+      </w:r>
+      <w:proofErr w:type="spellEnd"/>
+      <w:r>
+        <w:rPr>
+          <w:rFonts w:ascii="Times New Roman" w:eastAsia="Times New Roman" w:hAnsi="Times New Roman" w:cs="Times New Roman"/>
+          <w:sz w:val="24"/>
+          <w:szCs w:val="24"/>
+          <w:lang w:val="en-ID"/>
+        </w:rPr>
+        <w:t xml:space="preserve"> </w:t>
+      </w:r>
+      <w:proofErr w:type="spellStart"/>
+      <w:r>
+        <w:rPr>
+          <w:rFonts w:ascii="Times New Roman" w:eastAsia="Times New Roman" w:hAnsi="Times New Roman" w:cs="Times New Roman"/>
+          <w:sz w:val="24"/>
+          <w:szCs w:val="24"/>
+          <w:lang w:val="en-ID"/>
+        </w:rPr>
+        <w:t>lanjut</w:t>
+      </w:r>
+      <w:proofErr w:type="spellEnd"/>
+      <w:r>
+        <w:rPr>
+          <w:rFonts w:ascii="Times New Roman" w:eastAsia="Times New Roman" w:hAnsi="Times New Roman" w:cs="Times New Roman"/>
+          <w:sz w:val="24"/>
+          <w:szCs w:val="24"/>
+          <w:lang w:val="en-ID"/>
+        </w:rPr>
+        <w:t xml:space="preserve"> </w:t>
+      </w:r>
+      <w:proofErr w:type="spellStart"/>
+      <w:r>
+        <w:rPr>
+          <w:rFonts w:ascii="Times New Roman" w:eastAsia="Times New Roman" w:hAnsi="Times New Roman" w:cs="Times New Roman"/>
+          <w:sz w:val="24"/>
+          <w:szCs w:val="24"/>
+          <w:lang w:val="en-ID"/>
+        </w:rPr>
+        <w:t>perbaikan</w:t>
+      </w:r>
+      <w:proofErr w:type="spellEnd"/>
+      <w:r>
+        <w:rPr>
+          <w:rFonts w:ascii="Times New Roman" w:eastAsia="Times New Roman" w:hAnsi="Times New Roman" w:cs="Times New Roman"/>
+          <w:sz w:val="24"/>
+          <w:szCs w:val="24"/>
+          <w:lang w:val="en-ID"/>
+        </w:rPr>
+        <w:t xml:space="preserve"> oleh DPUPR, </w:t>
+      </w:r>
+      <w:proofErr w:type="spellStart"/>
+      <w:r>
+        <w:rPr>
+          <w:rFonts w:ascii="Times New Roman" w:eastAsia="Times New Roman" w:hAnsi="Times New Roman" w:cs="Times New Roman"/>
+          <w:sz w:val="24"/>
+          <w:szCs w:val="24"/>
+          <w:lang w:val="en-ID"/>
+        </w:rPr>
+        <w:t>termasuk</w:t>
+      </w:r>
+      <w:proofErr w:type="spellEnd"/>
+      <w:r>
+        <w:rPr>
+          <w:rFonts w:ascii="Times New Roman" w:eastAsia="Times New Roman" w:hAnsi="Times New Roman" w:cs="Times New Roman"/>
+          <w:sz w:val="24"/>
+          <w:szCs w:val="24"/>
+          <w:lang w:val="en-ID"/>
+        </w:rPr>
+        <w:t xml:space="preserve"> </w:t>
+      </w:r>
+      <w:proofErr w:type="spellStart"/>
+      <w:r>
+        <w:rPr>
+          <w:rFonts w:ascii="Times New Roman" w:eastAsia="Times New Roman" w:hAnsi="Times New Roman" w:cs="Times New Roman"/>
+          <w:sz w:val="24"/>
+          <w:szCs w:val="24"/>
+          <w:lang w:val="en-ID"/>
+        </w:rPr>
+        <w:t>pengurangan</w:t>
+      </w:r>
+      <w:proofErr w:type="spellEnd"/>
+      <w:r>
+        <w:rPr>
+          <w:rFonts w:ascii="Times New Roman" w:eastAsia="Times New Roman" w:hAnsi="Times New Roman" w:cs="Times New Roman"/>
+          <w:sz w:val="24"/>
+          <w:szCs w:val="24"/>
+          <w:lang w:val="en-ID"/>
+        </w:rPr>
+        <w:t xml:space="preserve"> </w:t>
+      </w:r>
+      <w:proofErr w:type="spellStart"/>
+      <w:r>
+        <w:rPr>
+          <w:rFonts w:ascii="Times New Roman" w:eastAsia="Times New Roman" w:hAnsi="Times New Roman" w:cs="Times New Roman"/>
+          <w:sz w:val="24"/>
+          <w:szCs w:val="24"/>
+          <w:lang w:val="en-ID"/>
+        </w:rPr>
+        <w:t>biaya</w:t>
+      </w:r>
+      <w:proofErr w:type="spellEnd"/>
+      <w:r>
+        <w:rPr>
+          <w:rFonts w:ascii="Times New Roman" w:eastAsia="Times New Roman" w:hAnsi="Times New Roman" w:cs="Times New Roman"/>
+          <w:sz w:val="24"/>
+          <w:szCs w:val="24"/>
+          <w:lang w:val="en-ID"/>
+        </w:rPr>
+        <w:t xml:space="preserve"> dan </w:t>
+      </w:r>
+      <w:proofErr w:type="spellStart"/>
+      <w:r>
+        <w:rPr>
+          <w:rFonts w:ascii="Times New Roman" w:eastAsia="Times New Roman" w:hAnsi="Times New Roman" w:cs="Times New Roman"/>
+          <w:sz w:val="24"/>
+          <w:szCs w:val="24"/>
+          <w:lang w:val="en-ID"/>
+        </w:rPr>
+        <w:t>waktu</w:t>
+      </w:r>
+      <w:proofErr w:type="spellEnd"/>
+      <w:r>
+        <w:rPr>
+          <w:rFonts w:ascii="Times New Roman" w:eastAsia="Times New Roman" w:hAnsi="Times New Roman" w:cs="Times New Roman"/>
+          <w:sz w:val="24"/>
+          <w:szCs w:val="24"/>
+          <w:lang w:val="en-ID"/>
+        </w:rPr>
+        <w:t>?</w:t>
+      </w:r>
+    </w:p>
+    <w:p>
+      <w:pPr>
+        <w:spacing w:after="0" w:line="360" w:lineRule="auto"/>
+        <w:ind w:firstLine="567"/>
+        <w:jc w:val="both"/>
+        <w:rPr>
+          <w:rFonts w:ascii="Times New Roman" w:eastAsia="Times New Roman" w:hAnsi="Times New Roman" w:cs="Times New Roman"/>
+          <w:sz w:val="24"/>
+          <w:szCs w:val="24"/>
+        </w:rPr>
+      </w:pPr>
     </w:p>
     <w:p>
       <w:pPr>
@@ -5379,6 +7164,7 @@
           <w:sz w:val="24"/>
           <w:szCs w:val="24"/>
         </w:rPr>
+        <w:lastRenderedPageBreak/>
         <w:tab/>
       </w:r>
     </w:p>
@@ -5394,8 +7180,8 @@
           <w:sz w:val="26"/>
         </w:rPr>
       </w:pPr>
-      <w:bookmarkStart w:id="12" w:name="_heading=h.35nkun2" w:colFirst="0" w:colLast="0"/>
-      <w:bookmarkEnd w:id="12"/>
+      <w:bookmarkStart w:id="10" w:name="_heading=h.35nkun2" w:colFirst="0" w:colLast="0"/>
+      <w:bookmarkEnd w:id="10"/>
       <w:r>
         <w:rPr>
           <w:sz w:val="26"/>
@@ -5459,6 +7245,15 @@
           <w:szCs w:val="24"/>
         </w:rPr>
       </w:pPr>
+      <w:r>
+        <w:rPr>
+          <w:rFonts w:ascii="Times New Roman" w:eastAsia="Times New Roman" w:hAnsi="Times New Roman" w:cs="Times New Roman"/>
+          <w:color w:val="000000"/>
+          <w:sz w:val="24"/>
+          <w:szCs w:val="24"/>
+        </w:rPr>
+        <w:t>Penelitian terbatas pada dataset foto manual dari Samarinda (tidak termasuk data aerial atau real-time dari drone).</w:t>
+      </w:r>
     </w:p>
     <w:p>
       <w:pPr>
@@ -5483,6 +7278,81 @@
           <w:szCs w:val="24"/>
         </w:rPr>
       </w:pPr>
+      <w:r>
+        <w:rPr>
+          <w:rFonts w:ascii="Times New Roman" w:eastAsia="Times New Roman" w:hAnsi="Times New Roman" w:cs="Times New Roman"/>
+          <w:color w:val="000000"/>
+          <w:sz w:val="24"/>
+          <w:szCs w:val="24"/>
+        </w:rPr>
+        <w:t>Fokus hanya pada CNN dasar (misalnya VGG19/ResNet50), tanpa perbandingan varian lanjutan seperti EfficientDet, dan evaluasi akurasi &lt;95% karena kompleksitas fitur lokal.</w:t>
+      </w:r>
+    </w:p>
+    <w:p>
+      <w:pPr>
+        <w:numPr>
+          <w:ilvl w:val="0"/>
+          <w:numId w:val="10"/>
+        </w:numPr>
+        <w:pBdr>
+          <w:top w:val="nil"/>
+          <w:left w:val="nil"/>
+          <w:bottom w:val="nil"/>
+          <w:right w:val="nil"/>
+          <w:between w:val="nil"/>
+        </w:pBdr>
+        <w:spacing w:after="0" w:line="360" w:lineRule="auto"/>
+        <w:ind w:left="567" w:hanging="567"/>
+        <w:jc w:val="both"/>
+        <w:rPr>
+          <w:rFonts w:ascii="Times New Roman" w:eastAsia="Times New Roman" w:hAnsi="Times New Roman" w:cs="Times New Roman"/>
+          <w:color w:val="000000"/>
+          <w:sz w:val="24"/>
+          <w:szCs w:val="24"/>
+        </w:rPr>
+      </w:pPr>
+      <w:r>
+        <w:rPr>
+          <w:rFonts w:ascii="Times New Roman" w:eastAsia="Times New Roman" w:hAnsi="Times New Roman" w:cs="Times New Roman"/>
+          <w:color w:val="000000"/>
+          <w:sz w:val="24"/>
+          <w:szCs w:val="24"/>
+        </w:rPr>
+        <w:t>Tidak mencakup implementasi full di app Jalan Peduli (hanya prototipe klasifikasi), serta asumsi akses data DPUPR terbatas pada foto statis, bukan video atau sensor IoT.</w:t>
+      </w:r>
+    </w:p>
+    <w:p>
+      <w:pPr>
+        <w:numPr>
+          <w:ilvl w:val="0"/>
+          <w:numId w:val="10"/>
+        </w:numPr>
+        <w:pBdr>
+          <w:top w:val="nil"/>
+          <w:left w:val="nil"/>
+          <w:bottom w:val="nil"/>
+          <w:right w:val="nil"/>
+          <w:between w:val="nil"/>
+        </w:pBdr>
+        <w:spacing w:after="0" w:line="360" w:lineRule="auto"/>
+        <w:ind w:left="567" w:hanging="567"/>
+        <w:jc w:val="both"/>
+        <w:rPr>
+          <w:rFonts w:ascii="Times New Roman" w:eastAsia="Times New Roman" w:hAnsi="Times New Roman" w:cs="Times New Roman"/>
+          <w:color w:val="000000"/>
+          <w:sz w:val="24"/>
+          <w:szCs w:val="24"/>
+        </w:rPr>
+      </w:pPr>
+      <w:r>
+        <w:rPr>
+          <w:rFonts w:ascii="Times New Roman" w:eastAsia="Times New Roman" w:hAnsi="Times New Roman" w:cs="Times New Roman"/>
+          <w:color w:val="000000"/>
+          <w:sz w:val="24"/>
+          <w:szCs w:val="24"/>
+        </w:rPr>
+        <w:t>Studi kasus spesifik Samarinda, tidak generalisasi ke wilayah lain di Kalimantan Timur.</w:t>
+      </w:r>
     </w:p>
     <w:p>
       <w:pPr>
@@ -5515,8 +7385,8 @@
           <w:sz w:val="26"/>
         </w:rPr>
       </w:pPr>
-      <w:bookmarkStart w:id="13" w:name="_heading=h.1ksv4uv" w:colFirst="0" w:colLast="0"/>
-      <w:bookmarkEnd w:id="13"/>
+      <w:bookmarkStart w:id="11" w:name="_heading=h.1ksv4uv" w:colFirst="0" w:colLast="0"/>
+      <w:bookmarkEnd w:id="11"/>
       <w:r>
         <w:rPr>
           <w:sz w:val="26"/>
@@ -5547,13 +7417,26 @@
           <w:sz w:val="24"/>
           <w:szCs w:val="24"/>
         </w:rPr>
-        <w:t>Tujuan yang ingin dicapai dalam penelitian ini adalah ……………………………..</w:t>
-      </w:r>
-    </w:p>
-    <w:p>
-      <w:pPr>
+        <w:t xml:space="preserve">Tujuan yang ingin dicapai dalam penelitian ini adalah </w:t>
+      </w:r>
+      <w:r>
+        <w:rPr>
+          <w:rFonts w:ascii="Times New Roman" w:eastAsia="Times New Roman" w:hAnsi="Times New Roman" w:cs="Times New Roman"/>
+          <w:sz w:val="24"/>
+          <w:szCs w:val="24"/>
+        </w:rPr>
+        <w:t>:</w:t>
+      </w:r>
+    </w:p>
+    <w:p>
+      <w:pPr>
+        <w:pStyle w:val="ListParagraph"/>
+        <w:numPr>
+          <w:ilvl w:val="3"/>
+          <w:numId w:val="7"/>
+        </w:numPr>
         <w:spacing w:after="0" w:line="360" w:lineRule="auto"/>
-        <w:ind w:firstLine="567"/>
+        <w:ind w:left="426"/>
         <w:jc w:val="both"/>
         <w:rPr>
           <w:rFonts w:ascii="Times New Roman" w:eastAsia="Times New Roman" w:hAnsi="Times New Roman" w:cs="Times New Roman"/>
@@ -5561,6 +7444,64 @@
           <w:szCs w:val="24"/>
         </w:rPr>
       </w:pPr>
+      <w:r>
+        <w:rPr>
+          <w:rFonts w:ascii="Times New Roman" w:eastAsia="Times New Roman" w:hAnsi="Times New Roman" w:cs="Times New Roman"/>
+          <w:sz w:val="24"/>
+          <w:szCs w:val="24"/>
+        </w:rPr>
+        <w:t>Mengembangkan model CNN untuk klasifikasi jenis dan tingkat kerusakan jalan (ringan/sedang/berat) berbasis dataset lokal Samarinda, terintegrasi dengan Jalan Peduli untuk validasi otomatis.</w:t>
+      </w:r>
+    </w:p>
+    <w:p>
+      <w:pPr>
+        <w:pStyle w:val="ListParagraph"/>
+        <w:numPr>
+          <w:ilvl w:val="3"/>
+          <w:numId w:val="7"/>
+        </w:numPr>
+        <w:spacing w:after="0" w:line="360" w:lineRule="auto"/>
+        <w:ind w:left="426"/>
+        <w:jc w:val="both"/>
+        <w:rPr>
+          <w:rFonts w:ascii="Times New Roman" w:eastAsia="Times New Roman" w:hAnsi="Times New Roman" w:cs="Times New Roman"/>
+          <w:sz w:val="24"/>
+          <w:szCs w:val="24"/>
+        </w:rPr>
+      </w:pPr>
+      <w:r>
+        <w:rPr>
+          <w:rFonts w:ascii="Times New Roman" w:eastAsia="Times New Roman" w:hAnsi="Times New Roman" w:cs="Times New Roman"/>
+          <w:sz w:val="24"/>
+          <w:szCs w:val="24"/>
+        </w:rPr>
+        <w:t>Mengevaluasi performa model (akurasi, precision, recall) terhadap variasi kondisi lokal seperti pencahayaan dan tekstur.</w:t>
+      </w:r>
+    </w:p>
+    <w:p>
+      <w:pPr>
+        <w:pStyle w:val="ListParagraph"/>
+        <w:numPr>
+          <w:ilvl w:val="3"/>
+          <w:numId w:val="7"/>
+        </w:numPr>
+        <w:spacing w:after="0" w:line="360" w:lineRule="auto"/>
+        <w:ind w:left="426"/>
+        <w:jc w:val="both"/>
+        <w:rPr>
+          <w:rFonts w:ascii="Times New Roman" w:eastAsia="Times New Roman" w:hAnsi="Times New Roman" w:cs="Times New Roman"/>
+          <w:sz w:val="24"/>
+          <w:szCs w:val="24"/>
+        </w:rPr>
+      </w:pPr>
+      <w:r>
+        <w:rPr>
+          <w:rFonts w:ascii="Times New Roman" w:eastAsia="Times New Roman" w:hAnsi="Times New Roman" w:cs="Times New Roman"/>
+          <w:sz w:val="24"/>
+          <w:szCs w:val="24"/>
+        </w:rPr>
+        <w:t>Memberikan rekomendasi efisiensi untuk DPUPR dalam manajemen infrastruktur, termasuk pengurangan waktu verifikasi dari manual ke otomatis.</w:t>
+      </w:r>
     </w:p>
     <w:p>
       <w:pPr>
@@ -5575,8 +7516,8 @@
           <w:sz w:val="26"/>
         </w:rPr>
       </w:pPr>
-      <w:bookmarkStart w:id="14" w:name="_heading=h.44sinio" w:colFirst="0" w:colLast="0"/>
-      <w:bookmarkEnd w:id="14"/>
+      <w:bookmarkStart w:id="12" w:name="_heading=h.44sinio" w:colFirst="0" w:colLast="0"/>
+      <w:bookmarkEnd w:id="12"/>
       <w:r>
         <w:rPr>
           <w:sz w:val="26"/>
@@ -5631,7 +7572,6 @@
           <w:sz w:val="24"/>
           <w:szCs w:val="24"/>
         </w:rPr>
-        <w:lastRenderedPageBreak/>
         <w:t>1.</w:t>
       </w:r>
       <w:r>
@@ -5661,7 +7601,8 @@
           <w:sz w:val="24"/>
           <w:szCs w:val="24"/>
         </w:rPr>
-        <w:t>Manfaat penelitian bagi penulis adalah untuk mengembangkan wawasan penulis dalam mengimplementasikan/menerapkan metode/teknik/algoritma/cara ……………………………..…………………… dalam ……………………………..</w:t>
+        <w:lastRenderedPageBreak/>
+        <w:t>Manfaat penelitian bagi penulis adalah untuk mengembangkan wawasan penulis dalam mengimplementasikan/menerapkan metode/teknik/algoritma/cara Convolutional Neural Network (CNN) dalam klasifikasi jenis dan tingkat kerusakan jalan berbasis dataset lokal Samarinda.</w:t>
       </w:r>
     </w:p>
     <w:p>
@@ -5709,7 +7650,7 @@
           <w:sz w:val="24"/>
           <w:szCs w:val="24"/>
         </w:rPr>
-        <w:t>Penelitian ini dapat memberikan pengetahuan kepada mahasiswa bagaimana metode/teknik/algoritma/cara dilakukan dalam …………… dan menjadi referensi khususnya bagi mahasiswa dibidang Informatika yang dapat membantu proses pembelajaran.</w:t>
+        <w:t>Penelitian ini dapat memberikan pengetahuan kepada mahasiswa bagaimana metode/teknik/algoritma/cara CNN dilakukan dalam pemrosesan gambar digital untuk deteksi kerusakan infrastruktur dan menjadi referensi khususnya bagi mahasiswa dibidang Informatika yang dapat membantu proses pembelajaran.</w:t>
       </w:r>
     </w:p>
     <w:p>
@@ -5757,7 +7698,7 @@
           <w:sz w:val="24"/>
           <w:szCs w:val="24"/>
         </w:rPr>
-        <w:t>Manfaat penelitian ini bagi instansi/Lembaga/perusahaan adalah dengan adanya hasil analisa …………………….. diharapkan dapat membantu Instansi/Lembaga/Perusahaan untuk …………………..</w:t>
+        <w:t>Manfaat penelitian ini bagi instansi/Lembaga/perusahaan adalah dengan adanya hasil analisa klasifikasi otomatis kerusakan jalan menggunakan CNN diharapkan dapat membantu Instansi/Lembaga/Perusahaan seperti DPUPR Kota Samarinda untuk mempercepat validasi laporan pada sistem Jalan Peduli, mengurangi biaya pemeliharaan, dan meningkatkan efisiensi manajemen infrastruktur.</w:t>
       </w:r>
     </w:p>
     <w:p>
@@ -5778,8 +7719,8 @@
           <w:sz w:val="26"/>
         </w:rPr>
       </w:pPr>
-      <w:bookmarkStart w:id="15" w:name="_heading=h.2jxsxqh" w:colFirst="0" w:colLast="0"/>
-      <w:bookmarkEnd w:id="15"/>
+      <w:bookmarkStart w:id="13" w:name="_heading=h.2jxsxqh" w:colFirst="0" w:colLast="0"/>
+      <w:bookmarkEnd w:id="13"/>
       <w:r>
         <w:rPr>
           <w:sz w:val="26"/>
@@ -5817,8 +7758,8 @@
           <w:szCs w:val="24"/>
         </w:rPr>
         <w:sectPr>
-          <w:headerReference w:type="default" r:id="rId14"/>
-          <w:footerReference w:type="default" r:id="rId15"/>
+          <w:headerReference w:type="default" r:id="rId15"/>
+          <w:footerReference w:type="default" r:id="rId16"/>
           <w:type w:val="continuous"/>
           <w:pgSz w:w="11907" w:h="16839"/>
           <w:pgMar w:top="1985" w:right="1418" w:bottom="1418" w:left="1985" w:header="0" w:footer="1134" w:gutter="0"/>
@@ -5826,15 +7767,31 @@
           <w:cols w:space="720"/>
         </w:sectPr>
       </w:pPr>
-      <w:bookmarkStart w:id="16" w:name="_heading=h.z337ya" w:colFirst="0" w:colLast="0"/>
-      <w:bookmarkEnd w:id="16"/>
-      <w:r>
-        <w:rPr>
-          <w:rFonts w:ascii="Times New Roman" w:eastAsia="Times New Roman" w:hAnsi="Times New Roman" w:cs="Times New Roman"/>
-          <w:sz w:val="24"/>
-          <w:szCs w:val="24"/>
-        </w:rPr>
-        <w:t>Kontribusi yang dapat diberikan dari penelitian ini adalah ....................................................................</w:t>
+      <w:bookmarkStart w:id="14" w:name="_heading=h.z337ya" w:colFirst="0" w:colLast="0"/>
+      <w:bookmarkEnd w:id="14"/>
+      <w:r>
+        <w:rPr>
+          <w:rFonts w:ascii="Times New Roman" w:eastAsia="Times New Roman" w:hAnsi="Times New Roman" w:cs="Times New Roman"/>
+          <w:sz w:val="24"/>
+          <w:szCs w:val="24"/>
+        </w:rPr>
+        <w:t xml:space="preserve">Kontribusi yang dapat diberikan dari penelitian ini adalah pengembangan prototipe model CNN untuk klasifikasi jenis (retak, lubang, </w:t>
+      </w:r>
+      <w:r>
+        <w:rPr>
+          <w:rFonts w:ascii="Times New Roman" w:eastAsia="Times New Roman" w:hAnsi="Times New Roman" w:cs="Times New Roman"/>
+          <w:sz w:val="24"/>
+          <w:szCs w:val="24"/>
+        </w:rPr>
+        <w:t>permukaan tidak rata</w:t>
+      </w:r>
+      <w:r>
+        <w:rPr>
+          <w:rFonts w:ascii="Times New Roman" w:eastAsia="Times New Roman" w:hAnsi="Times New Roman" w:cs="Times New Roman"/>
+          <w:sz w:val="24"/>
+          <w:szCs w:val="24"/>
+        </w:rPr>
+        <w:t>) dan tingkat keparahan (ringan, sedang, berat) kerusakan jalan dengan akurasi tinggi (&gt;90%) menggunakan dataset lokal Samarinda, integrasi validasi otomatis ke sistem Jalan Peduli untuk mengatasi keterbatasan manual, serta rekomendasi adaptasi teknologi AI untuk manajemen infrastruktur regional di Indonesia, termasuk publikasi dataset terbuka sebagai referensi penelitian lanjutan di bidang deep learning dan pemrosesan gambar.</w:t>
       </w:r>
     </w:p>
     <w:p>
@@ -5919,8 +7876,8 @@
           <w:sz w:val="26"/>
         </w:rPr>
       </w:pPr>
-      <w:bookmarkStart w:id="17" w:name="_heading=h.3j2qqm3" w:colFirst="0" w:colLast="0"/>
-      <w:bookmarkEnd w:id="17"/>
+      <w:bookmarkStart w:id="15" w:name="_heading=h.3j2qqm3" w:colFirst="0" w:colLast="0"/>
+      <w:bookmarkEnd w:id="15"/>
       <w:r>
         <w:rPr>
           <w:sz w:val="26"/>
@@ -6493,8 +8450,8 @@
           <w:sz w:val="26"/>
         </w:rPr>
       </w:pPr>
-      <w:bookmarkStart w:id="18" w:name="_heading=h.1y810tw" w:colFirst="0" w:colLast="0"/>
-      <w:bookmarkEnd w:id="18"/>
+      <w:bookmarkStart w:id="16" w:name="_heading=h.1y810tw" w:colFirst="0" w:colLast="0"/>
+      <w:bookmarkEnd w:id="16"/>
       <w:r>
         <w:rPr>
           <w:sz w:val="26"/>
@@ -6703,8 +8660,8 @@
           <w:sz w:val="26"/>
         </w:rPr>
       </w:pPr>
-      <w:bookmarkStart w:id="19" w:name="_heading=h.4i7ojhp" w:colFirst="0" w:colLast="0"/>
-      <w:bookmarkEnd w:id="19"/>
+      <w:bookmarkStart w:id="17" w:name="_heading=h.4i7ojhp" w:colFirst="0" w:colLast="0"/>
+      <w:bookmarkEnd w:id="17"/>
       <w:r>
         <w:rPr>
           <w:sz w:val="26"/>
@@ -6771,8 +8728,8 @@
           <w:color w:val="000000"/>
         </w:rPr>
       </w:pPr>
-      <w:bookmarkStart w:id="20" w:name="_heading=h.2xcytpi" w:colFirst="0" w:colLast="0"/>
-      <w:bookmarkEnd w:id="20"/>
+      <w:bookmarkStart w:id="18" w:name="_heading=h.2xcytpi" w:colFirst="0" w:colLast="0"/>
+      <w:bookmarkEnd w:id="18"/>
       <w:r>
         <w:rPr>
           <w:rFonts w:ascii="Times New Roman" w:eastAsia="Times New Roman" w:hAnsi="Times New Roman" w:cs="Times New Roman"/>
@@ -6834,8 +8791,8 @@
           <w:color w:val="000000"/>
         </w:rPr>
       </w:pPr>
-      <w:bookmarkStart w:id="21" w:name="_heading=h.1ci93xb" w:colFirst="0" w:colLast="0"/>
-      <w:bookmarkEnd w:id="21"/>
+      <w:bookmarkStart w:id="19" w:name="_heading=h.1ci93xb" w:colFirst="0" w:colLast="0"/>
+      <w:bookmarkEnd w:id="19"/>
       <w:r>
         <w:rPr>
           <w:rFonts w:ascii="Times New Roman" w:eastAsia="Times New Roman" w:hAnsi="Times New Roman" w:cs="Times New Roman"/>
@@ -6899,8 +8856,8 @@
           <w:sz w:val="26"/>
         </w:rPr>
       </w:pPr>
-      <w:bookmarkStart w:id="22" w:name="_heading=h.3whwml4" w:colFirst="0" w:colLast="0"/>
-      <w:bookmarkEnd w:id="22"/>
+      <w:bookmarkStart w:id="20" w:name="_heading=h.3whwml4" w:colFirst="0" w:colLast="0"/>
+      <w:bookmarkEnd w:id="20"/>
       <w:r>
         <w:rPr>
           <w:sz w:val="26"/>
@@ -7009,7 +8966,7 @@
                     <pic:cNvPicPr preferRelativeResize="0"/>
                   </pic:nvPicPr>
                   <pic:blipFill>
-                    <a:blip r:embed="rId16"/>
+                    <a:blip r:embed="rId17"/>
                     <a:srcRect/>
                     <a:stretch>
                       <a:fillRect/>
@@ -7082,8 +9039,8 @@
           <w:szCs w:val="24"/>
         </w:rPr>
       </w:pPr>
-      <w:bookmarkStart w:id="23" w:name="_heading=h.2bn6wsx" w:colFirst="0" w:colLast="0"/>
-      <w:bookmarkEnd w:id="23"/>
+      <w:bookmarkStart w:id="21" w:name="_heading=h.2bn6wsx" w:colFirst="0" w:colLast="0"/>
+      <w:bookmarkEnd w:id="21"/>
       <w:r>
         <w:rPr>
           <w:rFonts w:ascii="Times New Roman" w:eastAsia="Times New Roman" w:hAnsi="Times New Roman" w:cs="Times New Roman"/>
@@ -7126,6 +9083,7 @@
       <w:tr>
         <w:trPr>
           <w:gridAfter w:val="1"/>
+          <w:wAfter w:w="250" w:type="dxa"/>
           <w:trHeight w:val="450"/>
           <w:jc w:val="center"/>
         </w:trPr>
@@ -8793,8 +10751,8 @@
           <w:szCs w:val="28"/>
         </w:rPr>
       </w:pPr>
-      <w:bookmarkStart w:id="24" w:name="_heading=h.qsh70q" w:colFirst="0" w:colLast="0"/>
-      <w:bookmarkEnd w:id="24"/>
+      <w:bookmarkStart w:id="22" w:name="_heading=h.qsh70q" w:colFirst="0" w:colLast="0"/>
+      <w:bookmarkEnd w:id="22"/>
     </w:p>
     <w:p/>
     <w:p/>
@@ -8849,8 +10807,8 @@
           <w:szCs w:val="28"/>
         </w:rPr>
       </w:pPr>
-      <w:bookmarkStart w:id="25" w:name="_heading=h.3as4poj" w:colFirst="0" w:colLast="0"/>
-      <w:bookmarkEnd w:id="25"/>
+      <w:bookmarkStart w:id="23" w:name="_heading=h.3as4poj" w:colFirst="0" w:colLast="0"/>
+      <w:bookmarkEnd w:id="23"/>
       <w:r>
         <w:rPr>
           <w:rFonts w:ascii="Times New Roman" w:eastAsia="Times New Roman" w:hAnsi="Times New Roman" w:cs="Times New Roman"/>
@@ -8901,8 +10859,8 @@
           <w:sz w:val="26"/>
         </w:rPr>
       </w:pPr>
-      <w:bookmarkStart w:id="26" w:name="_heading=h.1pxezwc" w:colFirst="0" w:colLast="0"/>
-      <w:bookmarkEnd w:id="26"/>
+      <w:bookmarkStart w:id="24" w:name="_heading=h.1pxezwc" w:colFirst="0" w:colLast="0"/>
+      <w:bookmarkEnd w:id="24"/>
       <w:r>
         <w:rPr>
           <w:sz w:val="26"/>
@@ -8968,8 +10926,8 @@
           <w:sz w:val="26"/>
         </w:rPr>
       </w:pPr>
-      <w:bookmarkStart w:id="27" w:name="_heading=h.49x2ik5" w:colFirst="0" w:colLast="0"/>
-      <w:bookmarkEnd w:id="27"/>
+      <w:bookmarkStart w:id="25" w:name="_heading=h.49x2ik5" w:colFirst="0" w:colLast="0"/>
+      <w:bookmarkEnd w:id="25"/>
       <w:r>
         <w:rPr>
           <w:sz w:val="26"/>
@@ -9036,8 +10994,8 @@
           <w:sz w:val="26"/>
         </w:rPr>
       </w:pPr>
-      <w:bookmarkStart w:id="28" w:name="_heading=h.2p2csry" w:colFirst="0" w:colLast="0"/>
-      <w:bookmarkEnd w:id="28"/>
+      <w:bookmarkStart w:id="26" w:name="_heading=h.2p2csry" w:colFirst="0" w:colLast="0"/>
+      <w:bookmarkEnd w:id="26"/>
       <w:r>
         <w:rPr>
           <w:sz w:val="26"/>
@@ -9099,8 +11057,8 @@
           <w:sz w:val="26"/>
         </w:rPr>
       </w:pPr>
-      <w:bookmarkStart w:id="29" w:name="_heading=h.147n2zr" w:colFirst="0" w:colLast="0"/>
-      <w:bookmarkEnd w:id="29"/>
+      <w:bookmarkStart w:id="27" w:name="_heading=h.147n2zr" w:colFirst="0" w:colLast="0"/>
+      <w:bookmarkEnd w:id="27"/>
       <w:r>
         <w:rPr>
           <w:sz w:val="26"/>
@@ -9176,8 +11134,8 @@
           <w:sz w:val="26"/>
         </w:rPr>
       </w:pPr>
-      <w:bookmarkStart w:id="30" w:name="_heading=h.3o7alnk" w:colFirst="0" w:colLast="0"/>
-      <w:bookmarkEnd w:id="30"/>
+      <w:bookmarkStart w:id="28" w:name="_heading=h.3o7alnk" w:colFirst="0" w:colLast="0"/>
+      <w:bookmarkEnd w:id="28"/>
       <w:r>
         <w:rPr>
           <w:sz w:val="26"/>
@@ -9243,8 +11201,8 @@
           <w:sz w:val="26"/>
         </w:rPr>
       </w:pPr>
-      <w:bookmarkStart w:id="31" w:name="_heading=h.23ckvvd" w:colFirst="0" w:colLast="0"/>
-      <w:bookmarkEnd w:id="31"/>
+      <w:bookmarkStart w:id="29" w:name="_heading=h.23ckvvd" w:colFirst="0" w:colLast="0"/>
+      <w:bookmarkEnd w:id="29"/>
       <w:r>
         <w:rPr>
           <w:sz w:val="26"/>
@@ -9317,8 +11275,8 @@
           <w:sz w:val="26"/>
         </w:rPr>
       </w:pPr>
-      <w:bookmarkStart w:id="32" w:name="_heading=h.ihv636" w:colFirst="0" w:colLast="0"/>
-      <w:bookmarkEnd w:id="32"/>
+      <w:bookmarkStart w:id="30" w:name="_heading=h.ihv636" w:colFirst="0" w:colLast="0"/>
+      <w:bookmarkEnd w:id="30"/>
       <w:r>
         <w:rPr>
           <w:sz w:val="26"/>
@@ -13151,8 +15109,8 @@
           <w:szCs w:val="28"/>
         </w:rPr>
       </w:pPr>
-      <w:bookmarkStart w:id="33" w:name="_heading=h.32hioqz" w:colFirst="0" w:colLast="0"/>
-      <w:bookmarkEnd w:id="33"/>
+      <w:bookmarkStart w:id="31" w:name="_heading=h.32hioqz" w:colFirst="0" w:colLast="0"/>
+      <w:bookmarkEnd w:id="31"/>
       <w:r>
         <w:rPr>
           <w:b/>
@@ -13163,27 +15121,791 @@
         <w:t>DAFTAR PUSTAKA</w:t>
       </w:r>
     </w:p>
-    <w:p>
-      <w:pPr>
+    <w:sdt>
+      <w:sdtPr>
+        <w:rPr>
+          <w:rFonts w:ascii="Times New Roman" w:eastAsia="Times New Roman" w:hAnsi="Times New Roman" w:cs="Times New Roman"/>
+          <w:color w:val="000000"/>
+          <w:sz w:val="24"/>
+          <w:szCs w:val="24"/>
+        </w:rPr>
+        <w:tag w:val="MENDELEY_BIBLIOGRAPHY"/>
+        <w:id w:val="-540663629"/>
+        <w:placeholder>
+          <w:docPart w:val="DefaultPlaceholder_-1854013440"/>
+        </w:placeholder>
+      </w:sdtPr>
+      <w:sdtContent>
+        <w:p>
+          <w:pPr>
+            <w:autoSpaceDE w:val="0"/>
+            <w:autoSpaceDN w:val="0"/>
+            <w:ind w:hanging="480"/>
+            <w:divId w:val="1767383734"/>
+            <w:rPr>
+              <w:rFonts w:eastAsia="Times New Roman"/>
+              <w:sz w:val="24"/>
+              <w:szCs w:val="24"/>
+            </w:rPr>
+          </w:pPr>
+          <w:r>
+            <w:rPr>
+              <w:rFonts w:eastAsia="Times New Roman"/>
+            </w:rPr>
+            <w:t xml:space="preserve">Angreni, I. A. A. (2024). KLASIFIKASI KERUSAKAN JALAN: RETAK, RETAK KULIT BUAYA DAN LUBANG BERDASARKAN CITRA DIGITAL. </w:t>
+          </w:r>
+          <w:r>
+            <w:rPr>
+              <w:rFonts w:eastAsia="Times New Roman"/>
+              <w:i/>
+              <w:iCs/>
+            </w:rPr>
+            <w:t>Jurnal Ilmiah Desain &amp; Konstruksi</w:t>
+          </w:r>
+          <w:r>
+            <w:rPr>
+              <w:rFonts w:eastAsia="Times New Roman"/>
+            </w:rPr>
+            <w:t xml:space="preserve">, </w:t>
+          </w:r>
+          <w:r>
+            <w:rPr>
+              <w:rFonts w:eastAsia="Times New Roman"/>
+              <w:i/>
+              <w:iCs/>
+            </w:rPr>
+            <w:t>23</w:t>
+          </w:r>
+          <w:r>
+            <w:rPr>
+              <w:rFonts w:eastAsia="Times New Roman"/>
+            </w:rPr>
+            <w:t>(2), 253–260. https://doi.org/10.35760/DK.2024.V23I2.11389</w:t>
+          </w:r>
+        </w:p>
+        <w:p>
+          <w:pPr>
+            <w:autoSpaceDE w:val="0"/>
+            <w:autoSpaceDN w:val="0"/>
+            <w:ind w:hanging="480"/>
+            <w:divId w:val="1473056876"/>
+            <w:rPr>
+              <w:rFonts w:eastAsia="Times New Roman"/>
+            </w:rPr>
+          </w:pPr>
+          <w:r>
+            <w:rPr>
+              <w:rFonts w:eastAsia="Times New Roman"/>
+            </w:rPr>
+            <w:t xml:space="preserve">Biswas, S., &amp; Jain, R. (2025). The Road to Safety - Examining the Nexus between Road Infrastructure and Crime in Rural India. </w:t>
+          </w:r>
+          <w:r>
+            <w:rPr>
+              <w:rFonts w:eastAsia="Times New Roman"/>
+              <w:i/>
+              <w:iCs/>
+            </w:rPr>
+            <w:t>Journal of Quantitative Economics</w:t>
+          </w:r>
+          <w:r>
+            <w:rPr>
+              <w:rFonts w:eastAsia="Times New Roman"/>
+            </w:rPr>
+            <w:t>, 1–24. https://doi.org/10.1007/S40953-025-00466-6/METRICS</w:t>
+          </w:r>
+        </w:p>
+        <w:p>
+          <w:pPr>
+            <w:autoSpaceDE w:val="0"/>
+            <w:autoSpaceDN w:val="0"/>
+            <w:ind w:hanging="480"/>
+            <w:divId w:val="1618947102"/>
+            <w:rPr>
+              <w:rFonts w:eastAsia="Times New Roman"/>
+            </w:rPr>
+          </w:pPr>
+          <w:r>
+            <w:rPr>
+              <w:rFonts w:eastAsia="Times New Roman"/>
+            </w:rPr>
+            <w:t xml:space="preserve">Denaro, L. G., &amp; Lim, R. (2025). Analisis Deteksi Kerusakan pada Jalan Aspal menggunakan Deep Learning untuk Mendukung Efisiensi Biaya dan Waktu dalam Pemantauan Berkelanjutan. </w:t>
+          </w:r>
+          <w:r>
+            <w:rPr>
+              <w:rFonts w:eastAsia="Times New Roman"/>
+              <w:i/>
+              <w:iCs/>
+            </w:rPr>
+            <w:t>Jurnal Dimensi Insinyur Profesional</w:t>
+          </w:r>
+          <w:r>
+            <w:rPr>
+              <w:rFonts w:eastAsia="Times New Roman"/>
+            </w:rPr>
+            <w:t xml:space="preserve">, </w:t>
+          </w:r>
+          <w:r>
+            <w:rPr>
+              <w:rFonts w:eastAsia="Times New Roman"/>
+              <w:i/>
+              <w:iCs/>
+            </w:rPr>
+            <w:t>3</w:t>
+          </w:r>
+          <w:r>
+            <w:rPr>
+              <w:rFonts w:eastAsia="Times New Roman"/>
+            </w:rPr>
+            <w:t>(1), 16–25. https://doi.org/10.9744/JDIP.3.1.16-25</w:t>
+          </w:r>
+        </w:p>
+        <w:p>
+          <w:pPr>
+            <w:autoSpaceDE w:val="0"/>
+            <w:autoSpaceDN w:val="0"/>
+            <w:ind w:hanging="480"/>
+            <w:divId w:val="1371301851"/>
+            <w:rPr>
+              <w:rFonts w:eastAsia="Times New Roman"/>
+            </w:rPr>
+          </w:pPr>
+          <w:r>
+            <w:rPr>
+              <w:rFonts w:eastAsia="Times New Roman"/>
+            </w:rPr>
+            <w:t xml:space="preserve">Falasyfa, R. S., &amp; Avianto, D. (2024). Perancangan Aplikasi Layanan Pengaduan Kerusakan Jalan Berbasis Android. </w:t>
+          </w:r>
+          <w:r>
+            <w:rPr>
+              <w:rFonts w:eastAsia="Times New Roman"/>
+              <w:i/>
+              <w:iCs/>
+            </w:rPr>
+            <w:t>Jurnal Indonesia : Manajemen Informatika Dan Komunikasi</w:t>
+          </w:r>
+          <w:r>
+            <w:rPr>
+              <w:rFonts w:eastAsia="Times New Roman"/>
+            </w:rPr>
+            <w:t xml:space="preserve">, </w:t>
+          </w:r>
+          <w:r>
+            <w:rPr>
+              <w:rFonts w:eastAsia="Times New Roman"/>
+              <w:i/>
+              <w:iCs/>
+            </w:rPr>
+            <w:t>5</w:t>
+          </w:r>
+          <w:r>
+            <w:rPr>
+              <w:rFonts w:eastAsia="Times New Roman"/>
+            </w:rPr>
+            <w:t>(1), 944–953. https://doi.org/10.35870/jimik.v5i1.569</w:t>
+          </w:r>
+        </w:p>
+        <w:p>
+          <w:pPr>
+            <w:autoSpaceDE w:val="0"/>
+            <w:autoSpaceDN w:val="0"/>
+            <w:ind w:hanging="480"/>
+            <w:divId w:val="1495338291"/>
+            <w:rPr>
+              <w:rFonts w:eastAsia="Times New Roman"/>
+            </w:rPr>
+          </w:pPr>
+          <w:r>
+            <w:rPr>
+              <w:rFonts w:eastAsia="Times New Roman"/>
+            </w:rPr>
+            <w:t xml:space="preserve">Harahap, L. S., &amp; Kembaren, M. F. H. (2025). Klasifikasi Objek Menggunakan Convolutional Neural Network pada Citra Satelit. </w:t>
+          </w:r>
+          <w:r>
+            <w:rPr>
+              <w:rFonts w:eastAsia="Times New Roman"/>
+              <w:i/>
+              <w:iCs/>
+            </w:rPr>
+            <w:t>RIGGS: Journal of Artificial Intelligence and Digital Business</w:t>
+          </w:r>
+          <w:r>
+            <w:rPr>
+              <w:rFonts w:eastAsia="Times New Roman"/>
+            </w:rPr>
+            <w:t xml:space="preserve">, </w:t>
+          </w:r>
+          <w:r>
+            <w:rPr>
+              <w:rFonts w:eastAsia="Times New Roman"/>
+              <w:i/>
+              <w:iCs/>
+            </w:rPr>
+            <w:t>4</w:t>
+          </w:r>
+          <w:r>
+            <w:rPr>
+              <w:rFonts w:eastAsia="Times New Roman"/>
+            </w:rPr>
+            <w:t>(2), 4663–4667. https://doi.org/10.31004/RIGGS.V4I2.1306</w:t>
+          </w:r>
+        </w:p>
+        <w:p>
+          <w:pPr>
+            <w:autoSpaceDE w:val="0"/>
+            <w:autoSpaceDN w:val="0"/>
+            <w:ind w:hanging="480"/>
+            <w:divId w:val="2126339213"/>
+            <w:rPr>
+              <w:rFonts w:eastAsia="Times New Roman"/>
+            </w:rPr>
+          </w:pPr>
+          <w:r>
+            <w:rPr>
+              <w:rFonts w:eastAsia="Times New Roman"/>
+            </w:rPr>
+            <w:t xml:space="preserve">Hugo, B., Zakiyyah, A. Y., &amp; Minor, K. A. (2025). EfficientDet Model for Accurate Detection and Classification of Road Damages in Indonesia. </w:t>
+          </w:r>
+          <w:r>
+            <w:rPr>
+              <w:rFonts w:eastAsia="Times New Roman"/>
+              <w:i/>
+              <w:iCs/>
+            </w:rPr>
+            <w:t>Journal of Machine Learning and Deep Learning</w:t>
+          </w:r>
+          <w:r>
+            <w:rPr>
+              <w:rFonts w:eastAsia="Times New Roman"/>
+            </w:rPr>
+            <w:t xml:space="preserve">, </w:t>
+          </w:r>
+          <w:r>
+            <w:rPr>
+              <w:rFonts w:eastAsia="Times New Roman"/>
+              <w:i/>
+              <w:iCs/>
+            </w:rPr>
+            <w:t>2</w:t>
+          </w:r>
+          <w:r>
+            <w:rPr>
+              <w:rFonts w:eastAsia="Times New Roman"/>
+            </w:rPr>
+            <w:t>(1), 11–17. https://doi.org/10.64820/AEPJMLDL.21.11.17.62025</w:t>
+          </w:r>
+        </w:p>
+        <w:p>
+          <w:pPr>
+            <w:autoSpaceDE w:val="0"/>
+            <w:autoSpaceDN w:val="0"/>
+            <w:ind w:hanging="480"/>
+            <w:divId w:val="1588034989"/>
+            <w:rPr>
+              <w:rFonts w:eastAsia="Times New Roman"/>
+            </w:rPr>
+          </w:pPr>
+          <w:r>
+            <w:rPr>
+              <w:rFonts w:eastAsia="Times New Roman"/>
+            </w:rPr>
+            <w:t xml:space="preserve">Iradaf Mandaya. (n.d.). </w:t>
+          </w:r>
+          <w:r>
+            <w:rPr>
+              <w:rFonts w:eastAsia="Times New Roman"/>
+              <w:i/>
+              <w:iCs/>
+            </w:rPr>
+            <w:t>Pemanfaatan Teknologi Unmanned Aerial Vehicle (UAV) untuk Identifikasi dan Klasifikasi Jenis Jenis Kerusakan Jalan</w:t>
+          </w:r>
+          <w:r>
+            <w:rPr>
+              <w:rFonts w:eastAsia="Times New Roman"/>
+            </w:rPr>
+            <w:t>. https://doi.org/https://doi.org/10.21776/ub.rekayasasipil.2020.014.03.1</w:t>
+          </w:r>
+        </w:p>
+        <w:p>
+          <w:pPr>
+            <w:autoSpaceDE w:val="0"/>
+            <w:autoSpaceDN w:val="0"/>
+            <w:ind w:hanging="480"/>
+            <w:divId w:val="814377867"/>
+            <w:rPr>
+              <w:rFonts w:eastAsia="Times New Roman"/>
+            </w:rPr>
+          </w:pPr>
+          <w:r>
+            <w:rPr>
+              <w:rFonts w:eastAsia="Times New Roman"/>
+              <w:i/>
+              <w:iCs/>
+            </w:rPr>
+            <w:t>Kerusakan Jalan di Samarinda Masalah Sistemik, Akademisi Ungkap Masalah Keterbatasan Anggaran</w:t>
+          </w:r>
+          <w:r>
+            <w:rPr>
+              <w:rFonts w:eastAsia="Times New Roman"/>
+            </w:rPr>
+            <w:t>. (n.d.). Retrieved October 8, 2025, from https://kaltimtoday.co/kerusakan-jalan-di-samarinda-masalah-sistemik-akademisi-ungkap-masalah-keterbatasan-anggaran</w:t>
+          </w:r>
+        </w:p>
+        <w:p>
+          <w:pPr>
+            <w:autoSpaceDE w:val="0"/>
+            <w:autoSpaceDN w:val="0"/>
+            <w:ind w:hanging="480"/>
+            <w:divId w:val="760763116"/>
+            <w:rPr>
+              <w:rFonts w:eastAsia="Times New Roman"/>
+            </w:rPr>
+          </w:pPr>
+          <w:r>
+            <w:rPr>
+              <w:rFonts w:eastAsia="Times New Roman"/>
+            </w:rPr>
+            <w:t xml:space="preserve">Kulambayev, B., Gleb, B., Katayev, N., Menglibay, I., Momynkulov, Z., &amp; University, T. (2024). Real-Time Road Damage Detection System on Deep Learning Based Image Analysis. In </w:t>
+          </w:r>
+          <w:r>
+            <w:rPr>
+              <w:rFonts w:eastAsia="Times New Roman"/>
+              <w:i/>
+              <w:iCs/>
+            </w:rPr>
+            <w:t>IJACSA) International Journal of Advanced Computer Science and Applications</w:t>
+          </w:r>
+          <w:r>
+            <w:rPr>
+              <w:rFonts w:eastAsia="Times New Roman"/>
+            </w:rPr>
+            <w:t xml:space="preserve"> (Vol. 15, Issue 9). www.ijacsa.thesai.org</w:t>
+          </w:r>
+        </w:p>
+        <w:p>
+          <w:pPr>
+            <w:autoSpaceDE w:val="0"/>
+            <w:autoSpaceDN w:val="0"/>
+            <w:ind w:hanging="480"/>
+            <w:divId w:val="1538665611"/>
+            <w:rPr>
+              <w:rFonts w:eastAsia="Times New Roman"/>
+            </w:rPr>
+          </w:pPr>
+          <w:r>
+            <w:rPr>
+              <w:rFonts w:eastAsia="Times New Roman"/>
+            </w:rPr>
+            <w:t xml:space="preserve">Kurniawan, A., Patriadi, A., &amp; Sajiyo, S. (2025). Analysis of the Correspondence Between the Type of Road Damage and the Budget Costs Incurred in Handling on Provincial Roads in the Madura Region. </w:t>
+          </w:r>
+          <w:r>
+            <w:rPr>
+              <w:rFonts w:eastAsia="Times New Roman"/>
+              <w:i/>
+              <w:iCs/>
+            </w:rPr>
+            <w:t>International Journal of Mechanical, Electrical and Civil Engineering</w:t>
+          </w:r>
+          <w:r>
+            <w:rPr>
+              <w:rFonts w:eastAsia="Times New Roman"/>
+            </w:rPr>
+            <w:t xml:space="preserve">, </w:t>
+          </w:r>
+          <w:r>
+            <w:rPr>
+              <w:rFonts w:eastAsia="Times New Roman"/>
+              <w:i/>
+              <w:iCs/>
+            </w:rPr>
+            <w:t>2</w:t>
+          </w:r>
+          <w:r>
+            <w:rPr>
+              <w:rFonts w:eastAsia="Times New Roman"/>
+            </w:rPr>
+            <w:t>(1), 149–156. https://doi.org/10.61132/IJMECIE.V2I1.140</w:t>
+          </w:r>
+        </w:p>
+        <w:p>
+          <w:pPr>
+            <w:autoSpaceDE w:val="0"/>
+            <w:autoSpaceDN w:val="0"/>
+            <w:ind w:hanging="480"/>
+            <w:divId w:val="116223862"/>
+            <w:rPr>
+              <w:rFonts w:eastAsia="Times New Roman"/>
+            </w:rPr>
+          </w:pPr>
+          <w:r>
+            <w:rPr>
+              <w:rFonts w:eastAsia="Times New Roman"/>
+            </w:rPr>
+            <w:t xml:space="preserve">Mulyana, D. I., Wahyudi, I., Studi, P., Komputer, I., Tinggi, S., Karya Informatika, C., Kota, J., Timur, D., Khusus, I., &amp; Jakarta, I. (2025). Deteksi Kerusakan Jalan Berdasarkan Citra Digital Menggunakan Convolutional Neural Network (CNN). In </w:t>
+          </w:r>
+          <w:r>
+            <w:rPr>
+              <w:rFonts w:eastAsia="Times New Roman"/>
+              <w:i/>
+              <w:iCs/>
+            </w:rPr>
+            <w:t xml:space="preserve">Jurnal Indonesia : </w:t>
+          </w:r>
+          <w:r>
+            <w:rPr>
+              <w:rFonts w:eastAsia="Times New Roman"/>
+              <w:i/>
+              <w:iCs/>
+            </w:rPr>
+            <w:lastRenderedPageBreak/>
+            <w:t>Manajemen Informatika dan Komunikasi (JIMIK)</w:t>
+          </w:r>
+          <w:r>
+            <w:rPr>
+              <w:rFonts w:eastAsia="Times New Roman"/>
+            </w:rPr>
+            <w:t xml:space="preserve"> (Vol. 6, Issue 1). https://journal.stmiki.ac.id</w:t>
+          </w:r>
+        </w:p>
+        <w:p>
+          <w:pPr>
+            <w:autoSpaceDE w:val="0"/>
+            <w:autoSpaceDN w:val="0"/>
+            <w:ind w:hanging="480"/>
+            <w:divId w:val="638192228"/>
+            <w:rPr>
+              <w:rFonts w:eastAsia="Times New Roman"/>
+            </w:rPr>
+          </w:pPr>
+          <w:r>
+            <w:rPr>
+              <w:rFonts w:eastAsia="Times New Roman"/>
+            </w:rPr>
+            <w:t xml:space="preserve">Nizamiyati, N., &amp; Brilliant, M. (2024). Road Damage Detection and Reporting System Using YOLOv7: Enhancing Public Participation in Infrastructure Maintenance. </w:t>
+          </w:r>
+          <w:r>
+            <w:rPr>
+              <w:rFonts w:eastAsia="Times New Roman"/>
+              <w:i/>
+              <w:iCs/>
+            </w:rPr>
+            <w:t>International Journal of Engineering Continuity</w:t>
+          </w:r>
+          <w:r>
+            <w:rPr>
+              <w:rFonts w:eastAsia="Times New Roman"/>
+            </w:rPr>
+            <w:t xml:space="preserve">, </w:t>
+          </w:r>
+          <w:r>
+            <w:rPr>
+              <w:rFonts w:eastAsia="Times New Roman"/>
+              <w:i/>
+              <w:iCs/>
+            </w:rPr>
+            <w:t>3</w:t>
+          </w:r>
+          <w:r>
+            <w:rPr>
+              <w:rFonts w:eastAsia="Times New Roman"/>
+            </w:rPr>
+            <w:t>(2), 69–85. https://doi.org/10.58291/ijec.v3i2.302</w:t>
+          </w:r>
+        </w:p>
+        <w:p>
+          <w:pPr>
+            <w:autoSpaceDE w:val="0"/>
+            <w:autoSpaceDN w:val="0"/>
+            <w:ind w:hanging="480"/>
+            <w:divId w:val="1663460796"/>
+            <w:rPr>
+              <w:rFonts w:eastAsia="Times New Roman"/>
+            </w:rPr>
+          </w:pPr>
+          <w:r>
+            <w:rPr>
+              <w:rFonts w:eastAsia="Times New Roman"/>
+            </w:rPr>
+            <w:t xml:space="preserve">Pandapotan, I. A., Siahaan, D., &amp; Fatichah, C. (2020). Pengembangan Modul Pengolah Data Citra untuk Aplikasi Pemetaan Kerusakan Jalan. </w:t>
+          </w:r>
+          <w:r>
+            <w:rPr>
+              <w:rFonts w:eastAsia="Times New Roman"/>
+              <w:i/>
+              <w:iCs/>
+            </w:rPr>
+            <w:t>Jurnal Teknik ITS</w:t>
+          </w:r>
+          <w:r>
+            <w:rPr>
+              <w:rFonts w:eastAsia="Times New Roman"/>
+            </w:rPr>
+            <w:t xml:space="preserve">, </w:t>
+          </w:r>
+          <w:r>
+            <w:rPr>
+              <w:rFonts w:eastAsia="Times New Roman"/>
+              <w:i/>
+              <w:iCs/>
+            </w:rPr>
+            <w:t>8</w:t>
+          </w:r>
+          <w:r>
+            <w:rPr>
+              <w:rFonts w:eastAsia="Times New Roman"/>
+            </w:rPr>
+            <w:t>(2). https://doi.org/10.12962/J23373539.V8I2.49489</w:t>
+          </w:r>
+        </w:p>
+        <w:p>
+          <w:pPr>
+            <w:autoSpaceDE w:val="0"/>
+            <w:autoSpaceDN w:val="0"/>
+            <w:ind w:hanging="480"/>
+            <w:divId w:val="1337809744"/>
+            <w:rPr>
+              <w:rFonts w:eastAsia="Times New Roman"/>
+            </w:rPr>
+          </w:pPr>
+          <w:r>
+            <w:rPr>
+              <w:rFonts w:eastAsia="Times New Roman"/>
+            </w:rPr>
+            <w:t xml:space="preserve">Probo Sumirat, L., Cahyono, D., &amp; Ali Akbar, A. (2021). GEOGRAPHIC INFORMATION SYSTEM FOR REPORTING DAMAGE AND ROAD IMPROVEMENT IN THE NATIONAL ROAD IMPLEMENTATION CENTER VIII BASED ON WEB AND ANDROID. In </w:t>
+          </w:r>
+          <w:r>
+            <w:rPr>
+              <w:rFonts w:eastAsia="Times New Roman"/>
+              <w:i/>
+              <w:iCs/>
+            </w:rPr>
+            <w:t>Jurnal Sistem Informasi Dan Bisnis Cerdas (SIBC)</w:t>
+          </w:r>
+          <w:r>
+            <w:rPr>
+              <w:rFonts w:eastAsia="Times New Roman"/>
+            </w:rPr>
+            <w:t xml:space="preserve"> (Vol. 14, Issue 1).</w:t>
+          </w:r>
+        </w:p>
+        <w:p>
+          <w:pPr>
+            <w:autoSpaceDE w:val="0"/>
+            <w:autoSpaceDN w:val="0"/>
+            <w:ind w:hanging="480"/>
+            <w:divId w:val="1126502845"/>
+            <w:rPr>
+              <w:rFonts w:eastAsia="Times New Roman"/>
+            </w:rPr>
+          </w:pPr>
+          <w:r>
+            <w:rPr>
+              <w:rFonts w:eastAsia="Times New Roman"/>
+            </w:rPr>
+            <w:t xml:space="preserve">Rahman, F. I., Lukman, L., &amp; Hildayati, H. (2025). Sistem Klasifikasi Kerusakan Jalan Metode Machine Learning dengan Algoritma K-Means dan Random Forest. </w:t>
+          </w:r>
+          <w:r>
+            <w:rPr>
+              <w:rFonts w:eastAsia="Times New Roman"/>
+              <w:i/>
+              <w:iCs/>
+            </w:rPr>
+            <w:t>Arus Jurnal Sains Dan Teknologi</w:t>
+          </w:r>
+          <w:r>
+            <w:rPr>
+              <w:rFonts w:eastAsia="Times New Roman"/>
+            </w:rPr>
+            <w:t xml:space="preserve">, </w:t>
+          </w:r>
+          <w:r>
+            <w:rPr>
+              <w:rFonts w:eastAsia="Times New Roman"/>
+              <w:i/>
+              <w:iCs/>
+            </w:rPr>
+            <w:t>3</w:t>
+          </w:r>
+          <w:r>
+            <w:rPr>
+              <w:rFonts w:eastAsia="Times New Roman"/>
+            </w:rPr>
+            <w:t>(1), 116–126. https://doi.org/10.57250/AJST.V3I1.1212</w:t>
+          </w:r>
+        </w:p>
+        <w:p>
+          <w:pPr>
+            <w:autoSpaceDE w:val="0"/>
+            <w:autoSpaceDN w:val="0"/>
+            <w:ind w:hanging="480"/>
+            <w:divId w:val="1958104360"/>
+            <w:rPr>
+              <w:rFonts w:eastAsia="Times New Roman"/>
+            </w:rPr>
+          </w:pPr>
+          <w:r>
+            <w:rPr>
+              <w:rFonts w:eastAsia="Times New Roman"/>
+            </w:rPr>
+            <w:t xml:space="preserve">Shaw, W., Wang, G., Ampofo, G. K. M., Befeke, C. L., &amp; Botei, D. (2025). An analysis of the symmetric and asymmetric relationship between road traffic casualties and economic development of Ghana. </w:t>
+          </w:r>
+          <w:r>
+            <w:rPr>
+              <w:rFonts w:eastAsia="Times New Roman"/>
+              <w:i/>
+              <w:iCs/>
+            </w:rPr>
+            <w:t>Journal of Transport Geography</w:t>
+          </w:r>
+          <w:r>
+            <w:rPr>
+              <w:rFonts w:eastAsia="Times New Roman"/>
+            </w:rPr>
+            <w:t xml:space="preserve">, </w:t>
+          </w:r>
+          <w:r>
+            <w:rPr>
+              <w:rFonts w:eastAsia="Times New Roman"/>
+              <w:i/>
+              <w:iCs/>
+            </w:rPr>
+            <w:t>124</w:t>
+          </w:r>
+          <w:r>
+            <w:rPr>
+              <w:rFonts w:eastAsia="Times New Roman"/>
+            </w:rPr>
+            <w:t>, 104174. https://doi.org/10.1016/J.JTRANGEO.2025.104174</w:t>
+          </w:r>
+        </w:p>
+        <w:p>
+          <w:pPr>
+            <w:autoSpaceDE w:val="0"/>
+            <w:autoSpaceDN w:val="0"/>
+            <w:ind w:hanging="480"/>
+            <w:divId w:val="648293072"/>
+            <w:rPr>
+              <w:rFonts w:eastAsia="Times New Roman"/>
+            </w:rPr>
+          </w:pPr>
+          <w:r>
+            <w:rPr>
+              <w:rFonts w:eastAsia="Times New Roman"/>
+            </w:rPr>
+            <w:t xml:space="preserve">Yanni, R. R. P., Mardhiyah, I., Irawati, D. C., Kosasih, R., &amp; Sari, D. P. (2025). PERBANDINGAN KLASIFIKASI KERUSAKAN JALAN MODEL CNN VGG19 DAN RESNET50. </w:t>
+          </w:r>
+          <w:r>
+            <w:rPr>
+              <w:rFonts w:eastAsia="Times New Roman"/>
+              <w:i/>
+              <w:iCs/>
+            </w:rPr>
+            <w:t>Jurnal Ilmiah Informatika Komputer</w:t>
+          </w:r>
+          <w:r>
+            <w:rPr>
+              <w:rFonts w:eastAsia="Times New Roman"/>
+            </w:rPr>
+            <w:t xml:space="preserve">, </w:t>
+          </w:r>
+          <w:r>
+            <w:rPr>
+              <w:rFonts w:eastAsia="Times New Roman"/>
+              <w:i/>
+              <w:iCs/>
+            </w:rPr>
+            <w:t>30</w:t>
+          </w:r>
+          <w:r>
+            <w:rPr>
+              <w:rFonts w:eastAsia="Times New Roman"/>
+            </w:rPr>
+            <w:t>(1), 69–80. https://doi.org/10.35760/ik.2025.v30i1.14230</w:t>
+          </w:r>
+        </w:p>
+        <w:p>
+          <w:pPr>
+            <w:autoSpaceDE w:val="0"/>
+            <w:autoSpaceDN w:val="0"/>
+            <w:ind w:hanging="480"/>
+            <w:divId w:val="1951085882"/>
+            <w:rPr>
+              <w:rFonts w:eastAsia="Times New Roman"/>
+            </w:rPr>
+          </w:pPr>
+          <w:r>
+            <w:rPr>
+              <w:rFonts w:eastAsia="Times New Roman"/>
+            </w:rPr>
+            <w:t xml:space="preserve">Zhang, C., Nateghinia, E., Miranda-Moreno, L. F., &amp; Sun, L. (2022). Pavement distress detection using convolutional neural network (CNN): A case study in Montreal, Canada. </w:t>
+          </w:r>
+          <w:r>
+            <w:rPr>
+              <w:rFonts w:eastAsia="Times New Roman"/>
+              <w:i/>
+              <w:iCs/>
+            </w:rPr>
+            <w:t>International Journal of Transportation Science and Technology</w:t>
+          </w:r>
+          <w:r>
+            <w:rPr>
+              <w:rFonts w:eastAsia="Times New Roman"/>
+            </w:rPr>
+            <w:t xml:space="preserve">, </w:t>
+          </w:r>
+          <w:r>
+            <w:rPr>
+              <w:rFonts w:eastAsia="Times New Roman"/>
+              <w:i/>
+              <w:iCs/>
+            </w:rPr>
+            <w:t>11</w:t>
+          </w:r>
+          <w:r>
+            <w:rPr>
+              <w:rFonts w:eastAsia="Times New Roman"/>
+            </w:rPr>
+            <w:t>(2), 298–309. https://doi.org/10.1016/J.IJTST.2021.04.008</w:t>
+          </w:r>
+        </w:p>
+        <w:p>
+          <w:pPr>
+            <w:widowControl w:val="0"/>
+            <w:pBdr>
+              <w:top w:val="nil"/>
+              <w:left w:val="nil"/>
+              <w:bottom w:val="nil"/>
+              <w:right w:val="nil"/>
+              <w:between w:val="nil"/>
+            </w:pBdr>
+            <w:spacing w:after="0" w:line="360" w:lineRule="auto"/>
+            <w:jc w:val="both"/>
+            <w:rPr>
+              <w:rFonts w:ascii="Times New Roman" w:eastAsia="Times New Roman" w:hAnsi="Times New Roman" w:cs="Times New Roman"/>
+              <w:sz w:val="24"/>
+              <w:szCs w:val="24"/>
+            </w:rPr>
+          </w:pPr>
+          <w:r>
+            <w:rPr>
+              <w:rFonts w:eastAsia="Times New Roman"/>
+            </w:rPr>
+            <w:t> </w:t>
+          </w:r>
+        </w:p>
+      </w:sdtContent>
+    </w:sdt>
+    <w:p>
+      <w:pPr>
+        <w:widowControl w:val="0"/>
+        <w:pBdr>
+          <w:top w:val="nil"/>
+          <w:left w:val="nil"/>
+          <w:bottom w:val="nil"/>
+          <w:right w:val="nil"/>
+          <w:between w:val="nil"/>
+        </w:pBdr>
         <w:spacing w:after="0" w:line="360" w:lineRule="auto"/>
         <w:jc w:val="both"/>
-        <w:rPr>
-          <w:rFonts w:ascii="Times New Roman" w:eastAsia="Times New Roman" w:hAnsi="Times New Roman" w:cs="Times New Roman"/>
-          <w:sz w:val="24"/>
-          <w:szCs w:val="24"/>
-        </w:rPr>
-      </w:pPr>
-    </w:p>
-    <w:p>
-      <w:pPr>
-        <w:spacing w:after="0" w:line="360" w:lineRule="auto"/>
-        <w:ind w:left="567" w:hanging="567"/>
-        <w:jc w:val="both"/>
-        <w:rPr>
-          <w:rFonts w:ascii="Times New Roman" w:eastAsia="Times New Roman" w:hAnsi="Times New Roman" w:cs="Times New Roman"/>
-          <w:sz w:val="24"/>
-          <w:szCs w:val="24"/>
-        </w:rPr>
       </w:pPr>
     </w:p>
     <w:p>
@@ -13211,552 +15933,21 @@
         </w:rPr>
       </w:pPr>
       <w:r>
-        <w:rPr>
-          <w:rFonts w:ascii="Times New Roman" w:eastAsia="Times New Roman" w:hAnsi="Times New Roman" w:cs="Times New Roman"/>
-          <w:color w:val="000000"/>
-          <w:sz w:val="24"/>
-          <w:szCs w:val="24"/>
-        </w:rPr>
-        <w:t xml:space="preserve"> Amir, H., Gatot, S., Wisnu, W. (2002). </w:t>
-      </w:r>
-      <w:r>
-        <w:rPr>
-          <w:rFonts w:ascii="Times New Roman" w:eastAsia="Times New Roman" w:hAnsi="Times New Roman" w:cs="Times New Roman"/>
-          <w:i/>
-          <w:color w:val="000000"/>
-          <w:sz w:val="24"/>
-          <w:szCs w:val="24"/>
-        </w:rPr>
-        <w:t>Klasifikasi Objek Dalam Visi Komputer Dengan Analisis Diskriminan</w:t>
-      </w:r>
-      <w:r>
-        <w:rPr>
-          <w:rFonts w:ascii="Times New Roman" w:eastAsia="Times New Roman" w:hAnsi="Times New Roman" w:cs="Times New Roman"/>
-          <w:color w:val="000000"/>
-          <w:sz w:val="24"/>
-          <w:szCs w:val="24"/>
-        </w:rPr>
-        <w:t>. Vol 6 (1), 24–32.</w:t>
-      </w:r>
-    </w:p>
-    <w:p>
-      <w:pPr>
-        <w:widowControl w:val="0"/>
-        <w:numPr>
-          <w:ilvl w:val="0"/>
-          <w:numId w:val="8"/>
-        </w:numPr>
-        <w:pBdr>
-          <w:top w:val="nil"/>
-          <w:left w:val="nil"/>
-          <w:bottom w:val="nil"/>
-          <w:right w:val="nil"/>
-          <w:between w:val="nil"/>
-        </w:pBdr>
-        <w:spacing w:after="0" w:line="360" w:lineRule="auto"/>
-        <w:ind w:left="567" w:hanging="567"/>
-        <w:jc w:val="both"/>
-        <w:rPr>
-          <w:rFonts w:ascii="Times New Roman" w:eastAsia="Times New Roman" w:hAnsi="Times New Roman" w:cs="Times New Roman"/>
-          <w:color w:val="000000"/>
-          <w:sz w:val="24"/>
-          <w:szCs w:val="24"/>
-        </w:rPr>
-      </w:pPr>
-      <w:r>
-        <w:rPr>
-          <w:rFonts w:ascii="Times New Roman" w:eastAsia="Times New Roman" w:hAnsi="Times New Roman" w:cs="Times New Roman"/>
-          <w:color w:val="000000"/>
-          <w:sz w:val="24"/>
-          <w:szCs w:val="24"/>
-        </w:rPr>
-        <w:t xml:space="preserve">Andono, N. P., Muljono, T. S. (2017). </w:t>
-      </w:r>
-      <w:r>
-        <w:rPr>
-          <w:rFonts w:ascii="Times New Roman" w:eastAsia="Times New Roman" w:hAnsi="Times New Roman" w:cs="Times New Roman"/>
-          <w:i/>
-          <w:color w:val="000000"/>
-          <w:sz w:val="24"/>
-          <w:szCs w:val="24"/>
-        </w:rPr>
-        <w:t>Pengolahan Citra Digital</w:t>
-      </w:r>
-      <w:r>
-        <w:rPr>
-          <w:rFonts w:ascii="Times New Roman" w:eastAsia="Times New Roman" w:hAnsi="Times New Roman" w:cs="Times New Roman"/>
-          <w:color w:val="000000"/>
-          <w:sz w:val="24"/>
-          <w:szCs w:val="24"/>
-        </w:rPr>
-        <w:t>. Penerbit Andi (Anggota IKAPI) Yogyakarta.</w:t>
-      </w:r>
-    </w:p>
-    <w:p>
-      <w:pPr>
-        <w:widowControl w:val="0"/>
-        <w:numPr>
-          <w:ilvl w:val="0"/>
-          <w:numId w:val="8"/>
-        </w:numPr>
-        <w:pBdr>
-          <w:top w:val="nil"/>
-          <w:left w:val="nil"/>
-          <w:bottom w:val="nil"/>
-          <w:right w:val="nil"/>
-          <w:between w:val="nil"/>
-        </w:pBdr>
-        <w:spacing w:after="0" w:line="360" w:lineRule="auto"/>
-        <w:ind w:left="567" w:hanging="567"/>
-        <w:jc w:val="both"/>
-        <w:rPr>
-          <w:rFonts w:ascii="Times New Roman" w:eastAsia="Times New Roman" w:hAnsi="Times New Roman" w:cs="Times New Roman"/>
-          <w:color w:val="000000"/>
-          <w:sz w:val="24"/>
-          <w:szCs w:val="24"/>
-        </w:rPr>
-      </w:pPr>
-      <w:r>
-        <w:rPr>
-          <w:rFonts w:ascii="Times New Roman" w:eastAsia="Times New Roman" w:hAnsi="Times New Roman" w:cs="Times New Roman"/>
-          <w:color w:val="000000"/>
-          <w:sz w:val="24"/>
-          <w:szCs w:val="24"/>
-        </w:rPr>
-        <w:t xml:space="preserve">Attaphongse, T., Siwaruk, S., Carlos, P. (2015). </w:t>
-      </w:r>
-      <w:r>
-        <w:rPr>
-          <w:rFonts w:ascii="Times New Roman" w:eastAsia="Times New Roman" w:hAnsi="Times New Roman" w:cs="Times New Roman"/>
-          <w:i/>
-          <w:color w:val="000000"/>
-          <w:sz w:val="24"/>
-          <w:szCs w:val="24"/>
-        </w:rPr>
-        <w:t>A Non-Destructive Oil Palm Ripeness Recognition System Using Relative Entropy</w:t>
-      </w:r>
-      <w:r>
-        <w:rPr>
-          <w:rFonts w:ascii="Times New Roman" w:eastAsia="Times New Roman" w:hAnsi="Times New Roman" w:cs="Times New Roman"/>
-          <w:color w:val="000000"/>
-          <w:sz w:val="24"/>
-          <w:szCs w:val="24"/>
-        </w:rPr>
-        <w:t xml:space="preserve">. </w:t>
-      </w:r>
-      <w:r>
-        <w:rPr>
-          <w:rFonts w:ascii="Times New Roman" w:eastAsia="Times New Roman" w:hAnsi="Times New Roman" w:cs="Times New Roman"/>
-          <w:i/>
-          <w:color w:val="000000"/>
-          <w:sz w:val="24"/>
-          <w:szCs w:val="24"/>
-        </w:rPr>
-        <w:t>Computers And Electronics In Agriculture</w:t>
-      </w:r>
-      <w:r>
-        <w:rPr>
-          <w:rFonts w:ascii="Times New Roman" w:eastAsia="Times New Roman" w:hAnsi="Times New Roman" w:cs="Times New Roman"/>
-          <w:color w:val="000000"/>
-          <w:sz w:val="24"/>
-          <w:szCs w:val="24"/>
-        </w:rPr>
-        <w:t>, Vol 118, 340–349. Https://Doi.Org/10.1016/J.Compag.2015.09.018.</w:t>
-      </w:r>
-    </w:p>
-    <w:p>
-      <w:pPr>
-        <w:widowControl w:val="0"/>
-        <w:numPr>
-          <w:ilvl w:val="0"/>
-          <w:numId w:val="8"/>
-        </w:numPr>
-        <w:pBdr>
-          <w:top w:val="nil"/>
-          <w:left w:val="nil"/>
-          <w:bottom w:val="nil"/>
-          <w:right w:val="nil"/>
-          <w:between w:val="nil"/>
-        </w:pBdr>
-        <w:spacing w:after="0" w:line="360" w:lineRule="auto"/>
-        <w:ind w:left="567" w:hanging="567"/>
-        <w:jc w:val="both"/>
-        <w:rPr>
-          <w:rFonts w:ascii="Times New Roman" w:eastAsia="Times New Roman" w:hAnsi="Times New Roman" w:cs="Times New Roman"/>
-          <w:color w:val="000000"/>
-          <w:sz w:val="24"/>
-          <w:szCs w:val="24"/>
-        </w:rPr>
-      </w:pPr>
-      <w:r>
-        <w:rPr>
-          <w:rFonts w:ascii="Times New Roman" w:eastAsia="Times New Roman" w:hAnsi="Times New Roman" w:cs="Times New Roman"/>
-          <w:color w:val="000000"/>
-          <w:sz w:val="24"/>
-          <w:szCs w:val="24"/>
-        </w:rPr>
-        <w:t xml:space="preserve">Burawich, P., Somchai, L., Thanate, K., Mitchai, C., Arno, R. (2017). </w:t>
-      </w:r>
-      <w:r>
-        <w:rPr>
-          <w:rFonts w:ascii="Times New Roman" w:eastAsia="Times New Roman" w:hAnsi="Times New Roman" w:cs="Times New Roman"/>
-          <w:i/>
-          <w:color w:val="000000"/>
-          <w:sz w:val="24"/>
-          <w:szCs w:val="24"/>
-        </w:rPr>
-        <w:t>An Automatic And Rapid System For Grading Palm Bunch Using A Kinect Camera</w:t>
-      </w:r>
-      <w:r>
-        <w:rPr>
-          <w:rFonts w:ascii="Times New Roman" w:eastAsia="Times New Roman" w:hAnsi="Times New Roman" w:cs="Times New Roman"/>
-          <w:color w:val="000000"/>
-          <w:sz w:val="24"/>
-          <w:szCs w:val="24"/>
-        </w:rPr>
-        <w:t xml:space="preserve">. </w:t>
-      </w:r>
-      <w:r>
-        <w:rPr>
-          <w:rFonts w:ascii="Times New Roman" w:eastAsia="Times New Roman" w:hAnsi="Times New Roman" w:cs="Times New Roman"/>
-          <w:i/>
-          <w:color w:val="000000"/>
-          <w:sz w:val="24"/>
-          <w:szCs w:val="24"/>
-        </w:rPr>
-        <w:t>Computers And Electronics In Agriculture</w:t>
-      </w:r>
-      <w:r>
-        <w:rPr>
-          <w:rFonts w:ascii="Times New Roman" w:eastAsia="Times New Roman" w:hAnsi="Times New Roman" w:cs="Times New Roman"/>
-          <w:color w:val="000000"/>
-          <w:sz w:val="24"/>
-          <w:szCs w:val="24"/>
-        </w:rPr>
-        <w:t>, Vol 143 (November), 227–237. Https://Doi.Org/10.1016/J.Compag.2017.10.020.</w:t>
-      </w:r>
-    </w:p>
-    <w:p>
-      <w:pPr>
-        <w:widowControl w:val="0"/>
-        <w:numPr>
-          <w:ilvl w:val="0"/>
-          <w:numId w:val="8"/>
-        </w:numPr>
-        <w:pBdr>
-          <w:top w:val="nil"/>
-          <w:left w:val="nil"/>
-          <w:bottom w:val="nil"/>
-          <w:right w:val="nil"/>
-          <w:between w:val="nil"/>
-        </w:pBdr>
-        <w:spacing w:after="0" w:line="360" w:lineRule="auto"/>
-        <w:ind w:left="567" w:hanging="567"/>
-        <w:jc w:val="both"/>
-        <w:rPr>
-          <w:rFonts w:ascii="Times New Roman" w:eastAsia="Times New Roman" w:hAnsi="Times New Roman" w:cs="Times New Roman"/>
-          <w:color w:val="000000"/>
-          <w:sz w:val="24"/>
-          <w:szCs w:val="24"/>
-        </w:rPr>
-      </w:pPr>
-      <w:r>
-        <w:rPr>
-          <w:rFonts w:ascii="Times New Roman" w:eastAsia="Times New Roman" w:hAnsi="Times New Roman" w:cs="Times New Roman"/>
-          <w:color w:val="000000"/>
-          <w:sz w:val="24"/>
-          <w:szCs w:val="24"/>
-        </w:rPr>
-        <w:t xml:space="preserve">Dinah, C., Sam, H., Usman, A., Tineke, M., Muhammad, M. (2015). </w:t>
-      </w:r>
-      <w:r>
-        <w:rPr>
-          <w:rFonts w:ascii="Times New Roman" w:eastAsia="Times New Roman" w:hAnsi="Times New Roman" w:cs="Times New Roman"/>
-          <w:i/>
-          <w:color w:val="000000"/>
-          <w:sz w:val="24"/>
-          <w:szCs w:val="24"/>
-        </w:rPr>
-        <w:t>Optical Characteristics Of Oil Palm Fresh Fruits Bunch (FFB) Under Three Spectrum Regions Influence For Harvest Decision</w:t>
-      </w:r>
-      <w:r>
-        <w:rPr>
-          <w:rFonts w:ascii="Times New Roman" w:eastAsia="Times New Roman" w:hAnsi="Times New Roman" w:cs="Times New Roman"/>
-          <w:color w:val="000000"/>
-          <w:sz w:val="24"/>
-          <w:szCs w:val="24"/>
-        </w:rPr>
-        <w:t xml:space="preserve">. </w:t>
-      </w:r>
-      <w:r>
-        <w:rPr>
-          <w:rFonts w:ascii="Times New Roman" w:eastAsia="Times New Roman" w:hAnsi="Times New Roman" w:cs="Times New Roman"/>
-          <w:i/>
-          <w:color w:val="000000"/>
-          <w:sz w:val="24"/>
-          <w:szCs w:val="24"/>
-        </w:rPr>
-        <w:t>International Journal On Advanced Science Engineering Information Technologi</w:t>
-      </w:r>
-      <w:r>
-        <w:rPr>
-          <w:rFonts w:ascii="Times New Roman" w:eastAsia="Times New Roman" w:hAnsi="Times New Roman" w:cs="Times New Roman"/>
-          <w:color w:val="000000"/>
-          <w:sz w:val="24"/>
-          <w:szCs w:val="24"/>
-        </w:rPr>
-        <w:t>, Vol 5 (3), 9–16.</w:t>
-      </w:r>
-    </w:p>
-    <w:p>
-      <w:pPr>
-        <w:widowControl w:val="0"/>
-        <w:spacing w:after="0" w:line="360" w:lineRule="auto"/>
-        <w:jc w:val="both"/>
-        <w:rPr>
-          <w:rFonts w:ascii="Times New Roman" w:eastAsia="Times New Roman" w:hAnsi="Times New Roman" w:cs="Times New Roman"/>
-          <w:sz w:val="24"/>
-          <w:szCs w:val="24"/>
-        </w:rPr>
-      </w:pPr>
-    </w:p>
-    <w:p>
-      <w:pPr>
-        <w:shd w:val="clear" w:color="auto" w:fill="FFFF00"/>
-        <w:ind w:left="567" w:hanging="567"/>
-        <w:rPr>
-          <w:rFonts w:ascii="Times New Roman" w:eastAsia="Times New Roman" w:hAnsi="Times New Roman" w:cs="Times New Roman"/>
-          <w:sz w:val="24"/>
-          <w:szCs w:val="24"/>
-        </w:rPr>
-      </w:pPr>
-      <w:r>
-        <w:rPr>
-          <w:rFonts w:ascii="Times New Roman" w:eastAsia="Times New Roman" w:hAnsi="Times New Roman" w:cs="Times New Roman"/>
-          <w:sz w:val="24"/>
-          <w:szCs w:val="24"/>
-        </w:rPr>
-        <w:t>Keterangan:</w:t>
-      </w:r>
-    </w:p>
-    <w:p>
-      <w:pPr>
-        <w:shd w:val="clear" w:color="auto" w:fill="FFFF00"/>
-        <w:rPr>
-          <w:rFonts w:ascii="Times New Roman" w:eastAsia="Times New Roman" w:hAnsi="Times New Roman" w:cs="Times New Roman"/>
-          <w:sz w:val="24"/>
-          <w:szCs w:val="24"/>
-        </w:rPr>
-      </w:pPr>
-      <w:r>
-        <w:rPr>
-          <w:rFonts w:ascii="Times New Roman" w:eastAsia="Times New Roman" w:hAnsi="Times New Roman" w:cs="Times New Roman"/>
-          <w:b/>
-          <w:sz w:val="24"/>
-          <w:szCs w:val="24"/>
-        </w:rPr>
-        <w:t>WAJIB</w:t>
-      </w:r>
-      <w:r>
-        <w:rPr>
-          <w:rFonts w:ascii="Times New Roman" w:eastAsia="Times New Roman" w:hAnsi="Times New Roman" w:cs="Times New Roman"/>
-          <w:sz w:val="24"/>
-          <w:szCs w:val="24"/>
-        </w:rPr>
-        <w:t xml:space="preserve"> menggunakan </w:t>
-      </w:r>
-      <w:r>
-        <w:rPr>
-          <w:rFonts w:ascii="Times New Roman" w:eastAsia="Times New Roman" w:hAnsi="Times New Roman" w:cs="Times New Roman"/>
-          <w:b/>
-          <w:sz w:val="24"/>
-          <w:szCs w:val="24"/>
-        </w:rPr>
-        <w:t>software management reference (SMR)</w:t>
-      </w:r>
-      <w:r>
-        <w:rPr>
-          <w:rFonts w:ascii="Times New Roman" w:eastAsia="Times New Roman" w:hAnsi="Times New Roman" w:cs="Times New Roman"/>
-          <w:sz w:val="24"/>
-          <w:szCs w:val="24"/>
-        </w:rPr>
-        <w:t xml:space="preserve"> seperti </w:t>
-      </w:r>
-      <w:r>
-        <w:rPr>
-          <w:rFonts w:ascii="Times New Roman" w:eastAsia="Times New Roman" w:hAnsi="Times New Roman" w:cs="Times New Roman"/>
-          <w:b/>
-          <w:sz w:val="24"/>
-          <w:szCs w:val="24"/>
-        </w:rPr>
-        <w:t>Mendeley, EndNote, Zotero dll.</w:t>
-      </w:r>
-    </w:p>
-    <w:p>
-      <w:pPr>
-        <w:shd w:val="clear" w:color="auto" w:fill="FFFF00"/>
-        <w:rPr>
-          <w:rFonts w:ascii="Times New Roman" w:eastAsia="Times New Roman" w:hAnsi="Times New Roman" w:cs="Times New Roman"/>
-          <w:b/>
-          <w:sz w:val="24"/>
-          <w:szCs w:val="24"/>
-        </w:rPr>
-      </w:pPr>
-      <w:r>
-        <w:rPr>
-          <w:rFonts w:ascii="Times New Roman" w:eastAsia="Times New Roman" w:hAnsi="Times New Roman" w:cs="Times New Roman"/>
-          <w:b/>
-          <w:sz w:val="24"/>
-          <w:szCs w:val="24"/>
-        </w:rPr>
-        <w:t>Komposisi daftar pustaka:</w:t>
-      </w:r>
-    </w:p>
-    <w:p>
-      <w:pPr>
-        <w:shd w:val="clear" w:color="auto" w:fill="FFFF00"/>
-        <w:rPr>
-          <w:rFonts w:ascii="Times New Roman" w:eastAsia="Times New Roman" w:hAnsi="Times New Roman" w:cs="Times New Roman"/>
-          <w:sz w:val="24"/>
-          <w:szCs w:val="24"/>
-        </w:rPr>
-      </w:pPr>
-      <w:r>
-        <w:rPr>
-          <w:rFonts w:ascii="Times New Roman" w:eastAsia="Times New Roman" w:hAnsi="Times New Roman" w:cs="Times New Roman"/>
-          <w:sz w:val="24"/>
-          <w:szCs w:val="24"/>
-        </w:rPr>
-        <w:t xml:space="preserve">Artikel Ilmiah (jurnal/prosiding) 5 tahun terakhir yang terkait/relevan penelitiannya, berbahasa Indonesia maupun Inggris </w:t>
-      </w:r>
-      <w:r>
-        <w:rPr>
-          <w:rFonts w:ascii="Times New Roman" w:eastAsia="Times New Roman" w:hAnsi="Times New Roman" w:cs="Times New Roman"/>
-          <w:b/>
-          <w:sz w:val="24"/>
-          <w:szCs w:val="24"/>
-        </w:rPr>
-        <w:t>60%</w:t>
-      </w:r>
-    </w:p>
-    <w:p>
-      <w:pPr>
-        <w:shd w:val="clear" w:color="auto" w:fill="FFFF00"/>
-        <w:rPr>
-          <w:rFonts w:ascii="Times New Roman" w:eastAsia="Times New Roman" w:hAnsi="Times New Roman" w:cs="Times New Roman"/>
-          <w:sz w:val="24"/>
-          <w:szCs w:val="24"/>
-        </w:rPr>
-      </w:pPr>
-      <w:r>
-        <w:rPr>
-          <w:rFonts w:ascii="Times New Roman" w:eastAsia="Times New Roman" w:hAnsi="Times New Roman" w:cs="Times New Roman"/>
-          <w:sz w:val="24"/>
-          <w:szCs w:val="24"/>
-        </w:rPr>
-        <w:t xml:space="preserve">Buku/Chapter Book 5 tahun terakhir yang terkait/relevan penelitiannya, berbahasa Indonesia maupun Inggris </w:t>
-      </w:r>
-      <w:r>
-        <w:rPr>
-          <w:rFonts w:ascii="Times New Roman" w:eastAsia="Times New Roman" w:hAnsi="Times New Roman" w:cs="Times New Roman"/>
-          <w:b/>
-          <w:sz w:val="24"/>
-          <w:szCs w:val="24"/>
-        </w:rPr>
-        <w:t>30%</w:t>
-      </w:r>
-    </w:p>
-    <w:p>
-      <w:pPr>
-        <w:shd w:val="clear" w:color="auto" w:fill="FFFF00"/>
-        <w:tabs>
-          <w:tab w:val="left" w:pos="2835"/>
-        </w:tabs>
-        <w:rPr>
-          <w:rFonts w:ascii="Times New Roman" w:eastAsia="Times New Roman" w:hAnsi="Times New Roman" w:cs="Times New Roman"/>
-          <w:sz w:val="24"/>
-          <w:szCs w:val="24"/>
-        </w:rPr>
-      </w:pPr>
-      <w:r>
-        <w:rPr>
-          <w:rFonts w:ascii="Times New Roman" w:eastAsia="Times New Roman" w:hAnsi="Times New Roman" w:cs="Times New Roman"/>
-          <w:sz w:val="24"/>
-          <w:szCs w:val="24"/>
-        </w:rPr>
-        <w:t xml:space="preserve">Web yang terkait/relevan penelitiannya, berbahasa Indonesia maupun Inggris </w:t>
-      </w:r>
-      <w:r>
-        <w:rPr>
-          <w:rFonts w:ascii="Times New Roman" w:eastAsia="Times New Roman" w:hAnsi="Times New Roman" w:cs="Times New Roman"/>
-          <w:b/>
-          <w:sz w:val="24"/>
-          <w:szCs w:val="24"/>
-        </w:rPr>
-        <w:t>10%</w:t>
-      </w:r>
-    </w:p>
-    <w:p>
-      <w:pPr>
-        <w:shd w:val="clear" w:color="auto" w:fill="FFFF00"/>
-        <w:rPr>
-          <w:rFonts w:ascii="Times New Roman" w:eastAsia="Times New Roman" w:hAnsi="Times New Roman" w:cs="Times New Roman"/>
-          <w:sz w:val="24"/>
-          <w:szCs w:val="24"/>
-        </w:rPr>
-      </w:pPr>
-      <w:r>
-        <w:rPr>
-          <w:rFonts w:ascii="Times New Roman" w:eastAsia="Times New Roman" w:hAnsi="Times New Roman" w:cs="Times New Roman"/>
-          <w:sz w:val="24"/>
-          <w:szCs w:val="24"/>
-        </w:rPr>
-        <w:t xml:space="preserve">Jumlah daftar pustaka yang digunakan yang terkait/relevan penelitiannya sebanyak </w:t>
-      </w:r>
-      <w:r>
-        <w:rPr>
-          <w:rFonts w:ascii="Times New Roman" w:eastAsia="Times New Roman" w:hAnsi="Times New Roman" w:cs="Times New Roman"/>
-          <w:b/>
-          <w:sz w:val="24"/>
-          <w:szCs w:val="24"/>
-        </w:rPr>
-        <w:t>30-50</w:t>
-      </w:r>
-      <w:r>
-        <w:rPr>
-          <w:rFonts w:ascii="Times New Roman" w:eastAsia="Times New Roman" w:hAnsi="Times New Roman" w:cs="Times New Roman"/>
-          <w:sz w:val="24"/>
-          <w:szCs w:val="24"/>
-        </w:rPr>
-        <w:t xml:space="preserve"> referensi.</w:t>
-      </w:r>
-    </w:p>
-    <w:p>
-      <w:pPr>
-        <w:rPr>
-          <w:rFonts w:ascii="Times New Roman" w:eastAsia="Times New Roman" w:hAnsi="Times New Roman" w:cs="Times New Roman"/>
+        <w:br w:type="page"/>
+      </w:r>
+    </w:p>
+    <w:p>
+      <w:pPr>
+        <w:pStyle w:val="Heading1"/>
+        <w:jc w:val="center"/>
+        <w:rPr>
           <w:b/>
           <w:sz w:val="28"/>
           <w:szCs w:val="28"/>
         </w:rPr>
       </w:pPr>
-      <w:r>
-        <w:lastRenderedPageBreak/>
-        <w:br w:type="page"/>
-      </w:r>
-    </w:p>
-    <w:p>
-      <w:pPr>
-        <w:pStyle w:val="Heading1"/>
-        <w:jc w:val="center"/>
-        <w:rPr>
-          <w:b/>
-          <w:sz w:val="28"/>
-          <w:szCs w:val="28"/>
-        </w:rPr>
-      </w:pPr>
-      <w:bookmarkStart w:id="34" w:name="_heading=h.1hmsyys" w:colFirst="0" w:colLast="0"/>
-      <w:bookmarkEnd w:id="34"/>
+      <w:bookmarkStart w:id="32" w:name="_heading=h.1hmsyys" w:colFirst="0" w:colLast="0"/>
+      <w:bookmarkEnd w:id="32"/>
       <w:r>
         <w:rPr>
           <w:b/>
@@ -13834,8 +16025,8 @@
       </w:r>
     </w:p>
     <w:sectPr>
-      <w:headerReference w:type="default" r:id="rId17"/>
-      <w:footerReference w:type="default" r:id="rId18"/>
+      <w:headerReference w:type="default" r:id="rId18"/>
+      <w:footerReference w:type="default" r:id="rId19"/>
       <w:pgSz w:w="11907" w:h="16839"/>
       <w:pgMar w:top="1985" w:right="1418" w:bottom="1418" w:left="1985" w:header="0" w:footer="1134" w:gutter="0"/>
       <w:pgNumType w:start="3"/>
@@ -16480,6 +18671,580 @@
 </w:styles>
 </file>
 
+<file path=word/glossary/document.xml><?xml version="1.0" encoding="utf-8"?>
+<w:glossaryDocument xmlns:wpc="http://schemas.microsoft.com/office/word/2010/wordprocessingCanvas" xmlns:cx="http://schemas.microsoft.com/office/drawing/2014/chartex" xmlns:cx1="http://schemas.microsoft.com/office/drawing/2015/9/8/chartex" xmlns:cx2="http://schemas.microsoft.com/office/drawing/2015/10/21/chartex" xmlns:cx3="http://schemas.microsoft.com/office/drawing/2016/5/9/chartex" xmlns:cx4="http://schemas.microsoft.com/office/drawing/2016/5/10/chartex" xmlns:cx5="http://schemas.microsoft.com/office/drawing/2016/5/11/chartex" xmlns:cx6="http://schemas.microsoft.com/office/drawing/2016/5/12/chartex" xmlns:cx7="http://schemas.microsoft.com/office/drawing/2016/5/13/chartex" xmlns:cx8="http://schemas.microsoft.com/office/drawing/2016/5/14/chartex" xmlns:mc="http://schemas.openxmlformats.org/markup-compatibility/2006" xmlns:aink="http://schemas.microsoft.com/office/drawing/2016/ink" xmlns:am3d="http://schemas.microsoft.com/office/drawing/2017/model3d" xmlns:o="urn:schemas-microsoft-com:office:office" xmlns:oel="http://schemas.microsoft.com/office/2019/extlst" xmlns:r="http://schemas.openxmlformats.org/officeDocument/2006/relationships" xmlns:m="http://schemas.openxmlformats.org/officeDocument/2006/math" xmlns:v="urn:schemas-microsoft-com:vml" xmlns:wp14="http://schemas.microsoft.com/office/word/2010/wordprocessingDrawing" xmlns:wp="http://schemas.openxmlformats.org/drawingml/2006/wordprocessingDrawing" xmlns:w10="urn:schemas-microsoft-com:office:word" xmlns:w="http://schemas.openxmlformats.org/wordprocessingml/2006/main" xmlns:w14="http://schemas.microsoft.com/office/word/2010/wordml" xmlns:w15="http://schemas.microsoft.com/office/word/2012/wordml" xmlns:w16cex="http://schemas.microsoft.com/office/word/2018/wordml/cex" xmlns:w16cid="http://schemas.microsoft.com/office/word/2016/wordml/cid" xmlns:w16="http://schemas.microsoft.com/office/word/2018/wordml" xmlns:w16du="http://schemas.microsoft.com/office/word/2023/wordml/word16du" xmlns:w16sdtdh="http://schemas.microsoft.com/office/word/2020/wordml/sdtdatahash" xmlns:w16sdtfl="http://schemas.microsoft.com/office/word/2024/wordml/sdtformatlock" xmlns:w16se="http://schemas.microsoft.com/office/word/2015/wordml/symex" xmlns:wpg="http://schemas.microsoft.com/office/word/2010/wordprocessingGroup" xmlns:wpi="http://schemas.microsoft.com/office/word/2010/wordprocessingInk" xmlns:wne="http://schemas.microsoft.com/office/word/2006/wordml" xmlns:wps="http://schemas.microsoft.com/office/word/2010/wordprocessingShape" mc:Ignorable="w14 w15 w16se w16cid w16 w16cex w16sdtdh w16sdtfl w16du wp14">
+  <w:docParts>
+    <w:docPart>
+      <w:docPartPr>
+        <w:name w:val="DefaultPlaceholder_-1854013440"/>
+        <w:category>
+          <w:name w:val="General"/>
+          <w:gallery w:val="placeholder"/>
+        </w:category>
+        <w:types>
+          <w:type w:val="bbPlcHdr"/>
+        </w:types>
+        <w:behaviors>
+          <w:behavior w:val="content"/>
+        </w:behaviors>
+        <w:guid w:val="{5C3926ED-CC76-4699-8F62-3F1D96FEAB28}"/>
+      </w:docPartPr>
+      <w:docPartBody>
+        <w:p>
+          <w:r>
+            <w:rPr>
+              <w:rStyle w:val="PlaceholderText"/>
+            </w:rPr>
+            <w:t>Click or tap here to enter text.</w:t>
+          </w:r>
+        </w:p>
+      </w:docPartBody>
+    </w:docPart>
+  </w:docParts>
+</w:glossaryDocument>
+</file>
+
+<file path=word/glossary/fontTable.xml><?xml version="1.0" encoding="utf-8"?>
+<w:fonts xmlns:mc="http://schemas.openxmlformats.org/markup-compatibility/2006" xmlns:r="http://schemas.openxmlformats.org/officeDocument/2006/relationships" xmlns:w="http://schemas.openxmlformats.org/wordprocessingml/2006/main" xmlns:w14="http://schemas.microsoft.com/office/word/2010/wordml" xmlns:w15="http://schemas.microsoft.com/office/word/2012/wordml" xmlns:w16cex="http://schemas.microsoft.com/office/word/2018/wordml/cex" xmlns:w16cid="http://schemas.microsoft.com/office/word/2016/wordml/cid" xmlns:w16="http://schemas.microsoft.com/office/word/2018/wordml" xmlns:w16du="http://schemas.microsoft.com/office/word/2023/wordml/word16du" xmlns:w16sdtdh="http://schemas.microsoft.com/office/word/2020/wordml/sdtdatahash" xmlns:w16sdtfl="http://schemas.microsoft.com/office/word/2024/wordml/sdtformatlock" xmlns:w16se="http://schemas.microsoft.com/office/word/2015/wordml/symex" mc:Ignorable="w14 w15 w16se w16cid w16 w16cex w16sdtdh w16sdtfl w16du">
+  <w:font w:name="Times New Roman">
+    <w:panose1 w:val="02020603050405020304"/>
+    <w:charset w:val="00"/>
+    <w:family w:val="roman"/>
+    <w:pitch w:val="variable"/>
+    <w:sig w:usb0="E0002EFF" w:usb1="C000785B" w:usb2="00000009" w:usb3="00000000" w:csb0="000001FF" w:csb1="00000000"/>
+  </w:font>
+  <w:font w:name="Noto Sans Symbols">
+    <w:charset w:val="00"/>
+    <w:family w:val="auto"/>
+    <w:pitch w:val="default"/>
+  </w:font>
+  <w:font w:name="Courier New">
+    <w:panose1 w:val="02070309020205020404"/>
+    <w:charset w:val="00"/>
+    <w:family w:val="modern"/>
+    <w:pitch w:val="fixed"/>
+    <w:sig w:usb0="E0002EFF" w:usb1="C0007843" w:usb2="00000009" w:usb3="00000000" w:csb0="000001FF" w:csb1="00000000"/>
+  </w:font>
+  <w:font w:name="Calibri">
+    <w:panose1 w:val="020F0502020204030204"/>
+    <w:charset w:val="00"/>
+    <w:family w:val="swiss"/>
+    <w:pitch w:val="variable"/>
+    <w:sig w:usb0="E4002EFF" w:usb1="C200247B" w:usb2="00000009" w:usb3="00000000" w:csb0="000001FF" w:csb1="00000000"/>
+  </w:font>
+  <w:font w:name="Calibri Light">
+    <w:panose1 w:val="020F0302020204030204"/>
+    <w:charset w:val="00"/>
+    <w:family w:val="swiss"/>
+    <w:pitch w:val="variable"/>
+    <w:sig w:usb0="E4002EFF" w:usb1="C200247B" w:usb2="00000009" w:usb3="00000000" w:csb0="000001FF" w:csb1="00000000"/>
+  </w:font>
+  <w:font w:name="Segoe UI">
+    <w:panose1 w:val="020B0502040204020203"/>
+    <w:charset w:val="00"/>
+    <w:family w:val="swiss"/>
+    <w:pitch w:val="variable"/>
+    <w:sig w:usb0="E4002EFF" w:usb1="C000E47F" w:usb2="00000009" w:usb3="00000000" w:csb0="000001FF" w:csb1="00000000"/>
+  </w:font>
+  <w:font w:name="Georgia">
+    <w:panose1 w:val="02040502050405020303"/>
+    <w:charset w:val="00"/>
+    <w:family w:val="roman"/>
+    <w:pitch w:val="variable"/>
+    <w:sig w:usb0="00000287" w:usb1="00000000" w:usb2="00000000" w:usb3="00000000" w:csb0="0000009F" w:csb1="00000000"/>
+  </w:font>
+</w:fonts>
+</file>
+
+<file path=word/glossary/settings.xml><?xml version="1.0" encoding="utf-8"?>
+<w:settings xmlns:mc="http://schemas.openxmlformats.org/markup-compatibility/2006" xmlns:o="urn:schemas-microsoft-com:office:office" xmlns:r="http://schemas.openxmlformats.org/officeDocument/2006/relationships" xmlns:m="http://schemas.openxmlformats.org/officeDocument/2006/math" xmlns:v="urn:schemas-microsoft-com:vml" xmlns:w10="urn:schemas-microsoft-com:office:word" xmlns:w="http://schemas.openxmlformats.org/wordprocessingml/2006/main" xmlns:w14="http://schemas.microsoft.com/office/word/2010/wordml" xmlns:w15="http://schemas.microsoft.com/office/word/2012/wordml" xmlns:w16cex="http://schemas.microsoft.com/office/word/2018/wordml/cex" xmlns:w16cid="http://schemas.microsoft.com/office/word/2016/wordml/cid" xmlns:w16="http://schemas.microsoft.com/office/word/2018/wordml" xmlns:w16du="http://schemas.microsoft.com/office/word/2023/wordml/word16du" xmlns:w16sdtdh="http://schemas.microsoft.com/office/word/2020/wordml/sdtdatahash" xmlns:w16sdtfl="http://schemas.microsoft.com/office/word/2024/wordml/sdtformatlock" xmlns:w16se="http://schemas.microsoft.com/office/word/2015/wordml/symex" xmlns:sl="http://schemas.openxmlformats.org/schemaLibrary/2006/main" mc:Ignorable="w14 w15 w16se w16cid w16 w16cex w16sdtdh w16sdtfl w16du">
+  <w:view w:val="normal"/>
+  <w:defaultTabStop w:val="720"/>
+  <w:characterSpacingControl w:val="doNotCompress"/>
+  <w:compat>
+    <w:useFELayout/>
+    <w:compatSetting w:name="compatibilityMode" w:uri="http://schemas.microsoft.com/office/word" w:val="15"/>
+    <w:compatSetting w:name="overrideTableStyleFontSizeAndJustification" w:uri="http://schemas.microsoft.com/office/word" w:val="1"/>
+    <w:compatSetting w:name="enableOpenTypeFeatures" w:uri="http://schemas.microsoft.com/office/word" w:val="1"/>
+    <w:compatSetting w:name="doNotFlipMirrorIndents" w:uri="http://schemas.microsoft.com/office/word" w:val="1"/>
+    <w:compatSetting w:name="differentiateMultirowTableHeaders" w:uri="http://schemas.microsoft.com/office/word" w:val="1"/>
+    <w:compatSetting w:name="useWord2013TrackBottomHyphenation" w:uri="http://schemas.microsoft.com/office/word" w:val="0"/>
+  </w:compat>
+  <w:rsids>
+    <w:rsidRoot w:val="00FD1950"/>
+    <w:rsid w:val="0019567E"/>
+    <w:rsid w:val="00E91ADE"/>
+    <w:rsid w:val="00FD1950"/>
+  </w:rsids>
+  <m:mathPr>
+    <m:mathFont m:val="Cambria Math"/>
+    <m:brkBin m:val="before"/>
+    <m:brkBinSub m:val="--"/>
+    <m:smallFrac m:val="0"/>
+    <m:dispDef/>
+    <m:lMargin m:val="0"/>
+    <m:rMargin m:val="0"/>
+    <m:defJc m:val="centerGroup"/>
+    <m:wrapIndent m:val="1440"/>
+    <m:intLim m:val="subSup"/>
+    <m:naryLim m:val="undOvr"/>
+  </m:mathPr>
+  <w:themeFontLang w:val="en-ID"/>
+  <w:clrSchemeMapping w:bg1="light1" w:t1="dark1" w:bg2="light2" w:t2="dark2" w:accent1="accent1" w:accent2="accent2" w:accent3="accent3" w:accent4="accent4" w:accent5="accent5" w:accent6="accent6" w:hyperlink="hyperlink" w:followedHyperlink="followedHyperlink"/>
+  <w:decimalSymbol w:val=","/>
+  <w:listSeparator w:val=";"/>
+  <w15:chartTrackingRefBased/>
+</w:settings>
+</file>
+
+<file path=word/glossary/styles.xml><?xml version="1.0" encoding="utf-8"?>
+<w:styles xmlns:mc="http://schemas.openxmlformats.org/markup-compatibility/2006" xmlns:r="http://schemas.openxmlformats.org/officeDocument/2006/relationships" xmlns:w="http://schemas.openxmlformats.org/wordprocessingml/2006/main" xmlns:w14="http://schemas.microsoft.com/office/word/2010/wordml" xmlns:w15="http://schemas.microsoft.com/office/word/2012/wordml" xmlns:w16cex="http://schemas.microsoft.com/office/word/2018/wordml/cex" xmlns:w16cid="http://schemas.microsoft.com/office/word/2016/wordml/cid" xmlns:w16="http://schemas.microsoft.com/office/word/2018/wordml" xmlns:w16du="http://schemas.microsoft.com/office/word/2023/wordml/word16du" xmlns:w16sdtdh="http://schemas.microsoft.com/office/word/2020/wordml/sdtdatahash" xmlns:w16sdtfl="http://schemas.microsoft.com/office/word/2024/wordml/sdtformatlock" xmlns:w16se="http://schemas.microsoft.com/office/word/2015/wordml/symex" mc:Ignorable="w14 w15 w16se w16cid w16 w16cex w16sdtdh w16sdtfl w16du">
+  <w:docDefaults>
+    <w:rPrDefault>
+      <w:rPr>
+        <w:rFonts w:asciiTheme="minorHAnsi" w:eastAsiaTheme="minorEastAsia" w:hAnsiTheme="minorHAnsi" w:cstheme="minorBidi"/>
+        <w:kern w:val="2"/>
+        <w:sz w:val="24"/>
+        <w:szCs w:val="24"/>
+        <w:lang w:val="en-ID" w:eastAsia="en-ID" w:bidi="ar-SA"/>
+        <w14:ligatures w14:val="standardContextual"/>
+      </w:rPr>
+    </w:rPrDefault>
+    <w:pPrDefault>
+      <w:pPr>
+        <w:spacing w:after="160" w:line="278" w:lineRule="auto"/>
+      </w:pPr>
+    </w:pPrDefault>
+  </w:docDefaults>
+  <w:latentStyles w:defLockedState="0" w:defUIPriority="99" w:defSemiHidden="0" w:defUnhideWhenUsed="0" w:defQFormat="0" w:count="376">
+    <w:lsdException w:name="Normal" w:uiPriority="0" w:qFormat="1"/>
+    <w:lsdException w:name="heading 1" w:uiPriority="9" w:qFormat="1"/>
+    <w:lsdException w:name="heading 2" w:semiHidden="1" w:uiPriority="9" w:unhideWhenUsed="1" w:qFormat="1"/>
+    <w:lsdException w:name="heading 3" w:semiHidden="1" w:uiPriority="9" w:unhideWhenUsed="1" w:qFormat="1"/>
+    <w:lsdException w:name="heading 4" w:semiHidden="1" w:uiPriority="9" w:unhideWhenUsed="1" w:qFormat="1"/>
+    <w:lsdException w:name="heading 5" w:semiHidden="1" w:uiPriority="9" w:unhideWhenUsed="1" w:qFormat="1"/>
+    <w:lsdException w:name="heading 6" w:semiHidden="1" w:uiPriority="9" w:unhideWhenUsed="1" w:qFormat="1"/>
+    <w:lsdException w:name="heading 7" w:semiHidden="1" w:uiPriority="9" w:unhideWhenUsed="1" w:qFormat="1"/>
+    <w:lsdException w:name="heading 8" w:semiHidden="1" w:uiPriority="9" w:unhideWhenUsed="1" w:qFormat="1"/>
+    <w:lsdException w:name="heading 9" w:semiHidden="1" w:uiPriority="9" w:unhideWhenUsed="1" w:qFormat="1"/>
+    <w:lsdException w:name="index 1" w:semiHidden="1" w:unhideWhenUsed="1"/>
+    <w:lsdException w:name="index 2" w:semiHidden="1" w:unhideWhenUsed="1"/>
+    <w:lsdException w:name="index 3" w:semiHidden="1" w:unhideWhenUsed="1"/>
+    <w:lsdException w:name="index 4" w:semiHidden="1" w:unhideWhenUsed="1"/>
+    <w:lsdException w:name="index 5" w:semiHidden="1" w:unhideWhenUsed="1"/>
+    <w:lsdException w:name="index 6" w:semiHidden="1" w:unhideWhenUsed="1"/>
+    <w:lsdException w:name="index 7" w:semiHidden="1" w:unhideWhenUsed="1"/>
+    <w:lsdException w:name="index 8" w:semiHidden="1" w:unhideWhenUsed="1"/>
+    <w:lsdException w:name="index 9" w:semiHidden="1" w:unhideWhenUsed="1"/>
+    <w:lsdException w:name="toc 1" w:semiHidden="1" w:uiPriority="39" w:unhideWhenUsed="1"/>
+    <w:lsdException w:name="toc 2" w:semiHidden="1" w:uiPriority="39" w:unhideWhenUsed="1"/>
+    <w:lsdException w:name="toc 3" w:semiHidden="1" w:uiPriority="39" w:unhideWhenUsed="1"/>
+    <w:lsdException w:name="toc 4" w:semiHidden="1" w:uiPriority="39" w:unhideWhenUsed="1"/>
+    <w:lsdException w:name="toc 5" w:semiHidden="1" w:uiPriority="39" w:unhideWhenUsed="1"/>
+    <w:lsdException w:name="toc 6" w:semiHidden="1" w:uiPriority="39" w:unhideWhenUsed="1"/>
+    <w:lsdException w:name="toc 7" w:semiHidden="1" w:uiPriority="39" w:unhideWhenUsed="1"/>
+    <w:lsdException w:name="toc 8" w:semiHidden="1" w:uiPriority="39" w:unhideWhenUsed="1"/>
+    <w:lsdException w:name="toc 9" w:semiHidden="1" w:uiPriority="39" w:unhideWhenUsed="1"/>
+    <w:lsdException w:name="Normal Indent" w:semiHidden="1" w:unhideWhenUsed="1"/>
+    <w:lsdException w:name="footnote text" w:semiHidden="1" w:unhideWhenUsed="1"/>
+    <w:lsdException w:name="annotation text" w:semiHidden="1" w:unhideWhenUsed="1"/>
+    <w:lsdException w:name="header" w:semiHidden="1" w:unhideWhenUsed="1"/>
+    <w:lsdException w:name="footer" w:semiHidden="1" w:unhideWhenUsed="1"/>
+    <w:lsdException w:name="index heading" w:semiHidden="1" w:unhideWhenUsed="1"/>
+    <w:lsdException w:name="caption" w:semiHidden="1" w:uiPriority="35" w:unhideWhenUsed="1" w:qFormat="1"/>
+    <w:lsdException w:name="table of figures" w:semiHidden="1" w:unhideWhenUsed="1"/>
+    <w:lsdException w:name="envelope address" w:semiHidden="1" w:unhideWhenUsed="1"/>
+    <w:lsdException w:name="envelope return" w:semiHidden="1" w:unhideWhenUsed="1"/>
+    <w:lsdException w:name="footnote reference" w:semiHidden="1" w:unhideWhenUsed="1"/>
+    <w:lsdException w:name="annotation reference" w:semiHidden="1" w:unhideWhenUsed="1"/>
+    <w:lsdException w:name="line number" w:semiHidden="1" w:unhideWhenUsed="1"/>
+    <w:lsdException w:name="page number" w:semiHidden="1" w:unhideWhenUsed="1"/>
+    <w:lsdException w:name="endnote reference" w:semiHidden="1" w:unhideWhenUsed="1"/>
+    <w:lsdException w:name="endnote text" w:semiHidden="1" w:unhideWhenUsed="1"/>
+    <w:lsdException w:name="table of authorities" w:semiHidden="1" w:unhideWhenUsed="1"/>
+    <w:lsdException w:name="macro" w:semiHidden="1" w:unhideWhenUsed="1"/>
+    <w:lsdException w:name="toa heading" w:semiHidden="1" w:unhideWhenUsed="1"/>
+    <w:lsdException w:name="List" w:semiHidden="1" w:unhideWhenUsed="1"/>
+    <w:lsdException w:name="List Bullet" w:semiHidden="1" w:unhideWhenUsed="1"/>
+    <w:lsdException w:name="List Number" w:semiHidden="1" w:unhideWhenUsed="1"/>
+    <w:lsdException w:name="List 2" w:semiHidden="1" w:unhideWhenUsed="1"/>
+    <w:lsdException w:name="List 3" w:semiHidden="1" w:unhideWhenUsed="1"/>
+    <w:lsdException w:name="List 4" w:semiHidden="1" w:unhideWhenUsed="1"/>
+    <w:lsdException w:name="List 5" w:semiHidden="1" w:unhideWhenUsed="1"/>
+    <w:lsdException w:name="List Bullet 2" w:semiHidden="1" w:unhideWhenUsed="1"/>
+    <w:lsdException w:name="List Bullet 3" w:semiHidden="1" w:unhideWhenUsed="1"/>
+    <w:lsdException w:name="List Bullet 4" w:semiHidden="1" w:unhideWhenUsed="1"/>
+    <w:lsdException w:name="List Bullet 5" w:semiHidden="1" w:unhideWhenUsed="1"/>
+    <w:lsdException w:name="List Number 2" w:semiHidden="1" w:unhideWhenUsed="1"/>
+    <w:lsdException w:name="List Number 3" w:semiHidden="1" w:unhideWhenUsed="1"/>
+    <w:lsdException w:name="List Number 4" w:semiHidden="1" w:unhideWhenUsed="1"/>
+    <w:lsdException w:name="List Number 5" w:semiHidden="1" w:unhideWhenUsed="1"/>
+    <w:lsdException w:name="Title" w:uiPriority="10" w:qFormat="1"/>
+    <w:lsdException w:name="Closing" w:semiHidden="1" w:unhideWhenUsed="1"/>
+    <w:lsdException w:name="Signature" w:semiHidden="1" w:unhideWhenUsed="1"/>
+    <w:lsdException w:name="Default Paragraph Font" w:semiHidden="1" w:uiPriority="1" w:unhideWhenUsed="1"/>
+    <w:lsdException w:name="Body Text" w:semiHidden="1" w:unhideWhenUsed="1"/>
+    <w:lsdException w:name="Body Text Indent" w:semiHidden="1" w:unhideWhenUsed="1"/>
+    <w:lsdException w:name="List Continue" w:semiHidden="1" w:unhideWhenUsed="1"/>
+    <w:lsdException w:name="List Continue 2" w:semiHidden="1" w:unhideWhenUsed="1"/>
+    <w:lsdException w:name="List Continue 3" w:semiHidden="1" w:unhideWhenUsed="1"/>
+    <w:lsdException w:name="List Continue 4" w:semiHidden="1" w:unhideWhenUsed="1"/>
+    <w:lsdException w:name="List Continue 5" w:semiHidden="1" w:unhideWhenUsed="1"/>
+    <w:lsdException w:name="Message Header" w:semiHidden="1" w:unhideWhenUsed="1"/>
+    <w:lsdException w:name="Subtitle" w:uiPriority="11" w:qFormat="1"/>
+    <w:lsdException w:name="Salutation" w:semiHidden="1" w:unhideWhenUsed="1"/>
+    <w:lsdException w:name="Date" w:semiHidden="1" w:unhideWhenUsed="1"/>
+    <w:lsdException w:name="Body Text First Indent" w:semiHidden="1" w:unhideWhenUsed="1"/>
+    <w:lsdException w:name="Body Text First Indent 2" w:semiHidden="1" w:unhideWhenUsed="1"/>
+    <w:lsdException w:name="Note Heading" w:semiHidden="1" w:unhideWhenUsed="1"/>
+    <w:lsdException w:name="Body Text 2" w:semiHidden="1" w:unhideWhenUsed="1"/>
+    <w:lsdException w:name="Body Text 3" w:semiHidden="1" w:unhideWhenUsed="1"/>
+    <w:lsdException w:name="Body Text Indent 2" w:semiHidden="1" w:unhideWhenUsed="1"/>
+    <w:lsdException w:name="Body Text Indent 3" w:semiHidden="1" w:unhideWhenUsed="1"/>
+    <w:lsdException w:name="Block Text" w:semiHidden="1" w:unhideWhenUsed="1"/>
+    <w:lsdException w:name="Hyperlink" w:semiHidden="1" w:unhideWhenUsed="1"/>
+    <w:lsdException w:name="FollowedHyperlink" w:semiHidden="1" w:unhideWhenUsed="1"/>
+    <w:lsdException w:name="Strong" w:uiPriority="22" w:qFormat="1"/>
+    <w:lsdException w:name="Emphasis" w:uiPriority="20" w:qFormat="1"/>
+    <w:lsdException w:name="Document Map" w:semiHidden="1" w:unhideWhenUsed="1"/>
+    <w:lsdException w:name="Plain Text" w:semiHidden="1" w:unhideWhenUsed="1"/>
+    <w:lsdException w:name="E-mail Signature" w:semiHidden="1" w:unhideWhenUsed="1"/>
+    <w:lsdException w:name="HTML Top of Form" w:semiHidden="1" w:unhideWhenUsed="1"/>
+    <w:lsdException w:name="HTML Bottom of Form" w:semiHidden="1" w:unhideWhenUsed="1"/>
+    <w:lsdException w:name="Normal (Web)" w:semiHidden="1" w:unhideWhenUsed="1"/>
+    <w:lsdException w:name="HTML Acronym" w:semiHidden="1" w:unhideWhenUsed="1"/>
+    <w:lsdException w:name="HTML Address" w:semiHidden="1" w:unhideWhenUsed="1"/>
+    <w:lsdException w:name="HTML Cite" w:semiHidden="1" w:unhideWhenUsed="1"/>
+    <w:lsdException w:name="HTML Code" w:semiHidden="1" w:unhideWhenUsed="1"/>
+    <w:lsdException w:name="HTML Definition" w:semiHidden="1" w:unhideWhenUsed="1"/>
+    <w:lsdException w:name="HTML Keyboard" w:semiHidden="1" w:unhideWhenUsed="1"/>
+    <w:lsdException w:name="HTML Preformatted" w:semiHidden="1" w:unhideWhenUsed="1"/>
+    <w:lsdException w:name="HTML Sample" w:semiHidden="1" w:unhideWhenUsed="1"/>
+    <w:lsdException w:name="HTML Typewriter" w:semiHidden="1" w:unhideWhenUsed="1"/>
+    <w:lsdException w:name="HTML Variable" w:semiHidden="1" w:unhideWhenUsed="1"/>
+    <w:lsdException w:name="Normal Table" w:semiHidden="1" w:unhideWhenUsed="1"/>
+    <w:lsdException w:name="annotation subject" w:semiHidden="1" w:unhideWhenUsed="1"/>
+    <w:lsdException w:name="No List" w:semiHidden="1" w:unhideWhenUsed="1"/>
+    <w:lsdException w:name="Outline List 1" w:semiHidden="1" w:unhideWhenUsed="1"/>
+    <w:lsdException w:name="Outline List 2" w:semiHidden="1" w:unhideWhenUsed="1"/>
+    <w:lsdException w:name="Outline List 3" w:semiHidden="1" w:unhideWhenUsed="1"/>
+    <w:lsdException w:name="Table Simple 1" w:semiHidden="1" w:unhideWhenUsed="1"/>
+    <w:lsdException w:name="Table Simple 2" w:semiHidden="1" w:unhideWhenUsed="1"/>
+    <w:lsdException w:name="Table Simple 3" w:semiHidden="1" w:unhideWhenUsed="1"/>
+    <w:lsdException w:name="Table Classic 1" w:semiHidden="1" w:unhideWhenUsed="1"/>
+    <w:lsdException w:name="Table Classic 2" w:semiHidden="1" w:unhideWhenUsed="1"/>
+    <w:lsdException w:name="Table Classic 3" w:semiHidden="1" w:unhideWhenUsed="1"/>
+    <w:lsdException w:name="Table Classic 4" w:semiHidden="1" w:unhideWhenUsed="1"/>
+    <w:lsdException w:name="Table Colorful 1" w:semiHidden="1" w:unhideWhenUsed="1"/>
+    <w:lsdException w:name="Table Colorful 2" w:semiHidden="1" w:unhideWhenUsed="1"/>
+    <w:lsdException w:name="Table Colorful 3" w:semiHidden="1" w:unhideWhenUsed="1"/>
+    <w:lsdException w:name="Table Columns 1" w:semiHidden="1" w:unhideWhenUsed="1"/>
+    <w:lsdException w:name="Table Columns 2" w:semiHidden="1" w:unhideWhenUsed="1"/>
+    <w:lsdException w:name="Table Columns 3" w:semiHidden="1" w:unhideWhenUsed="1"/>
+    <w:lsdException w:name="Table Columns 4" w:semiHidden="1" w:unhideWhenUsed="1"/>
+    <w:lsdException w:name="Table Columns 5" w:semiHidden="1" w:unhideWhenUsed="1"/>
+    <w:lsdException w:name="Table Grid 1" w:semiHidden="1" w:unhideWhenUsed="1"/>
+    <w:lsdException w:name="Table Grid 2" w:semiHidden="1" w:unhideWhenUsed="1"/>
+    <w:lsdException w:name="Table Grid 3" w:semiHidden="1" w:unhideWhenUsed="1"/>
+    <w:lsdException w:name="Table Grid 4" w:semiHidden="1" w:unhideWhenUsed="1"/>
+    <w:lsdException w:name="Table Grid 5" w:semiHidden="1" w:unhideWhenUsed="1"/>
+    <w:lsdException w:name="Table Grid 6" w:semiHidden="1" w:unhideWhenUsed="1"/>
+    <w:lsdException w:name="Table Grid 7" w:semiHidden="1" w:unhideWhenUsed="1"/>
+    <w:lsdException w:name="Table Grid 8" w:semiHidden="1" w:unhideWhenUsed="1"/>
+    <w:lsdException w:name="Table List 1" w:semiHidden="1" w:unhideWhenUsed="1"/>
+    <w:lsdException w:name="Table List 2" w:semiHidden="1" w:unhideWhenUsed="1"/>
+    <w:lsdException w:name="Table List 3" w:semiHidden="1" w:unhideWhenUsed="1"/>
+    <w:lsdException w:name="Table List 4" w:semiHidden="1" w:unhideWhenUsed="1"/>
+    <w:lsdException w:name="Table List 5" w:semiHidden="1" w:unhideWhenUsed="1"/>
+    <w:lsdException w:name="Table List 6" w:semiHidden="1" w:unhideWhenUsed="1"/>
+    <w:lsdException w:name="Table List 7" w:semiHidden="1" w:unhideWhenUsed="1"/>
+    <w:lsdException w:name="Table List 8" w:semiHidden="1" w:unhideWhenUsed="1"/>
+    <w:lsdException w:name="Table 3D effects 1" w:semiHidden="1" w:unhideWhenUsed="1"/>
+    <w:lsdException w:name="Table 3D effects 2" w:semiHidden="1" w:unhideWhenUsed="1"/>
+    <w:lsdException w:name="Table 3D effects 3" w:semiHidden="1" w:unhideWhenUsed="1"/>
+    <w:lsdException w:name="Table Contemporary" w:semiHidden="1" w:unhideWhenUsed="1"/>
+    <w:lsdException w:name="Table Elegant" w:semiHidden="1" w:unhideWhenUsed="1"/>
+    <w:lsdException w:name="Table Professional" w:semiHidden="1" w:unhideWhenUsed="1"/>
+    <w:lsdException w:name="Table Subtle 1" w:semiHidden="1" w:unhideWhenUsed="1"/>
+    <w:lsdException w:name="Table Subtle 2" w:semiHidden="1" w:unhideWhenUsed="1"/>
+    <w:lsdException w:name="Table Web 1" w:semiHidden="1" w:unhideWhenUsed="1"/>
+    <w:lsdException w:name="Table Web 2" w:semiHidden="1" w:unhideWhenUsed="1"/>
+    <w:lsdException w:name="Table Web 3" w:semiHidden="1" w:unhideWhenUsed="1"/>
+    <w:lsdException w:name="Balloon Text" w:semiHidden="1" w:unhideWhenUsed="1"/>
+    <w:lsdException w:name="Table Grid" w:uiPriority="39"/>
+    <w:lsdException w:name="Table Theme" w:semiHidden="1" w:unhideWhenUsed="1"/>
+    <w:lsdException w:name="Placeholder Text" w:semiHidden="1"/>
+    <w:lsdException w:name="No Spacing" w:uiPriority="1" w:qFormat="1"/>
+    <w:lsdException w:name="Light Shading" w:uiPriority="60"/>
+    <w:lsdException w:name="Light List" w:uiPriority="61"/>
+    <w:lsdException w:name="Light Grid" w:uiPriority="62"/>
+    <w:lsdException w:name="Medium Shading 1" w:uiPriority="63"/>
+    <w:lsdException w:name="Medium Shading 2" w:uiPriority="64"/>
+    <w:lsdException w:name="Medium List 1" w:uiPriority="65"/>
+    <w:lsdException w:name="Medium List 2" w:uiPriority="66"/>
+    <w:lsdException w:name="Medium Grid 1" w:uiPriority="67"/>
+    <w:lsdException w:name="Medium Grid 2" w:uiPriority="68"/>
+    <w:lsdException w:name="Medium Grid 3" w:uiPriority="69"/>
+    <w:lsdException w:name="Dark List" w:uiPriority="70"/>
+    <w:lsdException w:name="Colorful Shading" w:uiPriority="71"/>
+    <w:lsdException w:name="Colorful List" w:uiPriority="72"/>
+    <w:lsdException w:name="Colorful Grid" w:uiPriority="73"/>
+    <w:lsdException w:name="Light Shading Accent 1" w:uiPriority="60"/>
+    <w:lsdException w:name="Light List Accent 1" w:uiPriority="61"/>
+    <w:lsdException w:name="Light Grid Accent 1" w:uiPriority="62"/>
+    <w:lsdException w:name="Medium Shading 1 Accent 1" w:uiPriority="63"/>
+    <w:lsdException w:name="Medium Shading 2 Accent 1" w:uiPriority="64"/>
+    <w:lsdException w:name="Medium List 1 Accent 1" w:uiPriority="65"/>
+    <w:lsdException w:name="Revision" w:semiHidden="1"/>
+    <w:lsdException w:name="List Paragraph" w:uiPriority="34" w:qFormat="1"/>
+    <w:lsdException w:name="Quote" w:uiPriority="29" w:qFormat="1"/>
+    <w:lsdException w:name="Intense Quote" w:uiPriority="30" w:qFormat="1"/>
+    <w:lsdException w:name="Medium List 2 Accent 1" w:uiPriority="66"/>
+    <w:lsdException w:name="Medium Grid 1 Accent 1" w:uiPriority="67"/>
+    <w:lsdException w:name="Medium Grid 2 Accent 1" w:uiPriority="68"/>
+    <w:lsdException w:name="Medium Grid 3 Accent 1" w:uiPriority="69"/>
+    <w:lsdException w:name="Dark List Accent 1" w:uiPriority="70"/>
+    <w:lsdException w:name="Colorful Shading Accent 1" w:uiPriority="71"/>
+    <w:lsdException w:name="Colorful List Accent 1" w:uiPriority="72"/>
+    <w:lsdException w:name="Colorful Grid Accent 1" w:uiPriority="73"/>
+    <w:lsdException w:name="Light Shading Accent 2" w:uiPriority="60"/>
+    <w:lsdException w:name="Light List Accent 2" w:uiPriority="61"/>
+    <w:lsdException w:name="Light Grid Accent 2" w:uiPriority="62"/>
+    <w:lsdException w:name="Medium Shading 1 Accent 2" w:uiPriority="63"/>
+    <w:lsdException w:name="Medium Shading 2 Accent 2" w:uiPriority="64"/>
+    <w:lsdException w:name="Medium List 1 Accent 2" w:uiPriority="65"/>
+    <w:lsdException w:name="Medium List 2 Accent 2" w:uiPriority="66"/>
+    <w:lsdException w:name="Medium Grid 1 Accent 2" w:uiPriority="67"/>
+    <w:lsdException w:name="Medium Grid 2 Accent 2" w:uiPriority="68"/>
+    <w:lsdException w:name="Medium Grid 3 Accent 2" w:uiPriority="69"/>
+    <w:lsdException w:name="Dark List Accent 2" w:uiPriority="70"/>
+    <w:lsdException w:name="Colorful Shading Accent 2" w:uiPriority="71"/>
+    <w:lsdException w:name="Colorful List Accent 2" w:uiPriority="72"/>
+    <w:lsdException w:name="Colorful Grid Accent 2" w:uiPriority="73"/>
+    <w:lsdException w:name="Light Shading Accent 3" w:uiPriority="60"/>
+    <w:lsdException w:name="Light List Accent 3" w:uiPriority="61"/>
+    <w:lsdException w:name="Light Grid Accent 3" w:uiPriority="62"/>
+    <w:lsdException w:name="Medium Shading 1 Accent 3" w:uiPriority="63"/>
+    <w:lsdException w:name="Medium Shading 2 Accent 3" w:uiPriority="64"/>
+    <w:lsdException w:name="Medium List 1 Accent 3" w:uiPriority="65"/>
+    <w:lsdException w:name="Medium List 2 Accent 3" w:uiPriority="66"/>
+    <w:lsdException w:name="Medium Grid 1 Accent 3" w:uiPriority="67"/>
+    <w:lsdException w:name="Medium Grid 2 Accent 3" w:uiPriority="68"/>
+    <w:lsdException w:name="Medium Grid 3 Accent 3" w:uiPriority="69"/>
+    <w:lsdException w:name="Dark List Accent 3" w:uiPriority="70"/>
+    <w:lsdException w:name="Colorful Shading Accent 3" w:uiPriority="71"/>
+    <w:lsdException w:name="Colorful List Accent 3" w:uiPriority="72"/>
+    <w:lsdException w:name="Colorful Grid Accent 3" w:uiPriority="73"/>
+    <w:lsdException w:name="Light Shading Accent 4" w:uiPriority="60"/>
+    <w:lsdException w:name="Light List Accent 4" w:uiPriority="61"/>
+    <w:lsdException w:name="Light Grid Accent 4" w:uiPriority="62"/>
+    <w:lsdException w:name="Medium Shading 1 Accent 4" w:uiPriority="63"/>
+    <w:lsdException w:name="Medium Shading 2 Accent 4" w:uiPriority="64"/>
+    <w:lsdException w:name="Medium List 1 Accent 4" w:uiPriority="65"/>
+    <w:lsdException w:name="Medium List 2 Accent 4" w:uiPriority="66"/>
+    <w:lsdException w:name="Medium Grid 1 Accent 4" w:uiPriority="67"/>
+    <w:lsdException w:name="Medium Grid 2 Accent 4" w:uiPriority="68"/>
+    <w:lsdException w:name="Medium Grid 3 Accent 4" w:uiPriority="69"/>
+    <w:lsdException w:name="Dark List Accent 4" w:uiPriority="70"/>
+    <w:lsdException w:name="Colorful Shading Accent 4" w:uiPriority="71"/>
+    <w:lsdException w:name="Colorful List Accent 4" w:uiPriority="72"/>
+    <w:lsdException w:name="Colorful Grid Accent 4" w:uiPriority="73"/>
+    <w:lsdException w:name="Light Shading Accent 5" w:uiPriority="60"/>
+    <w:lsdException w:name="Light List Accent 5" w:uiPriority="61"/>
+    <w:lsdException w:name="Light Grid Accent 5" w:uiPriority="62"/>
+    <w:lsdException w:name="Medium Shading 1 Accent 5" w:uiPriority="63"/>
+    <w:lsdException w:name="Medium Shading 2 Accent 5" w:uiPriority="64"/>
+    <w:lsdException w:name="Medium List 1 Accent 5" w:uiPriority="65"/>
+    <w:lsdException w:name="Medium List 2 Accent 5" w:uiPriority="66"/>
+    <w:lsdException w:name="Medium Grid 1 Accent 5" w:uiPriority="67"/>
+    <w:lsdException w:name="Medium Grid 2 Accent 5" w:uiPriority="68"/>
+    <w:lsdException w:name="Medium Grid 3 Accent 5" w:uiPriority="69"/>
+    <w:lsdException w:name="Dark List Accent 5" w:uiPriority="70"/>
+    <w:lsdException w:name="Colorful Shading Accent 5" w:uiPriority="71"/>
+    <w:lsdException w:name="Colorful List Accent 5" w:uiPriority="72"/>
+    <w:lsdException w:name="Colorful Grid Accent 5" w:uiPriority="73"/>
+    <w:lsdException w:name="Light Shading Accent 6" w:uiPriority="60"/>
+    <w:lsdException w:name="Light List Accent 6" w:uiPriority="61"/>
+    <w:lsdException w:name="Light Grid Accent 6" w:uiPriority="62"/>
+    <w:lsdException w:name="Medium Shading 1 Accent 6" w:uiPriority="63"/>
+    <w:lsdException w:name="Medium Shading 2 Accent 6" w:uiPriority="64"/>
+    <w:lsdException w:name="Medium List 1 Accent 6" w:uiPriority="65"/>
+    <w:lsdException w:name="Medium List 2 Accent 6" w:uiPriority="66"/>
+    <w:lsdException w:name="Medium Grid 1 Accent 6" w:uiPriority="67"/>
+    <w:lsdException w:name="Medium Grid 2 Accent 6" w:uiPriority="68"/>
+    <w:lsdException w:name="Medium Grid 3 Accent 6" w:uiPriority="69"/>
+    <w:lsdException w:name="Dark List Accent 6" w:uiPriority="70"/>
+    <w:lsdException w:name="Colorful Shading Accent 6" w:uiPriority="71"/>
+    <w:lsdException w:name="Colorful List Accent 6" w:uiPriority="72"/>
+    <w:lsdException w:name="Colorful Grid Accent 6" w:uiPriority="73"/>
+    <w:lsdException w:name="Subtle Emphasis" w:uiPriority="19" w:qFormat="1"/>
+    <w:lsdException w:name="Intense Emphasis" w:uiPriority="21" w:qFormat="1"/>
+    <w:lsdException w:name="Subtle Reference" w:uiPriority="31" w:qFormat="1"/>
+    <w:lsdException w:name="Intense Reference" w:uiPriority="32" w:qFormat="1"/>
+    <w:lsdException w:name="Book Title" w:uiPriority="33" w:qFormat="1"/>
+    <w:lsdException w:name="Bibliography" w:semiHidden="1" w:uiPriority="37" w:unhideWhenUsed="1"/>
+    <w:lsdException w:name="TOC Heading" w:semiHidden="1" w:uiPriority="39" w:unhideWhenUsed="1" w:qFormat="1"/>
+    <w:lsdException w:name="Plain Table 1" w:uiPriority="41"/>
+    <w:lsdException w:name="Plain Table 2" w:uiPriority="42"/>
+    <w:lsdException w:name="Plain Table 3" w:uiPriority="43"/>
+    <w:lsdException w:name="Plain Table 4" w:uiPriority="44"/>
+    <w:lsdException w:name="Plain Table 5" w:uiPriority="45"/>
+    <w:lsdException w:name="Grid Table Light" w:uiPriority="40"/>
+    <w:lsdException w:name="Grid Table 1 Light" w:uiPriority="46"/>
+    <w:lsdException w:name="Grid Table 2" w:uiPriority="47"/>
+    <w:lsdException w:name="Grid Table 3" w:uiPriority="48"/>
+    <w:lsdException w:name="Grid Table 4" w:uiPriority="49"/>
+    <w:lsdException w:name="Grid Table 5 Dark" w:uiPriority="50"/>
+    <w:lsdException w:name="Grid Table 6 Colorful" w:uiPriority="51"/>
+    <w:lsdException w:name="Grid Table 7 Colorful" w:uiPriority="52"/>
+    <w:lsdException w:name="Grid Table 1 Light Accent 1" w:uiPriority="46"/>
+    <w:lsdException w:name="Grid Table 2 Accent 1" w:uiPriority="47"/>
+    <w:lsdException w:name="Grid Table 3 Accent 1" w:uiPriority="48"/>
+    <w:lsdException w:name="Grid Table 4 Accent 1" w:uiPriority="49"/>
+    <w:lsdException w:name="Grid Table 5 Dark Accent 1" w:uiPriority="50"/>
+    <w:lsdException w:name="Grid Table 6 Colorful Accent 1" w:uiPriority="51"/>
+    <w:lsdException w:name="Grid Table 7 Colorful Accent 1" w:uiPriority="52"/>
+    <w:lsdException w:name="Grid Table 1 Light Accent 2" w:uiPriority="46"/>
+    <w:lsdException w:name="Grid Table 2 Accent 2" w:uiPriority="47"/>
+    <w:lsdException w:name="Grid Table 3 Accent 2" w:uiPriority="48"/>
+    <w:lsdException w:name="Grid Table 4 Accent 2" w:uiPriority="49"/>
+    <w:lsdException w:name="Grid Table 5 Dark Accent 2" w:uiPriority="50"/>
+    <w:lsdException w:name="Grid Table 6 Colorful Accent 2" w:uiPriority="51"/>
+    <w:lsdException w:name="Grid Table 7 Colorful Accent 2" w:uiPriority="52"/>
+    <w:lsdException w:name="Grid Table 1 Light Accent 3" w:uiPriority="46"/>
+    <w:lsdException w:name="Grid Table 2 Accent 3" w:uiPriority="47"/>
+    <w:lsdException w:name="Grid Table 3 Accent 3" w:uiPriority="48"/>
+    <w:lsdException w:name="Grid Table 4 Accent 3" w:uiPriority="49"/>
+    <w:lsdException w:name="Grid Table 5 Dark Accent 3" w:uiPriority="50"/>
+    <w:lsdException w:name="Grid Table 6 Colorful Accent 3" w:uiPriority="51"/>
+    <w:lsdException w:name="Grid Table 7 Colorful Accent 3" w:uiPriority="52"/>
+    <w:lsdException w:name="Grid Table 1 Light Accent 4" w:uiPriority="46"/>
+    <w:lsdException w:name="Grid Table 2 Accent 4" w:uiPriority="47"/>
+    <w:lsdException w:name="Grid Table 3 Accent 4" w:uiPriority="48"/>
+    <w:lsdException w:name="Grid Table 4 Accent 4" w:uiPriority="49"/>
+    <w:lsdException w:name="Grid Table 5 Dark Accent 4" w:uiPriority="50"/>
+    <w:lsdException w:name="Grid Table 6 Colorful Accent 4" w:uiPriority="51"/>
+    <w:lsdException w:name="Grid Table 7 Colorful Accent 4" w:uiPriority="52"/>
+    <w:lsdException w:name="Grid Table 1 Light Accent 5" w:uiPriority="46"/>
+    <w:lsdException w:name="Grid Table 2 Accent 5" w:uiPriority="47"/>
+    <w:lsdException w:name="Grid Table 3 Accent 5" w:uiPriority="48"/>
+    <w:lsdException w:name="Grid Table 4 Accent 5" w:uiPriority="49"/>
+    <w:lsdException w:name="Grid Table 5 Dark Accent 5" w:uiPriority="50"/>
+    <w:lsdException w:name="Grid Table 6 Colorful Accent 5" w:uiPriority="51"/>
+    <w:lsdException w:name="Grid Table 7 Colorful Accent 5" w:uiPriority="52"/>
+    <w:lsdException w:name="Grid Table 1 Light Accent 6" w:uiPriority="46"/>
+    <w:lsdException w:name="Grid Table 2 Accent 6" w:uiPriority="47"/>
+    <w:lsdException w:name="Grid Table 3 Accent 6" w:uiPriority="48"/>
+    <w:lsdException w:name="Grid Table 4 Accent 6" w:uiPriority="49"/>
+    <w:lsdException w:name="Grid Table 5 Dark Accent 6" w:uiPriority="50"/>
+    <w:lsdException w:name="Grid Table 6 Colorful Accent 6" w:uiPriority="51"/>
+    <w:lsdException w:name="Grid Table 7 Colorful Accent 6" w:uiPriority="52"/>
+    <w:lsdException w:name="List Table 1 Light" w:uiPriority="46"/>
+    <w:lsdException w:name="List Table 2" w:uiPriority="47"/>
+    <w:lsdException w:name="List Table 3" w:uiPriority="48"/>
+    <w:lsdException w:name="List Table 4" w:uiPriority="49"/>
+    <w:lsdException w:name="List Table 5 Dark" w:uiPriority="50"/>
+    <w:lsdException w:name="List Table 6 Colorful" w:uiPriority="51"/>
+    <w:lsdException w:name="List Table 7 Colorful" w:uiPriority="52"/>
+    <w:lsdException w:name="List Table 1 Light Accent 1" w:uiPriority="46"/>
+    <w:lsdException w:name="List Table 2 Accent 1" w:uiPriority="47"/>
+    <w:lsdException w:name="List Table 3 Accent 1" w:uiPriority="48"/>
+    <w:lsdException w:name="List Table 4 Accent 1" w:uiPriority="49"/>
+    <w:lsdException w:name="List Table 5 Dark Accent 1" w:uiPriority="50"/>
+    <w:lsdException w:name="List Table 6 Colorful Accent 1" w:uiPriority="51"/>
+    <w:lsdException w:name="List Table 7 Colorful Accent 1" w:uiPriority="52"/>
+    <w:lsdException w:name="List Table 1 Light Accent 2" w:uiPriority="46"/>
+    <w:lsdException w:name="List Table 2 Accent 2" w:uiPriority="47"/>
+    <w:lsdException w:name="List Table 3 Accent 2" w:uiPriority="48"/>
+    <w:lsdException w:name="List Table 4 Accent 2" w:uiPriority="49"/>
+    <w:lsdException w:name="List Table 5 Dark Accent 2" w:uiPriority="50"/>
+    <w:lsdException w:name="List Table 6 Colorful Accent 2" w:uiPriority="51"/>
+    <w:lsdException w:name="List Table 7 Colorful Accent 2" w:uiPriority="52"/>
+    <w:lsdException w:name="List Table 1 Light Accent 3" w:uiPriority="46"/>
+    <w:lsdException w:name="List Table 2 Accent 3" w:uiPriority="47"/>
+    <w:lsdException w:name="List Table 3 Accent 3" w:uiPriority="48"/>
+    <w:lsdException w:name="List Table 4 Accent 3" w:uiPriority="49"/>
+    <w:lsdException w:name="List Table 5 Dark Accent 3" w:uiPriority="50"/>
+    <w:lsdException w:name="List Table 6 Colorful Accent 3" w:uiPriority="51"/>
+    <w:lsdException w:name="List Table 7 Colorful Accent 3" w:uiPriority="52"/>
+    <w:lsdException w:name="List Table 1 Light Accent 4" w:uiPriority="46"/>
+    <w:lsdException w:name="List Table 2 Accent 4" w:uiPriority="47"/>
+    <w:lsdException w:name="List Table 3 Accent 4" w:uiPriority="48"/>
+    <w:lsdException w:name="List Table 4 Accent 4" w:uiPriority="49"/>
+    <w:lsdException w:name="List Table 5 Dark Accent 4" w:uiPriority="50"/>
+    <w:lsdException w:name="List Table 6 Colorful Accent 4" w:uiPriority="51"/>
+    <w:lsdException w:name="List Table 7 Colorful Accent 4" w:uiPriority="52"/>
+    <w:lsdException w:name="List Table 1 Light Accent 5" w:uiPriority="46"/>
+    <w:lsdException w:name="List Table 2 Accent 5" w:uiPriority="47"/>
+    <w:lsdException w:name="List Table 3 Accent 5" w:uiPriority="48"/>
+    <w:lsdException w:name="List Table 4 Accent 5" w:uiPriority="49"/>
+    <w:lsdException w:name="List Table 5 Dark Accent 5" w:uiPriority="50"/>
+    <w:lsdException w:name="List Table 6 Colorful Accent 5" w:uiPriority="51"/>
+    <w:lsdException w:name="List Table 7 Colorful Accent 5" w:uiPriority="52"/>
+    <w:lsdException w:name="List Table 1 Light Accent 6" w:uiPriority="46"/>
+    <w:lsdException w:name="List Table 2 Accent 6" w:uiPriority="47"/>
+    <w:lsdException w:name="List Table 3 Accent 6" w:uiPriority="48"/>
+    <w:lsdException w:name="List Table 4 Accent 6" w:uiPriority="49"/>
+    <w:lsdException w:name="List Table 5 Dark Accent 6" w:uiPriority="50"/>
+    <w:lsdException w:name="List Table 6 Colorful Accent 6" w:uiPriority="51"/>
+    <w:lsdException w:name="List Table 7 Colorful Accent 6" w:uiPriority="52"/>
+    <w:lsdException w:name="Mention" w:semiHidden="1" w:unhideWhenUsed="1"/>
+    <w:lsdException w:name="Smart Hyperlink" w:semiHidden="1" w:unhideWhenUsed="1"/>
+    <w:lsdException w:name="Hashtag" w:semiHidden="1" w:unhideWhenUsed="1"/>
+    <w:lsdException w:name="Unresolved Mention" w:semiHidden="1" w:unhideWhenUsed="1"/>
+    <w:lsdException w:name="Smart Link" w:semiHidden="1" w:unhideWhenUsed="1"/>
+  </w:latentStyles>
+  <w:style w:type="paragraph" w:default="1" w:styleId="Normal">
+    <w:name w:val="Normal"/>
+    <w:qFormat/>
+  </w:style>
+  <w:style w:type="character" w:default="1" w:styleId="DefaultParagraphFont">
+    <w:name w:val="Default Paragraph Font"/>
+    <w:uiPriority w:val="1"/>
+    <w:semiHidden/>
+    <w:unhideWhenUsed/>
+  </w:style>
+  <w:style w:type="table" w:default="1" w:styleId="TableNormal">
+    <w:name w:val="Normal Table"/>
+    <w:uiPriority w:val="99"/>
+    <w:semiHidden/>
+    <w:unhideWhenUsed/>
+    <w:tblPr>
+      <w:tblInd w:w="0" w:type="dxa"/>
+      <w:tblCellMar>
+        <w:top w:w="0" w:type="dxa"/>
+        <w:left w:w="108" w:type="dxa"/>
+        <w:bottom w:w="0" w:type="dxa"/>
+        <w:right w:w="108" w:type="dxa"/>
+      </w:tblCellMar>
+    </w:tblPr>
+  </w:style>
+  <w:style w:type="numbering" w:default="1" w:styleId="NoList">
+    <w:name w:val="No List"/>
+    <w:uiPriority w:val="99"/>
+    <w:semiHidden/>
+    <w:unhideWhenUsed/>
+  </w:style>
+  <w:style w:type="character" w:styleId="PlaceholderText">
+    <w:name w:val="Placeholder Text"/>
+    <w:basedOn w:val="DefaultParagraphFont"/>
+    <w:uiPriority w:val="99"/>
+    <w:semiHidden/>
+    <w:rsid w:val="00FD1950"/>
+    <w:rPr>
+      <w:color w:val="808080"/>
+    </w:rPr>
+  </w:style>
+</w:styles>
+</file>
+
+<file path=word/glossary/webSettings.xml><?xml version="1.0" encoding="utf-8"?>
+<w:webSettings xmlns:mc="http://schemas.openxmlformats.org/markup-compatibility/2006" xmlns:r="http://schemas.openxmlformats.org/officeDocument/2006/relationships" xmlns:w="http://schemas.openxmlformats.org/wordprocessingml/2006/main" xmlns:w14="http://schemas.microsoft.com/office/word/2010/wordml" xmlns:w15="http://schemas.microsoft.com/office/word/2012/wordml" xmlns:w16cex="http://schemas.microsoft.com/office/word/2018/wordml/cex" xmlns:w16cid="http://schemas.microsoft.com/office/word/2016/wordml/cid" xmlns:w16="http://schemas.microsoft.com/office/word/2018/wordml" xmlns:w16du="http://schemas.microsoft.com/office/word/2023/wordml/word16du" xmlns:w16sdtdh="http://schemas.microsoft.com/office/word/2020/wordml/sdtdatahash" xmlns:w16sdtfl="http://schemas.microsoft.com/office/word/2024/wordml/sdtformatlock" xmlns:w16se="http://schemas.microsoft.com/office/word/2015/wordml/symex" mc:Ignorable="w14 w15 w16se w16cid w16 w16cex w16sdtdh w16sdtfl w16du">
+  <w:optimizeForBrowser/>
+  <w:allowPNG/>
+</w:webSettings>
+</file>
+
 <file path=word/theme/theme1.xml><?xml version="1.0" encoding="utf-8"?>
 <a:theme xmlns:a="http://schemas.openxmlformats.org/drawingml/2006/main" name="Office Theme">
   <a:themeElements>
@@ -16741,10 +19506,39 @@
 </a:theme>
 </file>
 
+<file path=word/webextensions/taskpanes.xml><?xml version="1.0" encoding="utf-8"?>
+<wetp:taskpanes xmlns:wetp="http://schemas.microsoft.com/office/webextensions/taskpanes/2010/11">
+  <wetp:taskpane dockstate="right" visibility="0" width="438" row="0">
+    <wetp:webextensionref xmlns:r="http://schemas.openxmlformats.org/officeDocument/2006/relationships" r:id="rId1"/>
+  </wetp:taskpane>
+</wetp:taskpanes>
+</file>
+
+<file path=word/webextensions/webextension1.xml><?xml version="1.0" encoding="utf-8"?>
+<we:webextension xmlns:we="http://schemas.microsoft.com/office/webextensions/webextension/2010/11" id="{D431B228-0BFC-4DC2-A30B-BC773E96178C}">
+  <we:reference id="wa104382081" version="1.55.1.0" store="en-US" storeType="OMEX"/>
+  <we:alternateReferences>
+    <we:reference id="WA104382081" version="1.55.1.0" store="" storeType="OMEX"/>
+  </we:alternateReferences>
+  <we:properties>
+    <we:property name="MENDELEY_BIBLIOGRAPHY_IS_DIRTY" value="false"/>
+    <we:property name="MENDELEY_BIBLIOGRAPHY_LAST_MODIFIED" value="1759930244780"/>
+    <we:property name="MENDELEY_CITATIONS" value="[{&quot;citationID&quot;:&quot;MENDELEY_CITATION_1027ab03-8e6d-42bc-9dda-0c74995a95d6&quot;,&quot;properties&quot;:{&quot;noteIndex&quot;:0},&quot;isEdited&quot;:false,&quot;manualOverride&quot;:{&quot;isManuallyOverridden&quot;:false,&quot;citeprocText&quot;:&quot;(Biswas &amp;#38; Jain, 2025)&quot;,&quot;manualOverrideText&quot;:&quot;&quot;},&quot;citationTag&quot;:&quot;MENDELEY_CITATION_v3_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&quot;,&quot;citationItems&quot;:[{&quot;id&quot;:&quot;4f951e2a-5d5f-3e54-b05d-34796e069a07&quot;,&quot;itemData&quot;:{&quot;type&quot;:&quot;article-journal&quot;,&quot;id&quot;:&quot;4f951e2a-5d5f-3e54-b05d-34796e069a07&quot;,&quot;title&quot;:&quot;The Road to Safety - Examining the Nexus between Road Infrastructure and Crime in Rural India&quot;,&quot;author&quot;:[{&quot;family&quot;:&quot;Biswas&quot;,&quot;given&quot;:&quot;Shreya&quot;,&quot;parse-names&quot;:false,&quot;dropping-particle&quot;:&quot;&quot;,&quot;non-dropping-particle&quot;:&quot;&quot;},{&quot;family&quot;:&quot;Jain&quot;,&quot;given&quot;:&quot;Ritika&quot;,&quot;parse-names&quot;:false,&quot;dropping-particle&quot;:&quot;&quot;,&quot;non-dropping-particle&quot;:&quot;&quot;}],&quot;container-title&quot;:&quot;Journal of Quantitative Economics&quot;,&quot;accessed&quot;:{&quot;date-parts&quot;:[[2025,10,8]]},&quot;DOI&quot;:&quot;10.1007/S40953-025-00466-6/METRICS&quot;,&quot;ISSN&quot;:&quot;23641045&quot;,&quot;URL&quot;:&quot;https://link.springer.com/article/10.1007/s40953-025-00466-6&quot;,&quot;issued&quot;:{&quot;date-parts&quot;:[[2025,7,21]]},&quot;page&quot;:&quot;1-24&quot;,&quot;abstract&quot;:&quot;This study examines the relationship between road infrastructure and crime in rural India using two rounds of the nationally representative India Human Development Survey. Our analysis reveals that roads in rural regions reduce crime. On exploring the pathways, we find that provisioning of public bus services, a higher number of daily commuters and higher likelihood of being employed are a few of the potential channels through which road infrastructure impedes crime. Finally, our study highlights that the negative impact of roads on crime is driven by states with lower police strength, lower chargesheeting rate, higher population density and by states performing better in terms of public employment programs. The findings underscore the positive spillover effects of investment in road infrastructure in a developing economy context.&quot;,&quot;publisher&quot;:&quot;Springer&quot;,&quot;container-title-short&quot;:&quot;&quot;},&quot;isTemporary&quot;:false}]},{&quot;citationID&quot;:&quot;MENDELEY_CITATION_168476d3-4609-4a5b-a2b6-ee2a6efe3561&quot;,&quot;properties&quot;:{&quot;noteIndex&quot;:0},&quot;isEdited&quot;:false,&quot;manualOverride&quot;:{&quot;isManuallyOverridden&quot;:false,&quot;citeprocText&quot;:&quot;(Shaw et al., 2025)&quot;,&quot;manualOverrideText&quot;:&quot;&quot;},&quot;citationTag&quot;:&quot;MENDELEY_CITATION_v3_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&quot;,&quot;citationItems&quot;:[{&quot;id&quot;:&quot;13256ae1-e86c-396e-9354-6398465ee644&quot;,&quot;itemData&quot;:{&quot;type&quot;:&quot;article-journal&quot;,&quot;id&quot;:&quot;13256ae1-e86c-396e-9354-6398465ee644&quot;,&quot;title&quot;:&quot;An analysis of the symmetric and asymmetric relationship between road traffic casualties and economic development of Ghana&quot;,&quot;author&quot;:[{&quot;family&quot;:&quot;Shaw&quot;,&quot;given&quot;:&quot;Williams&quot;,&quot;parse-names&quot;:false,&quot;dropping-particle&quot;:&quot;&quot;,&quot;non-dropping-particle&quot;:&quot;&quot;},{&quot;family&quot;:&quot;Wang&quot;,&quot;given&quot;:&quot;Guangmin&quot;,&quot;parse-names&quot;:false,&quot;dropping-particle&quot;:&quot;&quot;,&quot;non-dropping-particle&quot;:&quot;&quot;},{&quot;family&quot;:&quot;Ampofo&quot;,&quot;given&quot;:&quot;Gideon Kwaku Minua&quot;,&quot;parse-names&quot;:false,&quot;dropping-particle&quot;:&quot;&quot;,&quot;non-dropping-particle&quot;:&quot;&quot;},{&quot;family&quot;:&quot;Befeke&quot;,&quot;given&quot;:&quot;Chenyi Larry&quot;,&quot;parse-names&quot;:false,&quot;dropping-particle&quot;:&quot;&quot;,&quot;non-dropping-particle&quot;:&quot;&quot;},{&quot;family&quot;:&quot;Botei&quot;,&quot;given&quot;:&quot;Diana&quot;,&quot;parse-names&quot;:false,&quot;dropping-particle&quot;:&quot;&quot;,&quot;non-dropping-particle&quot;:&quot;&quot;}],&quot;container-title&quot;:&quot;Journal of Transport Geography&quot;,&quot;container-title-short&quot;:&quot;J Transp Geogr&quot;,&quot;accessed&quot;:{&quot;date-parts&quot;:[[2025,10,8]]},&quot;DOI&quot;:&quot;10.1016/J.JTRANGEO.2025.104174&quot;,&quot;ISSN&quot;:&quot;0966-6923&quot;,&quot;URL&quot;:&quot;https://www.sciencedirect.com/science/article/abs/pii/S0966692325000651&quot;,&quot;issued&quot;:{&quot;date-parts&quot;:[[2025,4,1]]},&quot;page&quot;:&quot;104174&quot;,&quot;abstract&quot;:&quot;This study investigates the symmetric and asymmetric relationship between road traffic casualties (RTCs) and economic development in Ghana, applying both Autoregressive Distributed Lag (ARDL) and Nonlinear ARDL (NARDL) models. Using 33 years of data (1991–2023), the research explores how key economic factors—GDP per capita, government spending, capital, and population—affect road traffic fatalities (RTF) and injuries (RTI). The results show a significant inverse long-term relationship between GDP per capita and RTCs, indicating that sustained economic growth reduces fatalities and injuries. However, short-run dynamics reveal an initial rise in RTCs as economic activity expands, driven by increased mobility and vehicle ownership, before road safety interventions take effect. Population growth consistently exerts upward pressure on RTCs in both the short and long run, reflecting the strain of rapid urbanization on road infrastructure. Government spending and capital positively impact road safety only when specifically directed toward targeted road safety interventions such as infrastructure improvements, public awareness campaigns, or law enforcement enhancements. The findings support the Kuznets curve theory, suggesting that road traffic casualties initially increase during the early stages of economic development but decline as growth continues and safety measures improve. Policymakers are urged to prioritize targeted investments in road safety infrastructure and ensure that safety measures keep pace with economic and demographic changes to mitigate short-term risks while realizing long-term benefits.&quot;,&quot;publisher&quot;:&quot;Pergamon&quot;,&quot;volume&quot;:&quot;124&quot;},&quot;isTemporary&quot;:false}]},{&quot;citationID&quot;:&quot;MENDELEY_CITATION_4005ef6b-5415-42ef-a0bc-3a28ad4a5966&quot;,&quot;properties&quot;:{&quot;noteIndex&quot;:0},&quot;isEdited&quot;:false,&quot;manualOverride&quot;:{&quot;isManuallyOverridden&quot;:false,&quot;citeprocText&quot;:&quot;(&lt;i&gt;Kerusakan Jalan Di Samarinda Masalah Sistemik, Akademisi Ungkap Masalah Keterbatasan Anggaran&lt;/i&gt;, n.d.)&quot;,&quot;manualOverrideText&quot;:&quot;&quot;},&quot;citationTag&quot;:&quot;MENDELEY_CITATION_v3_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&quot;,&quot;citationItems&quot;:[{&quot;id&quot;:&quot;d6187b53-3e68-323a-89fb-258fe962b49d&quot;,&quot;itemData&quot;:{&quot;type&quot;:&quot;webpage&quot;,&quot;id&quot;:&quot;d6187b53-3e68-323a-89fb-258fe962b49d&quot;,&quot;title&quot;:&quot;Kerusakan Jalan di Samarinda Masalah Sistemik, Akademisi Ungkap Masalah Keterbatasan Anggaran&quot;,&quot;accessed&quot;:{&quot;date-parts&quot;:[[2025,10,8]]},&quot;URL&quot;:&quot;https://kaltimtoday.co/kerusakan-jalan-di-samarinda-masalah-sistemik-akademisi-ungkap-masalah-keterbatasan-anggaran&quot;,&quot;container-title-short&quot;:&quot;&quot;},&quot;isTemporary&quot;:false}]},{&quot;citationID&quot;:&quot;MENDELEY_CITATION_ae5e12ca-2666-4a6f-a74d-9865c8ae2b8e&quot;,&quot;properties&quot;:{&quot;noteIndex&quot;:0},&quot;isEdited&quot;:false,&quot;manualOverride&quot;:{&quot;isManuallyOverridden&quot;:false,&quot;citeprocText&quot;:&quot;(Kurniawan et al., 2025)&quot;,&quot;manualOverrideText&quot;:&quot;&quot;},&quot;citationTag&quot;:&quot;MENDELEY_CITATION_v3_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&quot;,&quot;citationItems&quot;:[{&quot;id&quot;:&quot;329bb6de-a444-3b68-b758-14f6ac8358f4&quot;,&quot;itemData&quot;:{&quot;type&quot;:&quot;article-journal&quot;,&quot;id&quot;:&quot;329bb6de-a444-3b68-b758-14f6ac8358f4&quot;,&quot;title&quot;:&quot;Analysis of the Correspondence Between the Type of Road Damage and the Budget Costs Incurred in Handling on Provincial Roads in the Madura Region&quot;,&quot;author&quot;:[{&quot;family&quot;:&quot;Kurniawan&quot;,&quot;given&quot;:&quot;Adi&quot;,&quot;parse-names&quot;:false,&quot;dropping-particle&quot;:&quot;&quot;,&quot;non-dropping-particle&quot;:&quot;&quot;},{&quot;family&quot;:&quot;Patriadi&quot;,&quot;given&quot;:&quot;Andi&quot;,&quot;parse-names&quot;:false,&quot;dropping-particle&quot;:&quot;&quot;,&quot;non-dropping-particle&quot;:&quot;&quot;},{&quot;family&quot;:&quot;Sajiyo&quot;,&quot;given&quot;:&quot;Sajiyo&quot;,&quot;parse-names&quot;:false,&quot;dropping-particle&quot;:&quot;&quot;,&quot;non-dropping-particle&quot;:&quot;&quot;}],&quot;container-title&quot;:&quot;International Journal of Mechanical, Electrical and Civil Engineering&quot;,&quot;accessed&quot;:{&quot;date-parts&quot;:[[2025,10,8]]},&quot;DOI&quot;:&quot;10.61132/IJMECIE.V2I1.140&quot;,&quot;ISSN&quot;:&quot;3047-4523&quot;,&quot;URL&quot;:&quot;https://doi.org/10.61132/ijmecie.v2i1.140&quot;,&quot;issued&quot;:{&quot;date-parts&quot;:[[2025,1,13]]},&quot;page&quot;:&quot;149-156&quot;,&quot;abstract&quot;:&quot;This study aims to analyze the suitability between the type of road damage and the budget costs incurred on provincial roads in the Madura region. The research method used road condition survey and questionnaire distribution to contractors, consultants, budget users, and local communities. Data analysis was done descriptively qualitatively, including the type, volume, and location of road damage. The results showed that the three most common types of road damage were cracks, potholes and raveling. The total area of damage identified was 261.95 m², with a repair cost of Rp 57,586,900. This research emphasizes the importance of detailed road defect analysis and appropriate budget allocation to improve repair efficiency and support the region's economic activity. The findings conclude that detailed road defect analysis and budget efficiency can improve road quality and support mobility and economy in the Madura region. The results provide a basis for local governments to plan road infrastructure improvements more effectively and efficiently.&quot;,&quot;publisher&quot;:&quot;Asosiasi Riset Ilmu Manajemen dan Bisnis Indonesia&quot;,&quot;issue&quot;:&quot;1&quot;,&quot;volume&quot;:&quot;2&quot;,&quot;container-title-short&quot;:&quot;&quot;},&quot;isTemporary&quot;:false}]},{&quot;citationID&quot;:&quot;MENDELEY_CITATION_273ca614-67ea-460d-b486-a5ed8cf6beb7&quot;,&quot;properties&quot;:{&quot;noteIndex&quot;:0},&quot;isEdited&quot;:false,&quot;manualOverride&quot;:{&quot;isManuallyOverridden&quot;:false,&quot;citeprocText&quot;:&quot;(Nizamiyati &amp;#38; Brilliant, 2024)&quot;,&quot;manualOverrideText&quot;:&quot;&quot;},&quot;citationTag&quot;:&quot;MENDELEY_CITATION_v3_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&quot;,&quot;citationItems&quot;:[{&quot;id&quot;:&quot;0e65a4b1-8a0e-36ed-966e-4d6d49869d64&quot;,&quot;itemData&quot;:{&quot;type&quot;:&quot;article-journal&quot;,&quot;id&quot;:&quot;0e65a4b1-8a0e-36ed-966e-4d6d49869d64&quot;,&quot;title&quot;:&quot;Road Damage Detection and Reporting System Using YOLOv7: Enhancing Public Participation in Infrastructure Maintenance&quot;,&quot;author&quot;:[{&quot;family&quot;:&quot;Nizamiyati&quot;,&quot;given&quot;:&quot;Nizamiyati&quot;,&quot;parse-names&quot;:false,&quot;dropping-particle&quot;:&quot;&quot;,&quot;non-dropping-particle&quot;:&quot;&quot;},{&quot;family&quot;:&quot;Brilliant&quot;,&quot;given&quot;:&quot;Muhamad&quot;,&quot;parse-names&quot;:false,&quot;dropping-particle&quot;:&quot;&quot;,&quot;non-dropping-particle&quot;:&quot;&quot;}],&quot;container-title&quot;:&quot;International Journal of Engineering Continuity&quot;,&quot;DOI&quot;:&quot;10.58291/ijec.v3i2.302&quot;,&quot;issued&quot;:{&quot;date-parts&quot;:[[2024,9,26]]},&quot;page&quot;:&quot;69-85&quot;,&quot;abstract&quot;:&quot;Road damage in Lampung Province poses a serious threat to public safety and transportation, necessitating immediate government assistance. Despite the necessity for fast repair, there has been a lack of an appropriate platform for public reporting, making road inspections inefficient and error prone. This study makes two significant contributions: (1) the creation of a comprehensive dataset documenting road damage in Lampung, using samples collected in Pesawaran Regency, and (2) the development of an automated road damage identification and reporting system based on the YOLOv7 object detection model. The technology detects damage types such as alligator cracking, corrugation, depression, and potholes and provides real-time geolocation to improve reporting accuracy. Furthermore, it allows the public to report road damage. The model was trained on 1,200 pictures over 100 epochs, yielding a mean average precision (mAP) of 0.6. System performance was evaluated using precision and recall metrics, and compatibility testing confirmed that the system works reliably across various devices and browsers. This research enhances road maintenance by making inspections faster and more precise, while also promoting greater public involvement. Future work could integrate additional data sources, such as satellite imagery or IoT technology. to further increase the system’s scalability and accuracy.&quot;,&quot;publisher&quot;:&quot;Sultan Publisher&quot;,&quot;issue&quot;:&quot;2&quot;,&quot;volume&quot;:&quot;3&quot;,&quot;container-title-short&quot;:&quot;&quot;},&quot;isTemporary&quot;:false}]},{&quot;citationID&quot;:&quot;MENDELEY_CITATION_1e98badb-f057-4c8e-ad04-406b05e008f1&quot;,&quot;properties&quot;:{&quot;noteIndex&quot;:0},&quot;isEdited&quot;:false,&quot;manualOverride&quot;:{&quot;isManuallyOverridden&quot;:false,&quot;citeprocText&quot;:&quot;(Falasyfa &amp;#38; Avianto, 2024)&quot;,&quot;manualOverrideText&quot;:&quot;&quot;},&quot;citationTag&quot;:&quot;MENDELEY_CITATION_v3_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&quot;,&quot;citationItems&quot;:[{&quot;id&quot;:&quot;23e3b2be-3879-39da-b1a7-5523249666c4&quot;,&quot;itemData&quot;:{&quot;type&quot;:&quot;article-journal&quot;,&quot;id&quot;:&quot;23e3b2be-3879-39da-b1a7-5523249666c4&quot;,&quot;title&quot;:&quot;Perancangan Aplikasi Layanan Pengaduan Kerusakan Jalan Berbasis Android&quot;,&quot;author&quot;:[{&quot;family&quot;:&quot;Falasyfa&quot;,&quot;given&quot;:&quot;Rizky Samudra&quot;,&quot;parse-names&quot;:false,&quot;dropping-particle&quot;:&quot;&quot;,&quot;non-dropping-particle&quot;:&quot;&quot;},{&quot;family&quot;:&quot;Avianto&quot;,&quot;given&quot;:&quot;Donny&quot;,&quot;parse-names&quot;:false,&quot;dropping-particle&quot;:&quot;&quot;,&quot;non-dropping-particle&quot;:&quot;&quot;}],&quot;container-title&quot;:&quot;Jurnal Indonesia : Manajemen Informatika dan Komunikasi&quot;,&quot;DOI&quot;:&quot;10.35870/jimik.v5i1.569&quot;,&quot;ISSN&quot;:&quot;2776-8074&quot;,&quot;issued&quot;:{&quot;date-parts&quot;:[[2024,1,10]]},&quot;page&quot;:&quot;944-953&quot;,&quot;abstract&quot;:&quot;The android-based road damage complaint service application is a technological innovation that aims to improve the reporting and management of road damage. In the era of digitalization, people expect a lot from public services, especially infrastructure. However, the reporting process is still often done manually, causing weaknesses such as data loss, slow response and ineffectiveness. This application is an effective solution to overcome these problems. Users can easily report road damage through their Android devices. The benefit of this application is the ability to know the level of road damage in each report, making it easier for the authorities to determine the priority of handling. In addition, the app allows users to provide a detailed description of the damage, upload photos as evidence, and add additional relevant information. The app provides a complete and easy-to-fill form, making the reporting process more efficient.Once the report is submitted, users will receive a confirmation of report receipt to track the status of the report. The relevant agencies will utilize the app as a tool to manage incoming complaints, promptly responding to reports and processing them based on the priority and type of damage reported. Therefore, this application brings significant changes by improving public services and ensuring better infrastructure maintenance.&quot;,&quot;publisher&quot;:&quot;Sekolah Tinggi Manajemen Informatika dan Komputer Indonesia Banda Aceh&quot;,&quot;issue&quot;:&quot;1&quot;,&quot;volume&quot;:&quot;5&quot;,&quot;container-title-short&quot;:&quot;&quot;},&quot;isTemporary&quot;:false}]},{&quot;citationID&quot;:&quot;MENDELEY_CITATION_52c48b29-6d42-401d-8cbd-e666e9b7fc8f&quot;,&quot;properties&quot;:{&quot;noteIndex&quot;:0},&quot;isEdited&quot;:false,&quot;manualOverride&quot;:{&quot;isManuallyOverridden&quot;:false,&quot;citeprocText&quot;:&quot;(Probo Sumirat et al., 2021)&quot;,&quot;manualOverrideText&quot;:&quot;&quot;},&quot;citationTag&quot;:&quot;MENDELEY_CITATION_v3_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&quot;,&quot;citationItems&quot;:[{&quot;id&quot;:&quot;e6335e51-a6f7-3265-9f9d-b01a35c981bf&quot;,&quot;itemData&quot;:{&quot;type&quot;:&quot;report&quot;,&quot;id&quot;:&quot;e6335e51-a6f7-3265-9f9d-b01a35c981bf&quot;,&quot;title&quot;:&quot;GEOGRAPHIC INFORMATION SYSTEM FOR REPORTING DAMAGE AND ROAD IMPROVEMENT IN THE NATIONAL ROAD IMPLEMENTATION CENTER VIII BASED ON WEB AND ANDROID&quot;,&quot;author&quot;:[{&quot;family&quot;:&quot;Probo Sumirat&quot;,&quot;given&quot;:&quot;Lambang&quot;,&quot;parse-names&quot;:false,&quot;dropping-particle&quot;:&quot;&quot;,&quot;non-dropping-particle&quot;:&quot;&quot;},{&quot;family&quot;:&quot;Cahyono&quot;,&quot;given&quot;:&quot;Dwi&quot;,&quot;parse-names&quot;:false,&quot;dropping-particle&quot;:&quot;&quot;,&quot;non-dropping-particle&quot;:&quot;&quot;},{&quot;family&quot;:&quot;Ali Akbar&quot;,&quot;given&quot;:&quot;Achmad&quot;,&quot;parse-names&quot;:false,&quot;dropping-particle&quot;:&quot;&quot;,&quot;non-dropping-particle&quot;:&quot;&quot;}],&quot;container-title&quot;:&quot;Jurnal Sistem Informasi Dan Bisnis Cerdas (SIBC)&quot;,&quot;issued&quot;:{&quot;date-parts&quot;:[[2021]]},&quot;issue&quot;:&quot;1&quot;,&quot;volume&quot;:&quot;14&quot;,&quot;container-title-short&quot;:&quot;&quot;},&quot;isTemporary&quot;:false}]},{&quot;citationID&quot;:&quot;MENDELEY_CITATION_488dcfc2-d481-4157-a0d7-063991862a7c&quot;,&quot;properties&quot;:{&quot;noteIndex&quot;:0},&quot;isEdited&quot;:false,&quot;manualOverride&quot;:{&quot;isManuallyOverridden&quot;:false,&quot;citeprocText&quot;:&quot;(Angreni, 2024)&quot;,&quot;manualOverrideText&quot;:&quot;&quot;},&quot;citationTag&quot;:&quot;MENDELEY_CITATION_v3_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&quot;,&quot;citationItems&quot;:[{&quot;id&quot;:&quot;5fde951e-7312-3222-b27d-29583699ccd9&quot;,&quot;itemData&quot;:{&quot;type&quot;:&quot;article-journal&quot;,&quot;id&quot;:&quot;5fde951e-7312-3222-b27d-29583699ccd9&quot;,&quot;title&quot;:&quot;KLASIFIKASI KERUSAKAN JALAN: RETAK, RETAK KULIT BUAYA DAN LUBANG BERDASARKAN CITRA DIGITAL&quot;,&quot;author&quot;:[{&quot;family&quot;:&quot;Angreni&quot;,&quot;given&quot;:&quot;Ida Ayu Ari&quot;,&quot;parse-names&quot;:false,&quot;dropping-particle&quot;:&quot;&quot;,&quot;non-dropping-particle&quot;:&quot;&quot;}],&quot;container-title&quot;:&quot;Jurnal Ilmiah Desain &amp; Konstruksi&quot;,&quot;accessed&quot;:{&quot;date-parts&quot;:[[2025,10,8]]},&quot;DOI&quot;:&quot;10.35760/DK.2024.V23I2.11389&quot;,&quot;ISSN&quot;:&quot;0216-4086&quot;,&quot;issued&quot;:{&quot;date-parts&quot;:[[2024]]},&quot;page&quot;:&quot;253-260&quot;,&quot;abstract&quot;:&quot;Penilaian visual kerusakan jalan pada perkerasan fleksibel merupakan pendekatan yang efektif karena kesederhanaan, kepraktisan, dan efisiensinya. Namun dirasakan masih adanya kelemahan karena metode penilaian visual bersifat sangat subjektif, tergantung dari si penilainya, terutama dalam hal pemahaman si penilai sendiri dalam menentukan jenis kerusakan jalan. Hal ini dapat berakibat berbedanya hasil penilaian yang diakibatkan penentuan klasifikasi jenis kerusakan jalan berbeda antara satu penilai dengan penilai yang lain. Sangat penting untuk mengembangkan algoritma atau cara untuk mengkategorikan jenis kerusakan jalan menggunakan foto digital setelah melihat kekurangan visual dalam metode penilaian kerusakan jalan saat ini. Menggunakan kamera digital untuk menangkap gambar adalah langkah awal dari algoritma. Gambar digital kemudian diproses di Matlab RA 2016 untuk ekstraksi dan klasifikasi. Tujuannya adalah untuk mengidentifikasi jenis kerusakan jalan dengan cepat dan akurat menggunakan metode KNN. Temuan menunjukkan bahwa lubang, retakan kulit buaya, dan retakan di jalan dapat diklasifikasikan secara akurat dengan tingkat lebih dari 90%.&quot;,&quot;publisher&quot;:&quot;Gunadarma University&quot;,&quot;issue&quot;:&quot;2&quot;,&quot;volume&quot;:&quot;23&quot;,&quot;container-title-short&quot;:&quot;&quot;},&quot;isTemporary&quot;:false}]},{&quot;citationID&quot;:&quot;MENDELEY_CITATION_39650301-0770-4631-b07c-b9d855d16f50&quot;,&quot;properties&quot;:{&quot;noteIndex&quot;:0},&quot;isEdited&quot;:false,&quot;manualOverride&quot;:{&quot;isManuallyOverridden&quot;:false,&quot;citeprocText&quot;:&quot;(Pandapotan et al., 2020)&quot;,&quot;manualOverrideText&quot;:&quot;&quot;},&quot;citationTag&quot;:&quot;MENDELEY_CITATION_v3_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&quot;,&quot;citationItems&quot;:[{&quot;id&quot;:&quot;691470b8-1034-36e0-bb64-ba70ebd0e293&quot;,&quot;itemData&quot;:{&quot;type&quot;:&quot;article-journal&quot;,&quot;id&quot;:&quot;691470b8-1034-36e0-bb64-ba70ebd0e293&quot;,&quot;title&quot;:&quot;Pengembangan Modul Pengolah Data Citra untuk Aplikasi Pemetaan Kerusakan Jalan&quot;,&quot;author&quot;:[{&quot;family&quot;:&quot;Pandapotan&quot;,&quot;given&quot;:&quot;Ivan Agung&quot;,&quot;parse-names&quot;:false,&quot;dropping-particle&quot;:&quot;&quot;,&quot;non-dropping-particle&quot;:&quot;&quot;},{&quot;family&quot;:&quot;Siahaan&quot;,&quot;given&quot;:&quot;Daniel&quot;,&quot;parse-names&quot;:false,&quot;dropping-particle&quot;:&quot;&quot;,&quot;non-dropping-particle&quot;:&quot;&quot;},{&quot;family&quot;:&quot;Fatichah&quot;,&quot;given&quot;:&quot;Chastine&quot;,&quot;parse-names&quot;:false,&quot;dropping-particle&quot;:&quot;&quot;,&quot;non-dropping-particle&quot;:&quot;&quot;}],&quot;container-title&quot;:&quot;Jurnal Teknik ITS&quot;,&quot;accessed&quot;:{&quot;date-parts&quot;:[[2025,10,8]]},&quot;DOI&quot;:&quot;10.12962/J23373539.V8I2.49489&quot;,&quot;ISSN&quot;:&quot;2301-9271&quot;,&quot;issued&quot;:{&quot;date-parts&quot;:[[2020,1,30]]},&quot;abstract&quot;:&quot;Jalan merupakan suatu prasarana transportasi darat yang merupakan kebutuhan sehari hari bagi setiap manusia.\nSampai saat ini kerusakan jalan masih merupakan salah satu masalah utama untuk transportasi darat. Untuk menangani kerusakan jalan tersebut masih dengan metode manual, dimana semua proses dari awal sampai akhir perbaikan jalan tersebut masih dengan cara yang belum efektif. Untuk memetakan kerusakan jalan tersebut surveyor harus langsung turun ke lokasi kerusakan yang memberikan resiko kecelakaan, kurang efisien dari segi ruang, waktu, serta biaya karena harus turun langsung ke bagian jalan yang mengalami kerusakan dan melakukan pemetaan langsung di lokasi tersebut. Setelah pemetaan, surveyor\nharus memberikan data hasil pemetaan kepada perencana dalam bentuk berkas laporan. Sampai saat ini belum ada pengembangan untuk membuat proses pemetaan pada perbaikan jalan tersebut lebih efektif. Untuk mengotomatisasi proses pemetaan kerusakan jalan, maka dibangun Aplikasi Pemetaan Kerusakan Jalan, yang berbasis aplikasi desktop. Aplikasi yang dibangun memiliki fitur-fitur yang dapat digunakan oleh pengguna untuk membuat proses pemetaan pada proses perbaikan jalan dari awal sampai akhir menjadi lebih mudah dan cepat. Aplikasi Pemetaan Kerusakan Jalan yang dibangun memiliki beberapa modul yang dapat membantu proses pemetaan. Namun, pada penelitian ini hanya dibahas dua modu utamal, dimana dua modul tersebut adalah proses persiapan untuk melakukan pemetaan kerusakan jalan secara otomatis. Modul yang akan dibahas adalah tentang Image Manipulation, yaitu dengan metode Image Stretching dan metode Image Stitching. Keluaran dari modul yang dibangun dapat digunakan sebagai data masukkan untuk modul atau proses selanjutnya pada aplikasi untuk mengeluarkan hasil yang dapat digunakan dan sesuai kebutuhan.&quot;,&quot;publisher&quot;:&quot;Lembaga Penelitian dan Pengabdian kepada Masyarakat ITS&quot;,&quot;issue&quot;:&quot;2&quot;,&quot;volume&quot;:&quot;8&quot;,&quot;container-title-short&quot;:&quot;&quot;},&quot;isTemporary&quot;:false}]},{&quot;citationID&quot;:&quot;MENDELEY_CITATION_23e90242-436b-44c4-8d6d-883fea9b55da&quot;,&quot;properties&quot;:{&quot;noteIndex&quot;:0},&quot;isEdited&quot;:false,&quot;manualOverride&quot;:{&quot;isManuallyOverridden&quot;:false,&quot;citeprocText&quot;:&quot;(Rahman et al., 2025)&quot;,&quot;manualOverrideText&quot;:&quot;&quot;},&quot;citationTag&quot;:&quot;MENDELEY_CITATION_v3_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&quot;,&quot;citationItems&quot;:[{&quot;id&quot;:&quot;454ffeeb-e686-37e1-b711-96a518ce05f8&quot;,&quot;itemData&quot;:{&quot;type&quot;:&quot;article-journal&quot;,&quot;id&quot;:&quot;454ffeeb-e686-37e1-b711-96a518ce05f8&quot;,&quot;title&quot;:&quot;Sistem Klasifikasi Kerusakan Jalan Metode Machine Learning dengan Algoritma K-Means dan Random Forest&quot;,&quot;author&quot;:[{&quot;family&quot;:&quot;Rahman&quot;,&quot;given&quot;:&quot;Fahrim Irhamna&quot;,&quot;parse-names&quot;:false,&quot;dropping-particle&quot;:&quot;&quot;,&quot;non-dropping-particle&quot;:&quot;&quot;},{&quot;family&quot;:&quot;Lukman&quot;,&quot;given&quot;:&quot;Lukman&quot;,&quot;parse-names&quot;:false,&quot;dropping-particle&quot;:&quot;&quot;,&quot;non-dropping-particle&quot;:&quot;&quot;},{&quot;family&quot;:&quot;Hildayati&quot;,&quot;given&quot;:&quot;Hildayati&quot;,&quot;parse-names&quot;:false,&quot;dropping-particle&quot;:&quot;&quot;,&quot;non-dropping-particle&quot;:&quot;&quot;}],&quot;container-title&quot;:&quot;Arus Jurnal Sains dan Teknologi&quot;,&quot;accessed&quot;:{&quot;date-parts&quot;:[[2025,10,8]]},&quot;DOI&quot;:&quot;10.57250/AJST.V3I1.1212&quot;,&quot;issued&quot;:{&quot;date-parts&quot;:[[2025,6,5]]},&quot;page&quot;:&quot;116-126&quot;,&quot;abstract&quot;:&quot;Kerusakan jalan merupakan masalah yang signifikan dalam infrastruktur transportasi, yang dapat mempengaruhi kenyamanan dan kesalamatan pengguna jalan. Penelitian ini bertujuan untuk mengklasifikasi kerusakan jalan berdasarkan data yang diambil dari survey lapangan dengan menggunakan algoritma k-means dan random forest. Metode machine learning dengan menggunakan algoritma k-means dan random forest dipilih karena kemampuannya dalam mengklasifikasi dan mengelompokkan data berdasarkan kedekatan jarak antar sampel, dan dapat dapat mempercepat proses pemeliharaan jalan. Data yang digunakan mencakup pengukuran kondisi jalan, antara lain panjang jalan dalam kondisi baik, sedang, rusak, dan rusak berat. Fitur-fitur ini dipilih untuk mempresentasikan tingkat kerusakan jalan yang sesuai dengan algoritma k-means dan random forest. Penelitian ini dimulai dengan pra-pemrosesan data dan pengelompokkan data menggunakan algoritma k-means, termasuk penanganan nilai yang hilang dan standarisasi fitur, dan diikuti dengan implementasi algoritma random forest untuk klasifikasi. Kinerja model dievaluasi menggunakan confusion matrikx dan classification report, yang menunjukkan bahwa random forest mampu mengklasifikasi kerusakan jalan dengan akurasi yang benar. Kemudian hasil prediksi divalidasi dan disimpan untuk analisis lebih lanjut. Penelitian ini merupakan pengembangan model klasifikasi yang mendukung pengambilan keputusan yang terkait pemeliharaan dan perbaikan jalan secara efektif dan efisien. Penelitian ini berhasil membangun system klasifikasi kerusakan jalan dengan menggabungkan algoritma K-Means untuk pengelompokkan dan Random Forest untuk klasifikasi. Model tersebut dapat memberikan akurasi yang tinggi dalam mengidentifikasi tingkat kerusakan jalan, yang dapat mendukung upaya pemeliharaan jalan yang lebih efektif.&quot;,&quot;publisher&quot;:&quot;Arden Jaya Publisher&quot;,&quot;issue&quot;:&quot;1&quot;,&quot;volume&quot;:&quot;3&quot;,&quot;container-title-short&quot;:&quot;&quot;},&quot;isTemporary&quot;:false}]},{&quot;citationID&quot;:&quot;MENDELEY_CITATION_b0a5e140-bf1a-41ff-8843-f94e9a8b3dcd&quot;,&quot;properties&quot;:{&quot;noteIndex&quot;:0},&quot;isEdited&quot;:false,&quot;manualOverride&quot;:{&quot;isManuallyOverridden&quot;:false,&quot;citeprocText&quot;:&quot;(Denaro &amp;#38; Lim, 2025)&quot;,&quot;manualOverrideText&quot;:&quot;&quot;},&quot;citationTag&quot;:&quot;MENDELEY_CITATION_v3_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&quot;,&quot;citationItems&quot;:[{&quot;id&quot;:&quot;9f04c348-7a6f-348e-821e-48366d8a9820&quot;,&quot;itemData&quot;:{&quot;type&quot;:&quot;article-journal&quot;,&quot;id&quot;:&quot;9f04c348-7a6f-348e-821e-48366d8a9820&quot;,&quot;title&quot;:&quot;Analisis Deteksi Kerusakan pada Jalan Aspal menggunakan Deep Learning untuk Mendukung Efisiensi Biaya dan Waktu dalam Pemantauan Berkelanjutan&quot;,&quot;author&quot;:[{&quot;family&quot;:&quot;Denaro&quot;,&quot;given&quot;:&quot;Lino Garda&quot;,&quot;parse-names&quot;:false,&quot;dropping-particle&quot;:&quot;&quot;,&quot;non-dropping-particle&quot;:&quot;&quot;},{&quot;family&quot;:&quot;Lim&quot;,&quot;given&quot;:&quot;Resmana&quot;,&quot;parse-names&quot;:false,&quot;dropping-particle&quot;:&quot;&quot;,&quot;non-dropping-particle&quot;:&quot;&quot;}],&quot;container-title&quot;:&quot;Jurnal Dimensi Insinyur Profesional&quot;,&quot;accessed&quot;:{&quot;date-parts&quot;:[[2025,10,8]]},&quot;DOI&quot;:&quot;10.9744/JDIP.3.1.16-25&quot;,&quot;issued&quot;:{&quot;date-parts&quot;:[[2025,3,3]]},&quot;page&quot;:&quot;16-25&quot;,&quot;abstract&quot;:&quot;Deteksi dini kerusakan jalan, seperti retakan dan deformasi lainnya, sangat penting karena berfungsi sebagai indikatorawal keausan, kerusakan, atau masalah struktural yang mendasari yang dapat membahayakan keselamatan dan daya tahaninfrastruktur jalan. Penelitian ini bertujuan untuk mengembangkan sistem inspeksi otomatis berbasis pembelajaran mendalam(deep learning) dan pemrosesan citra untuk mendeteksi dan mengklasifikasikan kerusakan jalan secara efektif. Dalam proyek ini,kami menggunakan model pembelajaran mendalam dengan CNN (Convolutional Neural Networks) dan arsitektur ResNet untukmempelajari fitur intrinsik kerusakan permukaan jalan melalui gambar, yang kemudian digunakan untuk klasifikasi otomatis kedalam kelas rusak/tidak rusak atau deformasi permukaan. Model YOLO ini menggunakan metode pembelajaran transfer daridata global dan untuk data jalan nasional yang ada di Indonesia. Tidak seperti pendekatan konvensional, penelitian inimenerapkan model YOLO (You Only Look Once) untuk mendeteksi dan mengklasifikasikan kerusakan jalan secara real-time,memungkinkan deteksi langsung pada berbagai permukaan jalan. Dengan kemampuan YOLO dalam deteksi objek yang cepatdan efisien, sistem ini dapat digunakan dalam inspeksi infrastruktur jalan secara rutin dan pemantauan kondisi jalan secaraberkelanjutan. Pendekatan ini telah dievaluasi menggunakan dataset kerusakan jalan yang tersedia di jalan nasional di Palembang,Sumatera Selatan, Indonesia, dan hasil evaluasi menunjukkan bahwa model YOLO tidak hanya mendeteksi kerusakan jalandengan akurasi tinggi, tetapi juga menunjukkan kecepatan deteksi yang unggul dibandingkan dengan metode tradisional. Hasilpenelitian ini menunjukkan potensi signifikan penggunaan YOLO untuk inspeksi jalan otomatis, membantu mengidentifikasi danmenangani kerusakan dini serta mendukung upaya pemeliharaan dan keselamatan jalan.&quot;,&quot;publisher&quot;:&quot;Petra Christian University&quot;,&quot;issue&quot;:&quot;1&quot;,&quot;volume&quot;:&quot;3&quot;,&quot;container-title-short&quot;:&quot;&quot;},&quot;isTemporary&quot;:false}]},{&quot;citationID&quot;:&quot;MENDELEY_CITATION_729fb47e-dded-40c6-a903-06c259f21e6f&quot;,&quot;properties&quot;:{&quot;noteIndex&quot;:0},&quot;isEdited&quot;:false,&quot;manualOverride&quot;:{&quot;isManuallyOverridden&quot;:false,&quot;citeprocText&quot;:&quot;(Harahap &amp;#38; Kembaren, 2025)&quot;,&quot;manualOverrideText&quot;:&quot;&quot;},&quot;citationTag&quot;:&quot;MENDELEY_CITATION_v3_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&quot;,&quot;citationItems&quot;:[{&quot;id&quot;:&quot;76533ce9-7d2f-3616-b672-324abf54c069&quot;,&quot;itemData&quot;:{&quot;type&quot;:&quot;article-journal&quot;,&quot;id&quot;:&quot;76533ce9-7d2f-3616-b672-324abf54c069&quot;,&quot;title&quot;:&quot;Klasifikasi Objek Menggunakan Convolutional Neural Network pada Citra Satelit&quot;,&quot;author&quot;:[{&quot;family&quot;:&quot;Harahap&quot;,&quot;given&quot;:&quot;Lailan Sofinah&quot;,&quot;parse-names&quot;:false,&quot;dropping-particle&quot;:&quot;&quot;,&quot;non-dropping-particle&quot;:&quot;&quot;},{&quot;family&quot;:&quot;Kembaren&quot;,&quot;given&quot;:&quot;Muhammad Fajar Hidayah&quot;,&quot;parse-names&quot;:false,&quot;dropping-particle&quot;:&quot;&quot;,&quot;non-dropping-particle&quot;:&quot;&quot;}],&quot;container-title&quot;:&quot;RIGGS: Journal of Artificial Intelligence and Digital Business&quot;,&quot;accessed&quot;:{&quot;date-parts&quot;:[[2025,10,8]]},&quot;DOI&quot;:&quot;10.31004/RIGGS.V4I2.1306&quot;,&quot;ISSN&quot;:&quot;2963-9298&quot;,&quot;issued&quot;:{&quot;date-parts&quot;:[[2025,7,5]]},&quot;page&quot;:&quot;4663-4667&quot;,&quot;abstract&quot;:&quot;Penelitian ini mengkaji klasifikasi objek menggunakan Convolutional Neural Network (CNN) pada citra satelit, dengan fokus pada tinjauan literatur dari berbagai studi relevan yang diterbitkan antara tahun 2020 hingga 2025. Metode penelitian kepustakaan digunakan untuk mengidentifikasi jurnal-jurnal yang membahas penerapan CNN dalam berbagai konteks klasifikasi citra, termasuk deteksi target militer, tutupan lahan, citra jalan rusak, jenis sampah, bunga, citra hiperspektral, aktivitas olahraga, jenis anggur, dan pohon kelapa sawit. Hasil tinjauan menunjukkan bahwa CNN secara konsisten memberikan akurasi tinggi dalam berbagai aplikasi klasifikasi citra, dengan beberapa studi mencapai akurasi di atas 95%, bahkan hingga 99,25% untuk klasifikasi citra hiperspektral. Meskipun demikian, tantangan seperti false positive pada klasifikasi tutupan lahan dan kebutuhan akan pengembangan model berkelanjutan untuk aplikasi kritis seperti deteksi target militer masih menjadi perhatian. Penelitian ini menegaskan potensi luas CNN dalam analisis citra satelit dan data visual lainnya, sekaligus menyoroti area yang memerlukan pengembangan lebih lanjut untuk optimalisasi kinerja dan keandalan.&quot;,&quot;publisher&quot;:&quot;Universitas Pahlawan Tuanku Tambusai&quot;,&quot;issue&quot;:&quot;2&quot;,&quot;volume&quot;:&quot;4&quot;,&quot;container-title-short&quot;:&quot;&quot;},&quot;isTemporary&quot;:false}]},{&quot;citationID&quot;:&quot;MENDELEY_CITATION_9524e403-5b50-434c-a94b-18cd01f2239f&quot;,&quot;properties&quot;:{&quot;noteIndex&quot;:0},&quot;isEdited&quot;:false,&quot;manualOverride&quot;:{&quot;isManuallyOverridden&quot;:false,&quot;citeprocText&quot;:&quot;(Zhang et al., 2022)&quot;,&quot;manualOverrideText&quot;:&quot;&quot;},&quot;citationTag&quot;:&quot;MENDELEY_CITATION_v3_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&quot;,&quot;citationItems&quot;:[{&quot;id&quot;:&quot;6ab2cc3f-874c-305e-8cc6-11fa5f3dcfa3&quot;,&quot;itemData&quot;:{&quot;type&quot;:&quot;article-journal&quot;,&quot;id&quot;:&quot;6ab2cc3f-874c-305e-8cc6-11fa5f3dcfa3&quot;,&quot;title&quot;:&quot;Pavement distress detection using convolutional neural network (CNN): A case study in Montreal, Canada&quot;,&quot;author&quot;:[{&quot;family&quot;:&quot;Zhang&quot;,&quot;given&quot;:&quot;Ce&quot;,&quot;parse-names&quot;:false,&quot;dropping-particle&quot;:&quot;&quot;,&quot;non-dropping-particle&quot;:&quot;&quot;},{&quot;family&quot;:&quot;Nateghinia&quot;,&quot;given&quot;:&quot;Ehsan&quot;,&quot;parse-names&quot;:false,&quot;dropping-particle&quot;:&quot;&quot;,&quot;non-dropping-particle&quot;:&quot;&quot;},{&quot;family&quot;:&quot;Miranda-Moreno&quot;,&quot;given&quot;:&quot;Luis F.&quot;,&quot;parse-names&quot;:false,&quot;dropping-particle&quot;:&quot;&quot;,&quot;non-dropping-particle&quot;:&quot;&quot;},{&quot;family&quot;:&quot;Sun&quot;,&quot;given&quot;:&quot;Lijun&quot;,&quot;parse-names&quot;:false,&quot;dropping-particle&quot;:&quot;&quot;,&quot;non-dropping-particle&quot;:&quot;&quot;}],&quot;container-title&quot;:&quot;International Journal of Transportation Science and Technology&quot;,&quot;accessed&quot;:{&quot;date-parts&quot;:[[2025,10,8]]},&quot;DOI&quot;:&quot;10.1016/J.IJTST.2021.04.008&quot;,&quot;ISSN&quot;:&quot;2046-0430&quot;,&quot;URL&quot;:&quot;https://www.sciencedirect.com/science/article/pii/S2046043021000307&quot;,&quot;issued&quot;:{&quot;date-parts&quot;:[[2022,6,1]]},&quot;page&quot;:&quot;298-309&quot;,&quot;abstract&quot;:&quot;Pavement distresses, including cracking and disintegration, deteriorate road user's comfort, damage vehicles, increase evasive maneuvers, and increase emissions. Transportation agencies spend a significant portion of their budget to monitor and maintain road pavements. Pavement distress can be identified through manual surveys, i.e., visual inspections of pavement images captured by an inspection vehicle. To reduce manual inspection costs, research and industry have moved quietly towards the development and implementation of automated road surface monitoring systems. Considering the latest research developments, the objective of this work is to propose and evaluate a methodology for automated detection and classification of pavement distress types using Convolutional Neural Networks (CNN) and a low-cost video data collection strategy. In this work, pavement distress types are categorized as linear or longitudinal crack, network crack, fatigue crack or pothole, patch, and pavement marking. The models are trained and tested based on an image dataset collected from Montreal's road pavements. A sensitivity analysis is carried on for evaluating different regularization scenarios and data generation strategies especially scaling and partitioning the input image. The detection rate and classification accuracy of the proposed approach with the trained CNN model reaches 83.8% over the test set, which is promising compared with the literature. More specifically, the F1-scores for “pothole”, “patch”, “marking”, “crack-linear” and “crack-network” classes are 0.808, 0.802, 0.860, 0.796, and 0.813, respectively. However, by merging linear and network crack classes, the F1-score over the merged class increases to 0.916.&quot;,&quot;publisher&quot;:&quot;Elsevier&quot;,&quot;issue&quot;:&quot;2&quot;,&quot;volume&quot;:&quot;11&quot;,&quot;container-title-short&quot;:&quot;&quot;},&quot;isTemporary&quot;:false}]},{&quot;citationID&quot;:&quot;MENDELEY_CITATION_29f43ab9-484d-4551-b579-2a7b45279f53&quot;,&quot;properties&quot;:{&quot;noteIndex&quot;:0},&quot;isEdited&quot;:false,&quot;manualOverride&quot;:{&quot;isManuallyOverridden&quot;:false,&quot;citeprocText&quot;:&quot;(Kulambayev et al., 2024)&quot;,&quot;manualOverrideText&quot;:&quot;&quot;},&quot;citationTag&quot;:&quot;MENDELEY_CITATION_v3_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&quot;,&quot;citationItems&quot;:[{&quot;id&quot;:&quot;1c581491-d7b2-31e6-b3c4-53a4f6f68f0f&quot;,&quot;itemData&quot;:{&quot;type&quot;:&quot;report&quot;,&quot;id&quot;:&quot;1c581491-d7b2-31e6-b3c4-53a4f6f68f0f&quot;,&quot;title&quot;:&quot;Real-Time Road Damage Detection System on Deep Learning Based Image Analysis&quot;,&quot;author&quot;:[{&quot;family&quot;:&quot;Kulambayev&quot;,&quot;given&quot;:&quot;Bakhytzhan&quot;,&quot;parse-names&quot;:false,&quot;dropping-particle&quot;:&quot;&quot;,&quot;non-dropping-particle&quot;:&quot;&quot;},{&quot;family&quot;:&quot;Gleb&quot;,&quot;given&quot;:&quot;Belik&quot;,&quot;parse-names&quot;:false,&quot;dropping-particle&quot;:&quot;&quot;,&quot;non-dropping-particle&quot;:&quot;&quot;},{&quot;family&quot;:&quot;Katayev&quot;,&quot;given&quot;:&quot;Nazbek&quot;,&quot;parse-names&quot;:false,&quot;dropping-particle&quot;:&quot;&quot;,&quot;non-dropping-particle&quot;:&quot;&quot;},{&quot;family&quot;:&quot;Menglibay&quot;,&quot;given&quot;:&quot;Islam&quot;,&quot;parse-names&quot;:false,&quot;dropping-particle&quot;:&quot;&quot;,&quot;non-dropping-particle&quot;:&quot;&quot;},{&quot;family&quot;:&quot;Momynkulov&quot;,&quot;given&quot;:&quot;Zeinel&quot;,&quot;parse-names&quot;:false,&quot;dropping-particle&quot;:&quot;&quot;,&quot;non-dropping-particle&quot;:&quot;&quot;},{&quot;family&quot;:&quot;University&quot;,&quot;given&quot;:&quot;Turan&quot;,&quot;parse-names&quot;:false,&quot;dropping-particle&quot;:&quot;&quot;,&quot;non-dropping-particle&quot;:&quot;&quot;}],&quot;container-title&quot;:&quot;IJACSA) International Journal of Advanced Computer Science and Applications&quot;,&quot;URL&quot;:&quot;www.ijacsa.thesai.org&quot;,&quot;issued&quot;:{&quot;date-parts&quot;:[[2024]]},&quot;abstract&quot;:&quot;This research paper introduces a sophisticated deep learning-based system for real-time detection and segmentation of road damages, utilizing the Mask R-CNN framework to enhance road maintenance and safety. The primary objective was to develop a robust automated system capable of accurately identifying and classifying various types of road damages under diverse environmental conditions. The system employs advanced convolutional neural networks to process and analyze images captured from road surfaces, enabling precise localization and segmentation of damages such as cracks, potholes, and surface wear. Evaluation of the model's performance through metrics like accuracy, precision, recall, and F1-score demonstrated high effectiveness in real-world scenarios. The confusion matrix and loss curves presented in the study illustrate the system's ability to generalize well to unseen data, mitigating overfitting while maintaining high detection sensitivity. Challenges such as variable lighting, shadows, and background noise were addressed, highlighting the system's resilience and the need for further dataset diversification and integration of multimodal data sources. The potential improvements discussed include refining the convolutional network architecture and incorporating predictive maintenance capabilities. The system's application extends beyond mere detection, promising transformative impacts on urban planning and infrastructure management by integrating with smart city frameworks to facilitate real-time, predictive road maintenance. This research sets a benchmark for future developments in the field of automated road assessment, pointing towards a future where AI-driven technologies significantly enhance public safety and infrastructure efficiency.&quot;,&quot;issue&quot;:&quot;9&quot;,&quot;volume&quot;:&quot;15&quot;,&quot;container-title-short&quot;:&quot;&quot;},&quot;isTemporary&quot;:false}]},{&quot;citationID&quot;:&quot;MENDELEY_CITATION_a1b755c8-934a-4fb8-aff7-4022c0fc09a3&quot;,&quot;properties&quot;:{&quot;noteIndex&quot;:0},&quot;isEdited&quot;:false,&quot;manualOverride&quot;:{&quot;isManuallyOverridden&quot;:false,&quot;citeprocText&quot;:&quot;(Mulyana et al., 2025)&quot;,&quot;manualOverrideText&quot;:&quot;&quot;},&quot;citationTag&quot;:&quot;MENDELEY_CITATION_v3_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&quot;,&quot;citationItems&quot;:[{&quot;id&quot;:&quot;82b3e6f8-f164-3340-b6af-31554ccb378b&quot;,&quot;itemData&quot;:{&quot;type&quot;:&quot;report&quot;,&quot;id&quot;:&quot;82b3e6f8-f164-3340-b6af-31554ccb378b&quot;,&quot;title&quot;:&quot;Deteksi Kerusakan Jalan Berdasarkan Citra Digital Menggunakan Convolutional Neural Network (CNN)&quot;,&quot;author&quot;:[{&quot;family&quot;:&quot;Mulyana&quot;,&quot;given&quot;:&quot;Dadang Iskandar&quot;,&quot;parse-names&quot;:false,&quot;dropping-particle&quot;:&quot;&quot;,&quot;non-dropping-particle&quot;:&quot;&quot;},{&quot;family&quot;:&quot;Wahyudi&quot;,&quot;given&quot;:&quot;Ilham&quot;,&quot;parse-names&quot;:false,&quot;dropping-particle&quot;:&quot;&quot;,&quot;non-dropping-particle&quot;:&quot;&quot;},{&quot;family&quot;:&quot;Studi&quot;,&quot;given&quot;:&quot;Program&quot;,&quot;parse-names&quot;:false,&quot;dropping-particle&quot;:&quot;&quot;,&quot;non-dropping-particle&quot;:&quot;&quot;},{&quot;family&quot;:&quot;Komputer&quot;,&quot;given&quot;:&quot;Ilmu&quot;,&quot;parse-names&quot;:false,&quot;dropping-particle&quot;:&quot;&quot;,&quot;non-dropping-particle&quot;:&quot;&quot;},{&quot;family&quot;:&quot;Tinggi&quot;,&quot;given&quot;:&quot;Sekolah&quot;,&quot;parse-names&quot;:false,&quot;dropping-particle&quot;:&quot;&quot;,&quot;non-dropping-particle&quot;:&quot;&quot;},{&quot;family&quot;:&quot;Karya Informatika&quot;,&quot;given&quot;:&quot;Cipta&quot;,&quot;parse-names&quot;:false,&quot;dropping-particle&quot;:&quot;&quot;,&quot;non-dropping-particle&quot;:&quot;&quot;},{&quot;family&quot;:&quot;Kota&quot;,&quot;given&quot;:&quot;Jakarta&quot;,&quot;parse-names&quot;:false,&quot;dropping-particle&quot;:&quot;&quot;,&quot;non-dropping-particle&quot;:&quot;&quot;},{&quot;family&quot;:&quot;Timur&quot;,&quot;given&quot;:&quot;Daerah&quot;,&quot;parse-names&quot;:false,&quot;dropping-particle&quot;:&quot;&quot;,&quot;non-dropping-particle&quot;:&quot;&quot;},{&quot;family&quot;:&quot;Khusus&quot;,&quot;given&quot;:&quot;Ibukota&quot;,&quot;parse-names&quot;:false,&quot;dropping-particle&quot;:&quot;&quot;,&quot;non-dropping-particle&quot;:&quot;&quot;},{&quot;family&quot;:&quot;Jakarta&quot;,&quot;given&quot;:&quot;Indonesia&quot;,&quot;parse-names&quot;:false,&quot;dropping-particle&quot;:&quot;&quot;,&quot;non-dropping-particle&quot;:&quot;&quot;}],&quot;container-title&quot;:&quot;Jurnal Indonesia : Manajemen Informatika dan Komunikasi (JIMIK)&quot;,&quot;URL&quot;:&quot;https://journal.stmiki.ac.id&quot;,&quot;issued&quot;:{&quot;date-parts&quot;:[[2025]]},&quot;issue&quot;:&quot;1&quot;,&quot;volume&quot;:&quot;6&quot;,&quot;container-title-short&quot;:&quot;&quot;},&quot;isTemporary&quot;:false}]},{&quot;citationID&quot;:&quot;MENDELEY_CITATION_06b01a55-e6a5-4970-8feb-3e58e1434d1c&quot;,&quot;properties&quot;:{&quot;noteIndex&quot;:0},&quot;isEdited&quot;:false,&quot;manualOverride&quot;:{&quot;isManuallyOverridden&quot;:false,&quot;citeprocText&quot;:&quot;(Yanni et al., 2025)&quot;,&quot;manualOverrideText&quot;:&quot;&quot;},&quot;citationTag&quot;:&quot;MENDELEY_CITATION_v3_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&quot;,&quot;citationItems&quot;:[{&quot;id&quot;:&quot;69824a07-2868-3567-b2d6-fba7e807d921&quot;,&quot;itemData&quot;:{&quot;type&quot;:&quot;article-journal&quot;,&quot;id&quot;:&quot;69824a07-2868-3567-b2d6-fba7e807d921&quot;,&quot;title&quot;:&quot;PERBANDINGAN KLASIFIKASI KERUSAKAN JALAN MODEL CNN VGG19 DAN RESNET50&quot;,&quot;author&quot;:[{&quot;family&quot;:&quot;Yanni&quot;,&quot;given&quot;:&quot;Revanza Raditya Putra&quot;,&quot;parse-names&quot;:false,&quot;dropping-particle&quot;:&quot;&quot;,&quot;non-dropping-particle&quot;:&quot;&quot;},{&quot;family&quot;:&quot;Mardhiyah&quot;,&quot;given&quot;:&quot;Iffatul&quot;,&quot;parse-names&quot;:false,&quot;dropping-particle&quot;:&quot;&quot;,&quot;non-dropping-particle&quot;:&quot;&quot;},{&quot;family&quot;:&quot;Irawati&quot;,&quot;given&quot;:&quot;Dyah Cita&quot;,&quot;parse-names&quot;:false,&quot;dropping-particle&quot;:&quot;&quot;,&quot;non-dropping-particle&quot;:&quot;&quot;},{&quot;family&quot;:&quot;Kosasih&quot;,&quot;given&quot;:&quot;Rifki&quot;,&quot;parse-names&quot;:false,&quot;dropping-particle&quot;:&quot;&quot;,&quot;non-dropping-particle&quot;:&quot;&quot;},{&quot;family&quot;:&quot;Sari&quot;,&quot;given&quot;:&quot;Dyan Prawita&quot;,&quot;parse-names&quot;:false,&quot;dropping-particle&quot;:&quot;&quot;,&quot;non-dropping-particle&quot;:&quot;&quot;}],&quot;container-title&quot;:&quot;Jurnal Ilmiah Informatika Komputer&quot;,&quot;DOI&quot;:&quot;10.35760/ik.2025.v30i1.14230&quot;,&quot;ISSN&quot;:&quot;0853-8638&quot;,&quot;issued&quot;:{&quot;date-parts&quot;:[[2025]]},&quot;page&quot;:&quot;69-80&quot;,&quot;abstract&quot;:&quot;Masalah kerusakan jalan pada jalan utama adalah salah satu gangguan saat berkendara dan dapat menyebabkan kecelakaan. Identifikasi kerusakan jalan masih dilakukan secara manual oleh pemerintah daerah dengan penyisiran jalan. Penggunaan teknologi kecerdasan buatan untuk identifikasi kerusakan jalan, sangat diperlukan. Algoritma CNN dapat melakukan identifikasi dan klasifikasi kerusakan jalan. Beberapa arsitektur pada CNN yang sering digunakan untuk klasifikasi diantaranya VGG19 dan ResNet50. Penelitian ini bertujuan untuk mengetahui perbandingan klasifikasi antara VGG19 dan ResNet50 pada kerusakan jalan. Perbandingan dilakukan dengan membedakan jumlah epochnya untuk setiap arsitektur. Jumlah dataset yang digunakan sebanyak 1656 citra. Model yang dibentuk bertujuan mengklasifikasikan kerusakan jalan menjadi tiga klasifikasi yaitu, kerusakan_besar, kerusakan_sedang, dan kerusakan_kecil. Jumlah epoch yang digunakan pada model adalah sebesar 10, 50, dan 100. Hasil dari penelitian arsitektur VGG19 dengan epoch 10 mendapatkan akurasi sebesar 79%, epoch 50 sebesar 73%, dan epoch 100 sebesar 76%. Arsitektur ResNet50 memperoleh hasil akurasi sebesar 75% dengan epoch 10, untuk epoch 50 sebesar 78%, dan epoch 100 sebesar 79%. Kesimpulan penelitian perbandingan klasifikasi kerusakan jalan, VGG19 dapat mengklasifikasikan lebih baik jika proses pelatihan yang lebih sederhana, sedangkan ResNet50 dapat melakukan klasifikasi lebih baik jika proses pelatihan yang lebih kompleks.&quot;,&quot;publisher&quot;:&quot;Gunadarma University&quot;,&quot;issue&quot;:&quot;1&quot;,&quot;volume&quot;:&quot;30&quot;,&quot;container-title-short&quot;:&quot;&quot;},&quot;isTemporary&quot;:false}]},{&quot;citationID&quot;:&quot;MENDELEY_CITATION_724faa5f-f36c-4278-956e-eb14f34ce31d&quot;,&quot;properties&quot;:{&quot;noteIndex&quot;:0},&quot;isEdited&quot;:false,&quot;manualOverride&quot;:{&quot;isManuallyOverridden&quot;:false,&quot;citeprocText&quot;:&quot;(Iradaf Mandaya, n.d.)&quot;,&quot;manualOverrideText&quot;:&quot;&quot;},&quot;citationTag&quot;:&quot;MENDELEY_CITATION_v3_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&quot;,&quot;citationItems&quot;:[{&quot;id&quot;:&quot;8c879587-286f-35db-9ae9-31ebf13430fe&quot;,&quot;itemData&quot;:{&quot;type&quot;:&quot;article-journal&quot;,&quot;id&quot;:&quot;8c879587-286f-35db-9ae9-31ebf13430fe&quot;,&quot;title&quot;:&quot;Pemanfaatan Teknologi Unmanned Aerial Vehicle (UAV) untuk Identifikasi dan Klasifikasi Jenis Jenis Kerusakan Jalan&quot;,&quot;author&quot;:[{&quot;family&quot;:&quot;Iradaf Mandaya&quot;,&quot;given&quot;:&quot;&quot;,&quot;parse-names&quot;:false,&quot;dropping-particle&quot;:&quot;&quot;,&quot;non-dropping-particle&quot;:&quot;&quot;}],&quot;DOI&quot;:&quot;https://doi.org/10.21776/ub.rekayasasipil.2020.014.03.1&quot;},&quot;isTemporary&quot;:false}]},{&quot;citationID&quot;:&quot;MENDELEY_CITATION_ce2a1e2e-8088-4feb-800c-33bdb2479319&quot;,&quot;properties&quot;:{&quot;noteIndex&quot;:0},&quot;isEdited&quot;:false,&quot;manualOverride&quot;:{&quot;isManuallyOverridden&quot;:false,&quot;citeprocText&quot;:&quot;(Hugo et al., 2025)&quot;,&quot;manualOverrideText&quot;:&quot;&quot;},&quot;citationTag&quot;:&quot;MENDELEY_CITATION_v3_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&quot;,&quot;citationItems&quot;:[{&quot;id&quot;:&quot;d4380c8a-d7c2-3af4-a898-582d54c5cfe4&quot;,&quot;itemData&quot;:{&quot;type&quot;:&quot;article-journal&quot;,&quot;id&quot;:&quot;d4380c8a-d7c2-3af4-a898-582d54c5cfe4&quot;,&quot;title&quot;:&quot;EfficientDet Model for Accurate Detection and Classification of Road Damages in Indonesia&quot;,&quot;author&quot;:[{&quot;family&quot;:&quot;Hugo&quot;,&quot;given&quot;:&quot;Bernard&quot;,&quot;parse-names&quot;:false,&quot;dropping-particle&quot;:&quot;&quot;,&quot;non-dropping-particle&quot;:&quot;&quot;},{&quot;family&quot;:&quot;Zakiyyah&quot;,&quot;given&quot;:&quot;Alfi Yusrotis&quot;,&quot;parse-names&quot;:false,&quot;dropping-particle&quot;:&quot;&quot;,&quot;non-dropping-particle&quot;:&quot;&quot;},{&quot;family&quot;:&quot;Minor&quot;,&quot;given&quot;:&quot;Kelvin Asclepius&quot;,&quot;parse-names&quot;:false,&quot;dropping-particle&quot;:&quot;&quot;,&quot;non-dropping-particle&quot;:&quot;&quot;}],&quot;container-title&quot;:&quot;Journal of Machine Learning and Deep Learning&quot;,&quot;DOI&quot;:&quot;10.64820/AEPJMLDL.21.11.17.62025&quot;,&quot;ISSN&quot;:&quot;29784336&quot;,&quot;URL&quot;:&quot;https://www.academicedgepress.co.uk/JMLDL?ArticleID=15&quot;,&quot;issued&quot;:{&quot;date-parts&quot;:[[2025,6,30]]},&quot;page&quot;:&quot;11-17&quot;,&quot;abstract&quot;:&quot;&lt;p&gt;This electronic Road infrastructure is an important aspect that must be maintained to ensure public road safety. Traditional road damage detection methods are labor-intensive, costly, and inefficient, highlighting the need for an automated solution. By utilizing the EfficientDet model, we tried to assess the model’s performance in detecting and classifying diverse types of road damage in Indonesia. After that, we leverage a built-in data augmentation technique to improve the model’s succession. We achieved the best result with the validation F1 Score of 59.7%, bypassing the performance of the previous work. The moderate performance of the model is caused by the complexity in learning road damages features and challenges in generalizing on unseen data.&lt;/p&gt;&quot;,&quot;issue&quot;:&quot;1&quot;,&quot;volume&quot;:&quot;2&quot;,&quot;container-title-short&quot;:&quot;&quot;},&quot;isTemporary&quot;:false}]}]"/>
+    <we:property name="MENDELEY_CITATIONS_STYLE" value="{&quot;id&quot;:&quot;https://www.zotero.org/styles/apa&quot;,&quot;title&quot;:&quot;American Psychological Association 7th edition&quot;,&quot;format&quot;:&quot;author-date&quot;,&quot;defaultLocale&quot;:null,&quot;isLocaleCodeValid&quot;:true}"/>
+  </we:properties>
+  <we:bindings/>
+  <we:snapshot xmlns:r="http://schemas.openxmlformats.org/officeDocument/2006/relationships"/>
+</we:webextension>
+</file>
+
 <file path=customXml/item1.xml><?xml version="1.0" encoding="utf-8"?>
 <go:gDocsCustomXmlDataStorage xmlns:go="http://customooxmlschemas.google.com/" xmlns:r="http://schemas.openxmlformats.org/officeDocument/2006/relationships" uri="GoogleDocsCustomDataVersion2">
   <go:docsCustomData xmlns:go="http://customooxmlschemas.google.com/" roundtripDataSignature="AMtx7mgfN/ehq8DHxrg61fZv2jtxfOKw5w==">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</go:docsCustomData>
 </go:gDocsCustomXmlDataStorage>
+</file>
+
+<file path=customXml/item2.xml><?xml version="1.0" encoding="utf-8"?>
+<b:Sources xmlns:b="http://schemas.openxmlformats.org/officeDocument/2006/bibliography" xmlns="http://schemas.openxmlformats.org/officeDocument/2006/bibliography" SelectedStyle="\APASixthEditionOfficeOnline.xsl" StyleName="APA" Version="6"/>
 </file>
 
 <file path=customXml/itemProps1.xml><?xml version="1.0" encoding="utf-8"?>
@@ -16754,4 +19548,12 @@
     <ds:schemaRef ds:uri="http://schemas.openxmlformats.org/officeDocument/2006/relationships"/>
   </ds:schemaRefs>
 </ds:datastoreItem>
+</file>
+
+<file path=customXml/itemProps2.xml><?xml version="1.0" encoding="utf-8"?>
+<ds:datastoreItem xmlns:ds="http://schemas.openxmlformats.org/officeDocument/2006/customXml" ds:itemID="{889A2457-E67C-4DD1-9371-B05D7AC29857}">
+  <ds:schemaRefs>
+    <ds:schemaRef ds:uri="http://schemas.openxmlformats.org/officeDocument/2006/bibliography"/>
+  </ds:schemaRefs>
+</ds:datastoreItem>
 </file>
</xml_diff>